<commit_message>
New lines of code
</commit_message>
<xml_diff>
--- a/FBL-PhD-research-proposal.docx
+++ b/FBL-PhD-research-proposal.docx
@@ -5355,25 +5355,7 @@
           <w:sz w:val="20"/>
           <w:szCs w:val="20"/>
         </w:rPr>
-        <w:t xml:space="preserve"> (Depp and </w:t>
-      </w:r>
-      <w:proofErr w:type="spellStart"/>
-      <w:r>
-        <w:rPr>
-          <w:rFonts w:ascii="Arial" w:hAnsi="Arial" w:cs="Arial"/>
-          <w:sz w:val="20"/>
-          <w:szCs w:val="20"/>
-        </w:rPr>
-        <w:t>Jeste</w:t>
-      </w:r>
-      <w:proofErr w:type="spellEnd"/>
-      <w:r>
-        <w:rPr>
-          <w:rFonts w:ascii="Arial" w:hAnsi="Arial" w:cs="Arial"/>
-          <w:sz w:val="20"/>
-          <w:szCs w:val="20"/>
-        </w:rPr>
-        <w:t>, 2004)</w:t>
+        <w:t xml:space="preserve"> (Depp and Jeste, 2004)</w:t>
       </w:r>
       <w:r>
         <w:rPr>
@@ -5477,25 +5459,7 @@
           <w:sz w:val="20"/>
           <w:szCs w:val="20"/>
         </w:rPr>
-        <w:t xml:space="preserve">Mirowska and </w:t>
-      </w:r>
-      <w:proofErr w:type="spellStart"/>
-      <w:r>
-        <w:rPr>
-          <w:rFonts w:ascii="Arial" w:hAnsi="Arial" w:cs="Arial"/>
-          <w:sz w:val="20"/>
-          <w:szCs w:val="20"/>
-        </w:rPr>
-        <w:t>Arsenyan</w:t>
-      </w:r>
-      <w:proofErr w:type="spellEnd"/>
-      <w:r>
-        <w:rPr>
-          <w:rFonts w:ascii="Arial" w:hAnsi="Arial" w:cs="Arial"/>
-          <w:sz w:val="20"/>
-          <w:szCs w:val="20"/>
-        </w:rPr>
-        <w:t xml:space="preserve">, 2025; </w:t>
+        <w:t xml:space="preserve">Mirowska and Arsenyan, 2025; </w:t>
       </w:r>
       <w:r>
         <w:rPr>
@@ -5845,7 +5809,6 @@
         </w:rPr>
         <w:t xml:space="preserve">an open access paper by </w:t>
       </w:r>
-      <w:proofErr w:type="spellStart"/>
       <w:r>
         <w:rPr>
           <w:rFonts w:ascii="Arial" w:hAnsi="Arial" w:cs="Arial"/>
@@ -5854,7 +5817,6 @@
         </w:rPr>
         <w:t>Chilunjika</w:t>
       </w:r>
-      <w:proofErr w:type="spellEnd"/>
       <w:r>
         <w:rPr>
           <w:rFonts w:ascii="Arial" w:hAnsi="Arial" w:cs="Arial"/>
@@ -5903,25 +5865,7 @@
           <w:sz w:val="20"/>
           <w:szCs w:val="20"/>
         </w:rPr>
-        <w:t xml:space="preserve"> </w:t>
-      </w:r>
-      <w:proofErr w:type="spellStart"/>
-      <w:r>
-        <w:rPr>
-          <w:rFonts w:ascii="Arial" w:hAnsi="Arial" w:cs="Arial"/>
-          <w:sz w:val="20"/>
-          <w:szCs w:val="20"/>
-        </w:rPr>
-        <w:t>Chilunjika</w:t>
-      </w:r>
-      <w:proofErr w:type="spellEnd"/>
-      <w:r>
-        <w:rPr>
-          <w:rFonts w:ascii="Arial" w:hAnsi="Arial" w:cs="Arial"/>
-          <w:sz w:val="20"/>
-          <w:szCs w:val="20"/>
-        </w:rPr>
-        <w:t xml:space="preserve">, </w:t>
+        <w:t xml:space="preserve"> Chilunjika, </w:t>
       </w:r>
       <w:r>
         <w:rPr>
@@ -6074,7 +6018,39 @@
           <w:sz w:val="20"/>
           <w:szCs w:val="20"/>
         </w:rPr>
-        <w:t xml:space="preserve">One of the central propositions of this paper is in regard to a model which the author built and tested over a 3-week period. Whilst implementing Claude Opus 4.5 (the latest iteration of Anthropic’s market leading LLM) and prompting the model through an OAuth 2.0 API, much of the knowledge base it relies on was found to be deprecated. In one instance, when prompting the model for information about national days observed by African states during the testing period, Anthropic’s model responded </w:t>
+        <w:t xml:space="preserve">One of the central propositions of this paper is in regard to a model which the author built and tested over a 3-week period. Whilst implementing </w:t>
+      </w:r>
+      <w:r>
+        <w:rPr>
+          <w:rFonts w:ascii="Arial" w:hAnsi="Arial" w:cs="Arial"/>
+          <w:sz w:val="20"/>
+          <w:szCs w:val="20"/>
+        </w:rPr>
+        <w:t xml:space="preserve">Gemini 3.5, Claude Haiku 3.5 and </w:t>
+      </w:r>
+      <w:r>
+        <w:rPr>
+          <w:rFonts w:ascii="Arial" w:hAnsi="Arial" w:cs="Arial"/>
+          <w:sz w:val="20"/>
+          <w:szCs w:val="20"/>
+        </w:rPr>
+        <w:t xml:space="preserve">Claude Opus 4.5 (the latest iteration of Anthropic’s market leading LLM) and prompting </w:t>
+      </w:r>
+      <w:r>
+        <w:rPr>
+          <w:rFonts w:ascii="Arial" w:hAnsi="Arial" w:cs="Arial"/>
+          <w:sz w:val="20"/>
+          <w:szCs w:val="20"/>
+        </w:rPr>
+        <w:t>each</w:t>
+      </w:r>
+      <w:r>
+        <w:rPr>
+          <w:rFonts w:ascii="Arial" w:hAnsi="Arial" w:cs="Arial"/>
+          <w:sz w:val="20"/>
+          <w:szCs w:val="20"/>
+        </w:rPr>
+        <w:t xml:space="preserve"> model through an OAuth 2.0 API, much of the knowledge base it relies on was found to be deprecated. In one instance, when prompting the model for information about national days observed by African states during the testing period, Anthropic’s model responded </w:t>
       </w:r>
       <w:r>
         <w:rPr>
@@ -6106,7 +6082,23 @@
           <w:sz w:val="20"/>
           <w:szCs w:val="20"/>
         </w:rPr>
-        <w:t xml:space="preserve"> – in this instance, observed themes which related to non-African countries</w:t>
+        <w:t xml:space="preserve"> – in this instance, themes </w:t>
+      </w:r>
+      <w:r>
+        <w:rPr>
+          <w:rFonts w:ascii="Arial" w:hAnsi="Arial" w:cs="Arial"/>
+          <w:sz w:val="20"/>
+          <w:szCs w:val="20"/>
+        </w:rPr>
+        <w:t xml:space="preserve">observed </w:t>
+      </w:r>
+      <w:r>
+        <w:rPr>
+          <w:rFonts w:ascii="Arial" w:hAnsi="Arial" w:cs="Arial"/>
+          <w:sz w:val="20"/>
+          <w:szCs w:val="20"/>
+        </w:rPr>
+        <w:t>which related to non-African countries</w:t>
       </w:r>
       <w:r>
         <w:rPr>
@@ -6302,7 +6294,71 @@
           <w:sz w:val="20"/>
           <w:szCs w:val="20"/>
         </w:rPr>
-        <w:t>Far be it for one so unlearned in the economics of computer science to make judgements about how Anthropic has emerged, or its company’s interests in competing with OpenAI, but it s</w:t>
+        <w:t>Far be it for one so unlearned in the economics of computer science to make judgements about how Anthropic</w:t>
+      </w:r>
+      <w:r>
+        <w:rPr>
+          <w:rFonts w:ascii="Arial" w:hAnsi="Arial" w:cs="Arial"/>
+          <w:sz w:val="20"/>
+          <w:szCs w:val="20"/>
+        </w:rPr>
+        <w:t xml:space="preserve"> weights its algorithm</w:t>
+      </w:r>
+      <w:r>
+        <w:rPr>
+          <w:rFonts w:ascii="Arial" w:hAnsi="Arial" w:cs="Arial"/>
+          <w:sz w:val="20"/>
+          <w:szCs w:val="20"/>
+        </w:rPr>
+        <w:t xml:space="preserve">, or </w:t>
+      </w:r>
+      <w:r>
+        <w:rPr>
+          <w:rFonts w:ascii="Arial" w:hAnsi="Arial" w:cs="Arial"/>
+          <w:sz w:val="20"/>
+          <w:szCs w:val="20"/>
+        </w:rPr>
+        <w:t>how it decides upon its</w:t>
+      </w:r>
+      <w:r>
+        <w:rPr>
+          <w:rFonts w:ascii="Arial" w:hAnsi="Arial" w:cs="Arial"/>
+          <w:sz w:val="20"/>
+          <w:szCs w:val="20"/>
+        </w:rPr>
+        <w:t xml:space="preserve"> company’s interests </w:t>
+      </w:r>
+      <w:r>
+        <w:rPr>
+          <w:rFonts w:ascii="Arial" w:hAnsi="Arial" w:cs="Arial"/>
+          <w:sz w:val="20"/>
+          <w:szCs w:val="20"/>
+        </w:rPr>
+        <w:t>when</w:t>
+      </w:r>
+      <w:r>
+        <w:rPr>
+          <w:rFonts w:ascii="Arial" w:hAnsi="Arial" w:cs="Arial"/>
+          <w:sz w:val="20"/>
+          <w:szCs w:val="20"/>
+        </w:rPr>
+        <w:t xml:space="preserve"> competing with OpenAI</w:t>
+      </w:r>
+      <w:r>
+        <w:rPr>
+          <w:rFonts w:ascii="Arial" w:hAnsi="Arial" w:cs="Arial"/>
+          <w:sz w:val="20"/>
+          <w:szCs w:val="20"/>
+        </w:rPr>
+        <w:t xml:space="preserve"> and Google</w:t>
+      </w:r>
+      <w:r>
+        <w:rPr>
+          <w:rFonts w:ascii="Arial" w:hAnsi="Arial" w:cs="Arial"/>
+          <w:sz w:val="20"/>
+          <w:szCs w:val="20"/>
+        </w:rPr>
+        <w:t>, but it s</w:t>
       </w:r>
       <w:r>
         <w:rPr>
@@ -7187,27 +7243,7 @@
                 <w:sz w:val="20"/>
                 <w:szCs w:val="20"/>
               </w:rPr>
-              <w:t xml:space="preserve">Dutta &amp; </w:t>
-            </w:r>
-            <w:proofErr w:type="spellStart"/>
-            <w:r>
-              <w:rPr>
-                <w:rFonts w:ascii="Arial" w:hAnsi="Arial" w:cs="Arial"/>
-                <w:color w:val="000000" w:themeColor="text1"/>
-                <w:sz w:val="20"/>
-                <w:szCs w:val="20"/>
-              </w:rPr>
-              <w:t>Adsule</w:t>
-            </w:r>
-            <w:proofErr w:type="spellEnd"/>
-            <w:r>
-              <w:rPr>
-                <w:rFonts w:ascii="Arial" w:hAnsi="Arial" w:cs="Arial"/>
-                <w:color w:val="000000" w:themeColor="text1"/>
-                <w:sz w:val="20"/>
-                <w:szCs w:val="20"/>
-              </w:rPr>
-              <w:t xml:space="preserve"> (2025)</w:t>
+              <w:t>Dutta &amp; Adsule (2025)</w:t>
             </w:r>
           </w:p>
         </w:tc>
@@ -7283,7 +7319,6 @@
                 <w:szCs w:val="20"/>
               </w:rPr>
             </w:pPr>
-            <w:proofErr w:type="spellStart"/>
             <w:r>
               <w:rPr>
                 <w:rFonts w:ascii="Arial" w:hAnsi="Arial" w:cs="Arial"/>
@@ -7291,17 +7326,7 @@
                 <w:sz w:val="20"/>
                 <w:szCs w:val="20"/>
               </w:rPr>
-              <w:t>Lup</w:t>
-            </w:r>
-            <w:proofErr w:type="spellEnd"/>
-            <w:r>
-              <w:rPr>
-                <w:rFonts w:ascii="Arial" w:hAnsi="Arial" w:cs="Arial"/>
-                <w:color w:val="000000" w:themeColor="text1"/>
-                <w:sz w:val="20"/>
-                <w:szCs w:val="20"/>
-              </w:rPr>
-              <w:t xml:space="preserve"> and Canonico (2024)</w:t>
+              <w:t>Lup and Canonico (2024)</w:t>
             </w:r>
           </w:p>
         </w:tc>
@@ -11364,59 +11389,13 @@
           <w:szCs w:val="20"/>
         </w:rPr>
       </w:pPr>
-      <w:proofErr w:type="spellStart"/>
-      <w:r>
-        <w:rPr>
-          <w:rFonts w:ascii="Arial" w:hAnsi="Arial" w:cs="Arial"/>
-          <w:sz w:val="20"/>
-          <w:szCs w:val="20"/>
-        </w:rPr>
-        <w:t>Chilunjika</w:t>
-      </w:r>
-      <w:proofErr w:type="spellEnd"/>
-      <w:r>
-        <w:rPr>
-          <w:rFonts w:ascii="Arial" w:hAnsi="Arial" w:cs="Arial"/>
-          <w:sz w:val="20"/>
-          <w:szCs w:val="20"/>
-        </w:rPr>
-        <w:t xml:space="preserve">, A., </w:t>
-      </w:r>
-      <w:proofErr w:type="spellStart"/>
-      <w:r>
-        <w:rPr>
-          <w:rFonts w:ascii="Arial" w:hAnsi="Arial" w:cs="Arial"/>
-          <w:sz w:val="20"/>
-          <w:szCs w:val="20"/>
-        </w:rPr>
-        <w:t>Intauno</w:t>
-      </w:r>
-      <w:proofErr w:type="spellEnd"/>
-      <w:r>
-        <w:rPr>
-          <w:rFonts w:ascii="Arial" w:hAnsi="Arial" w:cs="Arial"/>
-          <w:sz w:val="20"/>
-          <w:szCs w:val="20"/>
-        </w:rPr>
-        <w:t xml:space="preserve">, K. &amp; </w:t>
-      </w:r>
-      <w:proofErr w:type="spellStart"/>
-      <w:r>
-        <w:rPr>
-          <w:rFonts w:ascii="Arial" w:hAnsi="Arial" w:cs="Arial"/>
-          <w:sz w:val="20"/>
-          <w:szCs w:val="20"/>
-        </w:rPr>
-        <w:t>Chilunjika</w:t>
-      </w:r>
-      <w:proofErr w:type="spellEnd"/>
-      <w:r>
-        <w:rPr>
-          <w:rFonts w:ascii="Arial" w:hAnsi="Arial" w:cs="Arial"/>
-          <w:sz w:val="20"/>
-          <w:szCs w:val="20"/>
-        </w:rPr>
-        <w:t xml:space="preserve">, S.R. (2022) “Artificial intelligence and public sector human resource management in South Africa: Opportunities, challenges and prospects,” </w:t>
+      <w:r>
+        <w:rPr>
+          <w:rFonts w:ascii="Arial" w:hAnsi="Arial" w:cs="Arial"/>
+          <w:sz w:val="20"/>
+          <w:szCs w:val="20"/>
+        </w:rPr>
+        <w:t xml:space="preserve">Chilunjika, A., Intauno, K. &amp; Chilunjika, S.R. (2022) “Artificial intelligence and public sector human resource management in South Africa: Opportunities, challenges and prospects,” </w:t>
       </w:r>
       <w:r>
         <w:rPr>
@@ -11644,25 +11623,7 @@
           <w:sz w:val="20"/>
           <w:szCs w:val="20"/>
         </w:rPr>
-        <w:t xml:space="preserve">Depp, C.A. and </w:t>
-      </w:r>
-      <w:proofErr w:type="spellStart"/>
-      <w:r>
-        <w:rPr>
-          <w:rFonts w:ascii="Arial" w:hAnsi="Arial" w:cs="Arial"/>
-          <w:sz w:val="20"/>
-          <w:szCs w:val="20"/>
-        </w:rPr>
-        <w:t>Jeste</w:t>
-      </w:r>
-      <w:proofErr w:type="spellEnd"/>
-      <w:r>
-        <w:rPr>
-          <w:rFonts w:ascii="Arial" w:hAnsi="Arial" w:cs="Arial"/>
-          <w:sz w:val="20"/>
-          <w:szCs w:val="20"/>
-        </w:rPr>
-        <w:t xml:space="preserve">, D.V. (2004), </w:t>
+        <w:t xml:space="preserve">Depp, C.A. and Jeste, D.V. (2004), </w:t>
       </w:r>
       <w:proofErr w:type="gramStart"/>
       <w:r>
@@ -11762,25 +11723,7 @@
           <w:sz w:val="20"/>
           <w:szCs w:val="20"/>
         </w:rPr>
-        <w:t>Dutta D, </w:t>
-      </w:r>
-      <w:proofErr w:type="spellStart"/>
-      <w:r>
-        <w:rPr>
-          <w:rFonts w:ascii="Arial" w:hAnsi="Arial" w:cs="Arial"/>
-          <w:sz w:val="20"/>
-          <w:szCs w:val="20"/>
-        </w:rPr>
-        <w:t>Adsule</w:t>
-      </w:r>
-      <w:proofErr w:type="spellEnd"/>
-      <w:r>
-        <w:rPr>
-          <w:rFonts w:ascii="Arial" w:hAnsi="Arial" w:cs="Arial"/>
-          <w:sz w:val="20"/>
-          <w:szCs w:val="20"/>
-        </w:rPr>
-        <w:t xml:space="preserve"> R (2025;) "Machines/humans agentic impacts on recruitment and selection practices across organizational contexts". </w:t>
+        <w:t>Dutta D, Adsule R (2025;) "Machines/humans agentic impacts on recruitment and selection practices across organizational contexts". </w:t>
       </w:r>
       <w:r>
         <w:rPr>
@@ -12013,25 +11956,7 @@
           <w:sz w:val="20"/>
           <w:szCs w:val="20"/>
         </w:rPr>
-        <w:t xml:space="preserve">Jones, D.A., </w:t>
-      </w:r>
-      <w:proofErr w:type="spellStart"/>
-      <w:r>
-        <w:rPr>
-          <w:rFonts w:ascii="Arial" w:hAnsi="Arial" w:cs="Arial"/>
-          <w:sz w:val="20"/>
-          <w:szCs w:val="20"/>
-        </w:rPr>
-        <w:t>Willness</w:t>
-      </w:r>
-      <w:proofErr w:type="spellEnd"/>
-      <w:r>
-        <w:rPr>
-          <w:rFonts w:ascii="Arial" w:hAnsi="Arial" w:cs="Arial"/>
-          <w:sz w:val="20"/>
-          <w:szCs w:val="20"/>
-        </w:rPr>
-        <w:t>, C.R. and Madey, S. (2014) ‘Why Are Job Seekers Attracted by Corporate Social Performance? Experimental and Field Tests of Three Signal-Based Mechanisms’, </w:t>
+        <w:t>Jones, D.A., Willness, C.R. and Madey, S. (2014) ‘Why Are Job Seekers Attracted by Corporate Social Performance? Experimental and Field Tests of Three Signal-Based Mechanisms’, </w:t>
       </w:r>
       <w:r>
         <w:rPr>
@@ -12091,25 +12016,7 @@
           <w:sz w:val="20"/>
           <w:szCs w:val="20"/>
         </w:rPr>
-        <w:t xml:space="preserve">Khan, M. H., </w:t>
-      </w:r>
-      <w:proofErr w:type="spellStart"/>
-      <w:r>
-        <w:rPr>
-          <w:rFonts w:ascii="Arial" w:hAnsi="Arial" w:cs="Arial"/>
-          <w:sz w:val="20"/>
-          <w:szCs w:val="20"/>
-        </w:rPr>
-        <w:t>Grabarski</w:t>
-      </w:r>
-      <w:proofErr w:type="spellEnd"/>
-      <w:r>
-        <w:rPr>
-          <w:rFonts w:ascii="Arial" w:hAnsi="Arial" w:cs="Arial"/>
-          <w:sz w:val="20"/>
-          <w:szCs w:val="20"/>
-        </w:rPr>
-        <w:t xml:space="preserve">, M. K., Ali, M., &amp; Buckmaster, S. (2023). Insights into Creating and Managing an Inclusive Neurodiverse Workplace for Positive Outcomes: A Multistage Theoretical Framework. </w:t>
+        <w:t xml:space="preserve">Khan, M. H., Grabarski, M. K., Ali, M., &amp; Buckmaster, S. (2023). Insights into Creating and Managing an Inclusive Neurodiverse Workplace for Positive Outcomes: A Multistage Theoretical Framework. </w:t>
       </w:r>
       <w:r>
         <w:rPr>
@@ -12242,23 +12149,13 @@
           <w:szCs w:val="20"/>
         </w:rPr>
       </w:pPr>
-      <w:proofErr w:type="spellStart"/>
-      <w:r>
-        <w:rPr>
-          <w:rFonts w:ascii="Arial" w:hAnsi="Arial" w:cs="Arial"/>
-          <w:sz w:val="20"/>
-          <w:szCs w:val="20"/>
-        </w:rPr>
-        <w:t>Lup</w:t>
-      </w:r>
-      <w:proofErr w:type="spellEnd"/>
-      <w:r>
-        <w:rPr>
-          <w:rFonts w:ascii="Arial" w:hAnsi="Arial" w:cs="Arial"/>
-          <w:sz w:val="20"/>
-          <w:szCs w:val="20"/>
-        </w:rPr>
-        <w:t>, D. and Canonico, E. (2024) ‘Bridges and gatekeepers: Employees' willingness to refer qualified candidates on the autism spectrum’, </w:t>
+      <w:r>
+        <w:rPr>
+          <w:rFonts w:ascii="Arial" w:hAnsi="Arial" w:cs="Arial"/>
+          <w:sz w:val="20"/>
+          <w:szCs w:val="20"/>
+        </w:rPr>
+        <w:t xml:space="preserve">Lindgren, S. and Edward Elgar Publishing, publisher (2023) </w:t>
       </w:r>
       <w:r>
         <w:rPr>
@@ -12268,33 +12165,15 @@
           <w:sz w:val="20"/>
           <w:szCs w:val="20"/>
         </w:rPr>
-        <w:t>Human Resource Management</w:t>
-      </w:r>
-      <w:r>
-        <w:rPr>
-          <w:rFonts w:ascii="Arial" w:hAnsi="Arial" w:cs="Arial"/>
-          <w:sz w:val="20"/>
-          <w:szCs w:val="20"/>
-        </w:rPr>
-        <w:t>, </w:t>
-      </w:r>
-      <w:r>
-        <w:rPr>
-          <w:rFonts w:ascii="Arial" w:hAnsi="Arial" w:cs="Arial"/>
-          <w:i/>
-          <w:iCs/>
-          <w:sz w:val="20"/>
-          <w:szCs w:val="20"/>
-        </w:rPr>
-        <w:t>63</w:t>
-      </w:r>
-      <w:r>
-        <w:rPr>
-          <w:rFonts w:ascii="Arial" w:hAnsi="Arial" w:cs="Arial"/>
-          <w:sz w:val="20"/>
-          <w:szCs w:val="20"/>
-        </w:rPr>
-        <w:t>(6), pp.1025-1043</w:t>
+        <w:t>Handbook of Critical Studies of Artificial Intelligence</w:t>
+      </w:r>
+      <w:r>
+        <w:rPr>
+          <w:rFonts w:ascii="Arial" w:hAnsi="Arial" w:cs="Arial"/>
+          <w:sz w:val="20"/>
+          <w:szCs w:val="20"/>
+        </w:rPr>
+        <w:t>. First edition. Edited by S. Lindgren. Northampton: Edward Elgar Publishing.</w:t>
       </w:r>
     </w:p>
     <w:p>
@@ -12316,7 +12195,7 @@
           <w:sz w:val="20"/>
           <w:szCs w:val="20"/>
         </w:rPr>
-        <w:t xml:space="preserve">Miller, H. and Doyle, N. (2025) ‘Signalling a diversity climate: Neurodivergent experiences and perceptions during selection and assessment’, </w:t>
+        <w:t>Lup, D. and Canonico, E. (2024) ‘Bridges and gatekeepers: Employees' willingness to refer qualified candidates on the autism spectrum’, </w:t>
       </w:r>
       <w:r>
         <w:rPr>
@@ -12326,15 +12205,33 @@
           <w:sz w:val="20"/>
           <w:szCs w:val="20"/>
         </w:rPr>
-        <w:t>Journal of occupational and organizational psychology</w:t>
-      </w:r>
-      <w:r>
-        <w:rPr>
-          <w:rFonts w:ascii="Arial" w:hAnsi="Arial" w:cs="Arial"/>
-          <w:sz w:val="20"/>
-          <w:szCs w:val="20"/>
-        </w:rPr>
-        <w:t>, 98(3)</w:t>
+        <w:t>Human Resource Management</w:t>
+      </w:r>
+      <w:r>
+        <w:rPr>
+          <w:rFonts w:ascii="Arial" w:hAnsi="Arial" w:cs="Arial"/>
+          <w:sz w:val="20"/>
+          <w:szCs w:val="20"/>
+        </w:rPr>
+        <w:t>, </w:t>
+      </w:r>
+      <w:r>
+        <w:rPr>
+          <w:rFonts w:ascii="Arial" w:hAnsi="Arial" w:cs="Arial"/>
+          <w:i/>
+          <w:iCs/>
+          <w:sz w:val="20"/>
+          <w:szCs w:val="20"/>
+        </w:rPr>
+        <w:t>63</w:t>
+      </w:r>
+      <w:r>
+        <w:rPr>
+          <w:rFonts w:ascii="Arial" w:hAnsi="Arial" w:cs="Arial"/>
+          <w:sz w:val="20"/>
+          <w:szCs w:val="20"/>
+        </w:rPr>
+        <w:t>(6), pp.1025-1043</w:t>
       </w:r>
     </w:p>
     <w:p>
@@ -12356,25 +12253,47 @@
           <w:sz w:val="20"/>
           <w:szCs w:val="20"/>
         </w:rPr>
-        <w:t xml:space="preserve">Mirowska, A. and </w:t>
-      </w:r>
-      <w:proofErr w:type="spellStart"/>
-      <w:r>
-        <w:rPr>
-          <w:rFonts w:ascii="Arial" w:hAnsi="Arial" w:cs="Arial"/>
-          <w:sz w:val="20"/>
-          <w:szCs w:val="20"/>
-        </w:rPr>
-        <w:t>Arsenyan</w:t>
-      </w:r>
-      <w:proofErr w:type="spellEnd"/>
-      <w:r>
-        <w:rPr>
-          <w:rFonts w:ascii="Arial" w:hAnsi="Arial" w:cs="Arial"/>
-          <w:sz w:val="20"/>
-          <w:szCs w:val="20"/>
-        </w:rPr>
-        <w:t>, J. (2025), A Bridge Too Far: Signalling Effects of Artificial Intelligence Evaluation of Job Interviews. International Journal of Selection and Assessment, 33: e70008. </w:t>
+        <w:t xml:space="preserve">Miller, H. and Doyle, N. (2025) ‘Signalling a diversity climate: Neurodivergent experiences and perceptions during selection and assessment’, </w:t>
+      </w:r>
+      <w:r>
+        <w:rPr>
+          <w:rFonts w:ascii="Arial" w:hAnsi="Arial" w:cs="Arial"/>
+          <w:i/>
+          <w:iCs/>
+          <w:sz w:val="20"/>
+          <w:szCs w:val="20"/>
+        </w:rPr>
+        <w:t>Journal of occupational and organizational psychology</w:t>
+      </w:r>
+      <w:r>
+        <w:rPr>
+          <w:rFonts w:ascii="Arial" w:hAnsi="Arial" w:cs="Arial"/>
+          <w:sz w:val="20"/>
+          <w:szCs w:val="20"/>
+        </w:rPr>
+        <w:t>, 98(3)</w:t>
+      </w:r>
+    </w:p>
+    <w:p>
+      <w:pPr>
+        <w:tabs>
+          <w:tab w:val="left" w:pos="1560"/>
+        </w:tabs>
+        <w:ind w:left="510" w:hanging="510"/>
+        <w:jc w:val="both"/>
+        <w:rPr>
+          <w:rFonts w:ascii="Arial" w:hAnsi="Arial" w:cs="Arial"/>
+          <w:sz w:val="20"/>
+          <w:szCs w:val="20"/>
+        </w:rPr>
+      </w:pPr>
+      <w:r>
+        <w:rPr>
+          <w:rFonts w:ascii="Arial" w:hAnsi="Arial" w:cs="Arial"/>
+          <w:sz w:val="20"/>
+          <w:szCs w:val="20"/>
+        </w:rPr>
+        <w:t>Mirowska, A. and Arsenyan, J. (2025), A Bridge Too Far: Signalling Effects of Artificial Intelligence Evaluation of Job Interviews. International Journal of Selection and Assessment, 33: e70008. </w:t>
       </w:r>
       <w:hyperlink r:id="rId23" w:history="1">
         <w:r>
@@ -15956,7 +15875,6 @@
   <w:style w:type="character" w:default="1" w:styleId="DefaultParagraphFont">
     <w:name w:val="Default Paragraph Font"/>
     <w:uiPriority w:val="1"/>
-    <w:semiHidden/>
     <w:unhideWhenUsed/>
   </w:style>
   <w:style w:type="table" w:default="1" w:styleId="TableNormal">

</xml_diff>

<commit_message>
Removal of ASI and context engineering entry
</commit_message>
<xml_diff>
--- a/FBL-PhD-research-proposal.docx
+++ b/FBL-PhD-research-proposal.docx
@@ -146,23 +146,7 @@
           <w:sz w:val="28"/>
           <w:szCs w:val="28"/>
         </w:rPr>
-        <w:t xml:space="preserve"> A</w:t>
-      </w:r>
-      <w:r>
-        <w:rPr>
-          <w:rFonts w:ascii="Arial" w:hAnsi="Arial" w:cs="Arial"/>
-          <w:sz w:val="28"/>
-          <w:szCs w:val="28"/>
-        </w:rPr>
-        <w:t>S</w:t>
-      </w:r>
-      <w:r>
-        <w:rPr>
-          <w:rFonts w:ascii="Arial" w:hAnsi="Arial" w:cs="Arial"/>
-          <w:sz w:val="28"/>
-          <w:szCs w:val="28"/>
-        </w:rPr>
-        <w:t xml:space="preserve">I </w:t>
+        <w:t xml:space="preserve"> AI </w:t>
       </w:r>
       <w:r>
         <w:rPr>
@@ -465,7 +449,7 @@
           <w:sz w:val="20"/>
           <w:szCs w:val="20"/>
         </w:rPr>
-        <w:t>Superi</w:t>
+        <w:t>I</w:t>
       </w:r>
       <w:r>
         <w:rPr>
@@ -474,14 +458,6 @@
           <w:szCs w:val="20"/>
         </w:rPr>
         <w:t>ntelligence (or ‘A</w:t>
-      </w:r>
-      <w:r>
-        <w:rPr>
-          <w:rFonts w:ascii="Arial" w:hAnsi="Arial" w:cs="Arial"/>
-          <w:sz w:val="20"/>
-          <w:szCs w:val="20"/>
-        </w:rPr>
-        <w:t>S</w:t>
       </w:r>
       <w:r>
         <w:rPr>
@@ -2324,7 +2300,7 @@
           <w:sz w:val="20"/>
           <w:szCs w:val="20"/>
         </w:rPr>
-        <w:t xml:space="preserve"> and the result itself (i.e. ‘ASI’) has been deemed a threat to society by the author of a recent House of Lords Library report</w:t>
+        <w:t xml:space="preserve"> and the result itself has been deemed a threat to society by the author of a recent House of Lords Library report</w:t>
       </w:r>
       <w:r>
         <w:rPr>
@@ -2510,15 +2486,33 @@
           <w:sz w:val="20"/>
           <w:szCs w:val="20"/>
         </w:rPr>
-        <w:t>proponents who advocate for AGI or its variant ASI (Artificial Superintelligence)</w:t>
-      </w:r>
-      <w:r>
-        <w:rPr>
-          <w:rFonts w:ascii="Arial" w:hAnsi="Arial" w:cs="Arial"/>
-          <w:sz w:val="20"/>
-          <w:szCs w:val="20"/>
-        </w:rPr>
-        <w:t>, and on the other there are naysayers.</w:t>
+        <w:t xml:space="preserve">proponents who advocate for AGI </w:t>
+      </w:r>
+      <w:r>
+        <w:rPr>
+          <w:rFonts w:ascii="Arial" w:hAnsi="Arial" w:cs="Arial"/>
+          <w:sz w:val="20"/>
+          <w:szCs w:val="20"/>
+        </w:rPr>
+        <w:t xml:space="preserve">and on the </w:t>
+      </w:r>
+      <w:proofErr w:type="gramStart"/>
+      <w:r>
+        <w:rPr>
+          <w:rFonts w:ascii="Arial" w:hAnsi="Arial" w:cs="Arial"/>
+          <w:sz w:val="20"/>
+          <w:szCs w:val="20"/>
+        </w:rPr>
+        <w:t>other</w:t>
+      </w:r>
+      <w:proofErr w:type="gramEnd"/>
+      <w:r>
+        <w:rPr>
+          <w:rFonts w:ascii="Arial" w:hAnsi="Arial" w:cs="Arial"/>
+          <w:sz w:val="20"/>
+          <w:szCs w:val="20"/>
+        </w:rPr>
+        <w:t xml:space="preserve"> there are naysayers.</w:t>
       </w:r>
     </w:p>
     <w:p>
@@ -4855,8 +4849,8 @@
         </w:rPr>
       </w:pPr>
       <w:bookmarkStart w:id="21" w:name="_Toc216632807"/>
-      <w:bookmarkStart w:id="22" w:name="_Toc215736438"/>
-      <w:bookmarkStart w:id="23" w:name="_Toc221004907"/>
+      <w:bookmarkStart w:id="22" w:name="_Toc221004907"/>
+      <w:bookmarkStart w:id="23" w:name="_Toc215736438"/>
       <w:r>
         <w:rPr>
           <w:rStyle w:val="Strong"/>
@@ -4888,7 +4882,7 @@
         </w:rPr>
         <w:t xml:space="preserve"> – Literature Review</w:t>
       </w:r>
-      <w:bookmarkEnd w:id="23"/>
+      <w:bookmarkEnd w:id="22"/>
     </w:p>
     <w:p>
       <w:pPr>
@@ -5355,7 +5349,25 @@
           <w:sz w:val="20"/>
           <w:szCs w:val="20"/>
         </w:rPr>
-        <w:t xml:space="preserve"> (Depp and Jeste, 2004)</w:t>
+        <w:t xml:space="preserve"> (Depp and </w:t>
+      </w:r>
+      <w:proofErr w:type="spellStart"/>
+      <w:r>
+        <w:rPr>
+          <w:rFonts w:ascii="Arial" w:hAnsi="Arial" w:cs="Arial"/>
+          <w:sz w:val="20"/>
+          <w:szCs w:val="20"/>
+        </w:rPr>
+        <w:t>Jeste</w:t>
+      </w:r>
+      <w:proofErr w:type="spellEnd"/>
+      <w:r>
+        <w:rPr>
+          <w:rFonts w:ascii="Arial" w:hAnsi="Arial" w:cs="Arial"/>
+          <w:sz w:val="20"/>
+          <w:szCs w:val="20"/>
+        </w:rPr>
+        <w:t>, 2004)</w:t>
       </w:r>
       <w:r>
         <w:rPr>
@@ -5419,7 +5431,23 @@
           <w:sz w:val="20"/>
           <w:szCs w:val="20"/>
         </w:rPr>
-        <w:t xml:space="preserve">ntelligence and employment </w:t>
+        <w:t xml:space="preserve">ntelligence </w:t>
+      </w:r>
+      <w:r>
+        <w:rPr>
+          <w:rFonts w:ascii="Arial" w:hAnsi="Arial" w:cs="Arial"/>
+          <w:sz w:val="20"/>
+          <w:szCs w:val="20"/>
+        </w:rPr>
+        <w:t xml:space="preserve">(“AI”) </w:t>
+      </w:r>
+      <w:r>
+        <w:rPr>
+          <w:rFonts w:ascii="Arial" w:hAnsi="Arial" w:cs="Arial"/>
+          <w:sz w:val="20"/>
+          <w:szCs w:val="20"/>
+        </w:rPr>
+        <w:t xml:space="preserve">and employment </w:t>
       </w:r>
       <w:r>
         <w:rPr>
@@ -5459,7 +5487,25 @@
           <w:sz w:val="20"/>
           <w:szCs w:val="20"/>
         </w:rPr>
-        <w:t xml:space="preserve">Mirowska and Arsenyan, 2025; </w:t>
+        <w:t xml:space="preserve">Mirowska and </w:t>
+      </w:r>
+      <w:proofErr w:type="spellStart"/>
+      <w:r>
+        <w:rPr>
+          <w:rFonts w:ascii="Arial" w:hAnsi="Arial" w:cs="Arial"/>
+          <w:sz w:val="20"/>
+          <w:szCs w:val="20"/>
+        </w:rPr>
+        <w:t>Arsenyan</w:t>
+      </w:r>
+      <w:proofErr w:type="spellEnd"/>
+      <w:r>
+        <w:rPr>
+          <w:rFonts w:ascii="Arial" w:hAnsi="Arial" w:cs="Arial"/>
+          <w:sz w:val="20"/>
+          <w:szCs w:val="20"/>
+        </w:rPr>
+        <w:t xml:space="preserve">, 2025; </w:t>
       </w:r>
       <w:r>
         <w:rPr>
@@ -5517,47 +5563,7 @@
           <w:sz w:val="20"/>
           <w:szCs w:val="20"/>
         </w:rPr>
-        <w:t xml:space="preserve">. Artificial </w:t>
-      </w:r>
-      <w:r>
-        <w:rPr>
-          <w:rFonts w:ascii="Arial" w:hAnsi="Arial" w:cs="Arial"/>
-          <w:sz w:val="20"/>
-          <w:szCs w:val="20"/>
-        </w:rPr>
-        <w:t>S</w:t>
-      </w:r>
-      <w:r>
-        <w:rPr>
-          <w:rFonts w:ascii="Arial" w:hAnsi="Arial" w:cs="Arial"/>
-          <w:sz w:val="20"/>
-          <w:szCs w:val="20"/>
-        </w:rPr>
-        <w:t>uper</w:t>
-      </w:r>
-      <w:r>
-        <w:rPr>
-          <w:rFonts w:ascii="Arial" w:hAnsi="Arial" w:cs="Arial"/>
-          <w:sz w:val="20"/>
-          <w:szCs w:val="20"/>
-        </w:rPr>
-        <w:t>intelligence or “A</w:t>
-      </w:r>
-      <w:r>
-        <w:rPr>
-          <w:rFonts w:ascii="Arial" w:hAnsi="Arial" w:cs="Arial"/>
-          <w:sz w:val="20"/>
-          <w:szCs w:val="20"/>
-        </w:rPr>
-        <w:t>S</w:t>
-      </w:r>
-      <w:r>
-        <w:rPr>
-          <w:rFonts w:ascii="Arial" w:hAnsi="Arial" w:cs="Arial"/>
-          <w:sz w:val="20"/>
-          <w:szCs w:val="20"/>
-        </w:rPr>
-        <w:t>I” has</w:t>
+        <w:t>. AI has</w:t>
       </w:r>
       <w:r>
         <w:rPr>
@@ -5809,6 +5815,7 @@
         </w:rPr>
         <w:t xml:space="preserve">an open access paper by </w:t>
       </w:r>
+      <w:proofErr w:type="spellStart"/>
       <w:r>
         <w:rPr>
           <w:rFonts w:ascii="Arial" w:hAnsi="Arial" w:cs="Arial"/>
@@ -5817,6 +5824,7 @@
         </w:rPr>
         <w:t>Chilunjika</w:t>
       </w:r>
+      <w:proofErr w:type="spellEnd"/>
       <w:r>
         <w:rPr>
           <w:rFonts w:ascii="Arial" w:hAnsi="Arial" w:cs="Arial"/>
@@ -5865,7 +5873,25 @@
           <w:sz w:val="20"/>
           <w:szCs w:val="20"/>
         </w:rPr>
-        <w:t xml:space="preserve"> Chilunjika, </w:t>
+        <w:t xml:space="preserve"> </w:t>
+      </w:r>
+      <w:proofErr w:type="spellStart"/>
+      <w:r>
+        <w:rPr>
+          <w:rFonts w:ascii="Arial" w:hAnsi="Arial" w:cs="Arial"/>
+          <w:sz w:val="20"/>
+          <w:szCs w:val="20"/>
+        </w:rPr>
+        <w:t>Chilunjika</w:t>
+      </w:r>
+      <w:proofErr w:type="spellEnd"/>
+      <w:r>
+        <w:rPr>
+          <w:rFonts w:ascii="Arial" w:hAnsi="Arial" w:cs="Arial"/>
+          <w:sz w:val="20"/>
+          <w:szCs w:val="20"/>
+        </w:rPr>
+        <w:t xml:space="preserve">, </w:t>
       </w:r>
       <w:r>
         <w:rPr>
@@ -6018,15 +6044,111 @@
           <w:sz w:val="20"/>
           <w:szCs w:val="20"/>
         </w:rPr>
-        <w:t xml:space="preserve">One of the central propositions of this paper is in regard to a model which the author built and tested over a 3-week period. Whilst implementing </w:t>
-      </w:r>
-      <w:r>
-        <w:rPr>
-          <w:rFonts w:ascii="Arial" w:hAnsi="Arial" w:cs="Arial"/>
-          <w:sz w:val="20"/>
-          <w:szCs w:val="20"/>
-        </w:rPr>
-        <w:t xml:space="preserve">Gemini 3.5, Claude Haiku 3.5 and </w:t>
+        <w:t xml:space="preserve">One of the central propositions of this paper is in regard to a </w:t>
+      </w:r>
+      <w:r>
+        <w:rPr>
+          <w:rFonts w:ascii="Arial" w:hAnsi="Arial" w:cs="Arial"/>
+          <w:sz w:val="20"/>
+          <w:szCs w:val="20"/>
+        </w:rPr>
+        <w:t>context engineering exercise</w:t>
+      </w:r>
+      <w:r>
+        <w:rPr>
+          <w:rFonts w:ascii="Arial" w:hAnsi="Arial" w:cs="Arial"/>
+          <w:sz w:val="20"/>
+          <w:szCs w:val="20"/>
+        </w:rPr>
+        <w:t xml:space="preserve"> which the author</w:t>
+      </w:r>
+      <w:r>
+        <w:rPr>
+          <w:rFonts w:ascii="Arial" w:hAnsi="Arial" w:cs="Arial"/>
+          <w:sz w:val="20"/>
+          <w:szCs w:val="20"/>
+        </w:rPr>
+        <w:t xml:space="preserve"> developed</w:t>
+      </w:r>
+      <w:r>
+        <w:rPr>
+          <w:rFonts w:ascii="Arial" w:hAnsi="Arial" w:cs="Arial"/>
+          <w:sz w:val="20"/>
+          <w:szCs w:val="20"/>
+        </w:rPr>
+        <w:t xml:space="preserve"> and tested over a 3-week period. Whilst implementing </w:t>
+      </w:r>
+      <w:r>
+        <w:rPr>
+          <w:rFonts w:ascii="Arial" w:hAnsi="Arial" w:cs="Arial"/>
+          <w:sz w:val="20"/>
+          <w:szCs w:val="20"/>
+        </w:rPr>
+        <w:t xml:space="preserve">3 key models 1) </w:t>
+      </w:r>
+      <w:r>
+        <w:rPr>
+          <w:rFonts w:ascii="Arial" w:hAnsi="Arial" w:cs="Arial"/>
+          <w:sz w:val="20"/>
+          <w:szCs w:val="20"/>
+        </w:rPr>
+        <w:t xml:space="preserve">Gemini 3.5, </w:t>
+      </w:r>
+      <w:r>
+        <w:rPr>
+          <w:rFonts w:ascii="Arial" w:hAnsi="Arial" w:cs="Arial"/>
+          <w:sz w:val="20"/>
+          <w:szCs w:val="20"/>
+        </w:rPr>
+        <w:t xml:space="preserve">2) </w:t>
+      </w:r>
+      <w:r>
+        <w:rPr>
+          <w:rFonts w:ascii="Arial" w:hAnsi="Arial" w:cs="Arial"/>
+          <w:sz w:val="20"/>
+          <w:szCs w:val="20"/>
+        </w:rPr>
+        <w:t>Claude Haiku 3.5</w:t>
+      </w:r>
+      <w:r>
+        <w:rPr>
+          <w:rFonts w:ascii="Arial" w:hAnsi="Arial" w:cs="Arial"/>
+          <w:sz w:val="20"/>
+          <w:szCs w:val="20"/>
+        </w:rPr>
+        <w:t>,</w:t>
+      </w:r>
+      <w:r>
+        <w:rPr>
+          <w:rFonts w:ascii="Arial" w:hAnsi="Arial" w:cs="Arial"/>
+          <w:sz w:val="20"/>
+          <w:szCs w:val="20"/>
+        </w:rPr>
+        <w:t xml:space="preserve"> and </w:t>
+      </w:r>
+      <w:r>
+        <w:rPr>
+          <w:rFonts w:ascii="Arial" w:hAnsi="Arial" w:cs="Arial"/>
+          <w:sz w:val="20"/>
+          <w:szCs w:val="20"/>
+        </w:rPr>
+        <w:t>finally</w:t>
+      </w:r>
+      <w:r>
+        <w:rPr>
+          <w:rFonts w:ascii="Arial" w:hAnsi="Arial" w:cs="Arial"/>
+          <w:sz w:val="20"/>
+          <w:szCs w:val="20"/>
+        </w:rPr>
+        <w:t>,</w:t>
+      </w:r>
+      <w:r>
+        <w:rPr>
+          <w:rFonts w:ascii="Arial" w:hAnsi="Arial" w:cs="Arial"/>
+          <w:sz w:val="20"/>
+          <w:szCs w:val="20"/>
+        </w:rPr>
+        <w:t xml:space="preserve"> 3) </w:t>
       </w:r>
       <w:r>
         <w:rPr>
@@ -7243,7 +7365,27 @@
                 <w:sz w:val="20"/>
                 <w:szCs w:val="20"/>
               </w:rPr>
-              <w:t>Dutta &amp; Adsule (2025)</w:t>
+              <w:t xml:space="preserve">Dutta &amp; </w:t>
+            </w:r>
+            <w:proofErr w:type="spellStart"/>
+            <w:r>
+              <w:rPr>
+                <w:rFonts w:ascii="Arial" w:hAnsi="Arial" w:cs="Arial"/>
+                <w:color w:val="000000" w:themeColor="text1"/>
+                <w:sz w:val="20"/>
+                <w:szCs w:val="20"/>
+              </w:rPr>
+              <w:t>Adsule</w:t>
+            </w:r>
+            <w:proofErr w:type="spellEnd"/>
+            <w:r>
+              <w:rPr>
+                <w:rFonts w:ascii="Arial" w:hAnsi="Arial" w:cs="Arial"/>
+                <w:color w:val="000000" w:themeColor="text1"/>
+                <w:sz w:val="20"/>
+                <w:szCs w:val="20"/>
+              </w:rPr>
+              <w:t xml:space="preserve"> (2025)</w:t>
             </w:r>
           </w:p>
         </w:tc>
@@ -7319,6 +7461,7 @@
                 <w:szCs w:val="20"/>
               </w:rPr>
             </w:pPr>
+            <w:proofErr w:type="spellStart"/>
             <w:r>
               <w:rPr>
                 <w:rFonts w:ascii="Arial" w:hAnsi="Arial" w:cs="Arial"/>
@@ -7326,7 +7469,17 @@
                 <w:sz w:val="20"/>
                 <w:szCs w:val="20"/>
               </w:rPr>
-              <w:t>Lup and Canonico (2024)</w:t>
+              <w:t>Lup</w:t>
+            </w:r>
+            <w:proofErr w:type="spellEnd"/>
+            <w:r>
+              <w:rPr>
+                <w:rFonts w:ascii="Arial" w:hAnsi="Arial" w:cs="Arial"/>
+                <w:color w:val="000000" w:themeColor="text1"/>
+                <w:sz w:val="20"/>
+                <w:szCs w:val="20"/>
+              </w:rPr>
+              <w:t xml:space="preserve"> and Canonico (2024)</w:t>
             </w:r>
           </w:p>
         </w:tc>
@@ -11196,7 +11349,7 @@
         </w:rPr>
         <w:t>References</w:t>
       </w:r>
-      <w:bookmarkEnd w:id="22"/>
+      <w:bookmarkEnd w:id="23"/>
     </w:p>
     <w:p>
       <w:pPr>
@@ -11389,13 +11542,59 @@
           <w:szCs w:val="20"/>
         </w:rPr>
       </w:pPr>
-      <w:r>
-        <w:rPr>
-          <w:rFonts w:ascii="Arial" w:hAnsi="Arial" w:cs="Arial"/>
-          <w:sz w:val="20"/>
-          <w:szCs w:val="20"/>
-        </w:rPr>
-        <w:t xml:space="preserve">Chilunjika, A., Intauno, K. &amp; Chilunjika, S.R. (2022) “Artificial intelligence and public sector human resource management in South Africa: Opportunities, challenges and prospects,” </w:t>
+      <w:proofErr w:type="spellStart"/>
+      <w:r>
+        <w:rPr>
+          <w:rFonts w:ascii="Arial" w:hAnsi="Arial" w:cs="Arial"/>
+          <w:sz w:val="20"/>
+          <w:szCs w:val="20"/>
+        </w:rPr>
+        <w:t>Chilunjika</w:t>
+      </w:r>
+      <w:proofErr w:type="spellEnd"/>
+      <w:r>
+        <w:rPr>
+          <w:rFonts w:ascii="Arial" w:hAnsi="Arial" w:cs="Arial"/>
+          <w:sz w:val="20"/>
+          <w:szCs w:val="20"/>
+        </w:rPr>
+        <w:t xml:space="preserve">, A., </w:t>
+      </w:r>
+      <w:proofErr w:type="spellStart"/>
+      <w:r>
+        <w:rPr>
+          <w:rFonts w:ascii="Arial" w:hAnsi="Arial" w:cs="Arial"/>
+          <w:sz w:val="20"/>
+          <w:szCs w:val="20"/>
+        </w:rPr>
+        <w:t>Intauno</w:t>
+      </w:r>
+      <w:proofErr w:type="spellEnd"/>
+      <w:r>
+        <w:rPr>
+          <w:rFonts w:ascii="Arial" w:hAnsi="Arial" w:cs="Arial"/>
+          <w:sz w:val="20"/>
+          <w:szCs w:val="20"/>
+        </w:rPr>
+        <w:t xml:space="preserve">, K. &amp; </w:t>
+      </w:r>
+      <w:proofErr w:type="spellStart"/>
+      <w:r>
+        <w:rPr>
+          <w:rFonts w:ascii="Arial" w:hAnsi="Arial" w:cs="Arial"/>
+          <w:sz w:val="20"/>
+          <w:szCs w:val="20"/>
+        </w:rPr>
+        <w:t>Chilunjika</w:t>
+      </w:r>
+      <w:proofErr w:type="spellEnd"/>
+      <w:r>
+        <w:rPr>
+          <w:rFonts w:ascii="Arial" w:hAnsi="Arial" w:cs="Arial"/>
+          <w:sz w:val="20"/>
+          <w:szCs w:val="20"/>
+        </w:rPr>
+        <w:t xml:space="preserve">, S.R. (2022) “Artificial intelligence and public sector human resource management in South Africa: Opportunities, challenges and prospects,” </w:t>
       </w:r>
       <w:r>
         <w:rPr>
@@ -11623,7 +11822,25 @@
           <w:sz w:val="20"/>
           <w:szCs w:val="20"/>
         </w:rPr>
-        <w:t xml:space="preserve">Depp, C.A. and Jeste, D.V. (2004), </w:t>
+        <w:t xml:space="preserve">Depp, C.A. and </w:t>
+      </w:r>
+      <w:proofErr w:type="spellStart"/>
+      <w:r>
+        <w:rPr>
+          <w:rFonts w:ascii="Arial" w:hAnsi="Arial" w:cs="Arial"/>
+          <w:sz w:val="20"/>
+          <w:szCs w:val="20"/>
+        </w:rPr>
+        <w:t>Jeste</w:t>
+      </w:r>
+      <w:proofErr w:type="spellEnd"/>
+      <w:r>
+        <w:rPr>
+          <w:rFonts w:ascii="Arial" w:hAnsi="Arial" w:cs="Arial"/>
+          <w:sz w:val="20"/>
+          <w:szCs w:val="20"/>
+        </w:rPr>
+        <w:t xml:space="preserve">, D.V. (2004), </w:t>
       </w:r>
       <w:proofErr w:type="gramStart"/>
       <w:r>
@@ -11723,7 +11940,25 @@
           <w:sz w:val="20"/>
           <w:szCs w:val="20"/>
         </w:rPr>
-        <w:t>Dutta D, Adsule R (2025;) "Machines/humans agentic impacts on recruitment and selection practices across organizational contexts". </w:t>
+        <w:t>Dutta D, </w:t>
+      </w:r>
+      <w:proofErr w:type="spellStart"/>
+      <w:r>
+        <w:rPr>
+          <w:rFonts w:ascii="Arial" w:hAnsi="Arial" w:cs="Arial"/>
+          <w:sz w:val="20"/>
+          <w:szCs w:val="20"/>
+        </w:rPr>
+        <w:t>Adsule</w:t>
+      </w:r>
+      <w:proofErr w:type="spellEnd"/>
+      <w:r>
+        <w:rPr>
+          <w:rFonts w:ascii="Arial" w:hAnsi="Arial" w:cs="Arial"/>
+          <w:sz w:val="20"/>
+          <w:szCs w:val="20"/>
+        </w:rPr>
+        <w:t xml:space="preserve"> R (2025;) "Machines/humans agentic impacts on recruitment and selection practices across organizational contexts". </w:t>
       </w:r>
       <w:r>
         <w:rPr>
@@ -11956,7 +12191,25 @@
           <w:sz w:val="20"/>
           <w:szCs w:val="20"/>
         </w:rPr>
-        <w:t>Jones, D.A., Willness, C.R. and Madey, S. (2014) ‘Why Are Job Seekers Attracted by Corporate Social Performance? Experimental and Field Tests of Three Signal-Based Mechanisms’, </w:t>
+        <w:t xml:space="preserve">Jones, D.A., </w:t>
+      </w:r>
+      <w:proofErr w:type="spellStart"/>
+      <w:r>
+        <w:rPr>
+          <w:rFonts w:ascii="Arial" w:hAnsi="Arial" w:cs="Arial"/>
+          <w:sz w:val="20"/>
+          <w:szCs w:val="20"/>
+        </w:rPr>
+        <w:t>Willness</w:t>
+      </w:r>
+      <w:proofErr w:type="spellEnd"/>
+      <w:r>
+        <w:rPr>
+          <w:rFonts w:ascii="Arial" w:hAnsi="Arial" w:cs="Arial"/>
+          <w:sz w:val="20"/>
+          <w:szCs w:val="20"/>
+        </w:rPr>
+        <w:t>, C.R. and Madey, S. (2014) ‘Why Are Job Seekers Attracted by Corporate Social Performance? Experimental and Field Tests of Three Signal-Based Mechanisms’, </w:t>
       </w:r>
       <w:r>
         <w:rPr>
@@ -12016,7 +12269,25 @@
           <w:sz w:val="20"/>
           <w:szCs w:val="20"/>
         </w:rPr>
-        <w:t xml:space="preserve">Khan, M. H., Grabarski, M. K., Ali, M., &amp; Buckmaster, S. (2023). Insights into Creating and Managing an Inclusive Neurodiverse Workplace for Positive Outcomes: A Multistage Theoretical Framework. </w:t>
+        <w:t xml:space="preserve">Khan, M. H., </w:t>
+      </w:r>
+      <w:proofErr w:type="spellStart"/>
+      <w:r>
+        <w:rPr>
+          <w:rFonts w:ascii="Arial" w:hAnsi="Arial" w:cs="Arial"/>
+          <w:sz w:val="20"/>
+          <w:szCs w:val="20"/>
+        </w:rPr>
+        <w:t>Grabarski</w:t>
+      </w:r>
+      <w:proofErr w:type="spellEnd"/>
+      <w:r>
+        <w:rPr>
+          <w:rFonts w:ascii="Arial" w:hAnsi="Arial" w:cs="Arial"/>
+          <w:sz w:val="20"/>
+          <w:szCs w:val="20"/>
+        </w:rPr>
+        <w:t xml:space="preserve">, M. K., Ali, M., &amp; Buckmaster, S. (2023). Insights into Creating and Managing an Inclusive Neurodiverse Workplace for Positive Outcomes: A Multistage Theoretical Framework. </w:t>
       </w:r>
       <w:r>
         <w:rPr>
@@ -12189,13 +12460,23 @@
           <w:szCs w:val="20"/>
         </w:rPr>
       </w:pPr>
-      <w:r>
-        <w:rPr>
-          <w:rFonts w:ascii="Arial" w:hAnsi="Arial" w:cs="Arial"/>
-          <w:sz w:val="20"/>
-          <w:szCs w:val="20"/>
-        </w:rPr>
-        <w:t>Lup, D. and Canonico, E. (2024) ‘Bridges and gatekeepers: Employees' willingness to refer qualified candidates on the autism spectrum’, </w:t>
+      <w:proofErr w:type="spellStart"/>
+      <w:r>
+        <w:rPr>
+          <w:rFonts w:ascii="Arial" w:hAnsi="Arial" w:cs="Arial"/>
+          <w:sz w:val="20"/>
+          <w:szCs w:val="20"/>
+        </w:rPr>
+        <w:t>Lup</w:t>
+      </w:r>
+      <w:proofErr w:type="spellEnd"/>
+      <w:r>
+        <w:rPr>
+          <w:rFonts w:ascii="Arial" w:hAnsi="Arial" w:cs="Arial"/>
+          <w:sz w:val="20"/>
+          <w:szCs w:val="20"/>
+        </w:rPr>
+        <w:t>, D. and Canonico, E. (2024) ‘Bridges and gatekeepers: Employees' willingness to refer qualified candidates on the autism spectrum’, </w:t>
       </w:r>
       <w:r>
         <w:rPr>
@@ -12293,7 +12574,25 @@
           <w:sz w:val="20"/>
           <w:szCs w:val="20"/>
         </w:rPr>
-        <w:t>Mirowska, A. and Arsenyan, J. (2025), A Bridge Too Far: Signalling Effects of Artificial Intelligence Evaluation of Job Interviews. International Journal of Selection and Assessment, 33: e70008. </w:t>
+        <w:t xml:space="preserve">Mirowska, A. and </w:t>
+      </w:r>
+      <w:proofErr w:type="spellStart"/>
+      <w:r>
+        <w:rPr>
+          <w:rFonts w:ascii="Arial" w:hAnsi="Arial" w:cs="Arial"/>
+          <w:sz w:val="20"/>
+          <w:szCs w:val="20"/>
+        </w:rPr>
+        <w:t>Arsenyan</w:t>
+      </w:r>
+      <w:proofErr w:type="spellEnd"/>
+      <w:r>
+        <w:rPr>
+          <w:rFonts w:ascii="Arial" w:hAnsi="Arial" w:cs="Arial"/>
+          <w:sz w:val="20"/>
+          <w:szCs w:val="20"/>
+        </w:rPr>
+        <w:t>, J. (2025), A Bridge Too Far: Signalling Effects of Artificial Intelligence Evaluation of Job Interviews. International Journal of Selection and Assessment, 33: e70008. </w:t>
       </w:r>
       <w:hyperlink r:id="rId23" w:history="1">
         <w:r>
@@ -15875,6 +16174,7 @@
   <w:style w:type="character" w:default="1" w:styleId="DefaultParagraphFont">
     <w:name w:val="Default Paragraph Font"/>
     <w:uiPriority w:val="1"/>
+    <w:semiHidden/>
     <w:unhideWhenUsed/>
   </w:style>
   <w:style w:type="table" w:default="1" w:styleId="TableNormal">

</xml_diff>

<commit_message>
Fiz Profile pic issue on msc-survey.html and add search tracker API json file
</commit_message>
<xml_diff>
--- a/FBL-PhD-research-proposal.docx
+++ b/FBL-PhD-research-proposal.docx
@@ -135,7 +135,23 @@
           <w:sz w:val="28"/>
           <w:szCs w:val="28"/>
         </w:rPr>
-        <w:t>ompared to Conventional Recruitment Approaches, Affect How Neurodiverse Applicants Perceive the Candidate Journey?</w:t>
+        <w:t xml:space="preserve">ompared to Conventional Recruitment Approaches, Affect How </w:t>
+      </w:r>
+      <w:r>
+        <w:rPr>
+          <w:rFonts w:ascii="Arial" w:hAnsi="Arial" w:cs="Arial"/>
+          <w:sz w:val="28"/>
+          <w:szCs w:val="28"/>
+        </w:rPr>
+        <w:t xml:space="preserve">Black </w:t>
+      </w:r>
+      <w:r>
+        <w:rPr>
+          <w:rFonts w:ascii="Arial" w:hAnsi="Arial" w:cs="Arial"/>
+          <w:sz w:val="28"/>
+          <w:szCs w:val="28"/>
+        </w:rPr>
+        <w:t>Neurodiverse Applicants Perceive the Candidate Journey?</w:t>
       </w:r>
     </w:p>
     <w:p>
@@ -2281,7 +2297,23 @@
           <w:sz w:val="20"/>
           <w:szCs w:val="20"/>
         </w:rPr>
-        <w:t xml:space="preserve">Though there are no doubt an immense amount of synergy and efficiency gains from the adoption of </w:t>
+        <w:t xml:space="preserve">Though there are no doubt an immense amount of synergy and efficiency gains </w:t>
+      </w:r>
+      <w:r>
+        <w:rPr>
+          <w:rFonts w:ascii="Arial" w:hAnsi="Arial" w:cs="Arial"/>
+          <w:sz w:val="20"/>
+          <w:szCs w:val="20"/>
+        </w:rPr>
+        <w:t>achieved through</w:t>
+      </w:r>
+      <w:r>
+        <w:rPr>
+          <w:rFonts w:ascii="Arial" w:hAnsi="Arial" w:cs="Arial"/>
+          <w:sz w:val="20"/>
+          <w:szCs w:val="20"/>
+        </w:rPr>
+        <w:t xml:space="preserve"> the adoption of </w:t>
       </w:r>
       <w:r>
         <w:rPr>
@@ -2297,7 +2329,23 @@
           <w:sz w:val="20"/>
           <w:szCs w:val="20"/>
         </w:rPr>
-        <w:t>cial Intelligence (‘AI’) and its proponents, the process of achieving result</w:t>
+        <w:t xml:space="preserve">cial Intelligence (‘AI’) and its proponents, the process of achieving </w:t>
+      </w:r>
+      <w:r>
+        <w:rPr>
+          <w:rFonts w:ascii="Arial" w:hAnsi="Arial" w:cs="Arial"/>
+          <w:sz w:val="20"/>
+          <w:szCs w:val="20"/>
+        </w:rPr>
+        <w:t xml:space="preserve">these </w:t>
+      </w:r>
+      <w:r>
+        <w:rPr>
+          <w:rFonts w:ascii="Arial" w:hAnsi="Arial" w:cs="Arial"/>
+          <w:sz w:val="20"/>
+          <w:szCs w:val="20"/>
+        </w:rPr>
+        <w:t>result</w:t>
       </w:r>
       <w:r>
         <w:rPr>
@@ -2322,6 +2370,344 @@
           <w:szCs w:val="20"/>
         </w:rPr>
         <w:t>.</w:t>
+      </w:r>
+      <w:r>
+        <w:rPr>
+          <w:rFonts w:ascii="Arial" w:hAnsi="Arial" w:cs="Arial"/>
+          <w:sz w:val="20"/>
+          <w:szCs w:val="20"/>
+        </w:rPr>
+        <w:t xml:space="preserve"> It is therefore timely that t</w:t>
+      </w:r>
+      <w:r>
+        <w:rPr>
+          <w:rFonts w:ascii="Arial" w:hAnsi="Arial" w:cs="Arial"/>
+          <w:sz w:val="20"/>
+          <w:szCs w:val="20"/>
+        </w:rPr>
+        <w:t xml:space="preserve">his opportunity to prepare a </w:t>
+      </w:r>
+      <w:r>
+        <w:rPr>
+          <w:rFonts w:ascii="Arial" w:hAnsi="Arial" w:cs="Arial"/>
+          <w:sz w:val="20"/>
+          <w:szCs w:val="20"/>
+        </w:rPr>
+        <w:t xml:space="preserve">MSc dissertation </w:t>
+      </w:r>
+      <w:r>
+        <w:rPr>
+          <w:rFonts w:ascii="Arial" w:hAnsi="Arial" w:cs="Arial"/>
+          <w:sz w:val="20"/>
+          <w:szCs w:val="20"/>
+        </w:rPr>
+        <w:t xml:space="preserve">thesis </w:t>
+      </w:r>
+      <w:r>
+        <w:rPr>
+          <w:rFonts w:ascii="Arial" w:hAnsi="Arial" w:cs="Arial"/>
+          <w:sz w:val="20"/>
+          <w:szCs w:val="20"/>
+        </w:rPr>
+        <w:t>h</w:t>
+      </w:r>
+      <w:r>
+        <w:rPr>
+          <w:rFonts w:ascii="Arial" w:hAnsi="Arial" w:cs="Arial"/>
+          <w:sz w:val="20"/>
+          <w:szCs w:val="20"/>
+        </w:rPr>
+        <w:t>a</w:t>
+      </w:r>
+      <w:r>
+        <w:rPr>
+          <w:rFonts w:ascii="Arial" w:hAnsi="Arial" w:cs="Arial"/>
+          <w:sz w:val="20"/>
+          <w:szCs w:val="20"/>
+        </w:rPr>
+        <w:t>s</w:t>
+      </w:r>
+      <w:r>
+        <w:rPr>
+          <w:rFonts w:ascii="Arial" w:hAnsi="Arial" w:cs="Arial"/>
+          <w:sz w:val="20"/>
+          <w:szCs w:val="20"/>
+        </w:rPr>
+        <w:t xml:space="preserve"> emerged</w:t>
+      </w:r>
+      <w:r>
+        <w:rPr>
+          <w:rFonts w:ascii="Arial" w:hAnsi="Arial" w:cs="Arial"/>
+          <w:sz w:val="20"/>
+          <w:szCs w:val="20"/>
+        </w:rPr>
+        <w:t xml:space="preserve">, partly due to the recency </w:t>
+      </w:r>
+      <w:r>
+        <w:rPr>
+          <w:rFonts w:ascii="Arial" w:hAnsi="Arial" w:cs="Arial"/>
+          <w:sz w:val="20"/>
+          <w:szCs w:val="20"/>
+        </w:rPr>
+        <w:t>of the Buckland Review which was commissioned by </w:t>
+      </w:r>
+      <w:r>
+        <w:rPr>
+          <w:rFonts w:ascii="Arial" w:hAnsi="Arial" w:cs="Arial"/>
+          <w:b/>
+          <w:bCs/>
+          <w:sz w:val="20"/>
+          <w:szCs w:val="20"/>
+        </w:rPr>
+        <w:t>Sir Robert Buckland QC</w:t>
+      </w:r>
+      <w:r>
+        <w:rPr>
+          <w:rFonts w:ascii="Arial" w:hAnsi="Arial" w:cs="Arial"/>
+          <w:sz w:val="20"/>
+          <w:szCs w:val="20"/>
+        </w:rPr>
+        <w:t xml:space="preserve"> (the long-serving </w:t>
+      </w:r>
+      <w:r>
+        <w:rPr>
+          <w:rFonts w:ascii="Arial" w:hAnsi="Arial" w:cs="Arial"/>
+          <w:sz w:val="20"/>
+          <w:szCs w:val="20"/>
+        </w:rPr>
+        <w:t xml:space="preserve">former UK </w:t>
+      </w:r>
+      <w:r>
+        <w:rPr>
+          <w:rFonts w:ascii="Arial" w:hAnsi="Arial" w:cs="Arial"/>
+          <w:sz w:val="20"/>
+          <w:szCs w:val="20"/>
+        </w:rPr>
+        <w:t xml:space="preserve">Cabinet Minister and </w:t>
+      </w:r>
+      <w:r>
+        <w:rPr>
+          <w:rFonts w:ascii="Arial" w:hAnsi="Arial" w:cs="Arial"/>
+          <w:sz w:val="20"/>
+          <w:szCs w:val="20"/>
+        </w:rPr>
+        <w:t xml:space="preserve">former </w:t>
+      </w:r>
+      <w:r>
+        <w:rPr>
+          <w:rFonts w:ascii="Arial" w:hAnsi="Arial" w:cs="Arial"/>
+          <w:sz w:val="20"/>
+          <w:szCs w:val="20"/>
+        </w:rPr>
+        <w:t>MP for South Swindon) and Autistica in early 2024 under the leadership of the then Conservative Prime Minister, the Rt. Hon Rishi Sunak</w:t>
+      </w:r>
+      <w:r>
+        <w:rPr>
+          <w:rFonts w:ascii="Arial" w:hAnsi="Arial" w:cs="Arial"/>
+          <w:sz w:val="20"/>
+          <w:szCs w:val="20"/>
+        </w:rPr>
+        <w:t xml:space="preserve"> and partly due to the author’s work as a Royal Economic Society independent researcher and Consultant working alongside the Business in the Community (BITC) Opening Doors Initiative</w:t>
+      </w:r>
+      <w:r>
+        <w:rPr>
+          <w:rFonts w:ascii="Arial" w:hAnsi="Arial" w:cs="Arial"/>
+          <w:sz w:val="20"/>
+          <w:szCs w:val="20"/>
+        </w:rPr>
+        <w:t>. </w:t>
+      </w:r>
+      <w:r>
+        <w:rPr>
+          <w:rFonts w:ascii="Arial" w:hAnsi="Arial" w:cs="Arial"/>
+          <w:sz w:val="20"/>
+          <w:szCs w:val="20"/>
+        </w:rPr>
+        <w:t xml:space="preserve">Since </w:t>
+      </w:r>
+      <w:r>
+        <w:rPr>
+          <w:rFonts w:ascii="Arial" w:hAnsi="Arial" w:cs="Arial"/>
+          <w:sz w:val="20"/>
+          <w:szCs w:val="20"/>
+        </w:rPr>
+        <w:t>the end of the Conservative Party’s 14-year tenure in office</w:t>
+      </w:r>
+      <w:r>
+        <w:rPr>
+          <w:rFonts w:ascii="Arial" w:hAnsi="Arial" w:cs="Arial"/>
+          <w:sz w:val="20"/>
+          <w:szCs w:val="20"/>
+        </w:rPr>
+        <w:t>, the rise in what has come to be known as Artificia</w:t>
+      </w:r>
+      <w:r>
+        <w:rPr>
+          <w:rFonts w:ascii="Arial" w:hAnsi="Arial" w:cs="Arial"/>
+          <w:sz w:val="20"/>
+          <w:szCs w:val="20"/>
+        </w:rPr>
+        <w:t xml:space="preserve">l </w:t>
+      </w:r>
+      <w:r>
+        <w:rPr>
+          <w:rFonts w:ascii="Arial" w:hAnsi="Arial" w:cs="Arial"/>
+          <w:sz w:val="20"/>
+          <w:szCs w:val="20"/>
+        </w:rPr>
+        <w:t>Intelligence</w:t>
+      </w:r>
+      <w:r>
+        <w:rPr>
+          <w:rFonts w:ascii="Arial" w:hAnsi="Arial" w:cs="Arial"/>
+          <w:sz w:val="20"/>
+          <w:szCs w:val="20"/>
+        </w:rPr>
+        <w:t xml:space="preserve"> or AI</w:t>
+      </w:r>
+      <w:r>
+        <w:rPr>
+          <w:rFonts w:ascii="Arial" w:hAnsi="Arial" w:cs="Arial"/>
+          <w:sz w:val="20"/>
+          <w:szCs w:val="20"/>
+        </w:rPr>
+        <w:t xml:space="preserve">, which forms </w:t>
+      </w:r>
+      <w:r>
+        <w:rPr>
+          <w:rFonts w:ascii="Arial" w:hAnsi="Arial" w:cs="Arial"/>
+          <w:sz w:val="20"/>
+          <w:szCs w:val="20"/>
+        </w:rPr>
+        <w:t xml:space="preserve">a fundamental </w:t>
+      </w:r>
+      <w:r>
+        <w:rPr>
+          <w:rFonts w:ascii="Arial" w:hAnsi="Arial" w:cs="Arial"/>
+          <w:sz w:val="20"/>
+          <w:szCs w:val="20"/>
+        </w:rPr>
+        <w:t xml:space="preserve">part of the </w:t>
+      </w:r>
+      <w:r>
+        <w:rPr>
+          <w:rFonts w:ascii="Arial" w:hAnsi="Arial" w:cs="Arial"/>
+          <w:sz w:val="20"/>
+          <w:szCs w:val="20"/>
+        </w:rPr>
+        <w:t>idea</w:t>
+      </w:r>
+      <w:r>
+        <w:rPr>
+          <w:rFonts w:ascii="Arial" w:hAnsi="Arial" w:cs="Arial"/>
+          <w:sz w:val="20"/>
+          <w:szCs w:val="20"/>
+        </w:rPr>
+        <w:t xml:space="preserve"> that there may in fact </w:t>
+      </w:r>
+      <w:r>
+        <w:rPr>
+          <w:rFonts w:ascii="Arial" w:hAnsi="Arial" w:cs="Arial"/>
+          <w:sz w:val="20"/>
+          <w:szCs w:val="20"/>
+        </w:rPr>
+        <w:t xml:space="preserve">may </w:t>
+      </w:r>
+      <w:r>
+        <w:rPr>
+          <w:rFonts w:ascii="Arial" w:hAnsi="Arial" w:cs="Arial"/>
+          <w:sz w:val="20"/>
+          <w:szCs w:val="20"/>
+        </w:rPr>
+        <w:t xml:space="preserve">be a Singularity </w:t>
+      </w:r>
+      <w:r>
+        <w:rPr>
+          <w:rFonts w:ascii="Arial" w:hAnsi="Arial" w:cs="Arial"/>
+          <w:sz w:val="20"/>
+          <w:szCs w:val="20"/>
+        </w:rPr>
+        <w:t xml:space="preserve">taking place </w:t>
+      </w:r>
+      <w:r>
+        <w:rPr>
+          <w:rFonts w:ascii="Arial" w:hAnsi="Arial" w:cs="Arial"/>
+          <w:sz w:val="20"/>
+          <w:szCs w:val="20"/>
+        </w:rPr>
+        <w:t>in the near future, has produced various “sides”</w:t>
+      </w:r>
+      <w:r>
+        <w:rPr>
+          <w:rFonts w:ascii="Arial" w:hAnsi="Arial" w:cs="Arial"/>
+          <w:sz w:val="20"/>
+          <w:szCs w:val="20"/>
+        </w:rPr>
+        <w:t xml:space="preserve">, creating extended debate on the topic of </w:t>
+      </w:r>
+      <w:r>
+        <w:rPr>
+          <w:rFonts w:ascii="Arial" w:hAnsi="Arial" w:cs="Arial"/>
+          <w:sz w:val="20"/>
+          <w:szCs w:val="20"/>
+        </w:rPr>
+        <w:t>signalling, reasonable adjustments and HR</w:t>
+      </w:r>
+      <w:r>
+        <w:rPr>
+          <w:rFonts w:ascii="Arial" w:hAnsi="Arial" w:cs="Arial"/>
+          <w:sz w:val="20"/>
+          <w:szCs w:val="20"/>
+        </w:rPr>
+        <w:t xml:space="preserve"> best practice</w:t>
+      </w:r>
+      <w:r>
+        <w:rPr>
+          <w:rFonts w:ascii="Arial" w:hAnsi="Arial" w:cs="Arial"/>
+          <w:sz w:val="20"/>
+          <w:szCs w:val="20"/>
+        </w:rPr>
+        <w:t xml:space="preserve">. On the one hand there are </w:t>
+      </w:r>
+      <w:r>
+        <w:rPr>
+          <w:rFonts w:ascii="Arial" w:hAnsi="Arial" w:cs="Arial"/>
+          <w:sz w:val="20"/>
+          <w:szCs w:val="20"/>
+        </w:rPr>
+        <w:t xml:space="preserve">proponents who advocate for AI </w:t>
+      </w:r>
+      <w:r>
+        <w:rPr>
+          <w:rFonts w:ascii="Arial" w:hAnsi="Arial" w:cs="Arial"/>
+          <w:sz w:val="20"/>
+          <w:szCs w:val="20"/>
+        </w:rPr>
+        <w:t xml:space="preserve">and on the other </w:t>
+      </w:r>
+      <w:r>
+        <w:rPr>
+          <w:rFonts w:ascii="Arial" w:hAnsi="Arial" w:cs="Arial"/>
+          <w:sz w:val="20"/>
+          <w:szCs w:val="20"/>
+        </w:rPr>
+        <w:t xml:space="preserve">hand </w:t>
+      </w:r>
+      <w:r>
+        <w:rPr>
+          <w:rFonts w:ascii="Arial" w:hAnsi="Arial" w:cs="Arial"/>
+          <w:sz w:val="20"/>
+          <w:szCs w:val="20"/>
+        </w:rPr>
+        <w:t>there are naysayers</w:t>
+      </w:r>
+      <w:r>
+        <w:rPr>
+          <w:rFonts w:ascii="Arial" w:hAnsi="Arial" w:cs="Arial"/>
+          <w:sz w:val="20"/>
+          <w:szCs w:val="20"/>
+        </w:rPr>
+        <w:t xml:space="preserve"> who oppose these synergies on the basis of work erosion and a reduction I the level of labour force participation.</w:t>
       </w:r>
     </w:p>
     <w:p>
@@ -2353,23 +2739,7 @@
           <w:sz w:val="20"/>
           <w:szCs w:val="20"/>
         </w:rPr>
-        <w:t xml:space="preserve">This opportunity to prepare a </w:t>
-      </w:r>
-      <w:r>
-        <w:rPr>
-          <w:rFonts w:ascii="Arial" w:hAnsi="Arial" w:cs="Arial"/>
-          <w:sz w:val="20"/>
-          <w:szCs w:val="20"/>
-        </w:rPr>
-        <w:t xml:space="preserve">MSc dissertation </w:t>
-      </w:r>
-      <w:r>
-        <w:rPr>
-          <w:rFonts w:ascii="Arial" w:hAnsi="Arial" w:cs="Arial"/>
-          <w:sz w:val="20"/>
-          <w:szCs w:val="20"/>
-        </w:rPr>
-        <w:t>thesis all emerged because of the Buckland Review which was commissioned by </w:t>
+        <w:t>Since the outcome of the Buckland Review and its subsequent findings concerning the employment opportunities of Autistic applicants (that is, </w:t>
       </w:r>
       <w:r>
         <w:rPr>
@@ -2379,135 +2749,115 @@
           <w:sz w:val="20"/>
           <w:szCs w:val="20"/>
         </w:rPr>
-        <w:t>Sir Robert Buckland QC</w:t>
-      </w:r>
-      <w:r>
-        <w:rPr>
-          <w:rFonts w:ascii="Arial" w:hAnsi="Arial" w:cs="Arial"/>
-          <w:sz w:val="20"/>
-          <w:szCs w:val="20"/>
-        </w:rPr>
-        <w:t xml:space="preserve"> (the long-serving </w:t>
-      </w:r>
-      <w:r>
-        <w:rPr>
-          <w:rFonts w:ascii="Arial" w:hAnsi="Arial" w:cs="Arial"/>
-          <w:sz w:val="20"/>
-          <w:szCs w:val="20"/>
-        </w:rPr>
-        <w:t xml:space="preserve">former UK </w:t>
-      </w:r>
-      <w:r>
-        <w:rPr>
-          <w:rFonts w:ascii="Arial" w:hAnsi="Arial" w:cs="Arial"/>
-          <w:sz w:val="20"/>
-          <w:szCs w:val="20"/>
-        </w:rPr>
-        <w:t xml:space="preserve">Cabinet Minister and </w:t>
-      </w:r>
-      <w:r>
-        <w:rPr>
-          <w:rFonts w:ascii="Arial" w:hAnsi="Arial" w:cs="Arial"/>
-          <w:sz w:val="20"/>
-          <w:szCs w:val="20"/>
-        </w:rPr>
-        <w:t xml:space="preserve">former </w:t>
-      </w:r>
-      <w:r>
-        <w:rPr>
-          <w:rFonts w:ascii="Arial" w:hAnsi="Arial" w:cs="Arial"/>
-          <w:sz w:val="20"/>
-          <w:szCs w:val="20"/>
-        </w:rPr>
-        <w:t>MP for South Swindon) and Autistica in early 2024 under the leadership of the then Conservative Prime Minister, the Rt. Hon Rishi Sunak. </w:t>
-      </w:r>
-      <w:r>
-        <w:rPr>
-          <w:rFonts w:ascii="Arial" w:hAnsi="Arial" w:cs="Arial"/>
-          <w:sz w:val="20"/>
-          <w:szCs w:val="20"/>
-        </w:rPr>
-        <w:t xml:space="preserve">Since </w:t>
-      </w:r>
-      <w:r>
-        <w:rPr>
-          <w:rFonts w:ascii="Arial" w:hAnsi="Arial" w:cs="Arial"/>
-          <w:sz w:val="20"/>
-          <w:szCs w:val="20"/>
-        </w:rPr>
-        <w:t>the end of the Conservative Party’s 14-year tenure in office</w:t>
-      </w:r>
-      <w:r>
-        <w:rPr>
-          <w:rFonts w:ascii="Arial" w:hAnsi="Arial" w:cs="Arial"/>
-          <w:sz w:val="20"/>
-          <w:szCs w:val="20"/>
-        </w:rPr>
-        <w:t>, the rise in what has come to be known as Artificial General Intelligence</w:t>
-      </w:r>
-      <w:r>
-        <w:rPr>
-          <w:rFonts w:ascii="Arial" w:hAnsi="Arial" w:cs="Arial"/>
-          <w:sz w:val="20"/>
-          <w:szCs w:val="20"/>
-        </w:rPr>
-        <w:t xml:space="preserve"> or AGI</w:t>
-      </w:r>
-      <w:r>
-        <w:rPr>
-          <w:rFonts w:ascii="Arial" w:hAnsi="Arial" w:cs="Arial"/>
-          <w:sz w:val="20"/>
-          <w:szCs w:val="20"/>
-        </w:rPr>
-        <w:t xml:space="preserve">, which forms part of the </w:t>
-      </w:r>
-      <w:r>
-        <w:rPr>
-          <w:rFonts w:ascii="Arial" w:hAnsi="Arial" w:cs="Arial"/>
-          <w:sz w:val="20"/>
-          <w:szCs w:val="20"/>
-        </w:rPr>
-        <w:t>idea</w:t>
-      </w:r>
-      <w:r>
-        <w:rPr>
-          <w:rFonts w:ascii="Arial" w:hAnsi="Arial" w:cs="Arial"/>
-          <w:sz w:val="20"/>
-          <w:szCs w:val="20"/>
-        </w:rPr>
-        <w:t xml:space="preserve"> that there may in fact </w:t>
-      </w:r>
-      <w:r>
-        <w:rPr>
-          <w:rFonts w:ascii="Arial" w:hAnsi="Arial" w:cs="Arial"/>
-          <w:sz w:val="20"/>
-          <w:szCs w:val="20"/>
-        </w:rPr>
-        <w:t xml:space="preserve">may </w:t>
-      </w:r>
-      <w:r>
-        <w:rPr>
-          <w:rFonts w:ascii="Arial" w:hAnsi="Arial" w:cs="Arial"/>
-          <w:sz w:val="20"/>
-          <w:szCs w:val="20"/>
-        </w:rPr>
-        <w:t xml:space="preserve">be a Singularity in the near future, has produced various “sides” of this perceived eventuality. On the one hand there are </w:t>
-      </w:r>
-      <w:r>
-        <w:rPr>
-          <w:rFonts w:ascii="Arial" w:hAnsi="Arial" w:cs="Arial"/>
-          <w:sz w:val="20"/>
-          <w:szCs w:val="20"/>
-        </w:rPr>
-        <w:t xml:space="preserve">proponents who advocate for AGI </w:t>
-      </w:r>
-      <w:r>
-        <w:rPr>
-          <w:rFonts w:ascii="Arial" w:hAnsi="Arial" w:cs="Arial"/>
-          <w:sz w:val="20"/>
-          <w:szCs w:val="20"/>
-        </w:rPr>
-        <w:t>and on the other there are naysayers.</w:t>
+        <w:t>7 in 10</w:t>
+      </w:r>
+      <w:r>
+        <w:rPr>
+          <w:rFonts w:ascii="Arial" w:hAnsi="Arial" w:cs="Arial"/>
+          <w:sz w:val="20"/>
+          <w:szCs w:val="20"/>
+        </w:rPr>
+        <w:t xml:space="preserve"> are not in gainful employment across the country), further research has been conducted by Miller and Doyle (2025) which forms the basis of how to </w:t>
+      </w:r>
+      <w:r>
+        <w:rPr>
+          <w:rFonts w:ascii="Arial" w:hAnsi="Arial" w:cs="Arial"/>
+          <w:i/>
+          <w:iCs/>
+          <w:sz w:val="20"/>
+          <w:szCs w:val="20"/>
+        </w:rPr>
+        <w:t>deconstruct</w:t>
+      </w:r>
+      <w:r>
+        <w:rPr>
+          <w:rFonts w:ascii="Arial" w:hAnsi="Arial" w:cs="Arial"/>
+          <w:sz w:val="20"/>
+          <w:szCs w:val="20"/>
+        </w:rPr>
+        <w:t> the various approaches taken by employers when attracting these aforementioned and completely hypothetical 7 in 10 neurodiverse applicants who are unemployed during recruitment activities, without employing specific and targeted recruitment campaigns which require candidates to come forward and identify their conditions at the outset of the process. </w:t>
+      </w:r>
+      <w:r>
+        <w:rPr>
+          <w:rFonts w:ascii="Arial" w:hAnsi="Arial" w:cs="Arial"/>
+          <w:sz w:val="20"/>
+          <w:szCs w:val="20"/>
+        </w:rPr>
+        <w:t xml:space="preserve">Dr. Nancy Doyle is a prolific campaigner for neurodivergence in the workplace </w:t>
+      </w:r>
+      <w:r>
+        <w:rPr>
+          <w:rFonts w:ascii="Arial" w:hAnsi="Arial" w:cs="Arial"/>
+          <w:sz w:val="20"/>
+          <w:szCs w:val="20"/>
+        </w:rPr>
+        <w:t xml:space="preserve">who has previously written an online opinion piece for Genius Within, a UK </w:t>
+      </w:r>
+      <w:r>
+        <w:rPr>
+          <w:rFonts w:ascii="Arial" w:hAnsi="Arial" w:cs="Arial"/>
+          <w:sz w:val="20"/>
+          <w:szCs w:val="20"/>
+        </w:rPr>
+        <w:t>community interest company</w:t>
+      </w:r>
+      <w:r>
+        <w:rPr>
+          <w:rFonts w:ascii="Arial" w:hAnsi="Arial" w:cs="Arial"/>
+          <w:sz w:val="20"/>
+          <w:szCs w:val="20"/>
+        </w:rPr>
+        <w:t>, on the</w:t>
+      </w:r>
+      <w:r>
+        <w:rPr>
+          <w:rFonts w:ascii="Arial" w:hAnsi="Arial" w:cs="Arial"/>
+          <w:sz w:val="20"/>
+          <w:szCs w:val="20"/>
+        </w:rPr>
+        <w:t xml:space="preserve"> subject of the</w:t>
+      </w:r>
+      <w:r>
+        <w:rPr>
+          <w:rFonts w:ascii="Arial" w:hAnsi="Arial" w:cs="Arial"/>
+          <w:sz w:val="20"/>
+          <w:szCs w:val="20"/>
+        </w:rPr>
+        <w:t xml:space="preserve"> </w:t>
+      </w:r>
+      <w:r>
+        <w:rPr>
+          <w:rFonts w:ascii="Arial" w:hAnsi="Arial" w:cs="Arial"/>
+          <w:b/>
+          <w:bCs/>
+          <w:sz w:val="20"/>
+          <w:szCs w:val="20"/>
+        </w:rPr>
+        <w:t xml:space="preserve">Sir Charlie Mayfield </w:t>
+      </w:r>
+      <w:r>
+        <w:rPr>
+          <w:rFonts w:ascii="Arial" w:hAnsi="Arial" w:cs="Arial"/>
+          <w:sz w:val="20"/>
+          <w:szCs w:val="20"/>
+        </w:rPr>
+        <w:t xml:space="preserve">Review </w:t>
+      </w:r>
+      <w:r>
+        <w:rPr>
+          <w:rFonts w:ascii="Arial" w:hAnsi="Arial" w:cs="Arial"/>
+          <w:sz w:val="20"/>
+          <w:szCs w:val="20"/>
+        </w:rPr>
+        <w:t>(Doyle, 2025)</w:t>
+      </w:r>
+      <w:r>
+        <w:rPr>
+          <w:rFonts w:ascii="Arial" w:hAnsi="Arial" w:cs="Arial"/>
+          <w:sz w:val="20"/>
+          <w:szCs w:val="20"/>
+        </w:rPr>
+        <w:t xml:space="preserve">. </w:t>
       </w:r>
     </w:p>
     <w:p>
@@ -2539,7 +2889,23 @@
           <w:sz w:val="20"/>
           <w:szCs w:val="20"/>
         </w:rPr>
-        <w:t>Since the outcome of the Buckland Review and its subsequent findings concerning the employment opportunities of Autistic applicants (that is, </w:t>
+        <w:t>Th</w:t>
+      </w:r>
+      <w:r>
+        <w:rPr>
+          <w:rFonts w:ascii="Arial" w:hAnsi="Arial" w:cs="Arial"/>
+          <w:sz w:val="20"/>
+          <w:szCs w:val="20"/>
+        </w:rPr>
+        <w:t xml:space="preserve">e aforementioned </w:t>
+      </w:r>
+      <w:r>
+        <w:rPr>
+          <w:rFonts w:ascii="Arial" w:hAnsi="Arial" w:cs="Arial"/>
+          <w:sz w:val="20"/>
+          <w:szCs w:val="20"/>
+        </w:rPr>
+        <w:t>is important for several reasons, not least for the intrinsic motivation of the employee but also on grounds of fairness and positive discrimination. I am aiming to study how neurodiverse applicants perceive resource-based HRM (what we call the RBV in HRM theory) and how RBV approaches, which are inherently focused on creating competitive advantage link to recruitment signalling during the applicant journey. I am hoping to investigate several hypotheses (which I have cited in my PhD proposal) which will form the backbone of the research study, and which will either confirm the work of </w:t>
       </w:r>
       <w:r>
         <w:rPr>
@@ -2549,81 +2915,31 @@
           <w:sz w:val="20"/>
           <w:szCs w:val="20"/>
         </w:rPr>
-        <w:t>7 in 10</w:t>
-      </w:r>
-      <w:r>
-        <w:rPr>
-          <w:rFonts w:ascii="Arial" w:hAnsi="Arial" w:cs="Arial"/>
-          <w:sz w:val="20"/>
-          <w:szCs w:val="20"/>
-        </w:rPr>
-        <w:t xml:space="preserve"> are not in gainful employment across the country), further research has been conducted by Miller and Doyle (2025) which forms the basis of how to </w:t>
-      </w:r>
-      <w:r>
-        <w:rPr>
-          <w:rFonts w:ascii="Arial" w:hAnsi="Arial" w:cs="Arial"/>
-          <w:i/>
-          <w:iCs/>
-          <w:sz w:val="20"/>
-          <w:szCs w:val="20"/>
-        </w:rPr>
-        <w:t>deconstruct</w:t>
-      </w:r>
-      <w:r>
-        <w:rPr>
-          <w:rFonts w:ascii="Arial" w:hAnsi="Arial" w:cs="Arial"/>
-          <w:sz w:val="20"/>
-          <w:szCs w:val="20"/>
-        </w:rPr>
-        <w:t> the various approaches taken by employers when attracting these aforementioned and completely hypothetical 7 in 10 neurodiverse applicants who are unemployed during recruitment activities, without employing specific and targeted recruitment campaigns which require candidates to come forward and identify their conditions at the outset of the process. </w:t>
-      </w:r>
-      <w:r>
-        <w:rPr>
-          <w:rFonts w:ascii="Arial" w:hAnsi="Arial" w:cs="Arial"/>
-          <w:sz w:val="20"/>
-          <w:szCs w:val="20"/>
-        </w:rPr>
-        <w:t xml:space="preserve">Dr. Nancy Doyle is a prolific campaigner for neurodivergence in the workplace </w:t>
-      </w:r>
-      <w:r>
-        <w:rPr>
-          <w:rFonts w:ascii="Arial" w:hAnsi="Arial" w:cs="Arial"/>
-          <w:sz w:val="20"/>
-          <w:szCs w:val="20"/>
-        </w:rPr>
-        <w:t xml:space="preserve">who has previously written an online opinion piece for Genius Within, a UK </w:t>
-      </w:r>
-      <w:r>
-        <w:rPr>
-          <w:rFonts w:ascii="Arial" w:hAnsi="Arial" w:cs="Arial"/>
-          <w:sz w:val="20"/>
-          <w:szCs w:val="20"/>
-        </w:rPr>
-        <w:t>community interest company</w:t>
-      </w:r>
-      <w:r>
-        <w:rPr>
-          <w:rFonts w:ascii="Arial" w:hAnsi="Arial" w:cs="Arial"/>
-          <w:sz w:val="20"/>
-          <w:szCs w:val="20"/>
-        </w:rPr>
-        <w:t>, on the</w:t>
-      </w:r>
-      <w:r>
-        <w:rPr>
-          <w:rFonts w:ascii="Arial" w:hAnsi="Arial" w:cs="Arial"/>
-          <w:sz w:val="20"/>
-          <w:szCs w:val="20"/>
-        </w:rPr>
-        <w:t xml:space="preserve"> subject of the</w:t>
-      </w:r>
-      <w:r>
-        <w:rPr>
-          <w:rFonts w:ascii="Arial" w:hAnsi="Arial" w:cs="Arial"/>
-          <w:sz w:val="20"/>
-          <w:szCs w:val="20"/>
-        </w:rPr>
-        <w:t xml:space="preserve"> </w:t>
+        <w:t>Miller and Doyle (2025)</w:t>
+      </w:r>
+      <w:r>
+        <w:rPr>
+          <w:rFonts w:ascii="Arial" w:hAnsi="Arial" w:cs="Arial"/>
+          <w:sz w:val="20"/>
+          <w:szCs w:val="20"/>
+        </w:rPr>
+        <w:t xml:space="preserve"> or reject the premise of their recent research study. I also plan to extend Miller and Doyle's work to study anonymous responses from applicants with </w:t>
+      </w:r>
+      <w:r>
+        <w:rPr>
+          <w:rFonts w:ascii="Arial" w:hAnsi="Arial" w:cs="Arial"/>
+          <w:sz w:val="20"/>
+          <w:szCs w:val="20"/>
+        </w:rPr>
+        <w:t>bipolar disorder</w:t>
+      </w:r>
+      <w:r>
+        <w:rPr>
+          <w:rFonts w:ascii="Arial" w:hAnsi="Arial" w:cs="Arial"/>
+          <w:sz w:val="20"/>
+          <w:szCs w:val="20"/>
+        </w:rPr>
+        <w:t xml:space="preserve"> (a condition that is </w:t>
       </w:r>
       <w:r>
         <w:rPr>
@@ -2633,32 +2949,60 @@
           <w:sz w:val="20"/>
           <w:szCs w:val="20"/>
         </w:rPr>
-        <w:t xml:space="preserve">Sir Charlie Mayfield </w:t>
-      </w:r>
-      <w:r>
-        <w:rPr>
-          <w:rFonts w:ascii="Arial" w:hAnsi="Arial" w:cs="Arial"/>
-          <w:sz w:val="20"/>
-          <w:szCs w:val="20"/>
-        </w:rPr>
-        <w:t xml:space="preserve">Review </w:t>
-      </w:r>
-      <w:r>
-        <w:rPr>
-          <w:rFonts w:ascii="Arial" w:hAnsi="Arial" w:cs="Arial"/>
-          <w:sz w:val="20"/>
-          <w:szCs w:val="20"/>
-        </w:rPr>
-        <w:t>(Doyle, 2025)</w:t>
-      </w:r>
-      <w:r>
-        <w:rPr>
-          <w:rFonts w:ascii="Arial" w:hAnsi="Arial" w:cs="Arial"/>
-          <w:sz w:val="20"/>
-          <w:szCs w:val="20"/>
-        </w:rPr>
-        <w:t xml:space="preserve">. </w:t>
-      </w:r>
+        <w:t>widely considered</w:t>
+      </w:r>
+      <w:r>
+        <w:rPr>
+          <w:rFonts w:ascii="Arial" w:hAnsi="Arial" w:cs="Arial"/>
+          <w:sz w:val="20"/>
+          <w:szCs w:val="20"/>
+        </w:rPr>
+        <w:t> as neurodivergent but was omitted from their empirical study).</w:t>
+      </w:r>
+    </w:p>
+    <w:p>
+      <w:pPr>
+        <w:pStyle w:val="Heading2"/>
+        <w:contextualSpacing/>
+        <w:jc w:val="both"/>
+        <w:rPr>
+          <w:rFonts w:ascii="Arial" w:hAnsi="Arial" w:cs="Arial"/>
+          <w:color w:val="auto"/>
+        </w:rPr>
+      </w:pPr>
+      <w:bookmarkStart w:id="2" w:name="_Toc221107084"/>
+      <w:r>
+        <w:rPr>
+          <w:rStyle w:val="Strong"/>
+          <w:rFonts w:ascii="Arial" w:hAnsi="Arial" w:cs="Arial"/>
+          <w:b w:val="0"/>
+          <w:bCs w:val="0"/>
+          <w:color w:val="auto"/>
+        </w:rPr>
+        <w:lastRenderedPageBreak/>
+        <w:t>1.12</w:t>
+      </w:r>
+      <w:r>
+        <w:rPr>
+          <w:rStyle w:val="Strong"/>
+          <w:rFonts w:ascii="Arial" w:hAnsi="Arial" w:cs="Arial"/>
+          <w:b w:val="0"/>
+          <w:bCs w:val="0"/>
+          <w:color w:val="auto"/>
+        </w:rPr>
+        <w:t xml:space="preserve"> </w:t>
+      </w:r>
+      <w:r>
+        <w:rPr>
+          <w:rStyle w:val="Strong"/>
+          <w:rFonts w:ascii="Arial" w:hAnsi="Arial" w:cs="Arial"/>
+          <w:b w:val="0"/>
+          <w:bCs w:val="0"/>
+          <w:color w:val="auto"/>
+        </w:rPr>
+        <w:t>Introduction</w:t>
+      </w:r>
+      <w:bookmarkEnd w:id="2"/>
     </w:p>
     <w:p>
       <w:pPr>
@@ -2671,6 +3015,282 @@
           <w:szCs w:val="20"/>
         </w:rPr>
       </w:pPr>
+      <w:r>
+        <w:rPr>
+          <w:rFonts w:ascii="Arial" w:hAnsi="Arial" w:cs="Arial"/>
+          <w:sz w:val="20"/>
+          <w:szCs w:val="20"/>
+        </w:rPr>
+        <w:t>Given that recent research demonstrates how neuro</w:t>
+      </w:r>
+      <w:r>
+        <w:rPr>
+          <w:rFonts w:ascii="Arial" w:hAnsi="Arial" w:cs="Arial"/>
+          <w:sz w:val="20"/>
+          <w:szCs w:val="20"/>
+        </w:rPr>
+        <w:t>inclusive</w:t>
+      </w:r>
+      <w:r>
+        <w:rPr>
+          <w:rFonts w:ascii="Arial" w:hAnsi="Arial" w:cs="Arial"/>
+          <w:sz w:val="20"/>
+          <w:szCs w:val="20"/>
+        </w:rPr>
+        <w:t xml:space="preserve"> teams can be 30% more productive than those which do not include neurodiverse employees (NatWest Mentor, 2025), and with Gen Z entering the workforce – over 50% of whom have some sort of neurodivergent condition</w:t>
+      </w:r>
+      <w:commentRangeStart w:id="3"/>
+      <w:commentRangeStart w:id="4"/>
+      <w:r>
+        <w:rPr>
+          <w:rStyle w:val="FootnoteReference"/>
+          <w:rFonts w:ascii="Arial" w:hAnsi="Arial" w:cs="Arial"/>
+          <w:sz w:val="20"/>
+          <w:szCs w:val="20"/>
+        </w:rPr>
+        <w:footnoteReference w:id="2"/>
+      </w:r>
+      <w:commentRangeEnd w:id="3"/>
+      <w:r>
+        <w:rPr>
+          <w:rStyle w:val="CommentReference"/>
+          <w:rFonts w:ascii="Arial" w:hAnsi="Arial" w:cs="Arial"/>
+        </w:rPr>
+        <w:commentReference w:id="3"/>
+      </w:r>
+      <w:commentRangeEnd w:id="4"/>
+      <w:r>
+        <w:rPr>
+          <w:rStyle w:val="CommentReference"/>
+          <w:rFonts w:ascii="Arial" w:hAnsi="Arial" w:cs="Arial"/>
+        </w:rPr>
+        <w:commentReference w:id="4"/>
+      </w:r>
+      <w:r>
+        <w:rPr>
+          <w:rFonts w:ascii="Arial" w:hAnsi="Arial" w:cs="Arial"/>
+          <w:sz w:val="20"/>
+          <w:szCs w:val="20"/>
+        </w:rPr>
+        <w:t xml:space="preserve"> </w:t>
+      </w:r>
+      <w:r>
+        <w:rPr>
+          <w:rFonts w:ascii="Arial" w:hAnsi="Arial" w:cs="Arial"/>
+          <w:sz w:val="20"/>
+          <w:szCs w:val="20"/>
+        </w:rPr>
+        <w:t xml:space="preserve">- either Autism Spectrum Disorder or Bipolar Disorder </w:t>
+      </w:r>
+      <w:r>
+        <w:rPr>
+          <w:rFonts w:ascii="Arial" w:hAnsi="Arial" w:cs="Arial"/>
+          <w:sz w:val="20"/>
+          <w:szCs w:val="20"/>
+        </w:rPr>
+        <w:t xml:space="preserve">(Forbes Magazine, 2025), the broad research topic I have selected to follow for this module is a contemporary problem with its roots in a recent report </w:t>
+      </w:r>
+      <w:r>
+        <w:rPr>
+          <w:rFonts w:ascii="Arial" w:hAnsi="Arial" w:cs="Arial"/>
+          <w:sz w:val="22"/>
+          <w:szCs w:val="22"/>
+        </w:rPr>
+        <w:t>(</w:t>
+      </w:r>
+      <w:r>
+        <w:rPr>
+          <w:rFonts w:ascii="Arial" w:hAnsi="Arial" w:cs="Arial"/>
+          <w:sz w:val="20"/>
+          <w:szCs w:val="20"/>
+        </w:rPr>
+        <w:t>Youth Future’s Foundation, 2025)</w:t>
+      </w:r>
+      <w:r>
+        <w:rPr>
+          <w:rFonts w:ascii="Arial" w:hAnsi="Arial" w:cs="Arial"/>
+          <w:sz w:val="22"/>
+          <w:szCs w:val="22"/>
+        </w:rPr>
+        <w:t xml:space="preserve">. </w:t>
+      </w:r>
+      <w:r>
+        <w:rPr>
+          <w:rFonts w:ascii="Arial" w:hAnsi="Arial" w:cs="Arial"/>
+          <w:sz w:val="20"/>
+          <w:szCs w:val="20"/>
+        </w:rPr>
+        <w:t xml:space="preserve">As an interdisciplinary topic, this thesis is partly covered by </w:t>
+      </w:r>
+      <w:r>
+        <w:rPr>
+          <w:rFonts w:ascii="Arial" w:hAnsi="Arial" w:cs="Arial"/>
+          <w:i/>
+          <w:iCs/>
+          <w:sz w:val="20"/>
+          <w:szCs w:val="20"/>
+        </w:rPr>
+        <w:t>signalling</w:t>
+      </w:r>
+      <w:r>
+        <w:rPr>
+          <w:rFonts w:ascii="Arial" w:hAnsi="Arial" w:cs="Arial"/>
+          <w:sz w:val="20"/>
+          <w:szCs w:val="20"/>
+        </w:rPr>
+        <w:t xml:space="preserve"> (</w:t>
+      </w:r>
+      <w:commentRangeStart w:id="5"/>
+      <w:r>
+        <w:rPr>
+          <w:rFonts w:ascii="Arial" w:hAnsi="Arial" w:cs="Arial"/>
+          <w:sz w:val="20"/>
+          <w:szCs w:val="20"/>
+        </w:rPr>
+        <w:t>psychology</w:t>
+      </w:r>
+      <w:commentRangeEnd w:id="5"/>
+      <w:r>
+        <w:rPr>
+          <w:rStyle w:val="CommentReference"/>
+          <w:rFonts w:ascii="Arial" w:hAnsi="Arial" w:cs="Arial"/>
+        </w:rPr>
+        <w:commentReference w:id="5"/>
+      </w:r>
+      <w:r>
+        <w:rPr>
+          <w:rFonts w:ascii="Arial" w:hAnsi="Arial" w:cs="Arial"/>
+          <w:sz w:val="20"/>
+          <w:szCs w:val="20"/>
+        </w:rPr>
+        <w:t xml:space="preserve">), </w:t>
+      </w:r>
+      <w:r>
+        <w:rPr>
+          <w:rFonts w:ascii="Arial" w:hAnsi="Arial" w:cs="Arial"/>
+          <w:i/>
+          <w:iCs/>
+          <w:sz w:val="20"/>
+          <w:szCs w:val="20"/>
+        </w:rPr>
+        <w:t>applicant</w:t>
+      </w:r>
+      <w:r>
+        <w:rPr>
+          <w:rFonts w:ascii="Arial" w:hAnsi="Arial" w:cs="Arial"/>
+          <w:sz w:val="20"/>
+          <w:szCs w:val="20"/>
+        </w:rPr>
+        <w:t xml:space="preserve"> </w:t>
+      </w:r>
+      <w:r>
+        <w:rPr>
+          <w:rFonts w:ascii="Arial" w:hAnsi="Arial" w:cs="Arial"/>
+          <w:i/>
+          <w:iCs/>
+          <w:sz w:val="20"/>
+          <w:szCs w:val="20"/>
+        </w:rPr>
+        <w:t>attraction</w:t>
+      </w:r>
+      <w:r>
+        <w:rPr>
+          <w:rFonts w:ascii="Arial" w:hAnsi="Arial" w:cs="Arial"/>
+          <w:sz w:val="20"/>
+          <w:szCs w:val="20"/>
+        </w:rPr>
+        <w:t xml:space="preserve"> (HRM), </w:t>
+      </w:r>
+      <w:r>
+        <w:rPr>
+          <w:rFonts w:ascii="Arial" w:hAnsi="Arial" w:cs="Arial"/>
+          <w:i/>
+          <w:iCs/>
+          <w:sz w:val="20"/>
+          <w:szCs w:val="20"/>
+        </w:rPr>
+        <w:t>employee</w:t>
+      </w:r>
+      <w:r>
+        <w:rPr>
+          <w:rFonts w:ascii="Arial" w:hAnsi="Arial" w:cs="Arial"/>
+          <w:sz w:val="20"/>
+          <w:szCs w:val="20"/>
+        </w:rPr>
+        <w:t xml:space="preserve"> </w:t>
+      </w:r>
+      <w:r>
+        <w:rPr>
+          <w:rFonts w:ascii="Arial" w:hAnsi="Arial" w:cs="Arial"/>
+          <w:i/>
+          <w:iCs/>
+          <w:sz w:val="20"/>
+          <w:szCs w:val="20"/>
+        </w:rPr>
+        <w:t>wellbeing</w:t>
+      </w:r>
+      <w:r>
+        <w:rPr>
+          <w:rFonts w:ascii="Arial" w:hAnsi="Arial" w:cs="Arial"/>
+          <w:sz w:val="20"/>
+          <w:szCs w:val="20"/>
+        </w:rPr>
+        <w:t xml:space="preserve"> (HRM) and </w:t>
+      </w:r>
+      <w:r>
+        <w:rPr>
+          <w:rFonts w:ascii="Arial" w:hAnsi="Arial" w:cs="Arial"/>
+          <w:i/>
+          <w:iCs/>
+          <w:sz w:val="20"/>
+          <w:szCs w:val="20"/>
+        </w:rPr>
+        <w:t>labour</w:t>
+      </w:r>
+      <w:r>
+        <w:rPr>
+          <w:rFonts w:ascii="Arial" w:hAnsi="Arial" w:cs="Arial"/>
+          <w:sz w:val="20"/>
+          <w:szCs w:val="20"/>
+        </w:rPr>
+        <w:t xml:space="preserve"> </w:t>
+      </w:r>
+      <w:r>
+        <w:rPr>
+          <w:rFonts w:ascii="Arial" w:hAnsi="Arial" w:cs="Arial"/>
+          <w:i/>
+          <w:iCs/>
+          <w:sz w:val="20"/>
+          <w:szCs w:val="20"/>
+        </w:rPr>
+        <w:t>market</w:t>
+      </w:r>
+      <w:r>
+        <w:rPr>
+          <w:rFonts w:ascii="Arial" w:hAnsi="Arial" w:cs="Arial"/>
+          <w:sz w:val="20"/>
+          <w:szCs w:val="20"/>
+        </w:rPr>
+        <w:t xml:space="preserve"> </w:t>
+      </w:r>
+      <w:r>
+        <w:rPr>
+          <w:rFonts w:ascii="Arial" w:hAnsi="Arial" w:cs="Arial"/>
+          <w:i/>
+          <w:iCs/>
+          <w:sz w:val="20"/>
+          <w:szCs w:val="20"/>
+        </w:rPr>
+        <w:t>analysis</w:t>
+      </w:r>
+      <w:r>
+        <w:rPr>
+          <w:rFonts w:ascii="Arial" w:hAnsi="Arial" w:cs="Arial"/>
+          <w:sz w:val="20"/>
+          <w:szCs w:val="20"/>
+        </w:rPr>
+        <w:t xml:space="preserve"> (game theory). </w:t>
+      </w:r>
     </w:p>
     <w:p>
       <w:pPr>
@@ -2683,81 +3303,25 @@
           <w:szCs w:val="20"/>
         </w:rPr>
       </w:pPr>
-      <w:r>
-        <w:rPr>
-          <w:rFonts w:ascii="Arial" w:hAnsi="Arial" w:cs="Arial"/>
-          <w:sz w:val="20"/>
-          <w:szCs w:val="20"/>
-        </w:rPr>
-        <w:t>Th</w:t>
-      </w:r>
-      <w:r>
-        <w:rPr>
-          <w:rFonts w:ascii="Arial" w:hAnsi="Arial" w:cs="Arial"/>
-          <w:sz w:val="20"/>
-          <w:szCs w:val="20"/>
-        </w:rPr>
-        <w:t xml:space="preserve">e aforementioned </w:t>
-      </w:r>
-      <w:r>
-        <w:rPr>
-          <w:rFonts w:ascii="Arial" w:hAnsi="Arial" w:cs="Arial"/>
-          <w:sz w:val="20"/>
-          <w:szCs w:val="20"/>
-        </w:rPr>
-        <w:t>is important for several reasons, not least for the intrinsic motivation of the employee but also on grounds of fairness and positive discrimination. I am aiming to study how neurodiverse applicants perceive resource-based HRM (what we call the RBV in HRM theory) and how RBV approaches, which are inherently focused on creating competitive advantage link to recruitment signalling during the applicant journey. I am hoping to investigate several hypotheses (which I have cited in my PhD proposal) which will form the backbone of the research study, and which will either confirm the work of </w:t>
-      </w:r>
-      <w:r>
-        <w:rPr>
-          <w:rFonts w:ascii="Arial" w:hAnsi="Arial" w:cs="Arial"/>
-          <w:b/>
-          <w:bCs/>
-          <w:sz w:val="20"/>
-          <w:szCs w:val="20"/>
-        </w:rPr>
-        <w:t>Miller and Doyle (2025)</w:t>
-      </w:r>
-      <w:r>
-        <w:rPr>
-          <w:rFonts w:ascii="Arial" w:hAnsi="Arial" w:cs="Arial"/>
-          <w:sz w:val="20"/>
-          <w:szCs w:val="20"/>
-        </w:rPr>
-        <w:t xml:space="preserve"> or reject the premise of their recent research study. I also plan to extend Miller and Doyle's work to study anonymous responses from applicants with </w:t>
-      </w:r>
-      <w:r>
-        <w:rPr>
-          <w:rFonts w:ascii="Arial" w:hAnsi="Arial" w:cs="Arial"/>
-          <w:sz w:val="20"/>
-          <w:szCs w:val="20"/>
-        </w:rPr>
-        <w:t>bipolar disorder</w:t>
-      </w:r>
-      <w:r>
-        <w:rPr>
-          <w:rFonts w:ascii="Arial" w:hAnsi="Arial" w:cs="Arial"/>
-          <w:sz w:val="20"/>
-          <w:szCs w:val="20"/>
-        </w:rPr>
-        <w:t xml:space="preserve"> (a condition that is </w:t>
-      </w:r>
-      <w:r>
-        <w:rPr>
-          <w:rFonts w:ascii="Arial" w:hAnsi="Arial" w:cs="Arial"/>
-          <w:b/>
-          <w:bCs/>
-          <w:sz w:val="20"/>
-          <w:szCs w:val="20"/>
-        </w:rPr>
-        <w:t>widely considered</w:t>
-      </w:r>
-      <w:r>
-        <w:rPr>
-          <w:rFonts w:ascii="Arial" w:hAnsi="Arial" w:cs="Arial"/>
-          <w:sz w:val="20"/>
-          <w:szCs w:val="20"/>
-        </w:rPr>
-        <w:t> as neurodivergent but was omitted from their empirical study).</w:t>
+    </w:p>
+    <w:p>
+      <w:pPr>
+        <w:spacing w:after="0" w:line="240" w:lineRule="auto"/>
+        <w:contextualSpacing/>
+        <w:jc w:val="both"/>
+        <w:rPr>
+          <w:rFonts w:ascii="Arial" w:hAnsi="Arial" w:cs="Arial"/>
+          <w:sz w:val="20"/>
+          <w:szCs w:val="20"/>
+        </w:rPr>
+      </w:pPr>
+      <w:r>
+        <w:rPr>
+          <w:rFonts w:ascii="Arial" w:hAnsi="Arial" w:cs="Arial"/>
+          <w:sz w:val="20"/>
+          <w:szCs w:val="20"/>
+        </w:rPr>
+        <w:t>As I am deeply intrigued by the sort of opportunities available to young and neurodiverse job applicants and how these opportunities are perceived by those who apply, I have chosen a topic that investigates an instance and prevalent gap in the literature on hiring technology and perceptions of website recruitment processes by neurodiverse applicants (Miller and Doyle, 2025). I have devised a set of five hypothesis to outline the direction which I would like the research to follow, and which resulted in the research question I have settled on.</w:t>
       </w:r>
     </w:p>
     <w:p>
@@ -2766,22 +3330,14 @@
         <w:contextualSpacing/>
         <w:jc w:val="both"/>
         <w:rPr>
-          <w:rFonts w:ascii="Arial" w:hAnsi="Arial" w:cs="Arial"/>
-          <w:color w:val="auto"/>
-        </w:rPr>
-      </w:pPr>
-      <w:bookmarkStart w:id="2" w:name="_Toc221107084"/>
-      <w:r>
-        <w:rPr>
           <w:rStyle w:val="Strong"/>
           <w:rFonts w:ascii="Arial" w:hAnsi="Arial" w:cs="Arial"/>
           <w:b w:val="0"/>
           <w:bCs w:val="0"/>
           <w:color w:val="auto"/>
         </w:rPr>
-        <w:lastRenderedPageBreak/>
-        <w:t>1.12</w:t>
-      </w:r>
+      </w:pPr>
+      <w:bookmarkStart w:id="6" w:name="_Toc221107085"/>
       <w:r>
         <w:rPr>
           <w:rStyle w:val="Strong"/>
@@ -2790,7 +3346,7 @@
           <w:bCs w:val="0"/>
           <w:color w:val="auto"/>
         </w:rPr>
-        <w:t xml:space="preserve"> </w:t>
+        <w:t>1.</w:t>
       </w:r>
       <w:r>
         <w:rPr>
@@ -2800,9 +3356,39 @@
           <w:bCs w:val="0"/>
           <w:color w:val="auto"/>
         </w:rPr>
-        <w:t>Introduction</w:t>
-      </w:r>
-      <w:bookmarkEnd w:id="2"/>
+        <w:t>13</w:t>
+      </w:r>
+      <w:r>
+        <w:rPr>
+          <w:rStyle w:val="Strong"/>
+          <w:rFonts w:ascii="Arial" w:hAnsi="Arial" w:cs="Arial"/>
+          <w:b w:val="0"/>
+          <w:bCs w:val="0"/>
+          <w:color w:val="auto"/>
+        </w:rPr>
+        <w:t xml:space="preserve"> </w:t>
+      </w:r>
+      <w:r>
+        <w:rPr>
+          <w:rStyle w:val="Strong"/>
+          <w:rFonts w:ascii="Arial" w:hAnsi="Arial" w:cs="Arial"/>
+          <w:b w:val="0"/>
+          <w:bCs w:val="0"/>
+          <w:color w:val="auto"/>
+        </w:rPr>
+        <w:t xml:space="preserve">Research </w:t>
+      </w:r>
+      <w:r>
+        <w:rPr>
+          <w:rStyle w:val="Strong"/>
+          <w:rFonts w:ascii="Arial" w:hAnsi="Arial" w:cs="Arial"/>
+          <w:b w:val="0"/>
+          <w:bCs w:val="0"/>
+          <w:color w:val="auto"/>
+        </w:rPr>
+        <w:t>Methodology</w:t>
+      </w:r>
+      <w:bookmarkEnd w:id="6"/>
     </w:p>
     <w:p>
       <w:pPr>
@@ -2821,50 +3407,39 @@
           <w:sz w:val="20"/>
           <w:szCs w:val="20"/>
         </w:rPr>
-        <w:t>Given that recent research demonstrates how neuro</w:t>
-      </w:r>
-      <w:r>
-        <w:rPr>
-          <w:rFonts w:ascii="Arial" w:hAnsi="Arial" w:cs="Arial"/>
-          <w:sz w:val="20"/>
-          <w:szCs w:val="20"/>
-        </w:rPr>
-        <w:t>inclusive</w:t>
-      </w:r>
-      <w:r>
-        <w:rPr>
-          <w:rFonts w:ascii="Arial" w:hAnsi="Arial" w:cs="Arial"/>
-          <w:sz w:val="20"/>
-          <w:szCs w:val="20"/>
-        </w:rPr>
-        <w:t xml:space="preserve"> teams can be 30% more productive than those which do not include neurodiverse employees (NatWest Mentor, 2025), and with Gen Z entering the workforce – over 50% of whom have some sort of neurodivergent condition</w:t>
-      </w:r>
-      <w:commentRangeStart w:id="3"/>
-      <w:commentRangeStart w:id="4"/>
-      <w:r>
-        <w:rPr>
-          <w:rStyle w:val="FootnoteReference"/>
-          <w:rFonts w:ascii="Arial" w:hAnsi="Arial" w:cs="Arial"/>
-          <w:sz w:val="20"/>
-          <w:szCs w:val="20"/>
-        </w:rPr>
-        <w:footnoteReference w:id="2"/>
-      </w:r>
-      <w:commentRangeEnd w:id="3"/>
-      <w:r>
-        <w:rPr>
-          <w:rStyle w:val="CommentReference"/>
-          <w:rFonts w:ascii="Arial" w:hAnsi="Arial" w:cs="Arial"/>
-        </w:rPr>
-        <w:commentReference w:id="3"/>
-      </w:r>
-      <w:commentRangeEnd w:id="4"/>
-      <w:r>
-        <w:rPr>
-          <w:rStyle w:val="CommentReference"/>
-          <w:rFonts w:ascii="Arial" w:hAnsi="Arial" w:cs="Arial"/>
-        </w:rPr>
-        <w:commentReference w:id="4"/>
+        <w:t xml:space="preserve">From the very outset I </w:t>
+      </w:r>
+      <w:r>
+        <w:rPr>
+          <w:rFonts w:ascii="Arial" w:hAnsi="Arial" w:cs="Arial"/>
+          <w:sz w:val="20"/>
+          <w:szCs w:val="20"/>
+        </w:rPr>
+        <w:t>will</w:t>
+      </w:r>
+      <w:r>
+        <w:rPr>
+          <w:rFonts w:ascii="Arial" w:hAnsi="Arial" w:cs="Arial"/>
+          <w:sz w:val="20"/>
+          <w:szCs w:val="20"/>
+        </w:rPr>
+        <w:t xml:space="preserve"> be</w:t>
+      </w:r>
+      <w:r>
+        <w:rPr>
+          <w:rFonts w:ascii="Arial" w:hAnsi="Arial" w:cs="Arial"/>
+          <w:sz w:val="20"/>
+          <w:szCs w:val="20"/>
+        </w:rPr>
+        <w:t xml:space="preserve"> aim</w:t>
+      </w:r>
+      <w:r>
+        <w:rPr>
+          <w:rFonts w:ascii="Arial" w:hAnsi="Arial" w:cs="Arial"/>
+          <w:sz w:val="20"/>
+          <w:szCs w:val="20"/>
+        </w:rPr>
+        <w:t>ing</w:t>
       </w:r>
       <w:r>
         <w:rPr>
@@ -2880,21 +3455,37 @@
           <w:sz w:val="20"/>
           <w:szCs w:val="20"/>
         </w:rPr>
-        <w:t xml:space="preserve">- either Autism Spectrum Disorder or Bipolar Disorder </w:t>
-      </w:r>
-      <w:r>
-        <w:rPr>
-          <w:rFonts w:ascii="Arial" w:hAnsi="Arial" w:cs="Arial"/>
-          <w:sz w:val="20"/>
-          <w:szCs w:val="20"/>
-        </w:rPr>
-        <w:t xml:space="preserve">(Forbes Magazine, 2025), the broad research topic I have selected to follow for this module is a contemporary problem with its roots in a recent report </w:t>
-      </w:r>
-      <w:r>
-        <w:rPr>
-          <w:rFonts w:ascii="Arial" w:hAnsi="Arial" w:cs="Arial"/>
-          <w:sz w:val="22"/>
-          <w:szCs w:val="22"/>
+        <w:t xml:space="preserve">to utilise a deductive approach for this </w:t>
+      </w:r>
+      <w:r>
+        <w:rPr>
+          <w:rFonts w:ascii="Arial" w:hAnsi="Arial" w:cs="Arial"/>
+          <w:sz w:val="20"/>
+          <w:szCs w:val="20"/>
+        </w:rPr>
+        <w:t xml:space="preserve">MSc </w:t>
+      </w:r>
+      <w:r>
+        <w:rPr>
+          <w:rFonts w:ascii="Arial" w:hAnsi="Arial" w:cs="Arial"/>
+          <w:sz w:val="20"/>
+          <w:szCs w:val="20"/>
+        </w:rPr>
+        <w:t xml:space="preserve">in HRM </w:t>
+      </w:r>
+      <w:r>
+        <w:rPr>
+          <w:rFonts w:ascii="Arial" w:hAnsi="Arial" w:cs="Arial"/>
+          <w:sz w:val="20"/>
+          <w:szCs w:val="20"/>
+        </w:rPr>
+        <w:t xml:space="preserve">research study </w:t>
+      </w:r>
+      <w:r>
+        <w:rPr>
+          <w:rFonts w:ascii="Arial" w:hAnsi="Arial" w:cs="Arial"/>
+          <w:sz w:val="20"/>
+          <w:szCs w:val="20"/>
         </w:rPr>
         <w:t>(</w:t>
       </w:r>
@@ -2904,76 +3495,15 @@
           <w:sz w:val="20"/>
           <w:szCs w:val="20"/>
         </w:rPr>
-        <w:t>Youth Future’s Foundation, 2025)</w:t>
-      </w:r>
-      <w:r>
-        <w:rPr>
-          <w:rFonts w:ascii="Arial" w:hAnsi="Arial" w:cs="Arial"/>
-          <w:sz w:val="22"/>
-          <w:szCs w:val="22"/>
-        </w:rPr>
-        <w:t xml:space="preserve">. </w:t>
-      </w:r>
-      <w:r>
-        <w:rPr>
-          <w:rFonts w:ascii="Arial" w:hAnsi="Arial" w:cs="Arial"/>
-          <w:sz w:val="20"/>
-          <w:szCs w:val="20"/>
-        </w:rPr>
-        <w:t xml:space="preserve">As an interdisciplinary topic, this thesis is partly covered by </w:t>
-      </w:r>
-      <w:r>
-        <w:rPr>
-          <w:rFonts w:ascii="Arial" w:hAnsi="Arial" w:cs="Arial"/>
-          <w:i/>
-          <w:iCs/>
-          <w:sz w:val="20"/>
-          <w:szCs w:val="20"/>
-        </w:rPr>
-        <w:t>signalling</w:t>
-      </w:r>
-      <w:r>
-        <w:rPr>
-          <w:rFonts w:ascii="Arial" w:hAnsi="Arial" w:cs="Arial"/>
-          <w:sz w:val="20"/>
-          <w:szCs w:val="20"/>
-        </w:rPr>
-        <w:t xml:space="preserve"> (</w:t>
-      </w:r>
-      <w:commentRangeStart w:id="5"/>
-      <w:r>
-        <w:rPr>
-          <w:rFonts w:ascii="Arial" w:hAnsi="Arial" w:cs="Arial"/>
-          <w:sz w:val="20"/>
-          <w:szCs w:val="20"/>
-        </w:rPr>
-        <w:t>psychology</w:t>
-      </w:r>
-      <w:commentRangeEnd w:id="5"/>
-      <w:r>
-        <w:rPr>
-          <w:rStyle w:val="CommentReference"/>
-          <w:rFonts w:ascii="Arial" w:hAnsi="Arial" w:cs="Arial"/>
-        </w:rPr>
-        <w:commentReference w:id="5"/>
-      </w:r>
-      <w:r>
-        <w:rPr>
-          <w:rFonts w:ascii="Arial" w:hAnsi="Arial" w:cs="Arial"/>
-          <w:sz w:val="20"/>
-          <w:szCs w:val="20"/>
-        </w:rPr>
-        <w:t xml:space="preserve">), </w:t>
-      </w:r>
-      <w:r>
-        <w:rPr>
-          <w:rFonts w:ascii="Arial" w:hAnsi="Arial" w:cs="Arial"/>
-          <w:i/>
-          <w:iCs/>
-          <w:sz w:val="20"/>
-          <w:szCs w:val="20"/>
-        </w:rPr>
-        <w:t>applicant</w:t>
+        <w:t xml:space="preserve">which </w:t>
+      </w:r>
+      <w:r>
+        <w:rPr>
+          <w:rFonts w:ascii="Arial" w:hAnsi="Arial" w:cs="Arial"/>
+          <w:sz w:val="20"/>
+          <w:szCs w:val="20"/>
+        </w:rPr>
+        <w:t>incorporates</w:t>
       </w:r>
       <w:r>
         <w:rPr>
@@ -2986,30 +3516,50 @@
       <w:r>
         <w:rPr>
           <w:rFonts w:ascii="Arial" w:hAnsi="Arial" w:cs="Arial"/>
-          <w:i/>
-          <w:iCs/>
-          <w:sz w:val="20"/>
-          <w:szCs w:val="20"/>
-        </w:rPr>
-        <w:t>attraction</w:t>
-      </w:r>
-      <w:r>
-        <w:rPr>
-          <w:rFonts w:ascii="Arial" w:hAnsi="Arial" w:cs="Arial"/>
-          <w:sz w:val="20"/>
-          <w:szCs w:val="20"/>
-        </w:rPr>
-        <w:t xml:space="preserve"> (HRM), </w:t>
-      </w:r>
-      <w:r>
-        <w:rPr>
-          <w:rFonts w:ascii="Arial" w:hAnsi="Arial" w:cs="Arial"/>
-          <w:i/>
-          <w:iCs/>
-          <w:sz w:val="20"/>
-          <w:szCs w:val="20"/>
-        </w:rPr>
-        <w:t>employee</w:t>
+          <w:sz w:val="20"/>
+          <w:szCs w:val="20"/>
+        </w:rPr>
+        <w:t>sentiment analysis and a</w:t>
+      </w:r>
+      <w:r>
+        <w:rPr>
+          <w:rFonts w:ascii="Arial" w:hAnsi="Arial" w:cs="Arial"/>
+          <w:sz w:val="20"/>
+          <w:szCs w:val="20"/>
+        </w:rPr>
+        <w:t>n open-ended questionnaire</w:t>
+      </w:r>
+      <w:r>
+        <w:rPr>
+          <w:rFonts w:ascii="Arial" w:hAnsi="Arial" w:cs="Arial"/>
+          <w:sz w:val="20"/>
+          <w:szCs w:val="20"/>
+        </w:rPr>
+        <w:t xml:space="preserve"> to answer the question as to how Black neurodiverse candidates can best </w:t>
+      </w:r>
+      <w:r>
+        <w:rPr>
+          <w:rFonts w:ascii="Arial" w:hAnsi="Arial" w:cs="Arial"/>
+          <w:sz w:val="20"/>
+          <w:szCs w:val="20"/>
+        </w:rPr>
+        <w:t>be catered for in</w:t>
+      </w:r>
+      <w:r>
+        <w:rPr>
+          <w:rFonts w:ascii="Arial" w:hAnsi="Arial" w:cs="Arial"/>
+          <w:sz w:val="20"/>
+          <w:szCs w:val="20"/>
+        </w:rPr>
+        <w:t>)</w:t>
+      </w:r>
+      <w:r>
+        <w:rPr>
+          <w:rFonts w:ascii="Arial" w:hAnsi="Arial" w:cs="Arial"/>
+          <w:sz w:val="20"/>
+          <w:szCs w:val="20"/>
+        </w:rPr>
+        <w:t xml:space="preserve"> by</w:t>
       </w:r>
       <w:r>
         <w:rPr>
@@ -3022,320 +3572,10 @@
       <w:r>
         <w:rPr>
           <w:rFonts w:ascii="Arial" w:hAnsi="Arial" w:cs="Arial"/>
-          <w:i/>
-          <w:iCs/>
-          <w:sz w:val="20"/>
-          <w:szCs w:val="20"/>
-        </w:rPr>
-        <w:t>wellbeing</w:t>
-      </w:r>
-      <w:r>
-        <w:rPr>
-          <w:rFonts w:ascii="Arial" w:hAnsi="Arial" w:cs="Arial"/>
-          <w:sz w:val="20"/>
-          <w:szCs w:val="20"/>
-        </w:rPr>
-        <w:t xml:space="preserve"> (HRM) and </w:t>
-      </w:r>
-      <w:r>
-        <w:rPr>
-          <w:rFonts w:ascii="Arial" w:hAnsi="Arial" w:cs="Arial"/>
-          <w:i/>
-          <w:iCs/>
-          <w:sz w:val="20"/>
-          <w:szCs w:val="20"/>
-        </w:rPr>
-        <w:t>labour</w:t>
-      </w:r>
-      <w:r>
-        <w:rPr>
-          <w:rFonts w:ascii="Arial" w:hAnsi="Arial" w:cs="Arial"/>
-          <w:sz w:val="20"/>
-          <w:szCs w:val="20"/>
-        </w:rPr>
-        <w:t xml:space="preserve"> </w:t>
-      </w:r>
-      <w:r>
-        <w:rPr>
-          <w:rFonts w:ascii="Arial" w:hAnsi="Arial" w:cs="Arial"/>
-          <w:i/>
-          <w:iCs/>
-          <w:sz w:val="20"/>
-          <w:szCs w:val="20"/>
-        </w:rPr>
-        <w:t>market</w:t>
-      </w:r>
-      <w:r>
-        <w:rPr>
-          <w:rFonts w:ascii="Arial" w:hAnsi="Arial" w:cs="Arial"/>
-          <w:sz w:val="20"/>
-          <w:szCs w:val="20"/>
-        </w:rPr>
-        <w:t xml:space="preserve"> </w:t>
-      </w:r>
-      <w:r>
-        <w:rPr>
-          <w:rFonts w:ascii="Arial" w:hAnsi="Arial" w:cs="Arial"/>
-          <w:i/>
-          <w:iCs/>
-          <w:sz w:val="20"/>
-          <w:szCs w:val="20"/>
-        </w:rPr>
-        <w:t>analysis</w:t>
-      </w:r>
-      <w:r>
-        <w:rPr>
-          <w:rFonts w:ascii="Arial" w:hAnsi="Arial" w:cs="Arial"/>
-          <w:sz w:val="20"/>
-          <w:szCs w:val="20"/>
-        </w:rPr>
-        <w:t xml:space="preserve"> (game theory). </w:t>
-      </w:r>
-    </w:p>
-    <w:p>
-      <w:pPr>
-        <w:spacing w:after="0" w:line="240" w:lineRule="auto"/>
-        <w:contextualSpacing/>
-        <w:jc w:val="both"/>
-        <w:rPr>
-          <w:rFonts w:ascii="Arial" w:hAnsi="Arial" w:cs="Arial"/>
-          <w:sz w:val="20"/>
-          <w:szCs w:val="20"/>
-        </w:rPr>
-      </w:pPr>
-    </w:p>
-    <w:p>
-      <w:pPr>
-        <w:spacing w:after="0" w:line="240" w:lineRule="auto"/>
-        <w:contextualSpacing/>
-        <w:jc w:val="both"/>
-        <w:rPr>
-          <w:rFonts w:ascii="Arial" w:hAnsi="Arial" w:cs="Arial"/>
-          <w:sz w:val="20"/>
-          <w:szCs w:val="20"/>
-        </w:rPr>
-      </w:pPr>
-      <w:r>
-        <w:rPr>
-          <w:rFonts w:ascii="Arial" w:hAnsi="Arial" w:cs="Arial"/>
-          <w:sz w:val="20"/>
-          <w:szCs w:val="20"/>
-        </w:rPr>
-        <w:t>As I am deeply intrigued by the sort of opportunities available to young and neurodiverse job applicants and how these opportunities are perceived by those who apply, I have chosen a topic that investigates an instance and prevalent gap in the literature on hiring technology and perceptions of website recruitment processes by neurodiverse applicants (Miller and Doyle, 2025). I have devised a set of five hypothesis to outline the direction which I would like the research to follow, and which resulted in the research question I have settled on.</w:t>
-      </w:r>
-    </w:p>
-    <w:p>
-      <w:pPr>
-        <w:pStyle w:val="Heading2"/>
-        <w:contextualSpacing/>
-        <w:jc w:val="both"/>
-        <w:rPr>
-          <w:rStyle w:val="Strong"/>
-          <w:rFonts w:ascii="Arial" w:hAnsi="Arial" w:cs="Arial"/>
-          <w:b w:val="0"/>
-          <w:bCs w:val="0"/>
-          <w:color w:val="auto"/>
-        </w:rPr>
-      </w:pPr>
-      <w:bookmarkStart w:id="6" w:name="_Toc221107085"/>
-      <w:r>
-        <w:rPr>
-          <w:rStyle w:val="Strong"/>
-          <w:rFonts w:ascii="Arial" w:hAnsi="Arial" w:cs="Arial"/>
-          <w:b w:val="0"/>
-          <w:bCs w:val="0"/>
-          <w:color w:val="auto"/>
-        </w:rPr>
-        <w:t>1.</w:t>
-      </w:r>
-      <w:r>
-        <w:rPr>
-          <w:rStyle w:val="Strong"/>
-          <w:rFonts w:ascii="Arial" w:hAnsi="Arial" w:cs="Arial"/>
-          <w:b w:val="0"/>
-          <w:bCs w:val="0"/>
-          <w:color w:val="auto"/>
-        </w:rPr>
-        <w:t>13</w:t>
-      </w:r>
-      <w:r>
-        <w:rPr>
-          <w:rStyle w:val="Strong"/>
-          <w:rFonts w:ascii="Arial" w:hAnsi="Arial" w:cs="Arial"/>
-          <w:b w:val="0"/>
-          <w:bCs w:val="0"/>
-          <w:color w:val="auto"/>
-        </w:rPr>
-        <w:t xml:space="preserve"> </w:t>
-      </w:r>
-      <w:r>
-        <w:rPr>
-          <w:rStyle w:val="Strong"/>
-          <w:rFonts w:ascii="Arial" w:hAnsi="Arial" w:cs="Arial"/>
-          <w:b w:val="0"/>
-          <w:bCs w:val="0"/>
-          <w:color w:val="auto"/>
-        </w:rPr>
-        <w:t xml:space="preserve">Research </w:t>
-      </w:r>
-      <w:r>
-        <w:rPr>
-          <w:rStyle w:val="Strong"/>
-          <w:rFonts w:ascii="Arial" w:hAnsi="Arial" w:cs="Arial"/>
-          <w:b w:val="0"/>
-          <w:bCs w:val="0"/>
-          <w:color w:val="auto"/>
-        </w:rPr>
-        <w:t>Methodology</w:t>
-      </w:r>
-      <w:bookmarkEnd w:id="6"/>
-    </w:p>
-    <w:p>
-      <w:pPr>
-        <w:spacing w:after="0" w:line="240" w:lineRule="auto"/>
-        <w:contextualSpacing/>
-        <w:jc w:val="both"/>
-        <w:rPr>
-          <w:rFonts w:ascii="Arial" w:hAnsi="Arial" w:cs="Arial"/>
-          <w:sz w:val="20"/>
-          <w:szCs w:val="20"/>
-        </w:rPr>
-      </w:pPr>
-      <w:r>
-        <w:rPr>
-          <w:rFonts w:ascii="Arial" w:hAnsi="Arial" w:cs="Arial"/>
-          <w:sz w:val="20"/>
-          <w:szCs w:val="20"/>
-        </w:rPr>
-        <w:t>For th</w:t>
-      </w:r>
-      <w:r>
-        <w:rPr>
-          <w:rFonts w:ascii="Arial" w:hAnsi="Arial" w:cs="Arial"/>
-          <w:sz w:val="20"/>
-          <w:szCs w:val="20"/>
-        </w:rPr>
-        <w:t xml:space="preserve">is </w:t>
-      </w:r>
-      <w:r>
-        <w:rPr>
-          <w:rFonts w:ascii="Arial" w:hAnsi="Arial" w:cs="Arial"/>
-          <w:sz w:val="20"/>
-          <w:szCs w:val="20"/>
-        </w:rPr>
-        <w:t xml:space="preserve">Masters’ </w:t>
-      </w:r>
-      <w:r>
-        <w:rPr>
-          <w:rFonts w:ascii="Arial" w:hAnsi="Arial" w:cs="Arial"/>
-          <w:sz w:val="20"/>
-          <w:szCs w:val="20"/>
-        </w:rPr>
-        <w:t>thesis, I will</w:t>
-      </w:r>
-      <w:r>
-        <w:rPr>
-          <w:rFonts w:ascii="Arial" w:hAnsi="Arial" w:cs="Arial"/>
-          <w:sz w:val="20"/>
-          <w:szCs w:val="20"/>
-        </w:rPr>
-        <w:t xml:space="preserve"> be</w:t>
-      </w:r>
-      <w:r>
-        <w:rPr>
-          <w:rFonts w:ascii="Arial" w:hAnsi="Arial" w:cs="Arial"/>
-          <w:sz w:val="20"/>
-          <w:szCs w:val="20"/>
-        </w:rPr>
-        <w:t xml:space="preserve"> aim</w:t>
-      </w:r>
-      <w:r>
-        <w:rPr>
-          <w:rFonts w:ascii="Arial" w:hAnsi="Arial" w:cs="Arial"/>
-          <w:sz w:val="20"/>
-          <w:szCs w:val="20"/>
-        </w:rPr>
-        <w:t>ing</w:t>
-      </w:r>
-      <w:r>
-        <w:rPr>
-          <w:rFonts w:ascii="Arial" w:hAnsi="Arial" w:cs="Arial"/>
-          <w:sz w:val="20"/>
-          <w:szCs w:val="20"/>
-        </w:rPr>
-        <w:t xml:space="preserve"> to build on the MSc </w:t>
-      </w:r>
-      <w:r>
-        <w:rPr>
-          <w:rFonts w:ascii="Arial" w:hAnsi="Arial" w:cs="Arial"/>
-          <w:sz w:val="20"/>
-          <w:szCs w:val="20"/>
-        </w:rPr>
-        <w:t xml:space="preserve">in HRM </w:t>
-      </w:r>
-      <w:r>
-        <w:rPr>
-          <w:rFonts w:ascii="Arial" w:hAnsi="Arial" w:cs="Arial"/>
-          <w:sz w:val="20"/>
-          <w:szCs w:val="20"/>
-        </w:rPr>
-        <w:t xml:space="preserve">research study </w:t>
-      </w:r>
-      <w:r>
-        <w:rPr>
-          <w:rFonts w:ascii="Arial" w:hAnsi="Arial" w:cs="Arial"/>
-          <w:sz w:val="20"/>
-          <w:szCs w:val="20"/>
-        </w:rPr>
-        <w:t>(</w:t>
-      </w:r>
-      <w:r>
-        <w:rPr>
-          <w:rFonts w:ascii="Arial" w:hAnsi="Arial" w:cs="Arial"/>
-          <w:sz w:val="20"/>
-          <w:szCs w:val="20"/>
-        </w:rPr>
-        <w:t xml:space="preserve">which </w:t>
-      </w:r>
-      <w:r>
-        <w:rPr>
-          <w:rFonts w:ascii="Arial" w:hAnsi="Arial" w:cs="Arial"/>
-          <w:sz w:val="20"/>
-          <w:szCs w:val="20"/>
-        </w:rPr>
-        <w:t>applies</w:t>
-      </w:r>
-      <w:r>
-        <w:rPr>
-          <w:rFonts w:ascii="Arial" w:hAnsi="Arial" w:cs="Arial"/>
-          <w:sz w:val="20"/>
-          <w:szCs w:val="20"/>
-        </w:rPr>
-        <w:t xml:space="preserve"> a sentiment analysis and a questionnaire approach</w:t>
-      </w:r>
-      <w:r>
-        <w:rPr>
-          <w:rFonts w:ascii="Arial" w:hAnsi="Arial" w:cs="Arial"/>
-          <w:sz w:val="20"/>
-          <w:szCs w:val="20"/>
-        </w:rPr>
-        <w:t xml:space="preserve">) </w:t>
-      </w:r>
-      <w:r>
-        <w:rPr>
-          <w:rFonts w:ascii="Arial" w:hAnsi="Arial" w:cs="Arial"/>
-          <w:sz w:val="20"/>
-          <w:szCs w:val="20"/>
-        </w:rPr>
-        <w:t xml:space="preserve">by </w:t>
-      </w:r>
-      <w:r>
-        <w:rPr>
-          <w:rFonts w:ascii="Arial" w:hAnsi="Arial" w:cs="Arial"/>
-          <w:sz w:val="20"/>
-          <w:szCs w:val="20"/>
-        </w:rPr>
-        <w:t xml:space="preserve">conducting empirical analysis of a diverse range of data sets including non-sensitive HR data from companies. </w:t>
+          <w:sz w:val="20"/>
+          <w:szCs w:val="20"/>
+        </w:rPr>
+        <w:t xml:space="preserve">conducting empirical analysis of a diverse range of datasets including non-sensitive HR data. </w:t>
       </w:r>
       <w:r>
         <w:rPr>
@@ -4073,6 +4313,7 @@
           <w:sz w:val="20"/>
           <w:szCs w:val="20"/>
         </w:rPr>
+        <w:lastRenderedPageBreak/>
         <w:t>A high-commitment HRM strategy is pursued and that firms conduct recruitment via a website</w:t>
       </w:r>
     </w:p>
@@ -4097,7 +4338,6 @@
           <w:sz w:val="20"/>
           <w:szCs w:val="20"/>
         </w:rPr>
-        <w:lastRenderedPageBreak/>
         <w:t>The firm may initiate a signal to the receiver via this website about its high-commitment HRM strategy</w:t>
       </w:r>
     </w:p>
@@ -4900,8 +5140,8 @@
         </w:rPr>
       </w:pPr>
       <w:bookmarkStart w:id="21" w:name="_Toc216632807"/>
-      <w:bookmarkStart w:id="22" w:name="_Toc215736438"/>
-      <w:bookmarkStart w:id="23" w:name="_Toc221107088"/>
+      <w:bookmarkStart w:id="22" w:name="_Toc221107088"/>
+      <w:bookmarkStart w:id="23" w:name="_Toc215736438"/>
       <w:r>
         <w:rPr>
           <w:rStyle w:val="Strong"/>
@@ -4953,7 +5193,7 @@
         </w:rPr>
         <w:t xml:space="preserve"> – Literature Review</w:t>
       </w:r>
-      <w:bookmarkEnd w:id="23"/>
+      <w:bookmarkEnd w:id="22"/>
     </w:p>
     <w:p>
       <w:pPr>
@@ -12566,7 +12806,7 @@
         </w:rPr>
       </w:pPr>
       <w:bookmarkStart w:id="34" w:name="_Toc221107096"/>
-      <w:bookmarkEnd w:id="22"/>
+      <w:bookmarkEnd w:id="23"/>
       <w:r>
         <w:rPr>
           <w:rStyle w:val="Strong"/>
@@ -17506,6 +17746,7 @@
   <w:style w:type="character" w:default="1" w:styleId="DefaultParagraphFont">
     <w:name w:val="Default Paragraph Font"/>
     <w:uiPriority w:val="1"/>
+    <w:semiHidden/>
     <w:unhideWhenUsed/>
   </w:style>
   <w:style w:type="table" w:default="1" w:styleId="TableNormal">

</xml_diff>

<commit_message>
Milano Cortina Day 4 changes to files and links
</commit_message>
<xml_diff>
--- a/FBL-PhD-research-proposal.docx
+++ b/FBL-PhD-research-proposal.docx
@@ -151,7 +151,23 @@
           <w:sz w:val="28"/>
           <w:szCs w:val="28"/>
         </w:rPr>
-        <w:t>Neurodiverse Applicants Perceive the Candidate Journey?</w:t>
+        <w:t>Neurodiver</w:t>
+      </w:r>
+      <w:r>
+        <w:rPr>
+          <w:rFonts w:ascii="Arial" w:hAnsi="Arial" w:cs="Arial"/>
+          <w:sz w:val="28"/>
+          <w:szCs w:val="28"/>
+        </w:rPr>
+        <w:t>gent</w:t>
+      </w:r>
+      <w:r>
+        <w:rPr>
+          <w:rFonts w:ascii="Arial" w:hAnsi="Arial" w:cs="Arial"/>
+          <w:sz w:val="28"/>
+          <w:szCs w:val="28"/>
+        </w:rPr>
+        <w:t xml:space="preserve"> Applicants Perceive the Candidate Journey?</w:t>
       </w:r>
     </w:p>
     <w:p>
@@ -2459,7 +2475,27 @@
           <w:sz w:val="20"/>
           <w:szCs w:val="20"/>
         </w:rPr>
-        <w:t>Sir Robert Buckland QC</w:t>
+        <w:t xml:space="preserve">Sir Robert Buckland </w:t>
+      </w:r>
+      <w:r>
+        <w:rPr>
+          <w:rFonts w:ascii="Arial" w:hAnsi="Arial" w:cs="Arial"/>
+          <w:b/>
+          <w:bCs/>
+          <w:sz w:val="20"/>
+          <w:szCs w:val="20"/>
+        </w:rPr>
+        <w:t>K</w:t>
+      </w:r>
+      <w:r>
+        <w:rPr>
+          <w:rFonts w:ascii="Arial" w:hAnsi="Arial" w:cs="Arial"/>
+          <w:b/>
+          <w:bCs/>
+          <w:sz w:val="20"/>
+          <w:szCs w:val="20"/>
+        </w:rPr>
+        <w:t>C</w:t>
       </w:r>
       <w:r>
         <w:rPr>
@@ -2905,7 +2941,23 @@
           <w:sz w:val="20"/>
           <w:szCs w:val="20"/>
         </w:rPr>
-        <w:t>is important for several reasons, not least for the intrinsic motivation of the employee but also on grounds of fairness and positive discrimination. I am aiming to study how neurodiverse applicants perceive resource-based HRM (what we call the RBV in HRM theory) and how RBV approaches, which are inherently focused on creating competitive advantage link to recruitment signalling during the applicant journey. I am hoping to investigate several hypotheses (which I have cited in my PhD proposal) which will form the backbone of the research study, and which will either confirm the work of </w:t>
+        <w:t xml:space="preserve">is important for several reasons, not least for the intrinsic motivation of the employee but also on grounds of fairness and positive discrimination. I am aiming to study how </w:t>
+      </w:r>
+      <w:r>
+        <w:rPr>
+          <w:rFonts w:ascii="Arial" w:hAnsi="Arial" w:cs="Arial"/>
+          <w:sz w:val="20"/>
+          <w:szCs w:val="20"/>
+        </w:rPr>
+        <w:t xml:space="preserve">Black </w:t>
+      </w:r>
+      <w:r>
+        <w:rPr>
+          <w:rFonts w:ascii="Arial" w:hAnsi="Arial" w:cs="Arial"/>
+          <w:sz w:val="20"/>
+          <w:szCs w:val="20"/>
+        </w:rPr>
+        <w:t>neurodiverse applicants perceive resource-based HRM (what we call the RBV in HRM theory) and how RBV approaches, which are inherently focused on creating competitive advantage link to recruitment signalling during the applicant journey. I am hoping to investigate several hypotheses (which I have cited in my PhD proposal) which will form the backbone of the research study, and which will either confirm the work of </w:t>
       </w:r>
       <w:r>
         <w:rPr>

</xml_diff>

<commit_message>
New uploads and various changes
</commit_message>
<xml_diff>
--- a/FBL-PhD-research-proposal.docx
+++ b/FBL-PhD-research-proposal.docx
@@ -135,7 +135,7 @@
           <w:sz w:val="28"/>
           <w:szCs w:val="28"/>
         </w:rPr>
-        <w:t xml:space="preserve">ompared to Conventional Recruitment Approaches, Affect How </w:t>
+        <w:t xml:space="preserve">ompared to Conventional </w:t>
       </w:r>
       <w:r>
         <w:rPr>
@@ -143,7 +143,7 @@
           <w:sz w:val="28"/>
           <w:szCs w:val="28"/>
         </w:rPr>
-        <w:t xml:space="preserve">Black </w:t>
+        <w:t>HRM</w:t>
       </w:r>
       <w:r>
         <w:rPr>
@@ -151,7 +151,7 @@
           <w:sz w:val="28"/>
           <w:szCs w:val="28"/>
         </w:rPr>
-        <w:t>Neurodiver</w:t>
+        <w:t xml:space="preserve"> Approaches, Affect How Neurodiver</w:t>
       </w:r>
       <w:r>
         <w:rPr>
@@ -167,7 +167,23 @@
           <w:sz w:val="28"/>
           <w:szCs w:val="28"/>
         </w:rPr>
-        <w:t xml:space="preserve"> Applicants Perceive the Candidate Journey?</w:t>
+        <w:t xml:space="preserve"> Applicants Perceive the </w:t>
+      </w:r>
+      <w:r>
+        <w:rPr>
+          <w:rFonts w:ascii="Arial" w:hAnsi="Arial" w:cs="Arial"/>
+          <w:sz w:val="28"/>
+          <w:szCs w:val="28"/>
+        </w:rPr>
+        <w:t>Employee</w:t>
+      </w:r>
+      <w:r>
+        <w:rPr>
+          <w:rFonts w:ascii="Arial" w:hAnsi="Arial" w:cs="Arial"/>
+          <w:sz w:val="28"/>
+          <w:szCs w:val="28"/>
+        </w:rPr>
+        <w:t xml:space="preserve"> Journey?</w:t>
       </w:r>
     </w:p>
     <w:p>
@@ -227,7 +243,6 @@
     <w:p>
       <w:pPr>
         <w:contextualSpacing/>
-        <w:jc w:val="center"/>
         <w:rPr>
           <w:rFonts w:ascii="Arial" w:hAnsi="Arial" w:cs="Arial"/>
         </w:rPr>
@@ -239,27 +254,8 @@
         <w:jc w:val="center"/>
         <w:rPr>
           <w:rFonts w:ascii="Arial" w:hAnsi="Arial" w:cs="Arial"/>
-          <w:sz w:val="20"/>
-          <w:szCs w:val="20"/>
-        </w:rPr>
-      </w:pPr>
-      <w:r>
-        <w:rPr>
-          <w:rFonts w:ascii="Arial" w:hAnsi="Arial" w:cs="Arial"/>
-          <w:sz w:val="20"/>
-          <w:szCs w:val="20"/>
-        </w:rPr>
-        <w:t>Alfred Anate Bodurin Mayaki</w:t>
-      </w:r>
-      <w:r>
-        <w:rPr>
-          <w:rStyle w:val="FootnoteReference"/>
-          <w:rFonts w:ascii="Arial" w:hAnsi="Arial" w:cs="Arial"/>
-          <w:sz w:val="20"/>
-          <w:szCs w:val="20"/>
-        </w:rPr>
-        <w:footnoteReference w:id="1"/>
-      </w:r>
+        </w:rPr>
+      </w:pPr>
     </w:p>
     <w:p>
       <w:pPr>
@@ -277,7 +273,31 @@
           <w:sz w:val="20"/>
           <w:szCs w:val="20"/>
         </w:rPr>
-        <w:t>Open University Business School</w:t>
+        <w:t xml:space="preserve">PgCert in Economics, University </w:t>
+      </w:r>
+      <w:r>
+        <w:rPr>
+          <w:rFonts w:ascii="Arial" w:hAnsi="Arial" w:cs="Arial"/>
+          <w:sz w:val="20"/>
+          <w:szCs w:val="20"/>
+        </w:rPr>
+        <w:t xml:space="preserve">of </w:t>
+      </w:r>
+      <w:r>
+        <w:rPr>
+          <w:rFonts w:ascii="Arial" w:hAnsi="Arial" w:cs="Arial"/>
+          <w:sz w:val="20"/>
+          <w:szCs w:val="20"/>
+        </w:rPr>
+        <w:t>Essex</w:t>
+      </w:r>
+      <w:r>
+        <w:rPr>
+          <w:rFonts w:ascii="Arial" w:hAnsi="Arial" w:cs="Arial"/>
+          <w:sz w:val="20"/>
+          <w:szCs w:val="20"/>
+        </w:rPr>
+        <w:t>, 2013</w:t>
       </w:r>
     </w:p>
     <w:p>
@@ -288,6 +308,104 @@
           <w:rFonts w:ascii="Arial" w:hAnsi="Arial" w:cs="Arial"/>
           <w:sz w:val="20"/>
           <w:szCs w:val="20"/>
+          <w:lang w:val="fr-FR"/>
+        </w:rPr>
+      </w:pPr>
+      <w:r>
+        <w:rPr>
+          <w:rFonts w:ascii="Arial" w:hAnsi="Arial" w:cs="Arial"/>
+          <w:sz w:val="20"/>
+          <w:szCs w:val="20"/>
+          <w:lang w:val="fr-FR"/>
+        </w:rPr>
+        <w:t xml:space="preserve">BBM, University </w:t>
+      </w:r>
+      <w:r>
+        <w:rPr>
+          <w:rFonts w:ascii="Arial" w:hAnsi="Arial" w:cs="Arial"/>
+          <w:sz w:val="20"/>
+          <w:szCs w:val="20"/>
+          <w:lang w:val="fr-FR"/>
+        </w:rPr>
+        <w:t xml:space="preserve">of </w:t>
+      </w:r>
+      <w:r>
+        <w:rPr>
+          <w:rFonts w:ascii="Arial" w:hAnsi="Arial" w:cs="Arial"/>
+          <w:sz w:val="20"/>
+          <w:szCs w:val="20"/>
+          <w:lang w:val="fr-FR"/>
+        </w:rPr>
+        <w:t>Essex</w:t>
+      </w:r>
+      <w:r>
+        <w:rPr>
+          <w:rFonts w:ascii="Arial" w:hAnsi="Arial" w:cs="Arial"/>
+          <w:sz w:val="20"/>
+          <w:szCs w:val="20"/>
+          <w:lang w:val="fr-FR"/>
+        </w:rPr>
+        <w:t>, 2010</w:t>
+      </w:r>
+    </w:p>
+    <w:p>
+      <w:pPr>
+        <w:contextualSpacing/>
+        <w:jc w:val="center"/>
+        <w:rPr>
+          <w:rFonts w:ascii="Arial" w:hAnsi="Arial" w:cs="Arial"/>
+          <w:sz w:val="20"/>
+          <w:szCs w:val="20"/>
+          <w:lang w:val="fr-FR"/>
+        </w:rPr>
+      </w:pPr>
+    </w:p>
+    <w:p>
+      <w:pPr>
+        <w:contextualSpacing/>
+        <w:jc w:val="center"/>
+        <w:rPr>
+          <w:rFonts w:ascii="Arial" w:hAnsi="Arial" w:cs="Arial"/>
+          <w:lang w:val="fr-FR"/>
+        </w:rPr>
+      </w:pPr>
+    </w:p>
+    <w:p>
+      <w:pPr>
+        <w:contextualSpacing/>
+        <w:jc w:val="center"/>
+        <w:rPr>
+          <w:rFonts w:ascii="Arial" w:hAnsi="Arial" w:cs="Arial"/>
+          <w:sz w:val="20"/>
+          <w:szCs w:val="20"/>
+        </w:rPr>
+      </w:pPr>
+      <w:r>
+        <w:rPr>
+          <w:rFonts w:ascii="Arial" w:hAnsi="Arial" w:cs="Arial"/>
+          <w:sz w:val="20"/>
+          <w:szCs w:val="20"/>
+        </w:rPr>
+        <w:t>Alfred Anate Bodurin Mayaki</w:t>
+      </w:r>
+      <w:r>
+        <w:rPr>
+          <w:rStyle w:val="FootnoteReference"/>
+          <w:rFonts w:ascii="Arial" w:hAnsi="Arial" w:cs="Arial"/>
+          <w:sz w:val="20"/>
+          <w:szCs w:val="20"/>
+        </w:rPr>
+        <w:footnoteReference w:id="1"/>
+      </w:r>
+    </w:p>
+    <w:p>
+      <w:pPr>
+        <w:contextualSpacing/>
+        <w:jc w:val="center"/>
+        <w:rPr>
+          <w:rFonts w:ascii="Arial" w:hAnsi="Arial" w:cs="Arial"/>
+          <w:sz w:val="20"/>
+          <w:szCs w:val="20"/>
         </w:rPr>
       </w:pPr>
       <w:r>
@@ -302,11 +420,30 @@
     <w:p>
       <w:pPr>
         <w:contextualSpacing/>
-        <w:jc w:val="both"/>
-        <w:rPr>
-          <w:rFonts w:ascii="Arial" w:hAnsi="Arial" w:cs="Arial"/>
-        </w:rPr>
-      </w:pPr>
+        <w:jc w:val="center"/>
+        <w:rPr>
+          <w:rFonts w:ascii="Arial" w:hAnsi="Arial" w:cs="Arial"/>
+        </w:rPr>
+      </w:pPr>
+    </w:p>
+    <w:p>
+      <w:pPr>
+        <w:contextualSpacing/>
+        <w:jc w:val="center"/>
+        <w:rPr>
+          <w:rFonts w:ascii="Arial" w:hAnsi="Arial" w:cs="Arial"/>
+          <w:sz w:val="20"/>
+          <w:szCs w:val="20"/>
+        </w:rPr>
+      </w:pPr>
+      <w:r>
+        <w:rPr>
+          <w:rFonts w:ascii="Arial" w:hAnsi="Arial" w:cs="Arial"/>
+          <w:sz w:val="20"/>
+          <w:szCs w:val="20"/>
+        </w:rPr>
+        <w:t>February 2026</w:t>
+      </w:r>
     </w:p>
     <w:p>
       <w:pPr>
@@ -485,6 +622,7 @@
         <w:rPr>
           <w:rFonts w:ascii="Arial" w:hAnsi="Arial" w:cs="Arial"/>
         </w:rPr>
+        <w:lastRenderedPageBreak/>
         <w:tab/>
       </w:r>
     </w:p>
@@ -544,19 +682,16 @@
         </w:p>
         <w:p>
           <w:pPr>
-            <w:tabs>
-              <w:tab w:val="left" w:pos="2280"/>
-            </w:tabs>
+            <w:pStyle w:val="TOCHeading"/>
             <w:jc w:val="both"/>
             <w:rPr>
               <w:rFonts w:ascii="Arial" w:hAnsi="Arial" w:cs="Arial"/>
-              <w:lang w:val="en-US"/>
+              <w:color w:val="auto"/>
             </w:rPr>
           </w:pPr>
           <w:r>
             <w:rPr>
               <w:rFonts w:ascii="Arial" w:hAnsi="Arial" w:cs="Arial"/>
-              <w:lang w:val="en-US"/>
             </w:rPr>
             <w:tab/>
           </w:r>
@@ -591,7 +726,7 @@
             </w:rPr>
             <w:fldChar w:fldCharType="separate"/>
           </w:r>
-          <w:hyperlink w:anchor="_Toc221107082" w:history="1">
+          <w:hyperlink w:anchor="_Toc221634000" w:history="1">
             <w:r>
               <w:rPr>
                 <w:rStyle w:val="Hyperlink"/>
@@ -619,7 +754,7 @@
                 <w:noProof/>
                 <w:webHidden/>
               </w:rPr>
-              <w:instrText xml:space="preserve"> PAGEREF _Toc221107082 \h </w:instrText>
+              <w:instrText xml:space="preserve"> PAGEREF _Toc221634000 \h </w:instrText>
             </w:r>
             <w:r>
               <w:rPr>
@@ -662,7 +797,7 @@
               <w:lang w:eastAsia="en-GB"/>
             </w:rPr>
           </w:pPr>
-          <w:hyperlink w:anchor="_Toc221107083" w:history="1">
+          <w:hyperlink w:anchor="_Toc221634001" w:history="1">
             <w:r>
               <w:rPr>
                 <w:rStyle w:val="Hyperlink"/>
@@ -690,7 +825,7 @@
                 <w:noProof/>
                 <w:webHidden/>
               </w:rPr>
-              <w:instrText xml:space="preserve"> PAGEREF _Toc221107083 \h </w:instrText>
+              <w:instrText xml:space="preserve"> PAGEREF _Toc221634001 \h </w:instrText>
             </w:r>
             <w:r>
               <w:rPr>
@@ -733,14 +868,14 @@
               <w:lang w:eastAsia="en-GB"/>
             </w:rPr>
           </w:pPr>
-          <w:hyperlink w:anchor="_Toc221107084" w:history="1">
+          <w:hyperlink w:anchor="_Toc221634002" w:history="1">
             <w:r>
               <w:rPr>
                 <w:rStyle w:val="Hyperlink"/>
                 <w:rFonts w:ascii="Arial" w:hAnsi="Arial" w:cs="Arial"/>
                 <w:noProof/>
               </w:rPr>
-              <w:t>1.12 Introduction</w:t>
+              <w:t>1.11.1 Key Questions Pertaining to the Dissertation Study</w:t>
             </w:r>
             <w:r>
               <w:rPr>
@@ -761,7 +896,7 @@
                 <w:noProof/>
                 <w:webHidden/>
               </w:rPr>
-              <w:instrText xml:space="preserve"> PAGEREF _Toc221107084 \h </w:instrText>
+              <w:instrText xml:space="preserve"> PAGEREF _Toc221634002 \h </w:instrText>
             </w:r>
             <w:r>
               <w:rPr>
@@ -804,14 +939,14 @@
               <w:lang w:eastAsia="en-GB"/>
             </w:rPr>
           </w:pPr>
-          <w:hyperlink w:anchor="_Toc221107085" w:history="1">
+          <w:hyperlink w:anchor="_Toc221634003" w:history="1">
             <w:r>
               <w:rPr>
                 <w:rStyle w:val="Hyperlink"/>
                 <w:rFonts w:ascii="Arial" w:hAnsi="Arial" w:cs="Arial"/>
                 <w:noProof/>
               </w:rPr>
-              <w:t>1.13 Research Methodology</w:t>
+              <w:t>1.12 Introduction</w:t>
             </w:r>
             <w:r>
               <w:rPr>
@@ -832,7 +967,7 @@
                 <w:noProof/>
                 <w:webHidden/>
               </w:rPr>
-              <w:instrText xml:space="preserve"> PAGEREF _Toc221107085 \h </w:instrText>
+              <w:instrText xml:space="preserve"> PAGEREF _Toc221634003 \h </w:instrText>
             </w:r>
             <w:r>
               <w:rPr>
@@ -875,14 +1010,14 @@
               <w:lang w:eastAsia="en-GB"/>
             </w:rPr>
           </w:pPr>
-          <w:hyperlink w:anchor="_Toc221107086" w:history="1">
+          <w:hyperlink w:anchor="_Toc221634004" w:history="1">
             <w:r>
               <w:rPr>
                 <w:rStyle w:val="Hyperlink"/>
                 <w:rFonts w:ascii="Arial" w:hAnsi="Arial" w:cs="Arial"/>
                 <w:noProof/>
               </w:rPr>
-              <w:t>1.14 The Topic’s Importance to the Literature</w:t>
+              <w:t>1.13 Research Methodology</w:t>
             </w:r>
             <w:r>
               <w:rPr>
@@ -903,7 +1038,7 @@
                 <w:noProof/>
                 <w:webHidden/>
               </w:rPr>
-              <w:instrText xml:space="preserve"> PAGEREF _Toc221107086 \h </w:instrText>
+              <w:instrText xml:space="preserve"> PAGEREF _Toc221634004 \h </w:instrText>
             </w:r>
             <w:r>
               <w:rPr>
@@ -946,14 +1081,14 @@
               <w:lang w:eastAsia="en-GB"/>
             </w:rPr>
           </w:pPr>
-          <w:hyperlink w:anchor="_Toc221107087" w:history="1">
+          <w:hyperlink w:anchor="_Toc221634005" w:history="1">
             <w:r>
               <w:rPr>
                 <w:rStyle w:val="Hyperlink"/>
                 <w:rFonts w:ascii="Arial" w:hAnsi="Arial" w:cs="Arial"/>
                 <w:noProof/>
               </w:rPr>
-              <w:t>1.15 Timeline for Completion and Next Steps</w:t>
+              <w:t>1.13.1 Data Sources</w:t>
             </w:r>
             <w:r>
               <w:rPr>
@@ -974,7 +1109,7 @@
                 <w:noProof/>
                 <w:webHidden/>
               </w:rPr>
-              <w:instrText xml:space="preserve"> PAGEREF _Toc221107087 \h </w:instrText>
+              <w:instrText xml:space="preserve"> PAGEREF _Toc221634005 \h </w:instrText>
             </w:r>
             <w:r>
               <w:rPr>
@@ -1017,14 +1152,14 @@
               <w:lang w:eastAsia="en-GB"/>
             </w:rPr>
           </w:pPr>
-          <w:hyperlink w:anchor="_Toc221107088" w:history="1">
+          <w:hyperlink w:anchor="_Toc221634006" w:history="1">
             <w:r>
               <w:rPr>
                 <w:rStyle w:val="Hyperlink"/>
                 <w:rFonts w:ascii="Arial" w:hAnsi="Arial" w:cs="Arial"/>
                 <w:noProof/>
               </w:rPr>
-              <w:t>1.16 Introduction to TMA 2 – Literature Review</w:t>
+              <w:t>1.14 The Topic’s Importance to the Literature</w:t>
             </w:r>
             <w:r>
               <w:rPr>
@@ -1045,7 +1180,7 @@
                 <w:noProof/>
                 <w:webHidden/>
               </w:rPr>
-              <w:instrText xml:space="preserve"> PAGEREF _Toc221107088 \h </w:instrText>
+              <w:instrText xml:space="preserve"> PAGEREF _Toc221634006 \h </w:instrText>
             </w:r>
             <w:r>
               <w:rPr>
@@ -1088,14 +1223,14 @@
               <w:lang w:eastAsia="en-GB"/>
             </w:rPr>
           </w:pPr>
-          <w:hyperlink w:anchor="_Toc221107089" w:history="1">
+          <w:hyperlink w:anchor="_Toc221634007" w:history="1">
             <w:r>
               <w:rPr>
                 <w:rStyle w:val="Hyperlink"/>
                 <w:rFonts w:ascii="Arial" w:hAnsi="Arial" w:cs="Arial"/>
                 <w:noProof/>
               </w:rPr>
-              <w:t>1.17 Mapping Relevant Subtopics</w:t>
+              <w:t>1.15 Timeline for Completion and Next Steps</w:t>
             </w:r>
             <w:r>
               <w:rPr>
@@ -1116,7 +1251,7 @@
                 <w:noProof/>
                 <w:webHidden/>
               </w:rPr>
-              <w:instrText xml:space="preserve"> PAGEREF _Toc221107089 \h </w:instrText>
+              <w:instrText xml:space="preserve"> PAGEREF _Toc221634007 \h </w:instrText>
             </w:r>
             <w:r>
               <w:rPr>
@@ -1159,14 +1294,14 @@
               <w:lang w:eastAsia="en-GB"/>
             </w:rPr>
           </w:pPr>
-          <w:hyperlink w:anchor="_Toc221107090" w:history="1">
+          <w:hyperlink w:anchor="_Toc221634008" w:history="1">
             <w:r>
               <w:rPr>
                 <w:rStyle w:val="Hyperlink"/>
                 <w:rFonts w:ascii="Arial" w:hAnsi="Arial" w:cs="Arial"/>
                 <w:noProof/>
               </w:rPr>
-              <w:t>1.18 Conducting Gap Analysis – ASI and its effect on HRM</w:t>
+              <w:t>1.16 Introduction to TMA 2 – Literature Review</w:t>
             </w:r>
             <w:r>
               <w:rPr>
@@ -1187,7 +1322,7 @@
                 <w:noProof/>
                 <w:webHidden/>
               </w:rPr>
-              <w:instrText xml:space="preserve"> PAGEREF _Toc221107090 \h </w:instrText>
+              <w:instrText xml:space="preserve"> PAGEREF _Toc221634008 \h </w:instrText>
             </w:r>
             <w:r>
               <w:rPr>
@@ -1230,14 +1365,14 @@
               <w:lang w:eastAsia="en-GB"/>
             </w:rPr>
           </w:pPr>
-          <w:hyperlink w:anchor="_Toc221107091" w:history="1">
+          <w:hyperlink w:anchor="_Toc221634009" w:history="1">
             <w:r>
               <w:rPr>
                 <w:rStyle w:val="Hyperlink"/>
                 <w:rFonts w:ascii="Arial" w:hAnsi="Arial" w:cs="Arial"/>
                 <w:noProof/>
               </w:rPr>
-              <w:t>1.19 Concerns and Recommendations</w:t>
+              <w:t>1.17 Mapping Relevant Subtopics</w:t>
             </w:r>
             <w:r>
               <w:rPr>
@@ -1258,7 +1393,7 @@
                 <w:noProof/>
                 <w:webHidden/>
               </w:rPr>
-              <w:instrText xml:space="preserve"> PAGEREF _Toc221107091 \h </w:instrText>
+              <w:instrText xml:space="preserve"> PAGEREF _Toc221634009 \h </w:instrText>
             </w:r>
             <w:r>
               <w:rPr>
@@ -1278,7 +1413,7 @@
                 <w:noProof/>
                 <w:webHidden/>
               </w:rPr>
-              <w:t>6</w:t>
+              <w:t>7</w:t>
             </w:r>
             <w:r>
               <w:rPr>
@@ -1301,14 +1436,14 @@
               <w:lang w:eastAsia="en-GB"/>
             </w:rPr>
           </w:pPr>
-          <w:hyperlink w:anchor="_Toc221107092" w:history="1">
+          <w:hyperlink w:anchor="_Toc221634010" w:history="1">
             <w:r>
               <w:rPr>
                 <w:rStyle w:val="Hyperlink"/>
                 <w:rFonts w:ascii="Arial" w:hAnsi="Arial" w:cs="Arial"/>
                 <w:noProof/>
               </w:rPr>
-              <w:t>1.20 Explicating my Literature Review 1 – Applicant Attraction</w:t>
+              <w:t>1.18 Conducting Gap Analysis – AI and its effect on HRM</w:t>
             </w:r>
             <w:r>
               <w:rPr>
@@ -1329,7 +1464,7 @@
                 <w:noProof/>
                 <w:webHidden/>
               </w:rPr>
-              <w:instrText xml:space="preserve"> PAGEREF _Toc221107092 \h </w:instrText>
+              <w:instrText xml:space="preserve"> PAGEREF _Toc221634010 \h </w:instrText>
             </w:r>
             <w:r>
               <w:rPr>
@@ -1372,14 +1507,14 @@
               <w:lang w:eastAsia="en-GB"/>
             </w:rPr>
           </w:pPr>
-          <w:hyperlink w:anchor="_Toc221107093" w:history="1">
+          <w:hyperlink w:anchor="_Toc221634011" w:history="1">
             <w:r>
               <w:rPr>
                 <w:rStyle w:val="Hyperlink"/>
                 <w:rFonts w:ascii="Arial" w:hAnsi="Arial" w:cs="Arial"/>
                 <w:noProof/>
               </w:rPr>
-              <w:t>1.21 Explicating my Literature Review 2 – Signalling Theory</w:t>
+              <w:t>1.19 Concerns and Recommendations</w:t>
             </w:r>
             <w:r>
               <w:rPr>
@@ -1400,7 +1535,7 @@
                 <w:noProof/>
                 <w:webHidden/>
               </w:rPr>
-              <w:instrText xml:space="preserve"> PAGEREF _Toc221107093 \h </w:instrText>
+              <w:instrText xml:space="preserve"> PAGEREF _Toc221634011 \h </w:instrText>
             </w:r>
             <w:r>
               <w:rPr>
@@ -1443,14 +1578,14 @@
               <w:lang w:eastAsia="en-GB"/>
             </w:rPr>
           </w:pPr>
-          <w:hyperlink w:anchor="_Toc221107094" w:history="1">
+          <w:hyperlink w:anchor="_Toc221634012" w:history="1">
             <w:r>
               <w:rPr>
                 <w:rStyle w:val="Hyperlink"/>
                 <w:rFonts w:ascii="Arial" w:hAnsi="Arial" w:cs="Arial"/>
                 <w:noProof/>
               </w:rPr>
-              <w:t>1.22 Explicating my Literature Review 3 – Recruitment &amp; Selection</w:t>
+              <w:t>1.20 Explicating the Literature Review 1 – Applicant Attraction</w:t>
             </w:r>
             <w:r>
               <w:rPr>
@@ -1471,7 +1606,7 @@
                 <w:noProof/>
                 <w:webHidden/>
               </w:rPr>
-              <w:instrText xml:space="preserve"> PAGEREF _Toc221107094 \h </w:instrText>
+              <w:instrText xml:space="preserve"> PAGEREF _Toc221634012 \h </w:instrText>
             </w:r>
             <w:r>
               <w:rPr>
@@ -1491,7 +1626,7 @@
                 <w:noProof/>
                 <w:webHidden/>
               </w:rPr>
-              <w:t>9</w:t>
+              <w:t>8</w:t>
             </w:r>
             <w:r>
               <w:rPr>
@@ -1514,14 +1649,14 @@
               <w:lang w:eastAsia="en-GB"/>
             </w:rPr>
           </w:pPr>
-          <w:hyperlink w:anchor="_Toc221107095" w:history="1">
+          <w:hyperlink w:anchor="_Toc221634013" w:history="1">
             <w:r>
               <w:rPr>
                 <w:rStyle w:val="Hyperlink"/>
                 <w:rFonts w:ascii="Arial" w:hAnsi="Arial" w:cs="Arial"/>
                 <w:noProof/>
               </w:rPr>
-              <w:t>1.23 Journal of Economic Literature (JEL) Classification</w:t>
+              <w:t>1.21 Explicating the Literature Review 2 – Signalling Theory</w:t>
             </w:r>
             <w:r>
               <w:rPr>
@@ -1542,7 +1677,7 @@
                 <w:noProof/>
                 <w:webHidden/>
               </w:rPr>
-              <w:instrText xml:space="preserve"> PAGEREF _Toc221107095 \h </w:instrText>
+              <w:instrText xml:space="preserve"> PAGEREF _Toc221634013 \h </w:instrText>
             </w:r>
             <w:r>
               <w:rPr>
@@ -1562,7 +1697,7 @@
                 <w:noProof/>
                 <w:webHidden/>
               </w:rPr>
-              <w:t>9</w:t>
+              <w:t>8</w:t>
             </w:r>
             <w:r>
               <w:rPr>
@@ -1585,14 +1720,14 @@
               <w:lang w:eastAsia="en-GB"/>
             </w:rPr>
           </w:pPr>
-          <w:hyperlink w:anchor="_Toc221107096" w:history="1">
+          <w:hyperlink w:anchor="_Toc221634014" w:history="1">
             <w:r>
               <w:rPr>
                 <w:rStyle w:val="Hyperlink"/>
                 <w:rFonts w:ascii="Arial" w:hAnsi="Arial" w:cs="Arial"/>
                 <w:noProof/>
               </w:rPr>
-              <w:t>References</w:t>
+              <w:t>1.22 Explicating the Literature Review 3 – Recruitment &amp; Selection</w:t>
             </w:r>
             <w:r>
               <w:rPr>
@@ -1613,7 +1748,7 @@
                 <w:noProof/>
                 <w:webHidden/>
               </w:rPr>
-              <w:instrText xml:space="preserve"> PAGEREF _Toc221107096 \h </w:instrText>
+              <w:instrText xml:space="preserve"> PAGEREF _Toc221634014 \h </w:instrText>
             </w:r>
             <w:r>
               <w:rPr>
@@ -1634,6 +1769,219 @@
                 <w:webHidden/>
               </w:rPr>
               <w:t>10</w:t>
+            </w:r>
+            <w:r>
+              <w:rPr>
+                <w:noProof/>
+                <w:webHidden/>
+              </w:rPr>
+              <w:fldChar w:fldCharType="end"/>
+            </w:r>
+          </w:hyperlink>
+        </w:p>
+        <w:p>
+          <w:pPr>
+            <w:pStyle w:val="TOC2"/>
+            <w:tabs>
+              <w:tab w:val="right" w:leader="dot" w:pos="9016"/>
+            </w:tabs>
+            <w:rPr>
+              <w:rFonts w:eastAsiaTheme="minorEastAsia"/>
+              <w:noProof/>
+              <w:lang w:eastAsia="en-GB"/>
+            </w:rPr>
+          </w:pPr>
+          <w:hyperlink w:anchor="_Toc221634015" w:history="1">
+            <w:r>
+              <w:rPr>
+                <w:rStyle w:val="Hyperlink"/>
+                <w:rFonts w:ascii="Arial" w:hAnsi="Arial" w:cs="Arial"/>
+                <w:noProof/>
+              </w:rPr>
+              <w:t>1.23 JEL Classifications</w:t>
+            </w:r>
+            <w:r>
+              <w:rPr>
+                <w:noProof/>
+                <w:webHidden/>
+              </w:rPr>
+              <w:tab/>
+            </w:r>
+            <w:r>
+              <w:rPr>
+                <w:noProof/>
+                <w:webHidden/>
+              </w:rPr>
+              <w:fldChar w:fldCharType="begin"/>
+            </w:r>
+            <w:r>
+              <w:rPr>
+                <w:noProof/>
+                <w:webHidden/>
+              </w:rPr>
+              <w:instrText xml:space="preserve"> PAGEREF _Toc221634015 \h </w:instrText>
+            </w:r>
+            <w:r>
+              <w:rPr>
+                <w:noProof/>
+                <w:webHidden/>
+              </w:rPr>
+            </w:r>
+            <w:r>
+              <w:rPr>
+                <w:noProof/>
+                <w:webHidden/>
+              </w:rPr>
+              <w:fldChar w:fldCharType="separate"/>
+            </w:r>
+            <w:r>
+              <w:rPr>
+                <w:noProof/>
+                <w:webHidden/>
+              </w:rPr>
+              <w:t>10</w:t>
+            </w:r>
+            <w:r>
+              <w:rPr>
+                <w:noProof/>
+                <w:webHidden/>
+              </w:rPr>
+              <w:fldChar w:fldCharType="end"/>
+            </w:r>
+          </w:hyperlink>
+        </w:p>
+        <w:p>
+          <w:pPr>
+            <w:pStyle w:val="TOC2"/>
+            <w:tabs>
+              <w:tab w:val="right" w:leader="dot" w:pos="9016"/>
+            </w:tabs>
+            <w:rPr>
+              <w:rFonts w:eastAsiaTheme="minorEastAsia"/>
+              <w:noProof/>
+              <w:lang w:eastAsia="en-GB"/>
+            </w:rPr>
+          </w:pPr>
+          <w:hyperlink w:anchor="_Toc221634016" w:history="1">
+            <w:r>
+              <w:rPr>
+                <w:rStyle w:val="Hyperlink"/>
+                <w:rFonts w:ascii="Arial" w:hAnsi="Arial" w:cs="Arial"/>
+                <w:noProof/>
+              </w:rPr>
+              <w:t>1.24 Discussion</w:t>
+            </w:r>
+            <w:r>
+              <w:rPr>
+                <w:noProof/>
+                <w:webHidden/>
+              </w:rPr>
+              <w:tab/>
+            </w:r>
+            <w:r>
+              <w:rPr>
+                <w:noProof/>
+                <w:webHidden/>
+              </w:rPr>
+              <w:fldChar w:fldCharType="begin"/>
+            </w:r>
+            <w:r>
+              <w:rPr>
+                <w:noProof/>
+                <w:webHidden/>
+              </w:rPr>
+              <w:instrText xml:space="preserve"> PAGEREF _Toc221634016 \h </w:instrText>
+            </w:r>
+            <w:r>
+              <w:rPr>
+                <w:noProof/>
+                <w:webHidden/>
+              </w:rPr>
+            </w:r>
+            <w:r>
+              <w:rPr>
+                <w:noProof/>
+                <w:webHidden/>
+              </w:rPr>
+              <w:fldChar w:fldCharType="separate"/>
+            </w:r>
+            <w:r>
+              <w:rPr>
+                <w:noProof/>
+                <w:webHidden/>
+              </w:rPr>
+              <w:t>11</w:t>
+            </w:r>
+            <w:r>
+              <w:rPr>
+                <w:noProof/>
+                <w:webHidden/>
+              </w:rPr>
+              <w:fldChar w:fldCharType="end"/>
+            </w:r>
+          </w:hyperlink>
+        </w:p>
+        <w:p>
+          <w:pPr>
+            <w:pStyle w:val="TOC2"/>
+            <w:tabs>
+              <w:tab w:val="right" w:leader="dot" w:pos="9016"/>
+            </w:tabs>
+            <w:rPr>
+              <w:rFonts w:eastAsiaTheme="minorEastAsia"/>
+              <w:noProof/>
+              <w:lang w:eastAsia="en-GB"/>
+            </w:rPr>
+          </w:pPr>
+          <w:hyperlink w:anchor="_Toc221634017" w:history="1">
+            <w:r>
+              <w:rPr>
+                <w:rStyle w:val="Hyperlink"/>
+                <w:rFonts w:ascii="Arial" w:hAnsi="Arial" w:cs="Arial"/>
+                <w:noProof/>
+              </w:rPr>
+              <w:t>References</w:t>
+            </w:r>
+            <w:r>
+              <w:rPr>
+                <w:noProof/>
+                <w:webHidden/>
+              </w:rPr>
+              <w:tab/>
+            </w:r>
+            <w:r>
+              <w:rPr>
+                <w:noProof/>
+                <w:webHidden/>
+              </w:rPr>
+              <w:fldChar w:fldCharType="begin"/>
+            </w:r>
+            <w:r>
+              <w:rPr>
+                <w:noProof/>
+                <w:webHidden/>
+              </w:rPr>
+              <w:instrText xml:space="preserve"> PAGEREF _Toc221634017 \h </w:instrText>
+            </w:r>
+            <w:r>
+              <w:rPr>
+                <w:noProof/>
+                <w:webHidden/>
+              </w:rPr>
+            </w:r>
+            <w:r>
+              <w:rPr>
+                <w:noProof/>
+                <w:webHidden/>
+              </w:rPr>
+              <w:fldChar w:fldCharType="separate"/>
+            </w:r>
+            <w:r>
+              <w:rPr>
+                <w:noProof/>
+                <w:webHidden/>
+              </w:rPr>
+              <w:t>11</w:t>
             </w:r>
             <w:r>
               <w:rPr>
@@ -1764,74 +2112,6 @@
     </w:p>
     <w:p>
       <w:pPr>
-        <w:contextualSpacing/>
-        <w:jc w:val="both"/>
-        <w:rPr>
-          <w:rFonts w:ascii="Arial" w:hAnsi="Arial" w:cs="Arial"/>
-        </w:rPr>
-      </w:pPr>
-    </w:p>
-    <w:p>
-      <w:pPr>
-        <w:contextualSpacing/>
-        <w:jc w:val="both"/>
-        <w:rPr>
-          <w:rFonts w:ascii="Arial" w:hAnsi="Arial" w:cs="Arial"/>
-        </w:rPr>
-      </w:pPr>
-    </w:p>
-    <w:p>
-      <w:pPr>
-        <w:contextualSpacing/>
-        <w:jc w:val="both"/>
-        <w:rPr>
-          <w:rFonts w:ascii="Arial" w:hAnsi="Arial" w:cs="Arial"/>
-        </w:rPr>
-      </w:pPr>
-    </w:p>
-    <w:p>
-      <w:pPr>
-        <w:contextualSpacing/>
-        <w:jc w:val="both"/>
-        <w:rPr>
-          <w:rFonts w:ascii="Arial" w:hAnsi="Arial" w:cs="Arial"/>
-        </w:rPr>
-      </w:pPr>
-    </w:p>
-    <w:p>
-      <w:pPr>
-        <w:contextualSpacing/>
-        <w:jc w:val="both"/>
-        <w:rPr>
-          <w:rFonts w:ascii="Arial" w:hAnsi="Arial" w:cs="Arial"/>
-        </w:rPr>
-      </w:pPr>
-    </w:p>
-    <w:p>
-      <w:pPr>
-        <w:contextualSpacing/>
-        <w:jc w:val="both"/>
-        <w:rPr>
-          <w:rFonts w:ascii="Arial" w:hAnsi="Arial" w:cs="Arial"/>
-        </w:rPr>
-      </w:pPr>
-    </w:p>
-    <w:p>
-      <w:pPr>
-        <w:contextualSpacing/>
-        <w:jc w:val="both"/>
-        <w:rPr>
-          <w:rFonts w:ascii="Arial" w:hAnsi="Arial" w:cs="Arial"/>
-        </w:rPr>
-      </w:pPr>
-    </w:p>
-    <w:p>
-      <w:pPr>
-        <w:pStyle w:val="NoSpacing"/>
-      </w:pPr>
-    </w:p>
-    <w:p>
-      <w:pPr>
         <w:pStyle w:val="Heading2"/>
         <w:contextualSpacing/>
         <w:jc w:val="both"/>
@@ -1839,7 +2119,7 @@
           <w:rFonts w:ascii="Arial" w:hAnsi="Arial" w:cs="Arial"/>
         </w:rPr>
       </w:pPr>
-      <w:bookmarkStart w:id="0" w:name="_Toc221107082"/>
+      <w:bookmarkStart w:id="0" w:name="_Toc221634000"/>
       <w:r>
         <w:rPr>
           <w:rStyle w:val="Strong"/>
@@ -1848,6 +2128,7 @@
           <w:bCs w:val="0"/>
           <w:color w:val="auto"/>
         </w:rPr>
+        <w:lastRenderedPageBreak/>
         <w:t>Acknowledgements</w:t>
       </w:r>
       <w:bookmarkEnd w:id="0"/>
@@ -2253,7 +2534,7 @@
           <w:color w:val="auto"/>
         </w:rPr>
       </w:pPr>
-      <w:bookmarkStart w:id="1" w:name="_Toc221107083"/>
+      <w:bookmarkStart w:id="1" w:name="_Toc221634001"/>
       <w:r>
         <w:rPr>
           <w:rStyle w:val="Strong"/>
@@ -3022,7 +3303,7 @@
           <w:color w:val="auto"/>
         </w:rPr>
       </w:pPr>
-      <w:bookmarkStart w:id="2" w:name="_Toc221107084"/>
+      <w:bookmarkStart w:id="2" w:name="_Toc221634002"/>
       <w:r>
         <w:rPr>
           <w:rStyle w:val="Strong"/>
@@ -3032,7 +3313,7 @@
           <w:color w:val="auto"/>
         </w:rPr>
         <w:lastRenderedPageBreak/>
-        <w:t>1.12</w:t>
+        <w:t>1.1</w:t>
       </w:r>
       <w:r>
         <w:rPr>
@@ -3042,7 +3323,7 @@
           <w:bCs w:val="0"/>
           <w:color w:val="auto"/>
         </w:rPr>
-        <w:t xml:space="preserve"> </w:t>
+        <w:t>1</w:t>
       </w:r>
       <w:r>
         <w:rPr>
@@ -3052,9 +3333,339 @@
           <w:bCs w:val="0"/>
           <w:color w:val="auto"/>
         </w:rPr>
+        <w:t>.1</w:t>
+      </w:r>
+      <w:r>
+        <w:rPr>
+          <w:rStyle w:val="Strong"/>
+          <w:rFonts w:ascii="Arial" w:hAnsi="Arial" w:cs="Arial"/>
+          <w:b w:val="0"/>
+          <w:bCs w:val="0"/>
+          <w:color w:val="auto"/>
+        </w:rPr>
+        <w:t xml:space="preserve"> </w:t>
+      </w:r>
+      <w:r>
+        <w:rPr>
+          <w:rStyle w:val="Strong"/>
+          <w:rFonts w:ascii="Arial" w:hAnsi="Arial" w:cs="Arial"/>
+          <w:b w:val="0"/>
+          <w:bCs w:val="0"/>
+          <w:color w:val="auto"/>
+        </w:rPr>
+        <w:t>Key Questions</w:t>
+      </w:r>
+      <w:r>
+        <w:rPr>
+          <w:rStyle w:val="Strong"/>
+          <w:rFonts w:ascii="Arial" w:hAnsi="Arial" w:cs="Arial"/>
+          <w:b w:val="0"/>
+          <w:bCs w:val="0"/>
+          <w:color w:val="auto"/>
+        </w:rPr>
+        <w:t xml:space="preserve"> Pertaining </w:t>
+      </w:r>
+      <w:r>
+        <w:rPr>
+          <w:rStyle w:val="Strong"/>
+          <w:rFonts w:ascii="Arial" w:hAnsi="Arial" w:cs="Arial"/>
+          <w:b w:val="0"/>
+          <w:bCs w:val="0"/>
+          <w:color w:val="auto"/>
+        </w:rPr>
+        <w:t>to</w:t>
+      </w:r>
+      <w:r>
+        <w:rPr>
+          <w:rStyle w:val="Strong"/>
+          <w:rFonts w:ascii="Arial" w:hAnsi="Arial" w:cs="Arial"/>
+          <w:b w:val="0"/>
+          <w:bCs w:val="0"/>
+          <w:color w:val="auto"/>
+        </w:rPr>
+        <w:t xml:space="preserve"> </w:t>
+      </w:r>
+      <w:r>
+        <w:rPr>
+          <w:rStyle w:val="Strong"/>
+          <w:rFonts w:ascii="Arial" w:hAnsi="Arial" w:cs="Arial"/>
+          <w:b w:val="0"/>
+          <w:bCs w:val="0"/>
+          <w:color w:val="auto"/>
+        </w:rPr>
+        <w:t xml:space="preserve">the Dissertation </w:t>
+      </w:r>
+      <w:r>
+        <w:rPr>
+          <w:rStyle w:val="Strong"/>
+          <w:rFonts w:ascii="Arial" w:hAnsi="Arial" w:cs="Arial"/>
+          <w:b w:val="0"/>
+          <w:bCs w:val="0"/>
+          <w:color w:val="auto"/>
+        </w:rPr>
+        <w:t>Study</w:t>
+      </w:r>
+      <w:bookmarkEnd w:id="2"/>
+    </w:p>
+    <w:p>
+      <w:pPr>
+        <w:rPr>
+          <w:rFonts w:ascii="Arial" w:hAnsi="Arial" w:cs="Arial"/>
+          <w:sz w:val="20"/>
+          <w:szCs w:val="20"/>
+        </w:rPr>
+      </w:pPr>
+      <w:r>
+        <w:rPr>
+          <w:rFonts w:ascii="Arial" w:hAnsi="Arial" w:cs="Arial"/>
+          <w:b/>
+          <w:bCs/>
+          <w:sz w:val="20"/>
+          <w:szCs w:val="20"/>
+        </w:rPr>
+        <w:t xml:space="preserve">Key </w:t>
+      </w:r>
+      <w:r>
+        <w:rPr>
+          <w:rFonts w:ascii="Arial" w:hAnsi="Arial" w:cs="Arial"/>
+          <w:b/>
+          <w:bCs/>
+          <w:sz w:val="20"/>
+          <w:szCs w:val="20"/>
+        </w:rPr>
+        <w:t>q</w:t>
+      </w:r>
+      <w:r>
+        <w:rPr>
+          <w:rFonts w:ascii="Arial" w:hAnsi="Arial" w:cs="Arial"/>
+          <w:b/>
+          <w:bCs/>
+          <w:sz w:val="20"/>
+          <w:szCs w:val="20"/>
+        </w:rPr>
+        <w:t xml:space="preserve">uestion: </w:t>
+      </w:r>
+      <w:r>
+        <w:rPr>
+          <w:rFonts w:ascii="Arial" w:hAnsi="Arial" w:cs="Arial"/>
+          <w:sz w:val="20"/>
+          <w:szCs w:val="20"/>
+        </w:rPr>
+        <w:t>What recruitment approaches are considered to be conventional and why are these approaches typically inadequate for high-growth companies? (Barber and Rynes).</w:t>
+      </w:r>
+    </w:p>
+    <w:p>
+      <w:pPr>
+        <w:jc w:val="both"/>
+        <w:rPr>
+          <w:rFonts w:ascii="Arial" w:hAnsi="Arial" w:cs="Arial"/>
+          <w:i/>
+          <w:iCs/>
+          <w:sz w:val="20"/>
+          <w:szCs w:val="20"/>
+        </w:rPr>
+      </w:pPr>
+      <w:r>
+        <w:rPr>
+          <w:rFonts w:ascii="Arial" w:hAnsi="Arial" w:cs="Arial"/>
+          <w:b/>
+          <w:bCs/>
+          <w:sz w:val="20"/>
+          <w:szCs w:val="20"/>
+        </w:rPr>
+        <w:t xml:space="preserve">Key </w:t>
+      </w:r>
+      <w:r>
+        <w:rPr>
+          <w:rFonts w:ascii="Arial" w:hAnsi="Arial" w:cs="Arial"/>
+          <w:b/>
+          <w:bCs/>
+          <w:sz w:val="20"/>
+          <w:szCs w:val="20"/>
+        </w:rPr>
+        <w:t>q</w:t>
+      </w:r>
+      <w:r>
+        <w:rPr>
+          <w:rFonts w:ascii="Arial" w:hAnsi="Arial" w:cs="Arial"/>
+          <w:b/>
+          <w:bCs/>
+          <w:sz w:val="20"/>
+          <w:szCs w:val="20"/>
+        </w:rPr>
+        <w:t>uestion:</w:t>
+      </w:r>
+      <w:r>
+        <w:rPr>
+          <w:rFonts w:ascii="Arial" w:hAnsi="Arial" w:cs="Arial"/>
+          <w:sz w:val="20"/>
+          <w:szCs w:val="20"/>
+        </w:rPr>
+        <w:t xml:space="preserve"> What kind of signalling is adequate for HRM to communicate during a corporate hiring process for a high-growth firm? How do signalling approaches benefit Black neurodivergent candidates?</w:t>
+      </w:r>
+    </w:p>
+    <w:p>
+      <w:pPr>
+        <w:jc w:val="both"/>
+        <w:rPr>
+          <w:rFonts w:ascii="Arial" w:hAnsi="Arial" w:cs="Arial"/>
+          <w:sz w:val="20"/>
+          <w:szCs w:val="20"/>
+        </w:rPr>
+      </w:pPr>
+      <w:r>
+        <w:rPr>
+          <w:rFonts w:ascii="Arial" w:hAnsi="Arial" w:cs="Arial"/>
+          <w:b/>
+          <w:bCs/>
+          <w:sz w:val="20"/>
+          <w:szCs w:val="20"/>
+        </w:rPr>
+        <w:t>Key question:</w:t>
+      </w:r>
+      <w:r>
+        <w:rPr>
+          <w:rFonts w:ascii="Arial" w:hAnsi="Arial" w:cs="Arial"/>
+          <w:sz w:val="20"/>
+          <w:szCs w:val="20"/>
+        </w:rPr>
+        <w:t xml:space="preserve"> What is the sub-game optimal (in a game of separating or pooling equilibrium) signal an employer should send to all applicants in order to be neuroinclusive? Also, at what level of signal does an employer who signals acceptance of a neurodiverse condition, become accepted by a neurodiverse applicant?</w:t>
+      </w:r>
+    </w:p>
+    <w:p>
+      <w:pPr>
+        <w:jc w:val="both"/>
+        <w:rPr>
+          <w:rFonts w:ascii="Arial" w:hAnsi="Arial" w:cs="Arial"/>
+          <w:sz w:val="20"/>
+          <w:szCs w:val="20"/>
+        </w:rPr>
+      </w:pPr>
+      <w:r>
+        <w:rPr>
+          <w:rFonts w:ascii="Arial" w:hAnsi="Arial" w:cs="Arial"/>
+          <w:b/>
+          <w:bCs/>
+          <w:sz w:val="20"/>
+          <w:szCs w:val="20"/>
+        </w:rPr>
+        <w:t xml:space="preserve">Key question: </w:t>
+      </w:r>
+      <w:r>
+        <w:rPr>
+          <w:rFonts w:ascii="Arial" w:hAnsi="Arial" w:cs="Arial"/>
+          <w:sz w:val="20"/>
+          <w:szCs w:val="20"/>
+        </w:rPr>
+        <w:t xml:space="preserve">What proportion of effort should be given to ensure reasonable adjustments are afforded to all neurodiverse applicants who are successful during the interview process and what proportion of effort should be afforded to </w:t>
+      </w:r>
+      <w:r>
+        <w:rPr>
+          <w:rFonts w:ascii="Arial" w:hAnsi="Arial" w:cs="Arial"/>
+          <w:sz w:val="20"/>
+          <w:szCs w:val="20"/>
+        </w:rPr>
+        <w:t>ensuring a plurality of ethnicities are duly and adequate engaged within that very same recruitment process?</w:t>
+      </w:r>
+    </w:p>
+    <w:p>
+      <w:pPr>
+        <w:jc w:val="both"/>
+        <w:rPr>
+          <w:rFonts w:ascii="Arial" w:hAnsi="Arial" w:cs="Arial"/>
+          <w:sz w:val="20"/>
+          <w:szCs w:val="20"/>
+        </w:rPr>
+      </w:pPr>
+      <w:r>
+        <w:rPr>
+          <w:rFonts w:ascii="Arial" w:hAnsi="Arial" w:cs="Arial"/>
+          <w:b/>
+          <w:bCs/>
+          <w:sz w:val="20"/>
+          <w:szCs w:val="20"/>
+        </w:rPr>
+        <w:t>Key question:</w:t>
+      </w:r>
+      <w:r>
+        <w:rPr>
+          <w:rFonts w:ascii="Arial" w:hAnsi="Arial" w:cs="Arial"/>
+          <w:sz w:val="20"/>
+          <w:szCs w:val="20"/>
+        </w:rPr>
+        <w:t xml:space="preserve"> In a separating equilibrium, that is, in a sub-game perfect Bayesian repeated game with known payoffs, and standard assumptions (complete information and perfect monitoring), how do employers navigate a many-to-one “lottery” scenario, using the offered wage as signals as navigating mechanisms?</w:t>
+      </w:r>
+    </w:p>
+    <w:p>
+      <w:pPr>
+        <w:jc w:val="both"/>
+        <w:rPr>
+          <w:rFonts w:ascii="Arial" w:hAnsi="Arial" w:cs="Arial"/>
+          <w:sz w:val="20"/>
+          <w:szCs w:val="20"/>
+        </w:rPr>
+      </w:pPr>
+      <w:r>
+        <w:rPr>
+          <w:rFonts w:ascii="Arial" w:hAnsi="Arial" w:cs="Arial"/>
+          <w:b/>
+          <w:bCs/>
+          <w:sz w:val="20"/>
+          <w:szCs w:val="20"/>
+        </w:rPr>
+        <w:t xml:space="preserve">Key question: </w:t>
+      </w:r>
+      <w:r>
+        <w:rPr>
+          <w:rFonts w:ascii="Arial" w:hAnsi="Arial" w:cs="Arial"/>
+          <w:sz w:val="20"/>
+          <w:szCs w:val="20"/>
+        </w:rPr>
+        <w:t>How can the use of artificial intelligence inspire a Nash outcome to occur that is Pareto-optimal in a repeated sub-game with known payoffs such as set wage parameters and a signal for a neuroinclusive working environment revealed by the employer and as accepted by the applicant.</w:t>
+      </w:r>
+    </w:p>
+    <w:p>
+      <w:pPr>
+        <w:pStyle w:val="Heading2"/>
+        <w:contextualSpacing/>
+        <w:jc w:val="both"/>
+        <w:rPr>
+          <w:rFonts w:ascii="Arial" w:hAnsi="Arial" w:cs="Arial"/>
+          <w:color w:val="auto"/>
+        </w:rPr>
+      </w:pPr>
+      <w:bookmarkStart w:id="3" w:name="_Toc221634003"/>
+      <w:r>
+        <w:rPr>
+          <w:rStyle w:val="Strong"/>
+          <w:rFonts w:ascii="Arial" w:hAnsi="Arial" w:cs="Arial"/>
+          <w:b w:val="0"/>
+          <w:bCs w:val="0"/>
+          <w:color w:val="auto"/>
+        </w:rPr>
+        <w:t>1.12</w:t>
+      </w:r>
+      <w:r>
+        <w:rPr>
+          <w:rStyle w:val="Strong"/>
+          <w:rFonts w:ascii="Arial" w:hAnsi="Arial" w:cs="Arial"/>
+          <w:b w:val="0"/>
+          <w:bCs w:val="0"/>
+          <w:color w:val="auto"/>
+        </w:rPr>
+        <w:t xml:space="preserve"> </w:t>
+      </w:r>
+      <w:r>
+        <w:rPr>
+          <w:rStyle w:val="Strong"/>
+          <w:rFonts w:ascii="Arial" w:hAnsi="Arial" w:cs="Arial"/>
+          <w:b w:val="0"/>
+          <w:bCs w:val="0"/>
+          <w:color w:val="auto"/>
+        </w:rPr>
         <w:t>Introduction</w:t>
       </w:r>
-      <w:bookmarkEnd w:id="2"/>
+      <w:bookmarkEnd w:id="3"/>
     </w:p>
     <w:p>
       <w:pPr>
@@ -3091,8 +3702,8 @@
         </w:rPr>
         <w:t xml:space="preserve"> teams can be 30% more productive than those which do not include neurodiverse employees (NatWest Mentor, 2025), and with Gen Z entering the workforce – over 50% of whom have some sort of neurodivergent condition</w:t>
       </w:r>
-      <w:commentRangeStart w:id="3"/>
       <w:commentRangeStart w:id="4"/>
+      <w:commentRangeStart w:id="5"/>
       <w:r>
         <w:rPr>
           <w:rStyle w:val="FootnoteReference"/>
@@ -3102,21 +3713,21 @@
         </w:rPr>
         <w:footnoteReference w:id="2"/>
       </w:r>
-      <w:commentRangeEnd w:id="3"/>
+      <w:commentRangeEnd w:id="4"/>
       <w:r>
         <w:rPr>
           <w:rStyle w:val="CommentReference"/>
           <w:rFonts w:ascii="Arial" w:hAnsi="Arial" w:cs="Arial"/>
         </w:rPr>
-        <w:commentReference w:id="3"/>
-      </w:r>
-      <w:commentRangeEnd w:id="4"/>
+        <w:commentReference w:id="4"/>
+      </w:r>
+      <w:commentRangeEnd w:id="5"/>
       <w:r>
         <w:rPr>
           <w:rStyle w:val="CommentReference"/>
           <w:rFonts w:ascii="Arial" w:hAnsi="Arial" w:cs="Arial"/>
         </w:rPr>
-        <w:commentReference w:id="4"/>
+        <w:commentReference w:id="5"/>
       </w:r>
       <w:r>
         <w:rPr>
@@ -3192,7 +3803,7 @@
         </w:rPr>
         <w:t xml:space="preserve"> (</w:t>
       </w:r>
-      <w:commentRangeStart w:id="5"/>
+      <w:commentRangeStart w:id="6"/>
       <w:r>
         <w:rPr>
           <w:rFonts w:ascii="Arial" w:hAnsi="Arial" w:cs="Arial"/>
@@ -3201,13 +3812,13 @@
         </w:rPr>
         <w:t>psychology</w:t>
       </w:r>
-      <w:commentRangeEnd w:id="5"/>
+      <w:commentRangeEnd w:id="6"/>
       <w:r>
         <w:rPr>
           <w:rStyle w:val="CommentReference"/>
           <w:rFonts w:ascii="Arial" w:hAnsi="Arial" w:cs="Arial"/>
         </w:rPr>
-        <w:commentReference w:id="5"/>
+        <w:commentReference w:id="6"/>
       </w:r>
       <w:r>
         <w:rPr>
@@ -3389,7 +4000,7 @@
           <w:color w:val="auto"/>
         </w:rPr>
       </w:pPr>
-      <w:bookmarkStart w:id="6" w:name="_Toc221107085"/>
+      <w:bookmarkStart w:id="7" w:name="_Toc221634004"/>
       <w:r>
         <w:rPr>
           <w:rStyle w:val="Strong"/>
@@ -3440,7 +4051,7 @@
         </w:rPr>
         <w:t>Methodology</w:t>
       </w:r>
-      <w:bookmarkEnd w:id="6"/>
+      <w:bookmarkEnd w:id="7"/>
     </w:p>
     <w:p>
       <w:pPr>
@@ -3734,7 +4345,16 @@
           <w:sz w:val="20"/>
           <w:szCs w:val="20"/>
         </w:rPr>
-        <w:t xml:space="preserve"> hypotheses are subject to supervisory changes and will be honed and amended as and when new information in the literature is discovered, reviewed and internalised. In order, these initial hypotheses read as follows:</w:t>
+        <w:t xml:space="preserve"> hypotheses are subject to supervisory changes and will be honed and amended </w:t>
+      </w:r>
+      <w:r>
+        <w:rPr>
+          <w:rFonts w:ascii="Arial" w:hAnsi="Arial" w:cs="Arial"/>
+          <w:sz w:val="20"/>
+          <w:szCs w:val="20"/>
+        </w:rPr>
+        <w:lastRenderedPageBreak/>
+        <w:t>as and when new information in the literature is discovered, reviewed and internalised. In order, these initial hypotheses read as follows:</w:t>
       </w:r>
     </w:p>
     <w:p>
@@ -3949,10 +4569,10 @@
         </w:rPr>
         <w:t xml:space="preserve"> Firms having lower net spend signal less resource-based HRM </w:t>
       </w:r>
-      <w:commentRangeStart w:id="7"/>
       <w:commentRangeStart w:id="8"/>
       <w:commentRangeStart w:id="9"/>
       <w:commentRangeStart w:id="10"/>
+      <w:commentRangeStart w:id="11"/>
       <w:r>
         <w:rPr>
           <w:rFonts w:ascii="Arial" w:hAnsi="Arial" w:cs="Arial"/>
@@ -3961,37 +4581,37 @@
         </w:rPr>
         <w:t>practices</w:t>
       </w:r>
-      <w:commentRangeEnd w:id="7"/>
+      <w:commentRangeEnd w:id="8"/>
       <w:r>
         <w:rPr>
           <w:rStyle w:val="CommentReference"/>
           <w:rFonts w:ascii="Arial" w:hAnsi="Arial" w:cs="Arial"/>
         </w:rPr>
-        <w:commentReference w:id="7"/>
-      </w:r>
-      <w:commentRangeEnd w:id="8"/>
+        <w:commentReference w:id="8"/>
+      </w:r>
+      <w:commentRangeEnd w:id="9"/>
       <w:r>
         <w:rPr>
           <w:rStyle w:val="CommentReference"/>
           <w:rFonts w:ascii="Arial" w:hAnsi="Arial" w:cs="Arial"/>
         </w:rPr>
-        <w:commentReference w:id="8"/>
-      </w:r>
-      <w:commentRangeEnd w:id="9"/>
+        <w:commentReference w:id="9"/>
+      </w:r>
+      <w:commentRangeEnd w:id="10"/>
       <w:r>
         <w:rPr>
           <w:rStyle w:val="CommentReference"/>
           <w:rFonts w:ascii="Arial" w:hAnsi="Arial" w:cs="Arial"/>
         </w:rPr>
-        <w:commentReference w:id="9"/>
-      </w:r>
-      <w:commentRangeEnd w:id="10"/>
+        <w:commentReference w:id="10"/>
+      </w:r>
+      <w:commentRangeEnd w:id="11"/>
       <w:r>
         <w:rPr>
           <w:rStyle w:val="CommentReference"/>
           <w:rFonts w:ascii="Arial" w:hAnsi="Arial" w:cs="Arial"/>
         </w:rPr>
-        <w:commentReference w:id="10"/>
+        <w:commentReference w:id="11"/>
       </w:r>
     </w:p>
     <w:p>
@@ -4201,22 +4821,15 @@
         <w:contextualSpacing/>
         <w:jc w:val="both"/>
         <w:rPr>
-          <w:rFonts w:ascii="Arial" w:hAnsi="Arial" w:cs="Arial"/>
-          <w:color w:val="auto"/>
-        </w:rPr>
-      </w:pPr>
-      <w:bookmarkStart w:id="11" w:name="_Toc215736436"/>
-      <w:bookmarkStart w:id="12" w:name="_Toc221107086"/>
-      <w:r>
-        <w:rPr>
           <w:rStyle w:val="Strong"/>
           <w:rFonts w:ascii="Arial" w:hAnsi="Arial" w:cs="Arial"/>
           <w:b w:val="0"/>
           <w:bCs w:val="0"/>
           <w:color w:val="auto"/>
         </w:rPr>
-        <w:t>1.</w:t>
-      </w:r>
+      </w:pPr>
+      <w:bookmarkStart w:id="12" w:name="_Toc215736436"/>
+      <w:bookmarkStart w:id="13" w:name="_Toc221634005"/>
       <w:r>
         <w:rPr>
           <w:rStyle w:val="Strong"/>
@@ -4225,7 +4838,7 @@
           <w:bCs w:val="0"/>
           <w:color w:val="auto"/>
         </w:rPr>
-        <w:t>14</w:t>
+        <w:t>1.13</w:t>
       </w:r>
       <w:r>
         <w:rPr>
@@ -4235,9 +4848,8 @@
           <w:bCs w:val="0"/>
           <w:color w:val="auto"/>
         </w:rPr>
-        <w:t xml:space="preserve"> </w:t>
-      </w:r>
-      <w:bookmarkEnd w:id="11"/>
+        <w:t>.1</w:t>
+      </w:r>
       <w:r>
         <w:rPr>
           <w:rStyle w:val="Strong"/>
@@ -4246,9 +4858,828 @@
           <w:bCs w:val="0"/>
           <w:color w:val="auto"/>
         </w:rPr>
+        <w:t xml:space="preserve"> </w:t>
+      </w:r>
+      <w:r>
+        <w:rPr>
+          <w:rStyle w:val="Strong"/>
+          <w:rFonts w:ascii="Arial" w:hAnsi="Arial" w:cs="Arial"/>
+          <w:b w:val="0"/>
+          <w:bCs w:val="0"/>
+          <w:color w:val="auto"/>
+        </w:rPr>
+        <w:t>Data Sources</w:t>
+      </w:r>
+      <w:bookmarkEnd w:id="13"/>
+    </w:p>
+    <w:p>
+      <w:pPr>
+        <w:spacing w:line="240" w:lineRule="auto"/>
+        <w:contextualSpacing/>
+        <w:jc w:val="both"/>
+        <w:rPr>
+          <w:rFonts w:ascii="Arial" w:hAnsi="Arial" w:cs="Arial"/>
+          <w:sz w:val="20"/>
+          <w:szCs w:val="20"/>
+        </w:rPr>
+      </w:pPr>
+      <w:r>
+        <w:rPr>
+          <w:rFonts w:ascii="Arial" w:hAnsi="Arial" w:cs="Arial"/>
+          <w:sz w:val="20"/>
+          <w:szCs w:val="20"/>
+        </w:rPr>
+        <w:t>Data sources for this project will use data from Understanding Society (UKHLS), the Life Opportunities Survey (Waves 1-3); and the OECD Employment &amp; Labour Market Statistics (each dataset from 2010-2015).</w:t>
+      </w:r>
+    </w:p>
+    <w:p>
+      <w:pPr>
+        <w:spacing w:line="240" w:lineRule="auto"/>
+        <w:contextualSpacing/>
+        <w:jc w:val="both"/>
+        <w:rPr>
+          <w:rFonts w:ascii="Arial" w:hAnsi="Arial" w:cs="Arial"/>
+          <w:sz w:val="20"/>
+          <w:szCs w:val="20"/>
+        </w:rPr>
+      </w:pPr>
+    </w:p>
+    <w:p>
+      <w:pPr>
+        <w:spacing w:line="240" w:lineRule="auto"/>
+        <w:contextualSpacing/>
+        <w:jc w:val="both"/>
+        <w:rPr>
+          <w:rFonts w:ascii="Arial" w:hAnsi="Arial" w:cs="Arial"/>
+          <w:sz w:val="20"/>
+          <w:szCs w:val="20"/>
+        </w:rPr>
+      </w:pPr>
+      <w:r>
+        <w:rPr>
+          <w:rFonts w:ascii="Arial" w:hAnsi="Arial" w:cs="Arial"/>
+          <w:sz w:val="20"/>
+          <w:szCs w:val="20"/>
+        </w:rPr>
+        <w:t>Selected</w:t>
+      </w:r>
+      <w:r>
+        <w:rPr>
+          <w:rFonts w:ascii="Arial" w:hAnsi="Arial" w:cs="Arial"/>
+          <w:sz w:val="20"/>
+          <w:szCs w:val="20"/>
+        </w:rPr>
+        <w:t xml:space="preserve"> variables: ‘</w:t>
+      </w:r>
+      <w:proofErr w:type="spellStart"/>
+      <w:r>
+        <w:rPr>
+          <w:rFonts w:ascii="Arial" w:hAnsi="Arial" w:cs="Arial"/>
+          <w:sz w:val="20"/>
+          <w:szCs w:val="20"/>
+        </w:rPr>
+        <w:t>jbatt</w:t>
+      </w:r>
+      <w:proofErr w:type="spellEnd"/>
+      <w:r>
+        <w:rPr>
+          <w:rFonts w:ascii="Arial" w:hAnsi="Arial" w:cs="Arial"/>
+          <w:sz w:val="20"/>
+          <w:szCs w:val="20"/>
+        </w:rPr>
+        <w:t xml:space="preserve">’ which is a </w:t>
+      </w:r>
+      <w:r>
+        <w:rPr>
+          <w:rFonts w:ascii="Arial" w:hAnsi="Arial" w:cs="Arial"/>
+          <w:sz w:val="20"/>
+          <w:szCs w:val="20"/>
+        </w:rPr>
+        <w:t xml:space="preserve">variable </w:t>
+      </w:r>
+      <w:r>
+        <w:rPr>
+          <w:rFonts w:ascii="Arial" w:hAnsi="Arial" w:cs="Arial"/>
+          <w:sz w:val="20"/>
+          <w:szCs w:val="20"/>
+        </w:rPr>
+        <w:t xml:space="preserve">proxy </w:t>
+      </w:r>
+      <w:r>
+        <w:rPr>
+          <w:rFonts w:ascii="Arial" w:hAnsi="Arial" w:cs="Arial"/>
+          <w:sz w:val="20"/>
+          <w:szCs w:val="20"/>
+        </w:rPr>
+        <w:t>representing</w:t>
+      </w:r>
+      <w:r>
+        <w:rPr>
+          <w:rFonts w:ascii="Arial" w:hAnsi="Arial" w:cs="Arial"/>
+          <w:sz w:val="20"/>
+          <w:szCs w:val="20"/>
+        </w:rPr>
+        <w:t xml:space="preserve"> the </w:t>
+      </w:r>
+      <w:r>
+        <w:rPr>
+          <w:rFonts w:ascii="Arial" w:hAnsi="Arial" w:cs="Arial"/>
+          <w:sz w:val="20"/>
+          <w:szCs w:val="20"/>
+        </w:rPr>
+        <w:t xml:space="preserve">survey response concerning the question about the </w:t>
+      </w:r>
+      <w:r>
+        <w:rPr>
+          <w:rFonts w:ascii="Arial" w:hAnsi="Arial" w:cs="Arial"/>
+          <w:sz w:val="20"/>
+          <w:szCs w:val="20"/>
+        </w:rPr>
+        <w:t xml:space="preserve">main attraction of one’s current job, ‘jwbs2_dv’ which is a job-related depression scale, and finally a variable proxy for ‘social contract’ which is derived from the Life Opportunities Survey, where the </w:t>
+      </w:r>
+      <w:r>
+        <w:rPr>
+          <w:rFonts w:ascii="Arial" w:hAnsi="Arial" w:cs="Arial"/>
+          <w:sz w:val="20"/>
+          <w:szCs w:val="20"/>
+        </w:rPr>
+        <w:t>respondent identifies if they</w:t>
+      </w:r>
+      <w:r>
+        <w:rPr>
+          <w:rFonts w:ascii="Arial" w:hAnsi="Arial" w:cs="Arial"/>
+          <w:sz w:val="20"/>
+          <w:szCs w:val="20"/>
+        </w:rPr>
+        <w:t xml:space="preserve"> ha</w:t>
+      </w:r>
+      <w:r>
+        <w:rPr>
+          <w:rFonts w:ascii="Arial" w:hAnsi="Arial" w:cs="Arial"/>
+          <w:sz w:val="20"/>
+          <w:szCs w:val="20"/>
+        </w:rPr>
+        <w:t>ve</w:t>
+      </w:r>
+      <w:r>
+        <w:rPr>
+          <w:rFonts w:ascii="Arial" w:hAnsi="Arial" w:cs="Arial"/>
+          <w:sz w:val="20"/>
+          <w:szCs w:val="20"/>
+        </w:rPr>
+        <w:t xml:space="preserve"> a health condition, impairment or other illness (this is </w:t>
+      </w:r>
+      <w:r>
+        <w:rPr>
+          <w:rFonts w:ascii="Arial" w:hAnsi="Arial" w:cs="Arial"/>
+          <w:sz w:val="20"/>
+          <w:szCs w:val="20"/>
+        </w:rPr>
+        <w:t xml:space="preserve">part of </w:t>
+      </w:r>
+      <w:r>
+        <w:rPr>
+          <w:rFonts w:ascii="Arial" w:hAnsi="Arial" w:cs="Arial"/>
+          <w:sz w:val="20"/>
+          <w:szCs w:val="20"/>
+        </w:rPr>
+        <w:t>a longitudinal dataset).</w:t>
+      </w:r>
+    </w:p>
+    <w:p>
+      <w:pPr>
+        <w:contextualSpacing/>
+        <w:jc w:val="both"/>
+        <w:rPr>
+          <w:rFonts w:ascii="Arial" w:hAnsi="Arial" w:cs="Arial"/>
+          <w:sz w:val="20"/>
+          <w:szCs w:val="20"/>
+        </w:rPr>
+      </w:pPr>
+    </w:p>
+    <w:tbl>
+      <w:tblPr>
+        <w:tblStyle w:val="TableGrid"/>
+        <w:tblW w:w="0" w:type="auto"/>
+        <w:tblLook w:val="04A0" w:firstRow="1" w:lastRow="0" w:firstColumn="1" w:lastColumn="0" w:noHBand="0" w:noVBand="1"/>
+      </w:tblPr>
+      <w:tblGrid>
+        <w:gridCol w:w="4508"/>
+        <w:gridCol w:w="4508"/>
+      </w:tblGrid>
+      <w:tr>
+        <w:tc>
+          <w:tcPr>
+            <w:tcW w:w="4508" w:type="dxa"/>
+          </w:tcPr>
+          <w:p>
+            <w:pPr>
+              <w:contextualSpacing/>
+              <w:jc w:val="both"/>
+              <w:rPr>
+                <w:rFonts w:ascii="Arial" w:hAnsi="Arial" w:cs="Arial"/>
+                <w:b/>
+                <w:bCs/>
+                <w:sz w:val="20"/>
+                <w:szCs w:val="20"/>
+              </w:rPr>
+            </w:pPr>
+            <w:r>
+              <w:rPr>
+                <w:rFonts w:ascii="Arial" w:hAnsi="Arial" w:cs="Arial"/>
+                <w:b/>
+                <w:bCs/>
+                <w:sz w:val="20"/>
+                <w:szCs w:val="20"/>
+              </w:rPr>
+              <w:t>Dependent Variable</w:t>
+            </w:r>
+          </w:p>
+        </w:tc>
+        <w:tc>
+          <w:tcPr>
+            <w:tcW w:w="4508" w:type="dxa"/>
+          </w:tcPr>
+          <w:p>
+            <w:pPr>
+              <w:contextualSpacing/>
+              <w:jc w:val="both"/>
+              <w:rPr>
+                <w:rFonts w:ascii="Arial" w:hAnsi="Arial" w:cs="Arial"/>
+                <w:b/>
+                <w:bCs/>
+                <w:sz w:val="20"/>
+                <w:szCs w:val="20"/>
+              </w:rPr>
+            </w:pPr>
+            <w:r>
+              <w:rPr>
+                <w:rFonts w:ascii="Arial" w:hAnsi="Arial" w:cs="Arial"/>
+                <w:b/>
+                <w:bCs/>
+                <w:sz w:val="20"/>
+                <w:szCs w:val="20"/>
+              </w:rPr>
+              <w:t>Representation</w:t>
+            </w:r>
+          </w:p>
+        </w:tc>
+      </w:tr>
+      <w:tr>
+        <w:tc>
+          <w:tcPr>
+            <w:tcW w:w="4508" w:type="dxa"/>
+          </w:tcPr>
+          <w:p>
+            <w:pPr>
+              <w:contextualSpacing/>
+              <w:jc w:val="both"/>
+              <w:rPr>
+                <w:rFonts w:ascii="Arial" w:hAnsi="Arial" w:cs="Arial"/>
+                <w:sz w:val="20"/>
+                <w:szCs w:val="20"/>
+              </w:rPr>
+            </w:pPr>
+            <w:r>
+              <w:rPr>
+                <w:rFonts w:ascii="Arial" w:hAnsi="Arial" w:cs="Arial"/>
+                <w:sz w:val="20"/>
+                <w:szCs w:val="20"/>
+              </w:rPr>
+              <w:t>Main attraction of current job</w:t>
+            </w:r>
+          </w:p>
+        </w:tc>
+        <w:tc>
+          <w:tcPr>
+            <w:tcW w:w="4508" w:type="dxa"/>
+          </w:tcPr>
+          <w:p>
+            <w:pPr>
+              <w:contextualSpacing/>
+              <w:jc w:val="both"/>
+              <w:rPr>
+                <w:rFonts w:ascii="Arial" w:hAnsi="Arial" w:cs="Arial"/>
+                <w:sz w:val="20"/>
+                <w:szCs w:val="20"/>
+              </w:rPr>
+            </w:pPr>
+            <w:r>
+              <w:rPr>
+                <w:rFonts w:ascii="Arial" w:hAnsi="Arial" w:cs="Arial"/>
+                <w:sz w:val="20"/>
+                <w:szCs w:val="20"/>
+              </w:rPr>
+              <w:t>‘J’</w:t>
+            </w:r>
+          </w:p>
+        </w:tc>
+      </w:tr>
+      <w:tr>
+        <w:tc>
+          <w:tcPr>
+            <w:tcW w:w="4508" w:type="dxa"/>
+          </w:tcPr>
+          <w:p>
+            <w:pPr>
+              <w:contextualSpacing/>
+              <w:jc w:val="both"/>
+              <w:rPr>
+                <w:rFonts w:ascii="Arial" w:hAnsi="Arial" w:cs="Arial"/>
+                <w:sz w:val="20"/>
+                <w:szCs w:val="20"/>
+              </w:rPr>
+            </w:pPr>
+            <w:r>
+              <w:rPr>
+                <w:rFonts w:ascii="Arial" w:hAnsi="Arial" w:cs="Arial"/>
+                <w:sz w:val="20"/>
+                <w:szCs w:val="20"/>
+              </w:rPr>
+              <w:t>Job-related Depression scale</w:t>
+            </w:r>
+          </w:p>
+        </w:tc>
+        <w:tc>
+          <w:tcPr>
+            <w:tcW w:w="4508" w:type="dxa"/>
+          </w:tcPr>
+          <w:p>
+            <w:pPr>
+              <w:contextualSpacing/>
+              <w:jc w:val="both"/>
+              <w:rPr>
+                <w:rFonts w:ascii="Arial" w:hAnsi="Arial" w:cs="Arial"/>
+                <w:sz w:val="20"/>
+                <w:szCs w:val="20"/>
+              </w:rPr>
+            </w:pPr>
+            <w:r>
+              <w:rPr>
+                <w:rFonts w:ascii="Arial" w:hAnsi="Arial" w:cs="Arial"/>
+                <w:sz w:val="20"/>
+                <w:szCs w:val="20"/>
+              </w:rPr>
+              <w:t>(</w:t>
+            </w:r>
+            <w:r>
+              <w:rPr>
+                <w:rFonts w:ascii="Arial" w:hAnsi="Arial" w:cs="Arial"/>
+                <w:sz w:val="20"/>
+                <w:szCs w:val="20"/>
+              </w:rPr>
+              <w:t xml:space="preserve">1 </w:t>
+            </w:r>
+            <w:r>
+              <w:rPr>
+                <w:rFonts w:ascii="Arial" w:hAnsi="Arial" w:cs="Arial"/>
+                <w:sz w:val="20"/>
+                <w:szCs w:val="20"/>
+              </w:rPr>
+              <w:t>–</w:t>
+            </w:r>
+            <w:r>
+              <w:rPr>
+                <w:rFonts w:ascii="Arial" w:hAnsi="Arial" w:cs="Arial"/>
+                <w:sz w:val="20"/>
+                <w:szCs w:val="20"/>
+              </w:rPr>
+              <w:t xml:space="preserve"> D</w:t>
+            </w:r>
+            <w:r>
+              <w:rPr>
+                <w:rFonts w:ascii="Arial" w:hAnsi="Arial" w:cs="Arial"/>
+                <w:sz w:val="20"/>
+                <w:szCs w:val="20"/>
+              </w:rPr>
+              <w:t>)</w:t>
+            </w:r>
+          </w:p>
+        </w:tc>
+      </w:tr>
+      <w:tr>
+        <w:tc>
+          <w:tcPr>
+            <w:tcW w:w="4508" w:type="dxa"/>
+          </w:tcPr>
+          <w:p>
+            <w:pPr>
+              <w:contextualSpacing/>
+              <w:jc w:val="both"/>
+              <w:rPr>
+                <w:rFonts w:ascii="Arial" w:hAnsi="Arial" w:cs="Arial"/>
+                <w:sz w:val="20"/>
+                <w:szCs w:val="20"/>
+              </w:rPr>
+            </w:pPr>
+            <w:r>
+              <w:rPr>
+                <w:rFonts w:ascii="Arial" w:hAnsi="Arial" w:cs="Arial"/>
+                <w:sz w:val="20"/>
+                <w:szCs w:val="20"/>
+              </w:rPr>
+              <w:t>Social contract (health condition)</w:t>
+            </w:r>
+          </w:p>
+        </w:tc>
+        <w:tc>
+          <w:tcPr>
+            <w:tcW w:w="4508" w:type="dxa"/>
+          </w:tcPr>
+          <w:p>
+            <w:pPr>
+              <w:contextualSpacing/>
+              <w:jc w:val="both"/>
+              <w:rPr>
+                <w:rFonts w:ascii="Arial" w:hAnsi="Arial" w:cs="Arial"/>
+                <w:sz w:val="20"/>
+                <w:szCs w:val="20"/>
+              </w:rPr>
+            </w:pPr>
+            <w:r>
+              <w:rPr>
+                <w:rFonts w:ascii="Arial" w:hAnsi="Arial" w:cs="Arial"/>
+                <w:sz w:val="20"/>
+                <w:szCs w:val="20"/>
+              </w:rPr>
+              <w:t>‘S’</w:t>
+            </w:r>
+          </w:p>
+        </w:tc>
+      </w:tr>
+    </w:tbl>
+    <w:p>
+      <w:pPr>
+        <w:contextualSpacing/>
+        <w:jc w:val="both"/>
+        <w:rPr>
+          <w:rFonts w:ascii="Arial" w:hAnsi="Arial" w:cs="Arial"/>
+          <w:sz w:val="20"/>
+          <w:szCs w:val="20"/>
+        </w:rPr>
+      </w:pPr>
+    </w:p>
+    <w:p>
+      <w:pPr>
+        <w:spacing w:line="240" w:lineRule="auto"/>
+        <w:contextualSpacing/>
+        <w:jc w:val="both"/>
+        <w:rPr>
+          <w:rFonts w:ascii="Arial" w:hAnsi="Arial" w:cs="Arial"/>
+          <w:sz w:val="20"/>
+          <w:szCs w:val="20"/>
+        </w:rPr>
+      </w:pPr>
+      <w:r>
+        <w:rPr>
+          <w:rFonts w:ascii="Arial" w:hAnsi="Arial" w:cs="Arial"/>
+          <w:sz w:val="20"/>
+          <w:szCs w:val="20"/>
+        </w:rPr>
+        <w:t>Other selected</w:t>
+      </w:r>
+      <w:r>
+        <w:rPr>
+          <w:rFonts w:ascii="Arial" w:hAnsi="Arial" w:cs="Arial"/>
+          <w:sz w:val="20"/>
+          <w:szCs w:val="20"/>
+        </w:rPr>
+        <w:t xml:space="preserve"> variables: We assume the employer observes productivity of current workers, profitability of their business unit, and thereafter sets its offered wage above the market wage as this is a proven method of ensuring the avoidance of workers who are likely to shirk or who signal low productivity levels (Shapiro and Stiglitz).</w:t>
+      </w:r>
+    </w:p>
+    <w:p>
+      <w:pPr>
+        <w:contextualSpacing/>
+        <w:jc w:val="both"/>
+        <w:rPr>
+          <w:rFonts w:ascii="Arial" w:hAnsi="Arial" w:cs="Arial"/>
+          <w:sz w:val="20"/>
+          <w:szCs w:val="20"/>
+        </w:rPr>
+      </w:pPr>
+    </w:p>
+    <w:tbl>
+      <w:tblPr>
+        <w:tblStyle w:val="TableGrid"/>
+        <w:tblW w:w="0" w:type="auto"/>
+        <w:tblLook w:val="04A0" w:firstRow="1" w:lastRow="0" w:firstColumn="1" w:lastColumn="0" w:noHBand="0" w:noVBand="1"/>
+      </w:tblPr>
+      <w:tblGrid>
+        <w:gridCol w:w="4508"/>
+        <w:gridCol w:w="4508"/>
+      </w:tblGrid>
+      <w:tr>
+        <w:tc>
+          <w:tcPr>
+            <w:tcW w:w="4508" w:type="dxa"/>
+          </w:tcPr>
+          <w:p>
+            <w:pPr>
+              <w:contextualSpacing/>
+              <w:jc w:val="both"/>
+              <w:rPr>
+                <w:rFonts w:ascii="Arial" w:hAnsi="Arial" w:cs="Arial"/>
+                <w:b/>
+                <w:bCs/>
+                <w:sz w:val="20"/>
+                <w:szCs w:val="20"/>
+              </w:rPr>
+            </w:pPr>
+            <w:r>
+              <w:rPr>
+                <w:rFonts w:ascii="Arial" w:hAnsi="Arial" w:cs="Arial"/>
+                <w:b/>
+                <w:bCs/>
+                <w:sz w:val="20"/>
+                <w:szCs w:val="20"/>
+              </w:rPr>
+              <w:t>Dependent Variable</w:t>
+            </w:r>
+          </w:p>
+        </w:tc>
+        <w:tc>
+          <w:tcPr>
+            <w:tcW w:w="4508" w:type="dxa"/>
+          </w:tcPr>
+          <w:p>
+            <w:pPr>
+              <w:contextualSpacing/>
+              <w:jc w:val="both"/>
+              <w:rPr>
+                <w:rFonts w:ascii="Arial" w:hAnsi="Arial" w:cs="Arial"/>
+                <w:b/>
+                <w:bCs/>
+                <w:sz w:val="20"/>
+                <w:szCs w:val="20"/>
+              </w:rPr>
+            </w:pPr>
+            <w:r>
+              <w:rPr>
+                <w:rFonts w:ascii="Arial" w:hAnsi="Arial" w:cs="Arial"/>
+                <w:b/>
+                <w:bCs/>
+                <w:sz w:val="20"/>
+                <w:szCs w:val="20"/>
+              </w:rPr>
+              <w:t>Representation</w:t>
+            </w:r>
+          </w:p>
+        </w:tc>
+      </w:tr>
+      <w:tr>
+        <w:tc>
+          <w:tcPr>
+            <w:tcW w:w="4508" w:type="dxa"/>
+          </w:tcPr>
+          <w:p>
+            <w:pPr>
+              <w:contextualSpacing/>
+              <w:jc w:val="both"/>
+              <w:rPr>
+                <w:rFonts w:ascii="Arial" w:hAnsi="Arial" w:cs="Arial"/>
+                <w:sz w:val="20"/>
+                <w:szCs w:val="20"/>
+              </w:rPr>
+            </w:pPr>
+            <w:r>
+              <w:rPr>
+                <w:rFonts w:ascii="Arial" w:hAnsi="Arial" w:cs="Arial"/>
+                <w:sz w:val="20"/>
+                <w:szCs w:val="20"/>
+              </w:rPr>
+              <w:t>Productivity signalled by new worker</w:t>
+            </w:r>
+          </w:p>
+        </w:tc>
+        <w:tc>
+          <w:tcPr>
+            <w:tcW w:w="4508" w:type="dxa"/>
+          </w:tcPr>
+          <w:p>
+            <w:pPr>
+              <w:contextualSpacing/>
+              <w:jc w:val="both"/>
+              <w:rPr>
+                <w:rFonts w:ascii="Arial" w:hAnsi="Arial" w:cs="Arial"/>
+                <w:sz w:val="20"/>
+                <w:szCs w:val="20"/>
+              </w:rPr>
+            </w:pPr>
+            <w:r>
+              <w:rPr>
+                <w:rFonts w:ascii="Arial" w:hAnsi="Arial" w:cs="Arial"/>
+                <w:sz w:val="20"/>
+                <w:szCs w:val="20"/>
+              </w:rPr>
+              <w:t>U*</w:t>
+            </w:r>
+          </w:p>
+        </w:tc>
+      </w:tr>
+      <w:tr>
+        <w:tc>
+          <w:tcPr>
+            <w:tcW w:w="4508" w:type="dxa"/>
+          </w:tcPr>
+          <w:p>
+            <w:pPr>
+              <w:contextualSpacing/>
+              <w:jc w:val="both"/>
+              <w:rPr>
+                <w:rFonts w:ascii="Arial" w:hAnsi="Arial" w:cs="Arial"/>
+                <w:sz w:val="20"/>
+                <w:szCs w:val="20"/>
+              </w:rPr>
+            </w:pPr>
+            <w:r>
+              <w:rPr>
+                <w:rFonts w:ascii="Arial" w:hAnsi="Arial" w:cs="Arial"/>
+                <w:sz w:val="20"/>
+                <w:szCs w:val="20"/>
+              </w:rPr>
+              <w:t>Profitability of the business</w:t>
+            </w:r>
+          </w:p>
+        </w:tc>
+        <w:tc>
+          <w:tcPr>
+            <w:tcW w:w="4508" w:type="dxa"/>
+          </w:tcPr>
+          <w:p>
+            <w:pPr>
+              <w:contextualSpacing/>
+              <w:jc w:val="both"/>
+              <w:rPr>
+                <w:rFonts w:ascii="Arial" w:hAnsi="Arial" w:cs="Arial"/>
+                <w:sz w:val="20"/>
+                <w:szCs w:val="20"/>
+              </w:rPr>
+            </w:pPr>
+            <w:r>
+              <w:rPr>
+                <w:rFonts w:ascii="Arial" w:hAnsi="Arial" w:cs="Arial"/>
+                <w:sz w:val="20"/>
+                <w:szCs w:val="20"/>
+              </w:rPr>
+              <w:t>Simply ‘H’ or (P*Q)</w:t>
+            </w:r>
+          </w:p>
+        </w:tc>
+      </w:tr>
+      <w:tr>
+        <w:tc>
+          <w:tcPr>
+            <w:tcW w:w="4508" w:type="dxa"/>
+          </w:tcPr>
+          <w:p>
+            <w:pPr>
+              <w:contextualSpacing/>
+              <w:jc w:val="both"/>
+              <w:rPr>
+                <w:rFonts w:ascii="Arial" w:hAnsi="Arial" w:cs="Arial"/>
+                <w:sz w:val="20"/>
+                <w:szCs w:val="20"/>
+              </w:rPr>
+            </w:pPr>
+            <w:r>
+              <w:rPr>
+                <w:rFonts w:ascii="Arial" w:hAnsi="Arial" w:cs="Arial"/>
+                <w:sz w:val="20"/>
+                <w:szCs w:val="20"/>
+              </w:rPr>
+              <w:t>Shirking likelihood</w:t>
+            </w:r>
+          </w:p>
+        </w:tc>
+        <w:tc>
+          <w:tcPr>
+            <w:tcW w:w="4508" w:type="dxa"/>
+          </w:tcPr>
+          <w:p>
+            <w:pPr>
+              <w:contextualSpacing/>
+              <w:jc w:val="both"/>
+              <w:rPr>
+                <w:rFonts w:ascii="Arial" w:hAnsi="Arial" w:cs="Arial"/>
+                <w:sz w:val="20"/>
+                <w:szCs w:val="20"/>
+              </w:rPr>
+            </w:pPr>
+            <w:r>
+              <w:rPr>
+                <w:rFonts w:ascii="Arial" w:hAnsi="Arial" w:cs="Arial"/>
+                <w:sz w:val="20"/>
+                <w:szCs w:val="20"/>
+              </w:rPr>
+              <w:t>(1 - U)</w:t>
+            </w:r>
+          </w:p>
+        </w:tc>
+      </w:tr>
+      <w:tr>
+        <w:tc>
+          <w:tcPr>
+            <w:tcW w:w="4508" w:type="dxa"/>
+          </w:tcPr>
+          <w:p>
+            <w:pPr>
+              <w:contextualSpacing/>
+              <w:jc w:val="both"/>
+              <w:rPr>
+                <w:rFonts w:ascii="Arial" w:hAnsi="Arial" w:cs="Arial"/>
+                <w:sz w:val="20"/>
+                <w:szCs w:val="20"/>
+              </w:rPr>
+            </w:pPr>
+            <w:r>
+              <w:rPr>
+                <w:rFonts w:ascii="Arial" w:hAnsi="Arial" w:cs="Arial"/>
+                <w:sz w:val="20"/>
+                <w:szCs w:val="20"/>
+              </w:rPr>
+              <w:t>Above market wage level</w:t>
+            </w:r>
+          </w:p>
+        </w:tc>
+        <w:tc>
+          <w:tcPr>
+            <w:tcW w:w="4508" w:type="dxa"/>
+          </w:tcPr>
+          <w:p>
+            <w:pPr>
+              <w:contextualSpacing/>
+              <w:jc w:val="both"/>
+              <w:rPr>
+                <w:rFonts w:ascii="Arial" w:hAnsi="Arial" w:cs="Arial"/>
+                <w:sz w:val="20"/>
+                <w:szCs w:val="20"/>
+              </w:rPr>
+            </w:pPr>
+            <w:r>
+              <w:rPr>
+                <w:rFonts w:ascii="Arial" w:hAnsi="Arial" w:cs="Arial"/>
+                <w:sz w:val="20"/>
+                <w:szCs w:val="20"/>
+              </w:rPr>
+              <w:t>1+ W x (H) / U</w:t>
+            </w:r>
+          </w:p>
+        </w:tc>
+      </w:tr>
+    </w:tbl>
+    <w:p>
+      <w:pPr>
+        <w:pStyle w:val="Heading2"/>
+        <w:contextualSpacing/>
+        <w:jc w:val="both"/>
+        <w:rPr>
+          <w:rFonts w:ascii="Arial" w:hAnsi="Arial" w:cs="Arial"/>
+          <w:color w:val="auto"/>
+        </w:rPr>
+      </w:pPr>
+      <w:bookmarkStart w:id="14" w:name="_Toc221634006"/>
+      <w:r>
+        <w:rPr>
+          <w:rStyle w:val="Strong"/>
+          <w:rFonts w:ascii="Arial" w:hAnsi="Arial" w:cs="Arial"/>
+          <w:b w:val="0"/>
+          <w:bCs w:val="0"/>
+          <w:color w:val="auto"/>
+        </w:rPr>
+        <w:t>1.</w:t>
+      </w:r>
+      <w:r>
+        <w:rPr>
+          <w:rStyle w:val="Strong"/>
+          <w:rFonts w:ascii="Arial" w:hAnsi="Arial" w:cs="Arial"/>
+          <w:b w:val="0"/>
+          <w:bCs w:val="0"/>
+          <w:color w:val="auto"/>
+        </w:rPr>
+        <w:t>14</w:t>
+      </w:r>
+      <w:r>
+        <w:rPr>
+          <w:rStyle w:val="Strong"/>
+          <w:rFonts w:ascii="Arial" w:hAnsi="Arial" w:cs="Arial"/>
+          <w:b w:val="0"/>
+          <w:bCs w:val="0"/>
+          <w:color w:val="auto"/>
+        </w:rPr>
+        <w:t xml:space="preserve"> </w:t>
+      </w:r>
+      <w:bookmarkEnd w:id="12"/>
+      <w:r>
+        <w:rPr>
+          <w:rStyle w:val="Strong"/>
+          <w:rFonts w:ascii="Arial" w:hAnsi="Arial" w:cs="Arial"/>
+          <w:b w:val="0"/>
+          <w:bCs w:val="0"/>
+          <w:color w:val="auto"/>
+        </w:rPr>
         <w:t>The Topic’s Importance to the Literature</w:t>
       </w:r>
-      <w:bookmarkEnd w:id="12"/>
+      <w:bookmarkEnd w:id="14"/>
     </w:p>
     <w:p>
       <w:pPr>
@@ -4269,7 +5700,7 @@
         </w:rPr>
         <w:t xml:space="preserve">The importance of this research topic cannot be </w:t>
       </w:r>
-      <w:commentRangeStart w:id="13"/>
+      <w:commentRangeStart w:id="15"/>
       <w:r>
         <w:rPr>
           <w:rFonts w:ascii="Arial" w:hAnsi="Arial" w:cs="Arial"/>
@@ -4278,13 +5709,13 @@
         </w:rPr>
         <w:t>understated</w:t>
       </w:r>
-      <w:commentRangeEnd w:id="13"/>
+      <w:commentRangeEnd w:id="15"/>
       <w:r>
         <w:rPr>
           <w:rStyle w:val="CommentReference"/>
           <w:rFonts w:ascii="Arial" w:hAnsi="Arial" w:cs="Arial"/>
         </w:rPr>
-        <w:commentReference w:id="13"/>
+        <w:commentReference w:id="15"/>
       </w:r>
       <w:r>
         <w:rPr>
@@ -4365,7 +5796,6 @@
           <w:sz w:val="20"/>
           <w:szCs w:val="20"/>
         </w:rPr>
-        <w:lastRenderedPageBreak/>
         <w:t>A high-commitment HRM strategy is pursued and that firms conduct recruitment via a website</w:t>
       </w:r>
     </w:p>
@@ -4390,6 +5820,7 @@
           <w:sz w:val="20"/>
           <w:szCs w:val="20"/>
         </w:rPr>
+        <w:lastRenderedPageBreak/>
         <w:t>The firm may initiate a signal to the receiver via this website about its high-commitment HRM strategy</w:t>
       </w:r>
     </w:p>
@@ -4728,9 +6159,9 @@
         </w:rPr>
         <w:t xml:space="preserve">Data on how firms spend on recruitment </w:t>
       </w:r>
-      <w:commentRangeStart w:id="14"/>
-      <w:commentRangeStart w:id="15"/>
       <w:commentRangeStart w:id="16"/>
+      <w:commentRangeStart w:id="17"/>
+      <w:commentRangeStart w:id="18"/>
       <w:r>
         <w:rPr>
           <w:rStyle w:val="Strong"/>
@@ -4742,29 +6173,29 @@
         </w:rPr>
         <w:t>websites</w:t>
       </w:r>
-      <w:commentRangeEnd w:id="14"/>
+      <w:commentRangeEnd w:id="16"/>
       <w:r>
         <w:rPr>
           <w:rStyle w:val="CommentReference"/>
           <w:rFonts w:ascii="Arial" w:hAnsi="Arial" w:cs="Arial"/>
         </w:rPr>
-        <w:commentReference w:id="14"/>
-      </w:r>
-      <w:commentRangeEnd w:id="15"/>
+        <w:commentReference w:id="16"/>
+      </w:r>
+      <w:commentRangeEnd w:id="17"/>
       <w:r>
         <w:rPr>
           <w:rStyle w:val="CommentReference"/>
           <w:rFonts w:ascii="Arial" w:hAnsi="Arial" w:cs="Arial"/>
         </w:rPr>
-        <w:commentReference w:id="15"/>
-      </w:r>
-      <w:commentRangeEnd w:id="16"/>
+        <w:commentReference w:id="17"/>
+      </w:r>
+      <w:commentRangeEnd w:id="18"/>
       <w:r>
         <w:rPr>
           <w:rStyle w:val="CommentReference"/>
           <w:rFonts w:ascii="Arial" w:hAnsi="Arial" w:cs="Arial"/>
         </w:rPr>
-        <w:commentReference w:id="16"/>
+        <w:commentReference w:id="18"/>
       </w:r>
     </w:p>
     <w:p>
@@ -4780,8 +6211,8 @@
           <w:color w:val="auto"/>
         </w:rPr>
       </w:pPr>
-      <w:bookmarkStart w:id="17" w:name="_Toc215736437"/>
-      <w:bookmarkStart w:id="18" w:name="_Toc221107087"/>
+      <w:bookmarkStart w:id="19" w:name="_Toc215736437"/>
+      <w:bookmarkStart w:id="20" w:name="_Toc221634007"/>
       <w:r>
         <w:rPr>
           <w:rFonts w:ascii="Arial" w:hAnsi="Arial" w:cs="Arial"/>
@@ -4831,8 +6262,8 @@
         </w:rPr>
         <w:t>Next Steps</w:t>
       </w:r>
-      <w:bookmarkEnd w:id="17"/>
-      <w:bookmarkEnd w:id="18"/>
+      <w:bookmarkEnd w:id="19"/>
+      <w:bookmarkEnd w:id="20"/>
     </w:p>
     <w:p>
       <w:pPr>
@@ -5060,8 +6491,8 @@
         </w:rPr>
         <w:t xml:space="preserve"> and indeed qualitative analysis </w:t>
       </w:r>
-      <w:commentRangeStart w:id="19"/>
-      <w:commentRangeStart w:id="20"/>
+      <w:commentRangeStart w:id="21"/>
+      <w:commentRangeStart w:id="22"/>
       <w:r>
         <w:rPr>
           <w:rStyle w:val="Strong"/>
@@ -5073,21 +6504,21 @@
         </w:rPr>
         <w:t>such</w:t>
       </w:r>
-      <w:commentRangeEnd w:id="19"/>
+      <w:commentRangeEnd w:id="21"/>
       <w:r>
         <w:rPr>
           <w:rStyle w:val="CommentReference"/>
           <w:rFonts w:ascii="Arial" w:hAnsi="Arial" w:cs="Arial"/>
         </w:rPr>
-        <w:commentReference w:id="19"/>
-      </w:r>
-      <w:commentRangeEnd w:id="20"/>
+        <w:commentReference w:id="21"/>
+      </w:r>
+      <w:commentRangeEnd w:id="22"/>
       <w:r>
         <w:rPr>
           <w:rStyle w:val="CommentReference"/>
           <w:rFonts w:ascii="Arial" w:hAnsi="Arial" w:cs="Arial"/>
         </w:rPr>
-        <w:commentReference w:id="20"/>
+        <w:commentReference w:id="22"/>
       </w:r>
       <w:r>
         <w:rPr>
@@ -5191,9 +6622,9 @@
           <w:color w:val="000000" w:themeColor="text1"/>
         </w:rPr>
       </w:pPr>
-      <w:bookmarkStart w:id="21" w:name="_Toc216632807"/>
-      <w:bookmarkStart w:id="22" w:name="_Toc221107088"/>
-      <w:bookmarkStart w:id="23" w:name="_Toc215736438"/>
+      <w:bookmarkStart w:id="23" w:name="_Toc216632807"/>
+      <w:bookmarkStart w:id="24" w:name="_Toc215736438"/>
+      <w:bookmarkStart w:id="25" w:name="_Toc221634008"/>
       <w:r>
         <w:rPr>
           <w:rStyle w:val="Strong"/>
@@ -5234,7 +6665,7 @@
         </w:rPr>
         <w:t>Introduction to TMA 2</w:t>
       </w:r>
-      <w:bookmarkEnd w:id="21"/>
+      <w:bookmarkEnd w:id="23"/>
       <w:r>
         <w:rPr>
           <w:rStyle w:val="Strong"/>
@@ -5245,7 +6676,7 @@
         </w:rPr>
         <w:t xml:space="preserve"> – Literature Review</w:t>
       </w:r>
-      <w:bookmarkEnd w:id="22"/>
+      <w:bookmarkEnd w:id="25"/>
     </w:p>
     <w:p>
       <w:pPr>
@@ -5265,7 +6696,25 @@
           <w:sz w:val="20"/>
           <w:szCs w:val="20"/>
         </w:rPr>
-        <w:t>As SHRM (specifically, RBV) is a very interdisciplinary subject when it comes to research that defines theory - I will be sourcing information on the following subtopics from three highly reliable contemporary literature sources (JSTOR, The Open University Library and Google Scholar). My intention is to source academic peer-reviewed literature published roughly between 2010 – 2025 in terms of timelines (the literature effectively narrates on the problem which can be traced back to about 2011 in reports so, there’s about a 8–10-year gap where the problem surfaces and the seminal papers focused on analysing the problem begin to emerge in the literature). However, there may be exceptions to this timeline as per the theoretical work of Coles and Treble (1993) or the earlier theoretical work by Rynes and Barber (1990). Though the three selected sources indeed do store great literature on each subtopic, I may require policy infographics, charts and vital published statistics which will also be important to this study’s objective. I will therefore be actively seeking NGO and government reports drawn from Overton.io, where such information may be found.</w:t>
+        <w:t>As SHRM (specifically, RBV) is a very interdisciplinary subject when it comes to research that defines theory - I will be sourcing information on the following subtopics from three highly reliable contemporary literature sources (</w:t>
+      </w:r>
+      <w:r>
+        <w:rPr>
+          <w:rFonts w:ascii="Arial" w:hAnsi="Arial" w:cs="Arial"/>
+          <w:color w:val="000000" w:themeColor="text1"/>
+          <w:sz w:val="20"/>
+          <w:szCs w:val="20"/>
+        </w:rPr>
+        <w:t xml:space="preserve">EBSCOhost Research Databases, </w:t>
+      </w:r>
+      <w:r>
+        <w:rPr>
+          <w:rFonts w:ascii="Arial" w:hAnsi="Arial" w:cs="Arial"/>
+          <w:color w:val="000000" w:themeColor="text1"/>
+          <w:sz w:val="20"/>
+          <w:szCs w:val="20"/>
+        </w:rPr>
+        <w:t>JSTOR, Open University Library and Google Scholar). My intention is to source academic peer-reviewed literature published roughly between 2010 – 2025 in terms of timelines (the literature effectively narrates on the problem which can be traced back to about 2011 in reports so, there’s about a 8–10-year gap where the problem surfaces and the seminal papers focused on analysing the problem begin to emerge in the literature). However, there may be exceptions to this timeline as per the theoretical work of Coles and Treble (1993) or the earlier theoretical work by Rynes and Barber (1990). Though the three selected sources indeed do store great literature on each subtopic, I may require policy infographics, charts and vital published statistics which will also be important to this study’s objective. I will therefore be actively seeking NGO and government reports drawn from Overton.io, where such information may be found.</w:t>
       </w:r>
     </w:p>
     <w:p>
@@ -5281,8 +6730,8 @@
           <w:color w:val="000000" w:themeColor="text1"/>
         </w:rPr>
       </w:pPr>
-      <w:bookmarkStart w:id="24" w:name="_Toc216632808"/>
-      <w:bookmarkStart w:id="25" w:name="_Toc221107089"/>
+      <w:bookmarkStart w:id="26" w:name="_Toc216632808"/>
+      <w:bookmarkStart w:id="27" w:name="_Toc221634009"/>
       <w:r>
         <w:rPr>
           <w:rStyle w:val="Strong"/>
@@ -5364,8 +6813,8 @@
         </w:rPr>
         <w:t>ubtopics</w:t>
       </w:r>
-      <w:bookmarkEnd w:id="24"/>
-      <w:bookmarkEnd w:id="25"/>
+      <w:bookmarkEnd w:id="26"/>
+      <w:bookmarkEnd w:id="27"/>
     </w:p>
     <w:p>
       <w:pPr>
@@ -5575,7 +7024,7 @@
           <w:color w:val="000000" w:themeColor="text1"/>
         </w:rPr>
       </w:pPr>
-      <w:bookmarkStart w:id="26" w:name="_Toc221107090"/>
+      <w:bookmarkStart w:id="28" w:name="_Toc221634010"/>
       <w:r>
         <w:rPr>
           <w:rStyle w:val="Strong"/>
@@ -5596,7 +7045,7 @@
         </w:rPr>
         <w:t>Conducting Gap Analysis – AI and its effect on HRM</w:t>
       </w:r>
-      <w:bookmarkEnd w:id="26"/>
+      <w:bookmarkEnd w:id="28"/>
     </w:p>
     <w:p>
       <w:pPr>
@@ -5607,7 +7056,7 @@
           <w:szCs w:val="20"/>
         </w:rPr>
       </w:pPr>
-      <w:bookmarkStart w:id="27" w:name="_Toc216632809"/>
+      <w:bookmarkStart w:id="29" w:name="_Toc216632809"/>
       <w:r>
         <w:rPr>
           <w:rFonts w:ascii="Arial" w:hAnsi="Arial" w:cs="Arial"/>
@@ -6166,7 +7615,7 @@
           <w:color w:val="000000" w:themeColor="text1"/>
         </w:rPr>
       </w:pPr>
-      <w:bookmarkStart w:id="28" w:name="_Toc221107091"/>
+      <w:bookmarkStart w:id="30" w:name="_Toc221634011"/>
       <w:r>
         <w:rPr>
           <w:rStyle w:val="Strong"/>
@@ -6187,7 +7636,7 @@
         </w:rPr>
         <w:t>Concerns and Recommendations</w:t>
       </w:r>
-      <w:bookmarkEnd w:id="28"/>
+      <w:bookmarkEnd w:id="30"/>
     </w:p>
     <w:p>
       <w:pPr>
@@ -6848,7 +8297,7 @@
           <w:color w:val="000000" w:themeColor="text1"/>
         </w:rPr>
       </w:pPr>
-      <w:bookmarkStart w:id="29" w:name="_Toc221107092"/>
+      <w:bookmarkStart w:id="31" w:name="_Toc221634012"/>
       <w:r>
         <w:rPr>
           <w:rStyle w:val="Strong"/>
@@ -6878,9 +8327,8 @@
           <w:bCs w:val="0"/>
           <w:color w:val="000000" w:themeColor="text1"/>
         </w:rPr>
-        <w:t>Explicating my Literature Review 1</w:t>
-      </w:r>
-      <w:bookmarkEnd w:id="27"/>
+        <w:t xml:space="preserve">Explicating </w:t>
+      </w:r>
       <w:r>
         <w:rPr>
           <w:rStyle w:val="Strong"/>
@@ -6889,9 +8337,30 @@
           <w:bCs w:val="0"/>
           <w:color w:val="000000" w:themeColor="text1"/>
         </w:rPr>
+        <w:t xml:space="preserve">the </w:t>
+      </w:r>
+      <w:r>
+        <w:rPr>
+          <w:rStyle w:val="Strong"/>
+          <w:rFonts w:ascii="Arial" w:hAnsi="Arial" w:cs="Arial"/>
+          <w:b w:val="0"/>
+          <w:bCs w:val="0"/>
+          <w:color w:val="000000" w:themeColor="text1"/>
+        </w:rPr>
+        <w:t>Literature Review 1</w:t>
+      </w:r>
+      <w:bookmarkEnd w:id="29"/>
+      <w:r>
+        <w:rPr>
+          <w:rStyle w:val="Strong"/>
+          <w:rFonts w:ascii="Arial" w:hAnsi="Arial" w:cs="Arial"/>
+          <w:b w:val="0"/>
+          <w:bCs w:val="0"/>
+          <w:color w:val="000000" w:themeColor="text1"/>
+        </w:rPr>
         <w:t xml:space="preserve"> – Applicant Attraction</w:t>
       </w:r>
-      <w:bookmarkEnd w:id="29"/>
+      <w:bookmarkEnd w:id="31"/>
     </w:p>
     <w:p>
       <w:pPr>
@@ -7529,7 +8998,7 @@
                 <w:sz w:val="20"/>
                 <w:szCs w:val="20"/>
               </w:rPr>
-              <w:t>The Scandinavian Journal of Economics</w:t>
+              <w:t>The Scandinavian Journal of Econ</w:t>
             </w:r>
           </w:p>
         </w:tc>
@@ -8100,7 +9569,7 @@
                 <w:sz w:val="20"/>
                 <w:szCs w:val="20"/>
               </w:rPr>
-              <w:t>The Scandinavian Journal of Economics</w:t>
+              <w:t>The Scandinavian Journal of Econ</w:t>
             </w:r>
           </w:p>
         </w:tc>
@@ -8641,6 +10110,9 @@
         </w:tc>
       </w:tr>
       <w:tr>
+        <w:trPr>
+          <w:trHeight w:val="80"/>
+        </w:trPr>
         <w:tc>
           <w:tcPr>
             <w:cnfStyle w:val="001000000000" w:firstRow="0" w:lastRow="0" w:firstColumn="1" w:lastColumn="0" w:oddVBand="0" w:evenVBand="0" w:oddHBand="0" w:evenHBand="0" w:firstRowFirstColumn="0" w:firstRowLastColumn="0" w:lastRowFirstColumn="0" w:lastRowLastColumn="0"/>
@@ -8659,6 +10131,7 @@
             <w:r>
               <w:rPr>
                 <w:rFonts w:ascii="Arial" w:hAnsi="Arial" w:cs="Arial"/>
+                <w:color w:val="000000" w:themeColor="text1"/>
                 <w:sz w:val="20"/>
                 <w:szCs w:val="20"/>
               </w:rPr>
@@ -8684,10 +10157,20 @@
             <w:r>
               <w:rPr>
                 <w:rFonts w:ascii="Arial" w:hAnsi="Arial" w:cs="Arial"/>
-                <w:sz w:val="20"/>
-                <w:szCs w:val="20"/>
-              </w:rPr>
-              <w:t>The Academy of Management Review</w:t>
+                <w:color w:val="000000" w:themeColor="text1"/>
+                <w:sz w:val="20"/>
+                <w:szCs w:val="20"/>
+              </w:rPr>
+              <w:t>The Quarterly Journal of Eco</w:t>
+            </w:r>
+            <w:r>
+              <w:rPr>
+                <w:rFonts w:ascii="Arial" w:hAnsi="Arial" w:cs="Arial"/>
+                <w:color w:val="000000" w:themeColor="text1"/>
+                <w:sz w:val="20"/>
+                <w:szCs w:val="20"/>
+              </w:rPr>
+              <w:t>n</w:t>
             </w:r>
           </w:p>
         </w:tc>
@@ -8709,174 +10192,11 @@
             <w:r>
               <w:rPr>
                 <w:rFonts w:ascii="Arial" w:hAnsi="Arial" w:cs="Arial"/>
-                <w:sz w:val="20"/>
-                <w:szCs w:val="20"/>
-              </w:rPr>
-              <w:t>Bowen &amp; Ostroff (2004)</w:t>
-            </w:r>
-          </w:p>
-        </w:tc>
-      </w:tr>
-      <w:tr>
-        <w:trPr>
-          <w:cnfStyle w:val="000000100000" w:firstRow="0" w:lastRow="0" w:firstColumn="0" w:lastColumn="0" w:oddVBand="0" w:evenVBand="0" w:oddHBand="1" w:evenHBand="0" w:firstRowFirstColumn="0" w:firstRowLastColumn="0" w:lastRowFirstColumn="0" w:lastRowLastColumn="0"/>
-          <w:trHeight w:val="80"/>
-        </w:trPr>
-        <w:tc>
-          <w:tcPr>
-            <w:cnfStyle w:val="001000000000" w:firstRow="0" w:lastRow="0" w:firstColumn="1" w:lastColumn="0" w:oddVBand="0" w:evenVBand="0" w:oddHBand="0" w:evenHBand="0" w:firstRowFirstColumn="0" w:firstRowLastColumn="0" w:lastRowFirstColumn="0" w:lastRowLastColumn="0"/>
-            <w:tcW w:w="1838" w:type="dxa"/>
-          </w:tcPr>
-          <w:p>
-            <w:pPr>
-              <w:jc w:val="both"/>
-              <w:rPr>
-                <w:rFonts w:ascii="Arial" w:hAnsi="Arial" w:cs="Arial"/>
                 <w:color w:val="000000" w:themeColor="text1"/>
                 <w:sz w:val="20"/>
                 <w:szCs w:val="20"/>
               </w:rPr>
-            </w:pPr>
-            <w:r>
-              <w:rPr>
-                <w:rFonts w:ascii="Arial" w:hAnsi="Arial" w:cs="Arial"/>
-                <w:color w:val="000000" w:themeColor="text1"/>
-                <w:sz w:val="20"/>
-                <w:szCs w:val="20"/>
-              </w:rPr>
-              <w:t>JSTOR</w:t>
-            </w:r>
-          </w:p>
-        </w:tc>
-        <w:tc>
-          <w:tcPr>
-            <w:tcW w:w="4172" w:type="dxa"/>
-          </w:tcPr>
-          <w:p>
-            <w:pPr>
-              <w:jc w:val="both"/>
-              <w:cnfStyle w:val="000000100000" w:firstRow="0" w:lastRow="0" w:firstColumn="0" w:lastColumn="0" w:oddVBand="0" w:evenVBand="0" w:oddHBand="1" w:evenHBand="0" w:firstRowFirstColumn="0" w:firstRowLastColumn="0" w:lastRowFirstColumn="0" w:lastRowLastColumn="0"/>
-              <w:rPr>
-                <w:rFonts w:ascii="Arial" w:hAnsi="Arial" w:cs="Arial"/>
-                <w:color w:val="000000" w:themeColor="text1"/>
-                <w:sz w:val="20"/>
-                <w:szCs w:val="20"/>
-              </w:rPr>
-            </w:pPr>
-            <w:r>
-              <w:rPr>
-                <w:rFonts w:ascii="Arial" w:hAnsi="Arial" w:cs="Arial"/>
-                <w:color w:val="000000" w:themeColor="text1"/>
-                <w:sz w:val="20"/>
-                <w:szCs w:val="20"/>
-              </w:rPr>
-              <w:t>The Quarterly Journal of Economics</w:t>
-            </w:r>
-          </w:p>
-        </w:tc>
-        <w:tc>
-          <w:tcPr>
-            <w:tcW w:w="3006" w:type="dxa"/>
-          </w:tcPr>
-          <w:p>
-            <w:pPr>
-              <w:jc w:val="both"/>
-              <w:cnfStyle w:val="000000100000" w:firstRow="0" w:lastRow="0" w:firstColumn="0" w:lastColumn="0" w:oddVBand="0" w:evenVBand="0" w:oddHBand="1" w:evenHBand="0" w:firstRowFirstColumn="0" w:firstRowLastColumn="0" w:lastRowFirstColumn="0" w:lastRowLastColumn="0"/>
-              <w:rPr>
-                <w:rFonts w:ascii="Arial" w:hAnsi="Arial" w:cs="Arial"/>
-                <w:color w:val="000000" w:themeColor="text1"/>
-                <w:sz w:val="20"/>
-                <w:szCs w:val="20"/>
-              </w:rPr>
-            </w:pPr>
-            <w:r>
-              <w:rPr>
-                <w:rFonts w:ascii="Arial" w:hAnsi="Arial" w:cs="Arial"/>
-                <w:color w:val="000000" w:themeColor="text1"/>
-                <w:sz w:val="20"/>
-                <w:szCs w:val="20"/>
-              </w:rPr>
               <w:t>Spence (1973)</w:t>
-            </w:r>
-          </w:p>
-        </w:tc>
-      </w:tr>
-      <w:tr>
-        <w:tc>
-          <w:tcPr>
-            <w:cnfStyle w:val="001000000000" w:firstRow="0" w:lastRow="0" w:firstColumn="1" w:lastColumn="0" w:oddVBand="0" w:evenVBand="0" w:oddHBand="0" w:evenHBand="0" w:firstRowFirstColumn="0" w:firstRowLastColumn="0" w:lastRowFirstColumn="0" w:lastRowLastColumn="0"/>
-            <w:tcW w:w="1838" w:type="dxa"/>
-          </w:tcPr>
-          <w:p>
-            <w:pPr>
-              <w:jc w:val="both"/>
-              <w:rPr>
-                <w:rFonts w:ascii="Arial" w:hAnsi="Arial" w:cs="Arial"/>
-                <w:color w:val="000000" w:themeColor="text1"/>
-                <w:sz w:val="20"/>
-                <w:szCs w:val="20"/>
-              </w:rPr>
-            </w:pPr>
-            <w:hyperlink r:id="rId13" w:history="1">
-              <w:r>
-                <w:rPr>
-                  <w:rStyle w:val="Hyperlink"/>
-                  <w:rFonts w:ascii="Arial" w:hAnsi="Arial" w:cs="Arial"/>
-                  <w:sz w:val="20"/>
-                  <w:szCs w:val="20"/>
-                </w:rPr>
-                <w:t>Wisconsin.edu</w:t>
-              </w:r>
-            </w:hyperlink>
-          </w:p>
-        </w:tc>
-        <w:tc>
-          <w:tcPr>
-            <w:tcW w:w="4172" w:type="dxa"/>
-          </w:tcPr>
-          <w:p>
-            <w:pPr>
-              <w:jc w:val="both"/>
-              <w:cnfStyle w:val="000000000000" w:firstRow="0" w:lastRow="0" w:firstColumn="0" w:lastColumn="0" w:oddVBand="0" w:evenVBand="0" w:oddHBand="0" w:evenHBand="0" w:firstRowFirstColumn="0" w:firstRowLastColumn="0" w:lastRowFirstColumn="0" w:lastRowLastColumn="0"/>
-              <w:rPr>
-                <w:rFonts w:ascii="Arial" w:hAnsi="Arial" w:cs="Arial"/>
-                <w:color w:val="000000" w:themeColor="text1"/>
-                <w:sz w:val="20"/>
-                <w:szCs w:val="20"/>
-              </w:rPr>
-            </w:pPr>
-            <w:r>
-              <w:rPr>
-                <w:rFonts w:ascii="Arial" w:hAnsi="Arial" w:cs="Arial"/>
-                <w:sz w:val="20"/>
-                <w:szCs w:val="20"/>
-              </w:rPr>
-              <w:t>Master of Science (Psychology) Dissertation</w:t>
-            </w:r>
-          </w:p>
-        </w:tc>
-        <w:tc>
-          <w:tcPr>
-            <w:tcW w:w="3006" w:type="dxa"/>
-          </w:tcPr>
-          <w:p>
-            <w:pPr>
-              <w:jc w:val="both"/>
-              <w:cnfStyle w:val="000000000000" w:firstRow="0" w:lastRow="0" w:firstColumn="0" w:lastColumn="0" w:oddVBand="0" w:evenVBand="0" w:oddHBand="0" w:evenHBand="0" w:firstRowFirstColumn="0" w:firstRowLastColumn="0" w:lastRowFirstColumn="0" w:lastRowLastColumn="0"/>
-              <w:rPr>
-                <w:rFonts w:ascii="Arial" w:hAnsi="Arial" w:cs="Arial"/>
-                <w:color w:val="000000" w:themeColor="text1"/>
-                <w:sz w:val="20"/>
-                <w:szCs w:val="20"/>
-              </w:rPr>
-            </w:pPr>
-            <w:r>
-              <w:rPr>
-                <w:rFonts w:ascii="Arial" w:hAnsi="Arial" w:cs="Arial"/>
-                <w:sz w:val="20"/>
-                <w:szCs w:val="20"/>
-              </w:rPr>
-              <w:t>Wright (2010)</w:t>
             </w:r>
           </w:p>
         </w:tc>
@@ -8998,7 +10318,7 @@
           <w:color w:val="000000" w:themeColor="text1"/>
         </w:rPr>
       </w:pPr>
-      <w:bookmarkStart w:id="30" w:name="_Toc216632810"/>
+      <w:bookmarkStart w:id="32" w:name="_Toc216632810"/>
     </w:p>
     <w:p>
       <w:pPr>
@@ -9013,7 +10333,7 @@
           <w:color w:val="000000" w:themeColor="text1"/>
         </w:rPr>
       </w:pPr>
-      <w:bookmarkStart w:id="31" w:name="_Toc221107093"/>
+      <w:bookmarkStart w:id="33" w:name="_Toc221634013"/>
       <w:r>
         <w:rPr>
           <w:rStyle w:val="Strong"/>
@@ -9042,9 +10362,8 @@
           <w:bCs w:val="0"/>
           <w:color w:val="000000" w:themeColor="text1"/>
         </w:rPr>
-        <w:t>Explicating my Literature Review 2</w:t>
-      </w:r>
-      <w:bookmarkEnd w:id="30"/>
+        <w:t xml:space="preserve">Explicating </w:t>
+      </w:r>
       <w:r>
         <w:rPr>
           <w:rStyle w:val="Strong"/>
@@ -9053,9 +10372,30 @@
           <w:bCs w:val="0"/>
           <w:color w:val="000000" w:themeColor="text1"/>
         </w:rPr>
+        <w:t xml:space="preserve">the </w:t>
+      </w:r>
+      <w:r>
+        <w:rPr>
+          <w:rStyle w:val="Strong"/>
+          <w:rFonts w:ascii="Arial" w:hAnsi="Arial" w:cs="Arial"/>
+          <w:b w:val="0"/>
+          <w:bCs w:val="0"/>
+          <w:color w:val="000000" w:themeColor="text1"/>
+        </w:rPr>
+        <w:t>Literature Review 2</w:t>
+      </w:r>
+      <w:bookmarkEnd w:id="32"/>
+      <w:r>
+        <w:rPr>
+          <w:rStyle w:val="Strong"/>
+          <w:rFonts w:ascii="Arial" w:hAnsi="Arial" w:cs="Arial"/>
+          <w:b w:val="0"/>
+          <w:bCs w:val="0"/>
+          <w:color w:val="000000" w:themeColor="text1"/>
+        </w:rPr>
         <w:t xml:space="preserve"> – Signalling Theory</w:t>
       </w:r>
-      <w:bookmarkEnd w:id="31"/>
+      <w:bookmarkEnd w:id="33"/>
     </w:p>
     <w:p>
       <w:pPr>
@@ -9481,7 +10821,88 @@
           <w:sz w:val="20"/>
           <w:szCs w:val="20"/>
         </w:rPr>
-        <w:t xml:space="preserve">n employer’s perception of this lottery </w:t>
+        <w:t xml:space="preserve">n employer’s perception of this lottery gamble is what Spence </w:t>
+      </w:r>
+      <w:r>
+        <w:rPr>
+          <w:rFonts w:ascii="Arial" w:hAnsi="Arial" w:cs="Arial"/>
+          <w:color w:val="000000" w:themeColor="text1"/>
+          <w:sz w:val="20"/>
+          <w:szCs w:val="20"/>
+        </w:rPr>
+        <w:t xml:space="preserve">(1973) </w:t>
+      </w:r>
+      <w:r>
+        <w:rPr>
+          <w:rFonts w:ascii="Arial" w:hAnsi="Arial" w:cs="Arial"/>
+          <w:color w:val="000000" w:themeColor="text1"/>
+          <w:sz w:val="20"/>
+          <w:szCs w:val="20"/>
+        </w:rPr>
+        <w:t xml:space="preserve">defines as </w:t>
+      </w:r>
+      <w:r>
+        <w:rPr>
+          <w:rFonts w:ascii="Arial" w:hAnsi="Arial" w:cs="Arial"/>
+          <w:color w:val="000000" w:themeColor="text1"/>
+          <w:sz w:val="20"/>
+          <w:szCs w:val="20"/>
+        </w:rPr>
+        <w:t>a</w:t>
+      </w:r>
+      <w:r>
+        <w:rPr>
+          <w:rFonts w:ascii="Arial" w:hAnsi="Arial" w:cs="Arial"/>
+          <w:color w:val="000000" w:themeColor="text1"/>
+          <w:sz w:val="20"/>
+          <w:szCs w:val="20"/>
+        </w:rPr>
+        <w:t xml:space="preserve"> “primary interest” due to the uncertainty involved </w:t>
+      </w:r>
+      <w:r>
+        <w:rPr>
+          <w:rFonts w:ascii="Arial" w:hAnsi="Arial" w:cs="Arial"/>
+          <w:color w:val="000000" w:themeColor="text1"/>
+          <w:sz w:val="20"/>
+          <w:szCs w:val="20"/>
+        </w:rPr>
+        <w:t>in making the</w:t>
+      </w:r>
+      <w:r>
+        <w:rPr>
+          <w:rFonts w:ascii="Arial" w:hAnsi="Arial" w:cs="Arial"/>
+          <w:color w:val="000000" w:themeColor="text1"/>
+          <w:sz w:val="20"/>
+          <w:szCs w:val="20"/>
+        </w:rPr>
+        <w:t xml:space="preserve"> proposed</w:t>
+      </w:r>
+      <w:r>
+        <w:rPr>
+          <w:rFonts w:ascii="Arial" w:hAnsi="Arial" w:cs="Arial"/>
+          <w:color w:val="000000" w:themeColor="text1"/>
+          <w:sz w:val="20"/>
+          <w:szCs w:val="20"/>
+        </w:rPr>
+        <w:t xml:space="preserve"> hire when weighed against</w:t>
+      </w:r>
+      <w:r>
+        <w:rPr>
+          <w:rFonts w:ascii="Arial" w:hAnsi="Arial" w:cs="Arial"/>
+          <w:color w:val="000000" w:themeColor="text1"/>
+          <w:sz w:val="20"/>
+          <w:szCs w:val="20"/>
+        </w:rPr>
+        <w:t xml:space="preserve"> the wages offered by the employer</w:t>
+      </w:r>
+      <w:r>
+        <w:rPr>
+          <w:rFonts w:ascii="Arial" w:hAnsi="Arial" w:cs="Arial"/>
+          <w:color w:val="000000" w:themeColor="text1"/>
+          <w:sz w:val="20"/>
+          <w:szCs w:val="20"/>
+        </w:rPr>
+        <w:t xml:space="preserve"> to the worker as </w:t>
       </w:r>
       <w:r>
         <w:rPr>
@@ -9491,88 +10912,7 @@
           <w:szCs w:val="20"/>
         </w:rPr>
         <w:lastRenderedPageBreak/>
-        <w:t xml:space="preserve">gamble is what Spence </w:t>
-      </w:r>
-      <w:r>
-        <w:rPr>
-          <w:rFonts w:ascii="Arial" w:hAnsi="Arial" w:cs="Arial"/>
-          <w:color w:val="000000" w:themeColor="text1"/>
-          <w:sz w:val="20"/>
-          <w:szCs w:val="20"/>
-        </w:rPr>
-        <w:t xml:space="preserve">(1973) </w:t>
-      </w:r>
-      <w:r>
-        <w:rPr>
-          <w:rFonts w:ascii="Arial" w:hAnsi="Arial" w:cs="Arial"/>
-          <w:color w:val="000000" w:themeColor="text1"/>
-          <w:sz w:val="20"/>
-          <w:szCs w:val="20"/>
-        </w:rPr>
-        <w:t xml:space="preserve">defines as </w:t>
-      </w:r>
-      <w:r>
-        <w:rPr>
-          <w:rFonts w:ascii="Arial" w:hAnsi="Arial" w:cs="Arial"/>
-          <w:color w:val="000000" w:themeColor="text1"/>
-          <w:sz w:val="20"/>
-          <w:szCs w:val="20"/>
-        </w:rPr>
-        <w:t>a</w:t>
-      </w:r>
-      <w:r>
-        <w:rPr>
-          <w:rFonts w:ascii="Arial" w:hAnsi="Arial" w:cs="Arial"/>
-          <w:color w:val="000000" w:themeColor="text1"/>
-          <w:sz w:val="20"/>
-          <w:szCs w:val="20"/>
-        </w:rPr>
-        <w:t xml:space="preserve"> “primary interest” due to the uncertainty involved </w:t>
-      </w:r>
-      <w:r>
-        <w:rPr>
-          <w:rFonts w:ascii="Arial" w:hAnsi="Arial" w:cs="Arial"/>
-          <w:color w:val="000000" w:themeColor="text1"/>
-          <w:sz w:val="20"/>
-          <w:szCs w:val="20"/>
-        </w:rPr>
-        <w:t>in making the</w:t>
-      </w:r>
-      <w:r>
-        <w:rPr>
-          <w:rFonts w:ascii="Arial" w:hAnsi="Arial" w:cs="Arial"/>
-          <w:color w:val="000000" w:themeColor="text1"/>
-          <w:sz w:val="20"/>
-          <w:szCs w:val="20"/>
-        </w:rPr>
-        <w:t xml:space="preserve"> proposed</w:t>
-      </w:r>
-      <w:r>
-        <w:rPr>
-          <w:rFonts w:ascii="Arial" w:hAnsi="Arial" w:cs="Arial"/>
-          <w:color w:val="000000" w:themeColor="text1"/>
-          <w:sz w:val="20"/>
-          <w:szCs w:val="20"/>
-        </w:rPr>
-        <w:t xml:space="preserve"> hire when weighed against</w:t>
-      </w:r>
-      <w:r>
-        <w:rPr>
-          <w:rFonts w:ascii="Arial" w:hAnsi="Arial" w:cs="Arial"/>
-          <w:color w:val="000000" w:themeColor="text1"/>
-          <w:sz w:val="20"/>
-          <w:szCs w:val="20"/>
-        </w:rPr>
-        <w:t xml:space="preserve"> the wages offered by the employer</w:t>
-      </w:r>
-      <w:r>
-        <w:rPr>
-          <w:rFonts w:ascii="Arial" w:hAnsi="Arial" w:cs="Arial"/>
-          <w:color w:val="000000" w:themeColor="text1"/>
-          <w:sz w:val="20"/>
-          <w:szCs w:val="20"/>
-        </w:rPr>
-        <w:t xml:space="preserve"> to the worker as compensation for services rendered.</w:t>
+        <w:t>compensation for services rendered.</w:t>
       </w:r>
       <w:r>
         <w:rPr>
@@ -10822,116 +12162,125 @@
           <w:sz w:val="20"/>
           <w:szCs w:val="20"/>
         </w:rPr>
+        <w:t xml:space="preserve">to imply </w:t>
+      </w:r>
+      <w:r>
+        <w:rPr>
+          <w:rFonts w:ascii="Arial" w:hAnsi="Arial" w:cs="Arial"/>
+          <w:color w:val="000000" w:themeColor="text1"/>
+          <w:sz w:val="20"/>
+          <w:szCs w:val="20"/>
+        </w:rPr>
+        <w:t xml:space="preserve">that the organisation (recruiter or hiring manager) </w:t>
+      </w:r>
+      <w:r>
+        <w:rPr>
+          <w:rFonts w:ascii="Arial" w:hAnsi="Arial" w:cs="Arial"/>
+          <w:color w:val="000000" w:themeColor="text1"/>
+          <w:sz w:val="20"/>
+          <w:szCs w:val="20"/>
+        </w:rPr>
+        <w:t xml:space="preserve">does indeed </w:t>
+      </w:r>
+      <w:r>
+        <w:rPr>
+          <w:rFonts w:ascii="Arial" w:hAnsi="Arial" w:cs="Arial"/>
+          <w:color w:val="000000" w:themeColor="text1"/>
+          <w:sz w:val="20"/>
+          <w:szCs w:val="20"/>
+        </w:rPr>
+        <w:t>perceive</w:t>
+      </w:r>
+      <w:r>
+        <w:rPr>
+          <w:rFonts w:ascii="Arial" w:hAnsi="Arial" w:cs="Arial"/>
+          <w:color w:val="000000" w:themeColor="text1"/>
+          <w:sz w:val="20"/>
+          <w:szCs w:val="20"/>
+        </w:rPr>
+        <w:t xml:space="preserve"> and internalise</w:t>
+      </w:r>
+      <w:r>
+        <w:rPr>
+          <w:rFonts w:ascii="Arial" w:hAnsi="Arial" w:cs="Arial"/>
+          <w:color w:val="000000" w:themeColor="text1"/>
+          <w:sz w:val="20"/>
+          <w:szCs w:val="20"/>
+        </w:rPr>
+        <w:t xml:space="preserve"> what Spence (1973) defines as </w:t>
+      </w:r>
+      <w:r>
+        <w:rPr>
+          <w:rFonts w:ascii="Arial" w:hAnsi="Arial" w:cs="Arial"/>
+          <w:color w:val="000000" w:themeColor="text1"/>
+          <w:sz w:val="20"/>
+          <w:szCs w:val="20"/>
+        </w:rPr>
+        <w:t>‘</w:t>
+      </w:r>
+      <w:r>
+        <w:rPr>
+          <w:rFonts w:ascii="Arial" w:hAnsi="Arial" w:cs="Arial"/>
+          <w:color w:val="000000" w:themeColor="text1"/>
+          <w:sz w:val="20"/>
+          <w:szCs w:val="20"/>
+        </w:rPr>
+        <w:t>alterable</w:t>
+      </w:r>
+      <w:r>
+        <w:rPr>
+          <w:rFonts w:ascii="Arial" w:hAnsi="Arial" w:cs="Arial"/>
+          <w:color w:val="000000" w:themeColor="text1"/>
+          <w:sz w:val="20"/>
+          <w:szCs w:val="20"/>
+        </w:rPr>
+        <w:t>’</w:t>
+      </w:r>
+      <w:r>
+        <w:rPr>
+          <w:rFonts w:ascii="Arial" w:hAnsi="Arial" w:cs="Arial"/>
+          <w:color w:val="000000" w:themeColor="text1"/>
+          <w:sz w:val="20"/>
+          <w:szCs w:val="20"/>
+        </w:rPr>
+        <w:t xml:space="preserve"> attributes (</w:t>
+      </w:r>
+      <w:r>
+        <w:rPr>
+          <w:rFonts w:ascii="Arial" w:hAnsi="Arial" w:cs="Arial"/>
+          <w:color w:val="000000" w:themeColor="text1"/>
+          <w:sz w:val="20"/>
+          <w:szCs w:val="20"/>
+        </w:rPr>
+        <w:t xml:space="preserve">for instance, the highest </w:t>
+      </w:r>
+      <w:r>
+        <w:rPr>
+          <w:rFonts w:ascii="Arial" w:hAnsi="Arial" w:cs="Arial"/>
+          <w:color w:val="000000" w:themeColor="text1"/>
+          <w:sz w:val="20"/>
+          <w:szCs w:val="20"/>
+        </w:rPr>
+        <w:t xml:space="preserve">level of education </w:t>
+      </w:r>
+      <w:r>
+        <w:rPr>
+          <w:rFonts w:ascii="Arial" w:hAnsi="Arial" w:cs="Arial"/>
+          <w:color w:val="000000" w:themeColor="text1"/>
+          <w:sz w:val="20"/>
+          <w:szCs w:val="20"/>
+        </w:rPr>
+        <w:t xml:space="preserve">signalled by </w:t>
+      </w:r>
+      <w:r>
+        <w:rPr>
+          <w:rFonts w:ascii="Arial" w:hAnsi="Arial" w:cs="Arial"/>
+          <w:color w:val="000000" w:themeColor="text1"/>
+          <w:sz w:val="20"/>
+          <w:szCs w:val="20"/>
+        </w:rPr>
         <w:lastRenderedPageBreak/>
-        <w:t xml:space="preserve">to imply </w:t>
-      </w:r>
-      <w:r>
-        <w:rPr>
-          <w:rFonts w:ascii="Arial" w:hAnsi="Arial" w:cs="Arial"/>
-          <w:color w:val="000000" w:themeColor="text1"/>
-          <w:sz w:val="20"/>
-          <w:szCs w:val="20"/>
-        </w:rPr>
-        <w:t xml:space="preserve">that the organisation (recruiter or hiring manager) </w:t>
-      </w:r>
-      <w:r>
-        <w:rPr>
-          <w:rFonts w:ascii="Arial" w:hAnsi="Arial" w:cs="Arial"/>
-          <w:color w:val="000000" w:themeColor="text1"/>
-          <w:sz w:val="20"/>
-          <w:szCs w:val="20"/>
-        </w:rPr>
-        <w:t xml:space="preserve">does indeed </w:t>
-      </w:r>
-      <w:r>
-        <w:rPr>
-          <w:rFonts w:ascii="Arial" w:hAnsi="Arial" w:cs="Arial"/>
-          <w:color w:val="000000" w:themeColor="text1"/>
-          <w:sz w:val="20"/>
-          <w:szCs w:val="20"/>
-        </w:rPr>
-        <w:t>perceive</w:t>
-      </w:r>
-      <w:r>
-        <w:rPr>
-          <w:rFonts w:ascii="Arial" w:hAnsi="Arial" w:cs="Arial"/>
-          <w:color w:val="000000" w:themeColor="text1"/>
-          <w:sz w:val="20"/>
-          <w:szCs w:val="20"/>
-        </w:rPr>
-        <w:t xml:space="preserve"> and internalise</w:t>
-      </w:r>
-      <w:r>
-        <w:rPr>
-          <w:rFonts w:ascii="Arial" w:hAnsi="Arial" w:cs="Arial"/>
-          <w:color w:val="000000" w:themeColor="text1"/>
-          <w:sz w:val="20"/>
-          <w:szCs w:val="20"/>
-        </w:rPr>
-        <w:t xml:space="preserve"> what Spence (1973) defines as </w:t>
-      </w:r>
-      <w:r>
-        <w:rPr>
-          <w:rFonts w:ascii="Arial" w:hAnsi="Arial" w:cs="Arial"/>
-          <w:color w:val="000000" w:themeColor="text1"/>
-          <w:sz w:val="20"/>
-          <w:szCs w:val="20"/>
-        </w:rPr>
-        <w:t>‘</w:t>
-      </w:r>
-      <w:r>
-        <w:rPr>
-          <w:rFonts w:ascii="Arial" w:hAnsi="Arial" w:cs="Arial"/>
-          <w:color w:val="000000" w:themeColor="text1"/>
-          <w:sz w:val="20"/>
-          <w:szCs w:val="20"/>
-        </w:rPr>
-        <w:t>alterable</w:t>
-      </w:r>
-      <w:r>
-        <w:rPr>
-          <w:rFonts w:ascii="Arial" w:hAnsi="Arial" w:cs="Arial"/>
-          <w:color w:val="000000" w:themeColor="text1"/>
-          <w:sz w:val="20"/>
-          <w:szCs w:val="20"/>
-        </w:rPr>
-        <w:t>’</w:t>
-      </w:r>
-      <w:r>
-        <w:rPr>
-          <w:rFonts w:ascii="Arial" w:hAnsi="Arial" w:cs="Arial"/>
-          <w:color w:val="000000" w:themeColor="text1"/>
-          <w:sz w:val="20"/>
-          <w:szCs w:val="20"/>
-        </w:rPr>
-        <w:t xml:space="preserve"> attributes (</w:t>
-      </w:r>
-      <w:r>
-        <w:rPr>
-          <w:rFonts w:ascii="Arial" w:hAnsi="Arial" w:cs="Arial"/>
-          <w:color w:val="000000" w:themeColor="text1"/>
-          <w:sz w:val="20"/>
-          <w:szCs w:val="20"/>
-        </w:rPr>
-        <w:t xml:space="preserve">for instance, the highest </w:t>
-      </w:r>
-      <w:r>
-        <w:rPr>
-          <w:rFonts w:ascii="Arial" w:hAnsi="Arial" w:cs="Arial"/>
-          <w:color w:val="000000" w:themeColor="text1"/>
-          <w:sz w:val="20"/>
-          <w:szCs w:val="20"/>
-        </w:rPr>
-        <w:t xml:space="preserve">level of education </w:t>
-      </w:r>
-      <w:r>
-        <w:rPr>
-          <w:rFonts w:ascii="Arial" w:hAnsi="Arial" w:cs="Arial"/>
-          <w:color w:val="000000" w:themeColor="text1"/>
-          <w:sz w:val="20"/>
-          <w:szCs w:val="20"/>
-        </w:rPr>
-        <w:t xml:space="preserve">signalled by the candidate </w:t>
+        <w:t xml:space="preserve">the candidate </w:t>
       </w:r>
       <w:r>
         <w:rPr>
@@ -11705,7 +13054,7 @@
           <w:color w:val="000000" w:themeColor="text1"/>
         </w:rPr>
       </w:pPr>
-      <w:bookmarkStart w:id="32" w:name="_Toc221107094"/>
+      <w:bookmarkStart w:id="34" w:name="_Toc221634014"/>
       <w:r>
         <w:rPr>
           <w:rStyle w:val="Strong"/>
@@ -11744,9 +13093,29 @@
           <w:bCs w:val="0"/>
           <w:color w:val="000000" w:themeColor="text1"/>
         </w:rPr>
-        <w:t>Explicating my Literature Review 3 – Recruitment &amp; Selection</w:t>
-      </w:r>
-      <w:bookmarkEnd w:id="32"/>
+        <w:t xml:space="preserve">Explicating </w:t>
+      </w:r>
+      <w:r>
+        <w:rPr>
+          <w:rStyle w:val="Strong"/>
+          <w:rFonts w:ascii="Arial" w:hAnsi="Arial" w:cs="Arial"/>
+          <w:b w:val="0"/>
+          <w:bCs w:val="0"/>
+          <w:color w:val="000000" w:themeColor="text1"/>
+        </w:rPr>
+        <w:t>the</w:t>
+      </w:r>
+      <w:r>
+        <w:rPr>
+          <w:rStyle w:val="Strong"/>
+          <w:rFonts w:ascii="Arial" w:hAnsi="Arial" w:cs="Arial"/>
+          <w:b w:val="0"/>
+          <w:bCs w:val="0"/>
+          <w:color w:val="000000" w:themeColor="text1"/>
+        </w:rPr>
+        <w:t xml:space="preserve"> Literature Review 3 – Recruitment &amp; Selection</w:t>
+      </w:r>
+      <w:bookmarkEnd w:id="34"/>
     </w:p>
     <w:p>
       <w:pPr>
@@ -11788,10 +13157,7 @@
       <w:pPr>
         <w:jc w:val="both"/>
         <w:rPr>
-          <w:rStyle w:val="Strong"/>
-          <w:rFonts w:ascii="Arial" w:hAnsi="Arial" w:cs="Arial"/>
-          <w:b w:val="0"/>
-          <w:bCs w:val="0"/>
+          <w:rFonts w:ascii="Arial" w:hAnsi="Arial" w:cs="Arial"/>
           <w:sz w:val="20"/>
           <w:szCs w:val="20"/>
         </w:rPr>
@@ -11826,7 +13192,7 @@
           <w:color w:val="000000" w:themeColor="text1"/>
         </w:rPr>
       </w:pPr>
-      <w:bookmarkStart w:id="33" w:name="_Toc221107095"/>
+      <w:bookmarkStart w:id="35" w:name="_Toc221634015"/>
       <w:r>
         <w:rPr>
           <w:rStyle w:val="Strong"/>
@@ -11865,9 +13231,39 @@
           <w:bCs w:val="0"/>
           <w:color w:val="000000" w:themeColor="text1"/>
         </w:rPr>
-        <w:t xml:space="preserve"> Journal of Economic Literature (JEL) Classification</w:t>
-      </w:r>
-      <w:bookmarkEnd w:id="33"/>
+        <w:t xml:space="preserve"> JEL</w:t>
+      </w:r>
+      <w:r>
+        <w:rPr>
+          <w:rStyle w:val="Strong"/>
+          <w:rFonts w:ascii="Arial" w:hAnsi="Arial" w:cs="Arial"/>
+          <w:b w:val="0"/>
+          <w:bCs w:val="0"/>
+          <w:color w:val="000000" w:themeColor="text1"/>
+        </w:rPr>
+        <w:t xml:space="preserve"> </w:t>
+      </w:r>
+      <w:r>
+        <w:rPr>
+          <w:rStyle w:val="Strong"/>
+          <w:rFonts w:ascii="Arial" w:hAnsi="Arial" w:cs="Arial"/>
+          <w:b w:val="0"/>
+          <w:bCs w:val="0"/>
+          <w:color w:val="000000" w:themeColor="text1"/>
+        </w:rPr>
+        <w:t>Classification</w:t>
+      </w:r>
+      <w:r>
+        <w:rPr>
+          <w:rStyle w:val="Strong"/>
+          <w:rFonts w:ascii="Arial" w:hAnsi="Arial" w:cs="Arial"/>
+          <w:b w:val="0"/>
+          <w:bCs w:val="0"/>
+          <w:color w:val="000000" w:themeColor="text1"/>
+        </w:rPr>
+        <w:t>s</w:t>
+      </w:r>
+      <w:bookmarkEnd w:id="35"/>
     </w:p>
     <w:p>
       <w:pPr>
@@ -12786,7 +14182,6 @@
                 <w:sz w:val="20"/>
                 <w:szCs w:val="20"/>
               </w:rPr>
-              <w:lastRenderedPageBreak/>
               <w:t>I14</w:t>
             </w:r>
           </w:p>
@@ -12857,8 +14252,7 @@
           <w:color w:val="000000" w:themeColor="text1"/>
         </w:rPr>
       </w:pPr>
-      <w:bookmarkStart w:id="34" w:name="_Toc221107096"/>
-      <w:bookmarkEnd w:id="23"/>
+      <w:bookmarkStart w:id="36" w:name="_Toc221634016"/>
       <w:r>
         <w:rPr>
           <w:rStyle w:val="Strong"/>
@@ -12867,9 +14261,312 @@
           <w:bCs w:val="0"/>
           <w:color w:val="000000" w:themeColor="text1"/>
         </w:rPr>
+        <w:lastRenderedPageBreak/>
+        <w:t>1.2</w:t>
+      </w:r>
+      <w:r>
+        <w:rPr>
+          <w:rStyle w:val="Strong"/>
+          <w:rFonts w:ascii="Arial" w:hAnsi="Arial" w:cs="Arial"/>
+          <w:b w:val="0"/>
+          <w:bCs w:val="0"/>
+          <w:color w:val="000000" w:themeColor="text1"/>
+        </w:rPr>
+        <w:t>4</w:t>
+      </w:r>
+      <w:r>
+        <w:rPr>
+          <w:rStyle w:val="Strong"/>
+          <w:rFonts w:ascii="Arial" w:hAnsi="Arial" w:cs="Arial"/>
+          <w:b w:val="0"/>
+          <w:bCs w:val="0"/>
+          <w:color w:val="000000" w:themeColor="text1"/>
+        </w:rPr>
+        <w:t xml:space="preserve"> </w:t>
+      </w:r>
+      <w:r>
+        <w:rPr>
+          <w:rStyle w:val="Strong"/>
+          <w:rFonts w:ascii="Arial" w:hAnsi="Arial" w:cs="Arial"/>
+          <w:b w:val="0"/>
+          <w:bCs w:val="0"/>
+          <w:color w:val="000000" w:themeColor="text1"/>
+        </w:rPr>
+        <w:t>Discussion</w:t>
+      </w:r>
+      <w:bookmarkEnd w:id="36"/>
+    </w:p>
+    <w:p>
+      <w:pPr>
+        <w:jc w:val="both"/>
+        <w:rPr>
+          <w:rFonts w:ascii="Arial" w:hAnsi="Arial" w:cs="Arial"/>
+          <w:sz w:val="20"/>
+          <w:szCs w:val="20"/>
+        </w:rPr>
+      </w:pPr>
+      <w:r>
+        <w:rPr>
+          <w:rFonts w:ascii="Arial" w:hAnsi="Arial" w:cs="Arial"/>
+          <w:sz w:val="20"/>
+          <w:szCs w:val="20"/>
+        </w:rPr>
+        <w:t>A great example of how a high-growth firm’s ne</w:t>
+      </w:r>
+      <w:r>
+        <w:rPr>
+          <w:rFonts w:ascii="Arial" w:hAnsi="Arial" w:cs="Arial"/>
+          <w:sz w:val="20"/>
+          <w:szCs w:val="20"/>
+        </w:rPr>
+        <w:t xml:space="preserve">urodiversity </w:t>
+      </w:r>
+      <w:r>
+        <w:rPr>
+          <w:rFonts w:ascii="Arial" w:hAnsi="Arial" w:cs="Arial"/>
+          <w:sz w:val="20"/>
+          <w:szCs w:val="20"/>
+        </w:rPr>
+        <w:t>h</w:t>
+      </w:r>
+      <w:r>
+        <w:rPr>
+          <w:rFonts w:ascii="Arial" w:hAnsi="Arial" w:cs="Arial"/>
+          <w:sz w:val="20"/>
+          <w:szCs w:val="20"/>
+        </w:rPr>
+        <w:t xml:space="preserve">iring approach </w:t>
+      </w:r>
+      <w:r>
+        <w:rPr>
+          <w:rFonts w:ascii="Arial" w:hAnsi="Arial" w:cs="Arial"/>
+          <w:sz w:val="20"/>
+          <w:szCs w:val="20"/>
+        </w:rPr>
+        <w:t xml:space="preserve">can </w:t>
+      </w:r>
+      <w:r>
+        <w:rPr>
+          <w:rFonts w:ascii="Arial" w:hAnsi="Arial" w:cs="Arial"/>
+          <w:sz w:val="20"/>
+          <w:szCs w:val="20"/>
+        </w:rPr>
+        <w:t>eliminate</w:t>
+      </w:r>
+      <w:r>
+        <w:rPr>
+          <w:rFonts w:ascii="Arial" w:hAnsi="Arial" w:cs="Arial"/>
+          <w:sz w:val="20"/>
+          <w:szCs w:val="20"/>
+        </w:rPr>
+        <w:t xml:space="preserve"> the bias of the interviewer, recruiter or hiring manager</w:t>
+      </w:r>
+      <w:r>
+        <w:rPr>
+          <w:rFonts w:ascii="Arial" w:hAnsi="Arial" w:cs="Arial"/>
+          <w:sz w:val="20"/>
+          <w:szCs w:val="20"/>
+        </w:rPr>
+        <w:t xml:space="preserve"> </w:t>
+      </w:r>
+      <w:r>
+        <w:rPr>
+          <w:rFonts w:ascii="Arial" w:hAnsi="Arial" w:cs="Arial"/>
+          <w:sz w:val="20"/>
+          <w:szCs w:val="20"/>
+        </w:rPr>
+        <w:t>comes in the form of Microsoft recruitment and workplace accom</w:t>
+      </w:r>
+      <w:r>
+        <w:rPr>
+          <w:rFonts w:ascii="Arial" w:hAnsi="Arial" w:cs="Arial"/>
+          <w:sz w:val="20"/>
+          <w:szCs w:val="20"/>
+        </w:rPr>
+        <w:t>m</w:t>
+      </w:r>
+      <w:r>
+        <w:rPr>
+          <w:rFonts w:ascii="Arial" w:hAnsi="Arial" w:cs="Arial"/>
+          <w:sz w:val="20"/>
+          <w:szCs w:val="20"/>
+        </w:rPr>
+        <w:t>odations (</w:t>
+      </w:r>
+      <w:r>
+        <w:rPr>
+          <w:rFonts w:ascii="Arial" w:hAnsi="Arial" w:cs="Arial"/>
+          <w:sz w:val="20"/>
+          <w:szCs w:val="20"/>
+        </w:rPr>
+        <w:t xml:space="preserve">Microsoft, </w:t>
+      </w:r>
+      <w:r>
+        <w:rPr>
+          <w:rFonts w:ascii="Arial" w:hAnsi="Arial" w:cs="Arial"/>
+          <w:sz w:val="20"/>
+          <w:szCs w:val="20"/>
+        </w:rPr>
+        <w:t>202</w:t>
+      </w:r>
+      <w:r>
+        <w:rPr>
+          <w:rFonts w:ascii="Arial" w:hAnsi="Arial" w:cs="Arial"/>
+          <w:sz w:val="20"/>
+          <w:szCs w:val="20"/>
+        </w:rPr>
+        <w:t>6</w:t>
+      </w:r>
+      <w:r>
+        <w:rPr>
+          <w:rFonts w:ascii="Arial" w:hAnsi="Arial" w:cs="Arial"/>
+          <w:sz w:val="20"/>
+          <w:szCs w:val="20"/>
+        </w:rPr>
+        <w:t>)</w:t>
+      </w:r>
+      <w:r>
+        <w:rPr>
+          <w:rFonts w:ascii="Arial" w:hAnsi="Arial" w:cs="Arial"/>
+          <w:sz w:val="20"/>
+          <w:szCs w:val="20"/>
+        </w:rPr>
+        <w:t>.</w:t>
+      </w:r>
+      <w:r>
+        <w:rPr>
+          <w:rFonts w:ascii="Arial" w:hAnsi="Arial" w:cs="Arial"/>
+          <w:sz w:val="20"/>
+          <w:szCs w:val="20"/>
+        </w:rPr>
+        <w:t xml:space="preserve"> </w:t>
+      </w:r>
+    </w:p>
+    <w:p>
+      <w:pPr>
+        <w:jc w:val="both"/>
+        <w:rPr>
+          <w:rStyle w:val="Strong"/>
+          <w:rFonts w:ascii="Arial" w:hAnsi="Arial" w:cs="Arial"/>
+          <w:b w:val="0"/>
+          <w:bCs w:val="0"/>
+          <w:sz w:val="20"/>
+          <w:szCs w:val="20"/>
+        </w:rPr>
+      </w:pPr>
+      <w:r>
+        <w:rPr>
+          <w:rFonts w:ascii="Arial" w:hAnsi="Arial" w:cs="Arial"/>
+          <w:sz w:val="20"/>
+          <w:szCs w:val="20"/>
+        </w:rPr>
+        <w:t>Axiology which studies the science of value</w:t>
+      </w:r>
+      <w:r>
+        <w:rPr>
+          <w:rFonts w:ascii="Arial" w:hAnsi="Arial" w:cs="Arial"/>
+          <w:sz w:val="20"/>
+          <w:szCs w:val="20"/>
+        </w:rPr>
+        <w:t xml:space="preserve"> (Bahm, 2021)</w:t>
+      </w:r>
+      <w:r>
+        <w:rPr>
+          <w:rFonts w:ascii="Arial" w:hAnsi="Arial" w:cs="Arial"/>
+          <w:sz w:val="20"/>
+          <w:szCs w:val="20"/>
+        </w:rPr>
+        <w:t xml:space="preserve"> is an important aspect to consider when developing a </w:t>
+      </w:r>
+      <w:r>
+        <w:rPr>
+          <w:rFonts w:ascii="Arial" w:hAnsi="Arial" w:cs="Arial"/>
+          <w:sz w:val="20"/>
+          <w:szCs w:val="20"/>
+        </w:rPr>
+        <w:t>theoretical understanding of recruitment.</w:t>
+      </w:r>
+      <w:r>
+        <w:rPr>
+          <w:rFonts w:ascii="Arial" w:hAnsi="Arial" w:cs="Arial"/>
+          <w:sz w:val="20"/>
+          <w:szCs w:val="20"/>
+        </w:rPr>
+        <w:t xml:space="preserve"> Contextualising and internalising the scientific value of the process requires an understanding of the employer’s brand value, and its positioning relative </w:t>
+      </w:r>
+      <w:r>
+        <w:rPr>
+          <w:rFonts w:ascii="Arial" w:hAnsi="Arial" w:cs="Arial"/>
+          <w:sz w:val="20"/>
+          <w:szCs w:val="20"/>
+        </w:rPr>
+        <w:t xml:space="preserve">proximity </w:t>
+      </w:r>
+      <w:r>
+        <w:rPr>
+          <w:rFonts w:ascii="Arial" w:hAnsi="Arial" w:cs="Arial"/>
+          <w:sz w:val="20"/>
+          <w:szCs w:val="20"/>
+        </w:rPr>
+        <w:t xml:space="preserve">to </w:t>
+      </w:r>
+      <w:r>
+        <w:rPr>
+          <w:rFonts w:ascii="Arial" w:hAnsi="Arial" w:cs="Arial"/>
+          <w:sz w:val="20"/>
+          <w:szCs w:val="20"/>
+        </w:rPr>
+        <w:t xml:space="preserve">the preferences of ideal applicants and </w:t>
+      </w:r>
+      <w:r>
+        <w:rPr>
+          <w:rFonts w:ascii="Arial" w:hAnsi="Arial" w:cs="Arial"/>
+          <w:sz w:val="20"/>
+          <w:szCs w:val="20"/>
+        </w:rPr>
+        <w:t>other organizations.</w:t>
+      </w:r>
+    </w:p>
+    <w:p>
+      <w:pPr>
+        <w:rPr>
+          <w:rFonts w:ascii="Arial" w:hAnsi="Arial" w:cs="Arial"/>
+        </w:rPr>
+      </w:pPr>
+    </w:p>
+    <w:p>
+      <w:pPr>
+        <w:rPr>
+          <w:rFonts w:ascii="Arial" w:hAnsi="Arial" w:cs="Arial"/>
+        </w:rPr>
+      </w:pPr>
+    </w:p>
+    <w:p>
+      <w:pPr>
+        <w:pStyle w:val="Heading2"/>
+        <w:contextualSpacing/>
+        <w:jc w:val="both"/>
+        <w:rPr>
+          <w:rStyle w:val="Strong"/>
+          <w:rFonts w:ascii="Arial" w:hAnsi="Arial" w:cs="Arial"/>
+          <w:b w:val="0"/>
+          <w:bCs w:val="0"/>
+          <w:color w:val="000000" w:themeColor="text1"/>
+        </w:rPr>
+      </w:pPr>
+      <w:bookmarkStart w:id="37" w:name="_Toc221634017"/>
+      <w:bookmarkEnd w:id="24"/>
+      <w:r>
+        <w:rPr>
+          <w:rStyle w:val="Strong"/>
+          <w:rFonts w:ascii="Arial" w:hAnsi="Arial" w:cs="Arial"/>
+          <w:b w:val="0"/>
+          <w:bCs w:val="0"/>
+          <w:color w:val="000000" w:themeColor="text1"/>
+        </w:rPr>
         <w:t>References</w:t>
       </w:r>
-      <w:bookmarkEnd w:id="34"/>
+      <w:bookmarkEnd w:id="37"/>
     </w:p>
     <w:p>
       <w:pPr>
@@ -13088,7 +14785,7 @@
         </w:rPr>
         <w:t xml:space="preserve">, 20(1), pp. e1–e12. Available at: </w:t>
       </w:r>
-      <w:hyperlink r:id="rId14" w:history="1">
+      <w:hyperlink r:id="rId13" w:history="1">
         <w:r>
           <w:rPr>
             <w:rStyle w:val="Hyperlink"/>
@@ -13245,7 +14942,7 @@
         </w:rPr>
         <w:t xml:space="preserve">, 27(6), pp. 1746–1763. Available at: </w:t>
       </w:r>
-      <w:hyperlink r:id="rId15" w:history="1">
+      <w:hyperlink r:id="rId14" w:history="1">
         <w:r>
           <w:rPr>
             <w:rStyle w:val="Hyperlink"/>
@@ -13285,9 +14982,27 @@
           <w:sz w:val="20"/>
           <w:szCs w:val="20"/>
         </w:rPr>
-        <w:t xml:space="preserve">Depp, C.A. and Jeste, D.V. (2004), Bipolar disorder in older adults: a critical review. Bipolar Disorders, 6: 343-367. </w:t>
-      </w:r>
-      <w:hyperlink r:id="rId16" w:history="1">
+        <w:t xml:space="preserve">Depp, C.A. and Jeste, D.V. (2004), </w:t>
+      </w:r>
+      <w:proofErr w:type="gramStart"/>
+      <w:r>
+        <w:rPr>
+          <w:rFonts w:ascii="Arial" w:hAnsi="Arial" w:cs="Arial"/>
+          <w:sz w:val="20"/>
+          <w:szCs w:val="20"/>
+        </w:rPr>
+        <w:t>Bipolar disorder</w:t>
+      </w:r>
+      <w:proofErr w:type="gramEnd"/>
+      <w:r>
+        <w:rPr>
+          <w:rFonts w:ascii="Arial" w:hAnsi="Arial" w:cs="Arial"/>
+          <w:sz w:val="20"/>
+          <w:szCs w:val="20"/>
+        </w:rPr>
+        <w:t xml:space="preserve"> in older adults: a critical review. Bipolar Disorders, 6: 343-367. </w:t>
+      </w:r>
+      <w:hyperlink r:id="rId15" w:history="1">
         <w:r>
           <w:rPr>
             <w:rStyle w:val="Hyperlink"/>
@@ -13328,7 +15043,7 @@
         </w:rPr>
         <w:t xml:space="preserve">Doyle (2025) ‘To Get Britain Working? Invest In People: Mayfield’s Report’, Available at: </w:t>
       </w:r>
-      <w:hyperlink r:id="rId17" w:history="1">
+      <w:hyperlink r:id="rId16" w:history="1">
         <w:r>
           <w:rPr>
             <w:rStyle w:val="Hyperlink"/>
@@ -13387,7 +15102,7 @@
         </w:rPr>
         <w:t>, Vol. ahead-of-print No. ahead-of-print. </w:t>
       </w:r>
-      <w:hyperlink r:id="rId18" w:tgtFrame="_blank" w:history="1">
+      <w:hyperlink r:id="rId17" w:tgtFrame="_blank" w:history="1">
         <w:r>
           <w:rPr>
             <w:rStyle w:val="Hyperlink"/>
@@ -13474,6 +15189,7 @@
           <w:sz w:val="20"/>
           <w:szCs w:val="20"/>
         </w:rPr>
+        <w:lastRenderedPageBreak/>
         <w:t>Forbes Magazine (2025) ‘</w:t>
       </w:r>
       <w:r>
@@ -13494,7 +15210,7 @@
         </w:rPr>
         <w:t xml:space="preserve">’, Available at : </w:t>
       </w:r>
-      <w:hyperlink r:id="rId19" w:history="1">
+      <w:hyperlink r:id="rId18" w:history="1">
         <w:r>
           <w:rPr>
             <w:rStyle w:val="Hyperlink"/>
@@ -13620,7 +15336,7 @@
         </w:rPr>
         <w:t xml:space="preserve">, 57(2), pp. 383–404. </w:t>
       </w:r>
-      <w:hyperlink r:id="rId20" w:history="1">
+      <w:hyperlink r:id="rId19" w:history="1">
         <w:r>
           <w:rPr>
             <w:rStyle w:val="Hyperlink"/>
@@ -13660,7 +15376,6 @@
           <w:sz w:val="20"/>
           <w:szCs w:val="20"/>
         </w:rPr>
-        <w:lastRenderedPageBreak/>
         <w:t xml:space="preserve">Khan, M. H., Grabarski, M. K., Ali, M., &amp; Buckmaster, S. (2023). Insights into Creating and Managing an Inclusive Neurodiverse Workplace for Positive Outcomes: A Multistage Theoretical Framework. </w:t>
       </w:r>
       <w:r>
@@ -13699,7 +15414,7 @@
         </w:rPr>
         <w:t xml:space="preserve">(5), 1339-1386. </w:t>
       </w:r>
-      <w:hyperlink r:id="rId21" w:history="1">
+      <w:hyperlink r:id="rId20" w:history="1">
         <w:r>
           <w:rPr>
             <w:rStyle w:val="Hyperlink"/>
@@ -13761,7 +15476,7 @@
         </w:rPr>
         <w:t xml:space="preserve">Harvard Business Review, </w:t>
       </w:r>
-      <w:hyperlink r:id="rId22" w:history="1">
+      <w:hyperlink r:id="rId21" w:history="1">
         <w:r>
           <w:rPr>
             <w:rStyle w:val="Hyperlink"/>
@@ -13916,7 +15631,7 @@
         </w:rPr>
         <w:t xml:space="preserve">Available at: </w:t>
       </w:r>
-      <w:hyperlink r:id="rId23" w:history="1">
+      <w:hyperlink r:id="rId22" w:history="1">
         <w:r>
           <w:rPr>
             <w:rStyle w:val="Hyperlink"/>
@@ -13997,7 +15712,7 @@
         </w:rPr>
         <w:t>Mirowska, A. and Arsenyan, J. (2025), A Bridge Too Far: Signalling Effects of Artificial Intelligence Evaluation of Job Interviews. International Journal of Selection and Assessment, 33: e70008. </w:t>
       </w:r>
-      <w:hyperlink r:id="rId24" w:history="1">
+      <w:hyperlink r:id="rId23" w:history="1">
         <w:r>
           <w:rPr>
             <w:rStyle w:val="Hyperlink"/>
@@ -14045,7 +15760,7 @@
         </w:rPr>
         <w:t xml:space="preserve">’, Available at: </w:t>
       </w:r>
-      <w:hyperlink r:id="rId25" w:history="1">
+      <w:hyperlink r:id="rId24" w:history="1">
         <w:r>
           <w:rPr>
             <w:rStyle w:val="Hyperlink"/>
@@ -14180,7 +15895,7 @@
         </w:rPr>
         <w:t>, 126: pp. 419-439. </w:t>
       </w:r>
-      <w:hyperlink r:id="rId26" w:history="1">
+      <w:hyperlink r:id="rId25" w:history="1">
         <w:r>
           <w:rPr>
             <w:rStyle w:val="Hyperlink"/>
@@ -14318,6 +16033,7 @@
           <w:sz w:val="20"/>
           <w:szCs w:val="20"/>
         </w:rPr>
+        <w:lastRenderedPageBreak/>
         <w:t xml:space="preserve">Suen, H.-Y., Hung, K.-E. and Tseng, F.-H. (2020) ‘Employer Ratings through Crowdsourcing on social media: An Examination of U.S. Fortune 500 Companies’, </w:t>
       </w:r>
       <w:r>
@@ -14338,7 +16054,7 @@
         </w:rPr>
         <w:t xml:space="preserve">, 12(16), p. 6308. Available at: </w:t>
       </w:r>
-      <w:hyperlink r:id="rId27" w:history="1">
+      <w:hyperlink r:id="rId26" w:history="1">
         <w:r>
           <w:rPr>
             <w:rStyle w:val="Hyperlink"/>
@@ -14372,7 +16088,7 @@
         </w:rPr>
         <w:t xml:space="preserve">University of Hull Library (2025) ‘Literature Review: Reviewing for Research’, University of Hull Skills Team, Available at: </w:t>
       </w:r>
-      <w:hyperlink r:id="rId28" w:history="1">
+      <w:hyperlink r:id="rId27" w:history="1">
         <w:r>
           <w:rPr>
             <w:rStyle w:val="Hyperlink"/>
@@ -14469,7 +16185,6 @@
           <w:sz w:val="20"/>
           <w:szCs w:val="20"/>
         </w:rPr>
-        <w:lastRenderedPageBreak/>
         <w:t>Vogel, D., Döring, M. and Sievert, M. (2024) ‘Motivational signals in public sector job advertisements and how they relate to attracting and hiring candidates’, </w:t>
       </w:r>
       <w:r>
@@ -14587,7 +16302,7 @@
         </w:rPr>
         <w:t xml:space="preserve">”, Available at: </w:t>
       </w:r>
-      <w:hyperlink r:id="rId29" w:history="1">
+      <w:hyperlink r:id="rId28" w:history="1">
         <w:r>
           <w:rPr>
             <w:rStyle w:val="Hyperlink"/>
@@ -14609,7 +16324,7 @@
       </w:r>
     </w:p>
     <w:sectPr>
-      <w:footerReference w:type="default" r:id="rId30"/>
+      <w:footerReference w:type="default" r:id="rId29"/>
       <w:pgSz w:w="11906" w:h="16838"/>
       <w:pgMar w:top="1440" w:right="1440" w:bottom="1440" w:left="1440" w:header="708" w:footer="708" w:gutter="0"/>
       <w:pgBorders w:offsetFrom="page">
@@ -14627,7 +16342,7 @@
 
 <file path=word/comments.xml><?xml version="1.0" encoding="utf-8"?>
 <w:comments xmlns:wpc="http://schemas.microsoft.com/office/word/2010/wordprocessingCanvas" xmlns:cx="http://schemas.microsoft.com/office/drawing/2014/chartex" xmlns:cx1="http://schemas.microsoft.com/office/drawing/2015/9/8/chartex" xmlns:cx2="http://schemas.microsoft.com/office/drawing/2015/10/21/chartex" xmlns:cx3="http://schemas.microsoft.com/office/drawing/2016/5/9/chartex" xmlns:cx4="http://schemas.microsoft.com/office/drawing/2016/5/10/chartex" xmlns:cx5="http://schemas.microsoft.com/office/drawing/2016/5/11/chartex" xmlns:cx6="http://schemas.microsoft.com/office/drawing/2016/5/12/chartex" xmlns:cx7="http://schemas.microsoft.com/office/drawing/2016/5/13/chartex" xmlns:cx8="http://schemas.microsoft.com/office/drawing/2016/5/14/chartex" xmlns:mc="http://schemas.openxmlformats.org/markup-compatibility/2006" xmlns:aink="http://schemas.microsoft.com/office/drawing/2016/ink" xmlns:am3d="http://schemas.microsoft.com/office/drawing/2017/model3d" xmlns:o="urn:schemas-microsoft-com:office:office" xmlns:oel="http://schemas.microsoft.com/office/2019/extlst" xmlns:r="http://schemas.openxmlformats.org/officeDocument/2006/relationships" xmlns:m="http://schemas.openxmlformats.org/officeDocument/2006/math" xmlns:v="urn:schemas-microsoft-com:vml" xmlns:wp14="http://schemas.microsoft.com/office/word/2010/wordprocessingDrawing" xmlns:wp="http://schemas.openxmlformats.org/drawingml/2006/wordprocessingDrawing" xmlns:w10="urn:schemas-microsoft-com:office:word" xmlns:w="http://schemas.openxmlformats.org/wordprocessingml/2006/main" xmlns:w14="http://schemas.microsoft.com/office/word/2010/wordml" xmlns:w15="http://schemas.microsoft.com/office/word/2012/wordml" xmlns:w16cex="http://schemas.microsoft.com/office/word/2018/wordml/cex" xmlns:w16cid="http://schemas.microsoft.com/office/word/2016/wordml/cid" xmlns:w16="http://schemas.microsoft.com/office/word/2018/wordml" xmlns:w16du="http://schemas.microsoft.com/office/word/2023/wordml/word16du" xmlns:w16sdtdh="http://schemas.microsoft.com/office/word/2020/wordml/sdtdatahash" xmlns:w16sdtfl="http://schemas.microsoft.com/office/word/2024/wordml/sdtformatlock" xmlns:w16se="http://schemas.microsoft.com/office/word/2015/wordml/symex" xmlns:wpg="http://schemas.microsoft.com/office/word/2010/wordprocessingGroup" xmlns:wpi="http://schemas.microsoft.com/office/word/2010/wordprocessingInk" xmlns:wne="http://schemas.microsoft.com/office/word/2006/wordml" xmlns:wps="http://schemas.microsoft.com/office/word/2010/wordprocessingShape" mc:Ignorable="w14 w15 w16se w16cid w16 w16cex w16sdtdh w16sdtfl w16du wp14">
-  <w:comment w:id="3" w:author="Dr Nicola J Bowman" w:date="2025-12-08T12:42:00Z" w:initials="NB">
+  <w:comment w:id="4" w:author="Dr Nicola J Bowman" w:date="2025-12-08T12:42:00Z" w:initials="NB">
     <w:p>
       <w:pPr>
         <w:pStyle w:val="CommentText"/>
@@ -14643,7 +16358,7 @@
       </w:r>
     </w:p>
   </w:comment>
-  <w:comment w:id="4" w:author="Alfred Anate Bodurin Mayaki" w:date="2025-12-23T14:14:00Z" w:initials="AABM">
+  <w:comment w:id="5" w:author="Alfred Anate Bodurin Mayaki" w:date="2025-12-23T14:14:00Z" w:initials="AABM">
     <w:p>
       <w:pPr>
         <w:pStyle w:val="CommentText"/>
@@ -14659,7 +16374,7 @@
       </w:r>
     </w:p>
   </w:comment>
-  <w:comment w:id="5" w:author="Dr Nicola J Bowman" w:date="2025-12-08T12:43:00Z" w:initials="NB">
+  <w:comment w:id="6" w:author="Dr Nicola J Bowman" w:date="2025-12-08T12:43:00Z" w:initials="NB">
     <w:p>
       <w:pPr>
         <w:pStyle w:val="CommentText"/>
@@ -14675,7 +16390,7 @@
       </w:r>
     </w:p>
   </w:comment>
-  <w:comment w:id="7" w:author="Dr Nicola J Bowman" w:date="2025-12-08T12:44:00Z" w:initials="NB">
+  <w:comment w:id="8" w:author="Dr Nicola J Bowman" w:date="2025-12-08T12:44:00Z" w:initials="NB">
     <w:p>
       <w:pPr>
         <w:pStyle w:val="CommentText"/>
@@ -14691,7 +16406,7 @@
       </w:r>
     </w:p>
   </w:comment>
-  <w:comment w:id="8" w:author="Dr Nicola J Bowman" w:date="2025-12-08T12:47:00Z" w:initials="NB">
+  <w:comment w:id="9" w:author="Dr Nicola J Bowman" w:date="2025-12-08T12:47:00Z" w:initials="NB">
     <w:p>
       <w:pPr>
         <w:pStyle w:val="CommentText"/>
@@ -14707,7 +16422,7 @@
       </w:r>
     </w:p>
   </w:comment>
-  <w:comment w:id="9" w:author="Alfred Anate Bodurin Mayaki" w:date="2025-12-10T08:21:00Z" w:initials="AABM">
+  <w:comment w:id="10" w:author="Alfred Anate Bodurin Mayaki" w:date="2025-12-10T08:21:00Z" w:initials="AABM">
     <w:p>
       <w:pPr>
         <w:pStyle w:val="CommentText"/>
@@ -14723,7 +16438,7 @@
       </w:r>
     </w:p>
   </w:comment>
-  <w:comment w:id="10" w:author="Alfred Anate Bodurin Mayaki" w:date="2026-02-02T12:59:00Z" w:initials="AABM">
+  <w:comment w:id="11" w:author="Alfred Anate Bodurin Mayaki" w:date="2026-02-02T12:59:00Z" w:initials="AABM">
     <w:p>
       <w:pPr>
         <w:pStyle w:val="CommentText"/>
@@ -14739,7 +16454,7 @@
       </w:r>
     </w:p>
   </w:comment>
-  <w:comment w:id="13" w:author="Dr Nicola J Bowman" w:date="2025-12-08T12:45:00Z" w:initials="NB">
+  <w:comment w:id="15" w:author="Dr Nicola J Bowman" w:date="2025-12-08T12:45:00Z" w:initials="NB">
     <w:p>
       <w:pPr>
         <w:pStyle w:val="CommentText"/>
@@ -14755,7 +16470,7 @@
       </w:r>
     </w:p>
   </w:comment>
-  <w:comment w:id="14" w:author="Dr Nicola J Bowman" w:date="2025-12-08T12:46:00Z" w:initials="NB">
+  <w:comment w:id="16" w:author="Dr Nicola J Bowman" w:date="2025-12-08T12:46:00Z" w:initials="NB">
     <w:p>
       <w:pPr>
         <w:pStyle w:val="CommentText"/>
@@ -14771,7 +16486,7 @@
       </w:r>
     </w:p>
   </w:comment>
-  <w:comment w:id="15" w:author="Alfred Anate Bodurin Mayaki" w:date="2025-12-10T09:06:00Z" w:initials="AABM">
+  <w:comment w:id="17" w:author="Alfred Anate Bodurin Mayaki" w:date="2025-12-10T09:06:00Z" w:initials="AABM">
     <w:p>
       <w:pPr>
         <w:pStyle w:val="CommentText"/>
@@ -14787,7 +16502,7 @@
       </w:r>
     </w:p>
   </w:comment>
-  <w:comment w:id="16" w:author="Alfred Anate Bodurin Mayaki" w:date="2025-12-10T09:09:00Z" w:initials="AABM">
+  <w:comment w:id="18" w:author="Alfred Anate Bodurin Mayaki" w:date="2025-12-10T09:09:00Z" w:initials="AABM">
     <w:p>
       <w:pPr>
         <w:pStyle w:val="CommentText"/>
@@ -14803,7 +16518,7 @@
       </w:r>
     </w:p>
   </w:comment>
-  <w:comment w:id="19" w:author="Dr Nicola J Bowman" w:date="2025-12-08T12:46:00Z" w:initials="NB">
+  <w:comment w:id="21" w:author="Dr Nicola J Bowman" w:date="2025-12-08T12:46:00Z" w:initials="NB">
     <w:p>
       <w:pPr>
         <w:pStyle w:val="CommentText"/>
@@ -14819,7 +16534,7 @@
       </w:r>
     </w:p>
   </w:comment>
-  <w:comment w:id="20" w:author="Alfred Anate Bodurin Mayaki" w:date="2025-12-10T09:10:00Z" w:initials="AABM">
+  <w:comment w:id="22" w:author="Alfred Anate Bodurin Mayaki" w:date="2025-12-10T09:10:00Z" w:initials="AABM">
     <w:p>
       <w:pPr>
         <w:pStyle w:val="CommentText"/>
@@ -15034,7 +16749,7 @@
             <w:sz w:val="18"/>
             <w:szCs w:val="18"/>
           </w:rPr>
-          <w:t>research.applications@ibrecruitment.com</w:t>
+          <w:t>alfred.mayaki@ou.ac.uk</w:t>
         </w:r>
       </w:hyperlink>
       <w:r>
@@ -15543,6 +17258,155 @@
     </w:lvl>
   </w:abstractNum>
   <w:abstractNum w:abstractNumId="5" w15:restartNumberingAfterBreak="0">
+    <w:nsid w:val="16672E28"/>
+    <w:multiLevelType w:val="multilevel"/>
+    <w:tmpl w:val="D3669BE8"/>
+    <w:lvl w:ilvl="0">
+      <w:start w:val="1"/>
+      <w:numFmt w:val="bullet"/>
+      <w:lvlText w:val=""/>
+      <w:lvlJc w:val="left"/>
+      <w:pPr>
+        <w:tabs>
+          <w:tab w:val="num" w:pos="720"/>
+        </w:tabs>
+        <w:ind w:left="720" w:hanging="360"/>
+      </w:pPr>
+      <w:rPr>
+        <w:rFonts w:ascii="Symbol" w:hAnsi="Symbol" w:hint="default"/>
+        <w:sz w:val="20"/>
+      </w:rPr>
+    </w:lvl>
+    <w:lvl w:ilvl="1" w:tentative="1">
+      <w:start w:val="1"/>
+      <w:numFmt w:val="bullet"/>
+      <w:lvlText w:val="o"/>
+      <w:lvlJc w:val="left"/>
+      <w:pPr>
+        <w:tabs>
+          <w:tab w:val="num" w:pos="1440"/>
+        </w:tabs>
+        <w:ind w:left="1440" w:hanging="360"/>
+      </w:pPr>
+      <w:rPr>
+        <w:rFonts w:ascii="Courier New" w:hAnsi="Courier New" w:hint="default"/>
+        <w:sz w:val="20"/>
+      </w:rPr>
+    </w:lvl>
+    <w:lvl w:ilvl="2" w:tentative="1">
+      <w:start w:val="1"/>
+      <w:numFmt w:val="bullet"/>
+      <w:lvlText w:val=""/>
+      <w:lvlJc w:val="left"/>
+      <w:pPr>
+        <w:tabs>
+          <w:tab w:val="num" w:pos="2160"/>
+        </w:tabs>
+        <w:ind w:left="2160" w:hanging="360"/>
+      </w:pPr>
+      <w:rPr>
+        <w:rFonts w:ascii="Wingdings" w:hAnsi="Wingdings" w:hint="default"/>
+        <w:sz w:val="20"/>
+      </w:rPr>
+    </w:lvl>
+    <w:lvl w:ilvl="3" w:tentative="1">
+      <w:start w:val="1"/>
+      <w:numFmt w:val="bullet"/>
+      <w:lvlText w:val=""/>
+      <w:lvlJc w:val="left"/>
+      <w:pPr>
+        <w:tabs>
+          <w:tab w:val="num" w:pos="2880"/>
+        </w:tabs>
+        <w:ind w:left="2880" w:hanging="360"/>
+      </w:pPr>
+      <w:rPr>
+        <w:rFonts w:ascii="Wingdings" w:hAnsi="Wingdings" w:hint="default"/>
+        <w:sz w:val="20"/>
+      </w:rPr>
+    </w:lvl>
+    <w:lvl w:ilvl="4" w:tentative="1">
+      <w:start w:val="1"/>
+      <w:numFmt w:val="bullet"/>
+      <w:lvlText w:val=""/>
+      <w:lvlJc w:val="left"/>
+      <w:pPr>
+        <w:tabs>
+          <w:tab w:val="num" w:pos="3600"/>
+        </w:tabs>
+        <w:ind w:left="3600" w:hanging="360"/>
+      </w:pPr>
+      <w:rPr>
+        <w:rFonts w:ascii="Wingdings" w:hAnsi="Wingdings" w:hint="default"/>
+        <w:sz w:val="20"/>
+      </w:rPr>
+    </w:lvl>
+    <w:lvl w:ilvl="5" w:tentative="1">
+      <w:start w:val="1"/>
+      <w:numFmt w:val="bullet"/>
+      <w:lvlText w:val=""/>
+      <w:lvlJc w:val="left"/>
+      <w:pPr>
+        <w:tabs>
+          <w:tab w:val="num" w:pos="4320"/>
+        </w:tabs>
+        <w:ind w:left="4320" w:hanging="360"/>
+      </w:pPr>
+      <w:rPr>
+        <w:rFonts w:ascii="Wingdings" w:hAnsi="Wingdings" w:hint="default"/>
+        <w:sz w:val="20"/>
+      </w:rPr>
+    </w:lvl>
+    <w:lvl w:ilvl="6" w:tentative="1">
+      <w:start w:val="1"/>
+      <w:numFmt w:val="bullet"/>
+      <w:lvlText w:val=""/>
+      <w:lvlJc w:val="left"/>
+      <w:pPr>
+        <w:tabs>
+          <w:tab w:val="num" w:pos="5040"/>
+        </w:tabs>
+        <w:ind w:left="5040" w:hanging="360"/>
+      </w:pPr>
+      <w:rPr>
+        <w:rFonts w:ascii="Wingdings" w:hAnsi="Wingdings" w:hint="default"/>
+        <w:sz w:val="20"/>
+      </w:rPr>
+    </w:lvl>
+    <w:lvl w:ilvl="7" w:tentative="1">
+      <w:start w:val="1"/>
+      <w:numFmt w:val="bullet"/>
+      <w:lvlText w:val=""/>
+      <w:lvlJc w:val="left"/>
+      <w:pPr>
+        <w:tabs>
+          <w:tab w:val="num" w:pos="5760"/>
+        </w:tabs>
+        <w:ind w:left="5760" w:hanging="360"/>
+      </w:pPr>
+      <w:rPr>
+        <w:rFonts w:ascii="Wingdings" w:hAnsi="Wingdings" w:hint="default"/>
+        <w:sz w:val="20"/>
+      </w:rPr>
+    </w:lvl>
+    <w:lvl w:ilvl="8" w:tentative="1">
+      <w:start w:val="1"/>
+      <w:numFmt w:val="bullet"/>
+      <w:lvlText w:val=""/>
+      <w:lvlJc w:val="left"/>
+      <w:pPr>
+        <w:tabs>
+          <w:tab w:val="num" w:pos="6480"/>
+        </w:tabs>
+        <w:ind w:left="6480" w:hanging="360"/>
+      </w:pPr>
+      <w:rPr>
+        <w:rFonts w:ascii="Wingdings" w:hAnsi="Wingdings" w:hint="default"/>
+        <w:sz w:val="20"/>
+      </w:rPr>
+    </w:lvl>
+  </w:abstractNum>
+  <w:abstractNum w:abstractNumId="6" w15:restartNumberingAfterBreak="0">
     <w:nsid w:val="20410D7B"/>
     <w:multiLevelType w:val="hybridMultilevel"/>
     <w:tmpl w:val="DC8A1966"/>
@@ -15632,7 +17496,7 @@
       </w:pPr>
     </w:lvl>
   </w:abstractNum>
-  <w:abstractNum w:abstractNumId="6" w15:restartNumberingAfterBreak="0">
+  <w:abstractNum w:abstractNumId="7" w15:restartNumberingAfterBreak="0">
     <w:nsid w:val="35AE2358"/>
     <w:multiLevelType w:val="hybridMultilevel"/>
     <w:tmpl w:val="313E9C48"/>
@@ -15745,7 +17609,7 @@
       </w:rPr>
     </w:lvl>
   </w:abstractNum>
-  <w:abstractNum w:abstractNumId="7" w15:restartNumberingAfterBreak="0">
+  <w:abstractNum w:abstractNumId="8" w15:restartNumberingAfterBreak="0">
     <w:nsid w:val="3763190F"/>
     <w:multiLevelType w:val="hybridMultilevel"/>
     <w:tmpl w:val="3B56DD94"/>
@@ -15858,7 +17722,7 @@
       </w:rPr>
     </w:lvl>
   </w:abstractNum>
-  <w:abstractNum w:abstractNumId="8" w15:restartNumberingAfterBreak="0">
+  <w:abstractNum w:abstractNumId="9" w15:restartNumberingAfterBreak="0">
     <w:nsid w:val="38002523"/>
     <w:multiLevelType w:val="hybridMultilevel"/>
     <w:tmpl w:val="C67AD9B8"/>
@@ -15944,7 +17808,7 @@
       </w:pPr>
     </w:lvl>
   </w:abstractNum>
-  <w:abstractNum w:abstractNumId="9" w15:restartNumberingAfterBreak="0">
+  <w:abstractNum w:abstractNumId="10" w15:restartNumberingAfterBreak="0">
     <w:nsid w:val="429B7366"/>
     <w:multiLevelType w:val="hybridMultilevel"/>
     <w:tmpl w:val="C5C4786E"/>
@@ -16057,7 +17921,7 @@
       </w:rPr>
     </w:lvl>
   </w:abstractNum>
-  <w:abstractNum w:abstractNumId="10" w15:restartNumberingAfterBreak="0">
+  <w:abstractNum w:abstractNumId="11" w15:restartNumberingAfterBreak="0">
     <w:nsid w:val="449D75EF"/>
     <w:multiLevelType w:val="hybridMultilevel"/>
     <w:tmpl w:val="269ED576"/>
@@ -16170,7 +18034,7 @@
       </w:rPr>
     </w:lvl>
   </w:abstractNum>
-  <w:abstractNum w:abstractNumId="11" w15:restartNumberingAfterBreak="0">
+  <w:abstractNum w:abstractNumId="12" w15:restartNumberingAfterBreak="0">
     <w:nsid w:val="55F14891"/>
     <w:multiLevelType w:val="hybridMultilevel"/>
     <w:tmpl w:val="44DAD432"/>
@@ -16283,7 +18147,7 @@
       </w:rPr>
     </w:lvl>
   </w:abstractNum>
-  <w:abstractNum w:abstractNumId="12" w15:restartNumberingAfterBreak="0">
+  <w:abstractNum w:abstractNumId="13" w15:restartNumberingAfterBreak="0">
     <w:nsid w:val="586323E8"/>
     <w:multiLevelType w:val="hybridMultilevel"/>
     <w:tmpl w:val="D58285D0"/>
@@ -16396,7 +18260,7 @@
       </w:rPr>
     </w:lvl>
   </w:abstractNum>
-  <w:abstractNum w:abstractNumId="13" w15:restartNumberingAfterBreak="0">
+  <w:abstractNum w:abstractNumId="14" w15:restartNumberingAfterBreak="0">
     <w:nsid w:val="5C0E4F3D"/>
     <w:multiLevelType w:val="hybridMultilevel"/>
     <w:tmpl w:val="EC20492C"/>
@@ -16487,7 +18351,7 @@
       </w:pPr>
     </w:lvl>
   </w:abstractNum>
-  <w:abstractNum w:abstractNumId="14" w15:restartNumberingAfterBreak="0">
+  <w:abstractNum w:abstractNumId="15" w15:restartNumberingAfterBreak="0">
     <w:nsid w:val="5C476B81"/>
     <w:multiLevelType w:val="multilevel"/>
     <w:tmpl w:val="FC8A0658"/>
@@ -16636,7 +18500,7 @@
       </w:rPr>
     </w:lvl>
   </w:abstractNum>
-  <w:abstractNum w:abstractNumId="15" w15:restartNumberingAfterBreak="0">
+  <w:abstractNum w:abstractNumId="16" w15:restartNumberingAfterBreak="0">
     <w:nsid w:val="5FC12913"/>
     <w:multiLevelType w:val="multilevel"/>
     <w:tmpl w:val="CCC2C13C"/>
@@ -16785,7 +18649,7 @@
       </w:rPr>
     </w:lvl>
   </w:abstractNum>
-  <w:abstractNum w:abstractNumId="16" w15:restartNumberingAfterBreak="0">
+  <w:abstractNum w:abstractNumId="17" w15:restartNumberingAfterBreak="0">
     <w:nsid w:val="6A6320F1"/>
     <w:multiLevelType w:val="hybridMultilevel"/>
     <w:tmpl w:val="06D0C24C"/>
@@ -16898,7 +18762,7 @@
       </w:rPr>
     </w:lvl>
   </w:abstractNum>
-  <w:abstractNum w:abstractNumId="17" w15:restartNumberingAfterBreak="0">
+  <w:abstractNum w:abstractNumId="18" w15:restartNumberingAfterBreak="0">
     <w:nsid w:val="6DF80A5C"/>
     <w:multiLevelType w:val="hybridMultilevel"/>
     <w:tmpl w:val="227C523A"/>
@@ -17011,7 +18875,7 @@
       </w:rPr>
     </w:lvl>
   </w:abstractNum>
-  <w:abstractNum w:abstractNumId="18" w15:restartNumberingAfterBreak="0">
+  <w:abstractNum w:abstractNumId="19" w15:restartNumberingAfterBreak="0">
     <w:nsid w:val="797C4B82"/>
     <w:multiLevelType w:val="hybridMultilevel"/>
     <w:tmpl w:val="07EAFC60"/>
@@ -17128,58 +18992,61 @@
     <w:abstractNumId w:val="4"/>
   </w:num>
   <w:num w:numId="2" w16cid:durableId="2040466800">
-    <w:abstractNumId w:val="8"/>
+    <w:abstractNumId w:val="9"/>
   </w:num>
   <w:num w:numId="3" w16cid:durableId="1340304127">
     <w:abstractNumId w:val="2"/>
   </w:num>
   <w:num w:numId="4" w16cid:durableId="1512138096">
-    <w:abstractNumId w:val="12"/>
+    <w:abstractNumId w:val="13"/>
   </w:num>
   <w:num w:numId="5" w16cid:durableId="1649553211">
     <w:abstractNumId w:val="3"/>
   </w:num>
   <w:num w:numId="6" w16cid:durableId="807891391">
+    <w:abstractNumId w:val="18"/>
+  </w:num>
+  <w:num w:numId="7" w16cid:durableId="729426662">
+    <w:abstractNumId w:val="14"/>
+  </w:num>
+  <w:num w:numId="8" w16cid:durableId="605891484">
+    <w:abstractNumId w:val="10"/>
+  </w:num>
+  <w:num w:numId="9" w16cid:durableId="1149131816">
+    <w:abstractNumId w:val="7"/>
+  </w:num>
+  <w:num w:numId="10" w16cid:durableId="912161938">
+    <w:abstractNumId w:val="8"/>
+  </w:num>
+  <w:num w:numId="11" w16cid:durableId="1896774179">
     <w:abstractNumId w:val="17"/>
   </w:num>
-  <w:num w:numId="7" w16cid:durableId="729426662">
-    <w:abstractNumId w:val="13"/>
-  </w:num>
-  <w:num w:numId="8" w16cid:durableId="605891484">
-    <w:abstractNumId w:val="9"/>
-  </w:num>
-  <w:num w:numId="9" w16cid:durableId="1149131816">
-    <w:abstractNumId w:val="6"/>
-  </w:num>
-  <w:num w:numId="10" w16cid:durableId="912161938">
-    <w:abstractNumId w:val="7"/>
-  </w:num>
-  <w:num w:numId="11" w16cid:durableId="1896774179">
+  <w:num w:numId="12" w16cid:durableId="1262647108">
     <w:abstractNumId w:val="16"/>
   </w:num>
-  <w:num w:numId="12" w16cid:durableId="1262647108">
+  <w:num w:numId="13" w16cid:durableId="1882472697">
     <w:abstractNumId w:val="15"/>
-  </w:num>
-  <w:num w:numId="13" w16cid:durableId="1882472697">
-    <w:abstractNumId w:val="14"/>
   </w:num>
   <w:num w:numId="14" w16cid:durableId="1431969139">
     <w:abstractNumId w:val="0"/>
   </w:num>
   <w:num w:numId="15" w16cid:durableId="514802652">
-    <w:abstractNumId w:val="5"/>
+    <w:abstractNumId w:val="6"/>
   </w:num>
   <w:num w:numId="16" w16cid:durableId="1098015004">
-    <w:abstractNumId w:val="10"/>
+    <w:abstractNumId w:val="11"/>
   </w:num>
   <w:num w:numId="17" w16cid:durableId="146677694">
-    <w:abstractNumId w:val="18"/>
+    <w:abstractNumId w:val="19"/>
   </w:num>
   <w:num w:numId="18" w16cid:durableId="1043676634">
     <w:abstractNumId w:val="1"/>
   </w:num>
   <w:num w:numId="19" w16cid:durableId="1144927941">
-    <w:abstractNumId w:val="11"/>
+    <w:abstractNumId w:val="12"/>
+  </w:num>
+  <w:num w:numId="20" w16cid:durableId="1313364356">
+    <w:abstractNumId w:val="5"/>
   </w:num>
 </w:numbering>
 </file>
@@ -17798,7 +19665,6 @@
   <w:style w:type="character" w:default="1" w:styleId="DefaultParagraphFont">
     <w:name w:val="Default Paragraph Font"/>
     <w:uiPriority w:val="1"/>
-    <w:semiHidden/>
     <w:unhideWhenUsed/>
   </w:style>
   <w:style w:type="table" w:default="1" w:styleId="TableNormal">

</xml_diff>

<commit_message>
Narrow object for var strings
</commit_message>
<xml_diff>
--- a/FBL-PhD-research-proposal.docx
+++ b/FBL-PhD-research-proposal.docx
@@ -281,15 +281,7 @@
           <w:sz w:val="20"/>
           <w:szCs w:val="20"/>
         </w:rPr>
-        <w:t>Essex</w:t>
-      </w:r>
-      <w:r>
-        <w:rPr>
-          <w:rFonts w:ascii="Arial" w:hAnsi="Arial" w:cs="Arial"/>
-          <w:sz w:val="20"/>
-          <w:szCs w:val="20"/>
-        </w:rPr>
-        <w:t>, 2013</w:t>
+        <w:t>Essex, 2013</w:t>
       </w:r>
     </w:p>
     <w:p>
@@ -300,44 +292,15 @@
           <w:rFonts w:ascii="Arial" w:hAnsi="Arial" w:cs="Arial"/>
           <w:sz w:val="20"/>
           <w:szCs w:val="20"/>
-          <w:lang w:val="fr-FR"/>
-        </w:rPr>
-      </w:pPr>
-      <w:r>
-        <w:rPr>
-          <w:rFonts w:ascii="Arial" w:hAnsi="Arial" w:cs="Arial"/>
-          <w:sz w:val="20"/>
-          <w:szCs w:val="20"/>
-          <w:lang w:val="fr-FR"/>
-        </w:rPr>
-        <w:t xml:space="preserve">BBM, University </w:t>
-      </w:r>
-      <w:r>
-        <w:rPr>
-          <w:rFonts w:ascii="Arial" w:hAnsi="Arial" w:cs="Arial"/>
-          <w:sz w:val="20"/>
-          <w:szCs w:val="20"/>
-          <w:lang w:val="fr-FR"/>
-        </w:rPr>
-        <w:t xml:space="preserve">of </w:t>
-      </w:r>
-      <w:r>
-        <w:rPr>
-          <w:rFonts w:ascii="Arial" w:hAnsi="Arial" w:cs="Arial"/>
-          <w:sz w:val="20"/>
-          <w:szCs w:val="20"/>
-          <w:lang w:val="fr-FR"/>
-        </w:rPr>
-        <w:t>Essex</w:t>
-      </w:r>
-      <w:r>
-        <w:rPr>
-          <w:rFonts w:ascii="Arial" w:hAnsi="Arial" w:cs="Arial"/>
-          <w:sz w:val="20"/>
-          <w:szCs w:val="20"/>
-          <w:lang w:val="fr-FR"/>
-        </w:rPr>
-        <w:t>, 2010</w:t>
+        </w:rPr>
+      </w:pPr>
+      <w:r>
+        <w:rPr>
+          <w:rFonts w:ascii="Arial" w:hAnsi="Arial" w:cs="Arial"/>
+          <w:sz w:val="20"/>
+          <w:szCs w:val="20"/>
+        </w:rPr>
+        <w:t>BBM, University of Essex, 2010</w:t>
       </w:r>
     </w:p>
     <w:p>
@@ -345,7 +308,6 @@
         <w:contextualSpacing/>
         <w:rPr>
           <w:rFonts w:ascii="Arial" w:hAnsi="Arial" w:cs="Arial"/>
-          <w:lang w:val="fr-FR"/>
         </w:rPr>
       </w:pPr>
     </w:p>
@@ -2560,87 +2522,7 @@
           <w:sz w:val="20"/>
           <w:szCs w:val="20"/>
         </w:rPr>
-        <w:t xml:space="preserve">Though there are no doubt an immense amount of synergy and efficiency gains </w:t>
-      </w:r>
-      <w:r>
-        <w:rPr>
-          <w:rFonts w:ascii="Arial" w:hAnsi="Arial" w:cs="Arial"/>
-          <w:sz w:val="20"/>
-          <w:szCs w:val="20"/>
-        </w:rPr>
-        <w:t>achieved through</w:t>
-      </w:r>
-      <w:r>
-        <w:rPr>
-          <w:rFonts w:ascii="Arial" w:hAnsi="Arial" w:cs="Arial"/>
-          <w:sz w:val="20"/>
-          <w:szCs w:val="20"/>
-        </w:rPr>
-        <w:t xml:space="preserve"> the adoption of </w:t>
-      </w:r>
-      <w:r>
-        <w:rPr>
-          <w:rFonts w:ascii="Arial" w:hAnsi="Arial" w:cs="Arial"/>
-          <w:sz w:val="20"/>
-          <w:szCs w:val="20"/>
-        </w:rPr>
-        <w:t>Artifi</w:t>
-      </w:r>
-      <w:r>
-        <w:rPr>
-          <w:rFonts w:ascii="Arial" w:hAnsi="Arial" w:cs="Arial"/>
-          <w:sz w:val="20"/>
-          <w:szCs w:val="20"/>
-        </w:rPr>
-        <w:t xml:space="preserve">cial Intelligence (‘AI’) and its proponents, the process of achieving </w:t>
-      </w:r>
-      <w:r>
-        <w:rPr>
-          <w:rFonts w:ascii="Arial" w:hAnsi="Arial" w:cs="Arial"/>
-          <w:sz w:val="20"/>
-          <w:szCs w:val="20"/>
-        </w:rPr>
-        <w:t xml:space="preserve">these </w:t>
-      </w:r>
-      <w:r>
-        <w:rPr>
-          <w:rFonts w:ascii="Arial" w:hAnsi="Arial" w:cs="Arial"/>
-          <w:sz w:val="20"/>
-          <w:szCs w:val="20"/>
-        </w:rPr>
-        <w:t>result</w:t>
-      </w:r>
-      <w:r>
-        <w:rPr>
-          <w:rFonts w:ascii="Arial" w:hAnsi="Arial" w:cs="Arial"/>
-          <w:sz w:val="20"/>
-          <w:szCs w:val="20"/>
-        </w:rPr>
-        <w:t>s</w:t>
-      </w:r>
-      <w:r>
-        <w:rPr>
-          <w:rFonts w:ascii="Arial" w:hAnsi="Arial" w:cs="Arial"/>
-          <w:sz w:val="20"/>
-          <w:szCs w:val="20"/>
-        </w:rPr>
-        <w:t xml:space="preserve"> and the result itself has been deemed a threat to society by the author of a recent House of Lords Library report</w:t>
-      </w:r>
-      <w:r>
-        <w:rPr>
-          <w:rFonts w:ascii="Arial" w:hAnsi="Arial" w:cs="Arial"/>
-          <w:sz w:val="20"/>
-          <w:szCs w:val="20"/>
-        </w:rPr>
-        <w:t>.</w:t>
-      </w:r>
-      <w:r>
-        <w:rPr>
-          <w:rFonts w:ascii="Arial" w:hAnsi="Arial" w:cs="Arial"/>
-          <w:sz w:val="20"/>
-          <w:szCs w:val="20"/>
-        </w:rPr>
-        <w:t xml:space="preserve"> It is therefore timely that t</w:t>
+        <w:t>It is timely that t</w:t>
       </w:r>
       <w:r>
         <w:rPr>
@@ -2798,6 +2680,14 @@
           <w:sz w:val="20"/>
           <w:szCs w:val="20"/>
         </w:rPr>
+        <w:t xml:space="preserve"> to develop employment opportunities for disadvantaged communities across Britain</w:t>
+      </w:r>
+      <w:r>
+        <w:rPr>
+          <w:rFonts w:ascii="Arial" w:hAnsi="Arial" w:cs="Arial"/>
+          <w:sz w:val="20"/>
+          <w:szCs w:val="20"/>
+        </w:rPr>
         <w:t>. </w:t>
       </w:r>
       <w:r>
@@ -2822,175 +2712,23 @@
           <w:sz w:val="20"/>
           <w:szCs w:val="20"/>
         </w:rPr>
-        <w:t>, the rise in what has come to be known as Artificia</w:t>
-      </w:r>
-      <w:r>
-        <w:rPr>
-          <w:rFonts w:ascii="Arial" w:hAnsi="Arial" w:cs="Arial"/>
-          <w:sz w:val="20"/>
-          <w:szCs w:val="20"/>
-        </w:rPr>
-        <w:t xml:space="preserve">l </w:t>
-      </w:r>
-      <w:r>
-        <w:rPr>
-          <w:rFonts w:ascii="Arial" w:hAnsi="Arial" w:cs="Arial"/>
-          <w:sz w:val="20"/>
-          <w:szCs w:val="20"/>
-        </w:rPr>
-        <w:t>Intelligence</w:t>
-      </w:r>
-      <w:r>
-        <w:rPr>
-          <w:rFonts w:ascii="Arial" w:hAnsi="Arial" w:cs="Arial"/>
-          <w:sz w:val="20"/>
-          <w:szCs w:val="20"/>
-        </w:rPr>
-        <w:t xml:space="preserve"> or AI</w:t>
-      </w:r>
-      <w:r>
-        <w:rPr>
-          <w:rFonts w:ascii="Arial" w:hAnsi="Arial" w:cs="Arial"/>
-          <w:sz w:val="20"/>
-          <w:szCs w:val="20"/>
-        </w:rPr>
-        <w:t xml:space="preserve">, which forms </w:t>
-      </w:r>
-      <w:r>
-        <w:rPr>
-          <w:rFonts w:ascii="Arial" w:hAnsi="Arial" w:cs="Arial"/>
-          <w:sz w:val="20"/>
-          <w:szCs w:val="20"/>
-        </w:rPr>
-        <w:t xml:space="preserve">a fundamental </w:t>
-      </w:r>
-      <w:r>
-        <w:rPr>
-          <w:rFonts w:ascii="Arial" w:hAnsi="Arial" w:cs="Arial"/>
-          <w:sz w:val="20"/>
-          <w:szCs w:val="20"/>
-        </w:rPr>
-        <w:t xml:space="preserve">part of the </w:t>
-      </w:r>
-      <w:r>
-        <w:rPr>
-          <w:rFonts w:ascii="Arial" w:hAnsi="Arial" w:cs="Arial"/>
-          <w:sz w:val="20"/>
-          <w:szCs w:val="20"/>
-        </w:rPr>
-        <w:t>idea</w:t>
-      </w:r>
-      <w:r>
-        <w:rPr>
-          <w:rFonts w:ascii="Arial" w:hAnsi="Arial" w:cs="Arial"/>
-          <w:sz w:val="20"/>
-          <w:szCs w:val="20"/>
-        </w:rPr>
-        <w:t xml:space="preserve"> that there may in fact </w:t>
-      </w:r>
-      <w:r>
-        <w:rPr>
-          <w:rFonts w:ascii="Arial" w:hAnsi="Arial" w:cs="Arial"/>
-          <w:sz w:val="20"/>
-          <w:szCs w:val="20"/>
-        </w:rPr>
-        <w:t xml:space="preserve">may </w:t>
-      </w:r>
-      <w:r>
-        <w:rPr>
-          <w:rFonts w:ascii="Arial" w:hAnsi="Arial" w:cs="Arial"/>
-          <w:sz w:val="20"/>
-          <w:szCs w:val="20"/>
-        </w:rPr>
-        <w:t xml:space="preserve">be a Singularity </w:t>
-      </w:r>
-      <w:r>
-        <w:rPr>
-          <w:rFonts w:ascii="Arial" w:hAnsi="Arial" w:cs="Arial"/>
-          <w:sz w:val="20"/>
-          <w:szCs w:val="20"/>
-        </w:rPr>
-        <w:t xml:space="preserve">taking place </w:t>
-      </w:r>
-      <w:r>
-        <w:rPr>
-          <w:rFonts w:ascii="Arial" w:hAnsi="Arial" w:cs="Arial"/>
-          <w:sz w:val="20"/>
-          <w:szCs w:val="20"/>
-        </w:rPr>
-        <w:t>in the near future, has produced various “sides”</w:t>
-      </w:r>
-      <w:r>
-        <w:rPr>
-          <w:rFonts w:ascii="Arial" w:hAnsi="Arial" w:cs="Arial"/>
-          <w:sz w:val="20"/>
-          <w:szCs w:val="20"/>
-        </w:rPr>
-        <w:t xml:space="preserve">, creating extended debate on the topic of </w:t>
-      </w:r>
-      <w:r>
-        <w:rPr>
-          <w:rFonts w:ascii="Arial" w:hAnsi="Arial" w:cs="Arial"/>
-          <w:sz w:val="20"/>
-          <w:szCs w:val="20"/>
-        </w:rPr>
-        <w:t>signalling, reasonable adjustments and HR</w:t>
-      </w:r>
-      <w:r>
-        <w:rPr>
-          <w:rFonts w:ascii="Arial" w:hAnsi="Arial" w:cs="Arial"/>
-          <w:sz w:val="20"/>
-          <w:szCs w:val="20"/>
-        </w:rPr>
-        <w:t xml:space="preserve"> best practice</w:t>
-      </w:r>
-      <w:r>
-        <w:rPr>
-          <w:rFonts w:ascii="Arial" w:hAnsi="Arial" w:cs="Arial"/>
-          <w:sz w:val="20"/>
-          <w:szCs w:val="20"/>
-        </w:rPr>
-        <w:t xml:space="preserve">. On the one hand there are </w:t>
-      </w:r>
-      <w:r>
-        <w:rPr>
-          <w:rFonts w:ascii="Arial" w:hAnsi="Arial" w:cs="Arial"/>
-          <w:sz w:val="20"/>
-          <w:szCs w:val="20"/>
-        </w:rPr>
-        <w:t xml:space="preserve">proponents who advocate for AI </w:t>
-      </w:r>
-      <w:r>
-        <w:rPr>
-          <w:rFonts w:ascii="Arial" w:hAnsi="Arial" w:cs="Arial"/>
-          <w:sz w:val="20"/>
-          <w:szCs w:val="20"/>
-        </w:rPr>
-        <w:t xml:space="preserve">and on the other </w:t>
-      </w:r>
-      <w:r>
-        <w:rPr>
-          <w:rFonts w:ascii="Arial" w:hAnsi="Arial" w:cs="Arial"/>
-          <w:sz w:val="20"/>
-          <w:szCs w:val="20"/>
-        </w:rPr>
-        <w:t xml:space="preserve">hand </w:t>
-      </w:r>
-      <w:r>
-        <w:rPr>
-          <w:rFonts w:ascii="Arial" w:hAnsi="Arial" w:cs="Arial"/>
-          <w:sz w:val="20"/>
-          <w:szCs w:val="20"/>
-        </w:rPr>
-        <w:t>there are naysayers</w:t>
-      </w:r>
-      <w:r>
-        <w:rPr>
-          <w:rFonts w:ascii="Arial" w:hAnsi="Arial" w:cs="Arial"/>
-          <w:sz w:val="20"/>
-          <w:szCs w:val="20"/>
-        </w:rPr>
-        <w:t xml:space="preserve"> who oppose these synergies on the basis of work erosion and a reduction I the level of labour force participation.</w:t>
+        <w:t xml:space="preserve"> in 2024</w:t>
+      </w:r>
+      <w:r>
+        <w:rPr>
+          <w:rFonts w:ascii="Arial" w:hAnsi="Arial" w:cs="Arial"/>
+          <w:sz w:val="20"/>
+          <w:szCs w:val="20"/>
+        </w:rPr>
+        <w:t xml:space="preserve">, the rise in what has come to be known as </w:t>
+      </w:r>
+      <w:r>
+        <w:rPr>
+          <w:rFonts w:ascii="Arial" w:hAnsi="Arial" w:cs="Arial"/>
+          <w:sz w:val="20"/>
+          <w:szCs w:val="20"/>
+        </w:rPr>
+        <w:t>youth who are not in employment, education or training (NEETs, essentially) has somewhat subsided.</w:t>
       </w:r>
     </w:p>
     <w:p>
@@ -3022,25 +2760,7 @@
           <w:sz w:val="20"/>
           <w:szCs w:val="20"/>
         </w:rPr>
-        <w:t>Since the outcome of the Buckland Review and its subsequent findings concerning the employment opportunities of Autistic applicants (that is, </w:t>
-      </w:r>
-      <w:r>
-        <w:rPr>
-          <w:rFonts w:ascii="Arial" w:hAnsi="Arial" w:cs="Arial"/>
-          <w:b/>
-          <w:bCs/>
-          <w:sz w:val="20"/>
-          <w:szCs w:val="20"/>
-        </w:rPr>
-        <w:t>7 in 10</w:t>
-      </w:r>
-      <w:r>
-        <w:rPr>
-          <w:rFonts w:ascii="Arial" w:hAnsi="Arial" w:cs="Arial"/>
-          <w:sz w:val="20"/>
-          <w:szCs w:val="20"/>
-        </w:rPr>
-        <w:t xml:space="preserve"> are not in gainful employment across the country), further research has been conducted by Miller and Doyle (2025) which forms the basis of how to </w:t>
+        <w:t>Since the outcome of the Buckland Review and its subsequent findings concerning the employment opportunities of Autistic applicants (that is, 7 in 10 are not in gainful employment across the country), further research has been conducted by Miller and Doyle (2025) which forms the basis of how to </w:t>
       </w:r>
       <w:r>
         <w:rPr>
@@ -3106,25 +2826,7 @@
           <w:sz w:val="20"/>
           <w:szCs w:val="20"/>
         </w:rPr>
-        <w:t xml:space="preserve"> </w:t>
-      </w:r>
-      <w:r>
-        <w:rPr>
-          <w:rFonts w:ascii="Arial" w:hAnsi="Arial" w:cs="Arial"/>
-          <w:b/>
-          <w:bCs/>
-          <w:sz w:val="20"/>
-          <w:szCs w:val="20"/>
-        </w:rPr>
-        <w:t xml:space="preserve">Sir Charlie Mayfield </w:t>
-      </w:r>
-      <w:r>
-        <w:rPr>
-          <w:rFonts w:ascii="Arial" w:hAnsi="Arial" w:cs="Arial"/>
-          <w:sz w:val="20"/>
-          <w:szCs w:val="20"/>
-        </w:rPr>
-        <w:t xml:space="preserve">Review </w:t>
+        <w:t xml:space="preserve"> Sir Charlie Mayfield Review </w:t>
       </w:r>
       <w:r>
         <w:rPr>
@@ -3188,75 +2890,103 @@
           <w:sz w:val="20"/>
           <w:szCs w:val="20"/>
         </w:rPr>
-        <w:t xml:space="preserve">is important for several reasons, not least for the intrinsic motivation of the employee but also on grounds of fairness and positive discrimination. I am aiming to study how </w:t>
-      </w:r>
-      <w:r>
-        <w:rPr>
-          <w:rFonts w:ascii="Arial" w:hAnsi="Arial" w:cs="Arial"/>
-          <w:sz w:val="20"/>
-          <w:szCs w:val="20"/>
-        </w:rPr>
-        <w:t xml:space="preserve">Black </w:t>
-      </w:r>
-      <w:r>
-        <w:rPr>
-          <w:rFonts w:ascii="Arial" w:hAnsi="Arial" w:cs="Arial"/>
-          <w:sz w:val="20"/>
-          <w:szCs w:val="20"/>
-        </w:rPr>
-        <w:t>neurodiverse applicants perceive resource-based HRM (what we call the RBV in HRM theory) and how RBV approaches, which are inherently focused on creating competitive advantage link to recruitment signalling during the applicant journey. I am hoping to investigate several hypotheses (which I have cited in my PhD proposal) which will form the backbone of the research study, and which will either confirm the work of </w:t>
-      </w:r>
-      <w:r>
-        <w:rPr>
-          <w:rFonts w:ascii="Arial" w:hAnsi="Arial" w:cs="Arial"/>
-          <w:b/>
-          <w:bCs/>
-          <w:sz w:val="20"/>
-          <w:szCs w:val="20"/>
-        </w:rPr>
-        <w:t>Miller and Doyle (2025)</w:t>
-      </w:r>
-      <w:r>
-        <w:rPr>
-          <w:rFonts w:ascii="Arial" w:hAnsi="Arial" w:cs="Arial"/>
-          <w:sz w:val="20"/>
-          <w:szCs w:val="20"/>
-        </w:rPr>
-        <w:t xml:space="preserve"> or reject the premise of their recent research study. I also plan to extend Miller and Doyle's work to study anonymous responses from applicants with </w:t>
-      </w:r>
-      <w:r>
-        <w:rPr>
-          <w:rFonts w:ascii="Arial" w:hAnsi="Arial" w:cs="Arial"/>
-          <w:sz w:val="20"/>
-          <w:szCs w:val="20"/>
-        </w:rPr>
-        <w:t>bipolar disorder</w:t>
-      </w:r>
-      <w:r>
-        <w:rPr>
-          <w:rFonts w:ascii="Arial" w:hAnsi="Arial" w:cs="Arial"/>
-          <w:sz w:val="20"/>
-          <w:szCs w:val="20"/>
-        </w:rPr>
-        <w:t xml:space="preserve"> (a condition that is </w:t>
-      </w:r>
-      <w:r>
-        <w:rPr>
-          <w:rFonts w:ascii="Arial" w:hAnsi="Arial" w:cs="Arial"/>
-          <w:b/>
-          <w:bCs/>
-          <w:sz w:val="20"/>
-          <w:szCs w:val="20"/>
-        </w:rPr>
-        <w:t>widely considered</w:t>
-      </w:r>
-      <w:r>
-        <w:rPr>
-          <w:rFonts w:ascii="Arial" w:hAnsi="Arial" w:cs="Arial"/>
-          <w:sz w:val="20"/>
-          <w:szCs w:val="20"/>
-        </w:rPr>
-        <w:t> as neurodivergent but was omitted from their empirical study).</w:t>
+        <w:t xml:space="preserve">is important for several reasons, not least for the intrinsic motivation of the employee but also on grounds of fairness and positive discrimination. I am aiming to study how neurodiverse applicants perceive </w:t>
+      </w:r>
+      <w:r>
+        <w:rPr>
+          <w:rFonts w:ascii="Arial" w:hAnsi="Arial" w:cs="Arial"/>
+          <w:sz w:val="20"/>
+          <w:szCs w:val="20"/>
+        </w:rPr>
+        <w:t>S</w:t>
+      </w:r>
+      <w:r>
+        <w:rPr>
+          <w:rFonts w:ascii="Arial" w:hAnsi="Arial" w:cs="Arial"/>
+          <w:sz w:val="20"/>
+          <w:szCs w:val="20"/>
+        </w:rPr>
+        <w:t xml:space="preserve">HRM and how </w:t>
+      </w:r>
+      <w:r>
+        <w:rPr>
+          <w:rFonts w:ascii="Arial" w:hAnsi="Arial" w:cs="Arial"/>
+          <w:sz w:val="20"/>
+          <w:szCs w:val="20"/>
+        </w:rPr>
+        <w:t>SHRM</w:t>
+      </w:r>
+      <w:r>
+        <w:rPr>
+          <w:rFonts w:ascii="Arial" w:hAnsi="Arial" w:cs="Arial"/>
+          <w:sz w:val="20"/>
+          <w:szCs w:val="20"/>
+        </w:rPr>
+        <w:t xml:space="preserve"> approaches, which are inherently focused on creating competitive advantage link to recruitment signalling during the applicant journey. I am hoping to investigate several</w:t>
+      </w:r>
+      <w:r>
+        <w:rPr>
+          <w:rFonts w:ascii="Arial" w:hAnsi="Arial" w:cs="Arial"/>
+          <w:sz w:val="20"/>
+          <w:szCs w:val="20"/>
+        </w:rPr>
+        <w:t xml:space="preserve">, </w:t>
+      </w:r>
+      <w:r>
+        <w:rPr>
+          <w:rFonts w:ascii="Arial" w:hAnsi="Arial" w:cs="Arial"/>
+          <w:sz w:val="20"/>
+          <w:szCs w:val="20"/>
+        </w:rPr>
+        <w:t>which will form the backbone of the research study, and which will either confirm the work of Miller and Doyle (2025) or reject the premise of their recent research study</w:t>
+      </w:r>
+      <w:r>
+        <w:rPr>
+          <w:rFonts w:ascii="Arial" w:hAnsi="Arial" w:cs="Arial"/>
+          <w:sz w:val="20"/>
+          <w:szCs w:val="20"/>
+        </w:rPr>
+        <w:t xml:space="preserve"> using a deductive methodology</w:t>
+      </w:r>
+      <w:r>
+        <w:rPr>
+          <w:rFonts w:ascii="Arial" w:hAnsi="Arial" w:cs="Arial"/>
+          <w:sz w:val="20"/>
+          <w:szCs w:val="20"/>
+        </w:rPr>
+        <w:t>. I also plan to</w:t>
+      </w:r>
+      <w:r>
+        <w:rPr>
+          <w:rFonts w:ascii="Arial" w:hAnsi="Arial" w:cs="Arial"/>
+          <w:sz w:val="20"/>
+          <w:szCs w:val="20"/>
+        </w:rPr>
+        <w:t xml:space="preserve"> extend Miller and Doyle's work to study anonymous responses from </w:t>
+      </w:r>
+      <w:r>
+        <w:rPr>
+          <w:rFonts w:ascii="Arial" w:hAnsi="Arial" w:cs="Arial"/>
+          <w:sz w:val="20"/>
+          <w:szCs w:val="20"/>
+        </w:rPr>
+        <w:t xml:space="preserve">neurotypical and neurodiverse </w:t>
+      </w:r>
+      <w:r>
+        <w:rPr>
+          <w:rFonts w:ascii="Arial" w:hAnsi="Arial" w:cs="Arial"/>
+          <w:sz w:val="20"/>
+          <w:szCs w:val="20"/>
+        </w:rPr>
+        <w:t>applican</w:t>
+      </w:r>
+      <w:r>
+        <w:rPr>
+          <w:rFonts w:ascii="Arial" w:hAnsi="Arial" w:cs="Arial"/>
+          <w:sz w:val="20"/>
+          <w:szCs w:val="20"/>
+        </w:rPr>
+        <w:t>ts.</w:t>
       </w:r>
     </w:p>
     <w:p>
@@ -3278,7 +3008,6 @@
           <w:bCs w:val="0"/>
           <w:color w:val="auto"/>
         </w:rPr>
-        <w:lastRenderedPageBreak/>
         <w:t>1.1</w:t>
       </w:r>
       <w:r>
@@ -3319,8 +3048,9 @@
           <w:bCs w:val="0"/>
           <w:color w:val="auto"/>
         </w:rPr>
-        <w:t>Key Questions</w:t>
-      </w:r>
+        <w:t xml:space="preserve">Four </w:t>
+      </w:r>
+      <w:bookmarkEnd w:id="2"/>
       <w:r>
         <w:rPr>
           <w:rStyle w:val="Strong"/>
@@ -3329,52 +3059,12 @@
           <w:bCs w:val="0"/>
           <w:color w:val="auto"/>
         </w:rPr>
-        <w:t xml:space="preserve"> Pertaining </w:t>
-      </w:r>
-      <w:r>
-        <w:rPr>
-          <w:rStyle w:val="Strong"/>
-          <w:rFonts w:ascii="Arial" w:hAnsi="Arial" w:cs="Arial"/>
-          <w:b w:val="0"/>
-          <w:bCs w:val="0"/>
-          <w:color w:val="auto"/>
-        </w:rPr>
-        <w:t>to</w:t>
-      </w:r>
-      <w:r>
-        <w:rPr>
-          <w:rStyle w:val="Strong"/>
-          <w:rFonts w:ascii="Arial" w:hAnsi="Arial" w:cs="Arial"/>
-          <w:b w:val="0"/>
-          <w:bCs w:val="0"/>
-          <w:color w:val="auto"/>
-        </w:rPr>
-        <w:t xml:space="preserve"> </w:t>
-      </w:r>
-      <w:r>
-        <w:rPr>
-          <w:rStyle w:val="Strong"/>
-          <w:rFonts w:ascii="Arial" w:hAnsi="Arial" w:cs="Arial"/>
-          <w:b w:val="0"/>
-          <w:bCs w:val="0"/>
-          <w:color w:val="auto"/>
-        </w:rPr>
-        <w:t xml:space="preserve">the Dissertation </w:t>
-      </w:r>
-      <w:r>
-        <w:rPr>
-          <w:rStyle w:val="Strong"/>
-          <w:rFonts w:ascii="Arial" w:hAnsi="Arial" w:cs="Arial"/>
-          <w:b w:val="0"/>
-          <w:bCs w:val="0"/>
-          <w:color w:val="auto"/>
-        </w:rPr>
-        <w:t>Study</w:t>
-      </w:r>
-      <w:bookmarkEnd w:id="2"/>
-    </w:p>
-    <w:p>
-      <w:pPr>
+        <w:t>Lines of Enquiry</w:t>
+      </w:r>
+    </w:p>
+    <w:p>
+      <w:pPr>
+        <w:jc w:val="both"/>
         <w:rPr>
           <w:rFonts w:ascii="Arial" w:hAnsi="Arial" w:cs="Arial"/>
           <w:sz w:val="20"/>
@@ -3389,7 +3079,7 @@
           <w:sz w:val="20"/>
           <w:szCs w:val="20"/>
         </w:rPr>
-        <w:t xml:space="preserve">Key </w:t>
+        <w:t>1</w:t>
       </w:r>
       <w:r>
         <w:rPr>
@@ -3399,8 +3089,42 @@
           <w:sz w:val="20"/>
           <w:szCs w:val="20"/>
         </w:rPr>
-        <w:t>q</w:t>
-      </w:r>
+        <w:t>:</w:t>
+      </w:r>
+      <w:r>
+        <w:rPr>
+          <w:rFonts w:ascii="Arial" w:hAnsi="Arial" w:cs="Arial"/>
+          <w:sz w:val="20"/>
+          <w:szCs w:val="20"/>
+        </w:rPr>
+        <w:t xml:space="preserve"> What is the sub-game optimal </w:t>
+      </w:r>
+      <w:r>
+        <w:rPr>
+          <w:rFonts w:ascii="Arial" w:hAnsi="Arial" w:cs="Arial"/>
+          <w:sz w:val="20"/>
+          <w:szCs w:val="20"/>
+        </w:rPr>
+        <w:t xml:space="preserve">signal </w:t>
+      </w:r>
+      <w:r>
+        <w:rPr>
+          <w:rFonts w:ascii="Arial" w:hAnsi="Arial" w:cs="Arial"/>
+          <w:sz w:val="20"/>
+          <w:szCs w:val="20"/>
+        </w:rPr>
+        <w:t>(in a game of separating or pooling equilibrium) an employer should send to all applicants in order to be neuroinclusive? Also, at what level of signal does an employer who signals acceptance of a neurodiverse condition, become accepted by a neurodiverse applicant?</w:t>
+      </w:r>
+    </w:p>
+    <w:p>
+      <w:pPr>
+        <w:jc w:val="both"/>
+        <w:rPr>
+          <w:rFonts w:ascii="Arial" w:hAnsi="Arial" w:cs="Arial"/>
+          <w:sz w:val="20"/>
+          <w:szCs w:val="20"/>
+        </w:rPr>
+      </w:pPr>
       <w:r>
         <w:rPr>
           <w:rFonts w:ascii="Arial" w:hAnsi="Arial" w:cs="Arial"/>
@@ -3409,28 +3133,9 @@
           <w:sz w:val="20"/>
           <w:szCs w:val="20"/>
         </w:rPr>
-        <w:t xml:space="preserve">uestion: </w:t>
-      </w:r>
-      <w:r>
-        <w:rPr>
-          <w:rFonts w:ascii="Arial" w:hAnsi="Arial" w:cs="Arial"/>
-          <w:sz w:val="20"/>
-          <w:szCs w:val="20"/>
-        </w:rPr>
-        <w:t>What recruitment approaches are considered to be conventional and why are these approaches typically inadequate for high-growth companies? (Barber and Rynes).</w:t>
-      </w:r>
-    </w:p>
-    <w:p>
-      <w:pPr>
-        <w:jc w:val="both"/>
-        <w:rPr>
-          <w:rFonts w:ascii="Arial" w:hAnsi="Arial" w:cs="Arial"/>
-          <w:i/>
-          <w:iCs/>
-          <w:sz w:val="20"/>
-          <w:szCs w:val="20"/>
-        </w:rPr>
-      </w:pPr>
+        <w:lastRenderedPageBreak/>
+        <w:t>2</w:t>
+      </w:r>
       <w:r>
         <w:rPr>
           <w:rFonts w:ascii="Arial" w:hAnsi="Arial" w:cs="Arial"/>
@@ -3439,8 +3144,34 @@
           <w:sz w:val="20"/>
           <w:szCs w:val="20"/>
         </w:rPr>
-        <w:t xml:space="preserve">Key </w:t>
-      </w:r>
+        <w:t xml:space="preserve">: </w:t>
+      </w:r>
+      <w:r>
+        <w:rPr>
+          <w:rFonts w:ascii="Arial" w:hAnsi="Arial" w:cs="Arial"/>
+          <w:sz w:val="20"/>
+          <w:szCs w:val="20"/>
+        </w:rPr>
+        <w:t xml:space="preserve">What proportion of effort should be given to ensure reasonable adjustments are afforded to all neurodiverse applicants who are successful during the interview process and what proportion of effort should be afforded to </w:t>
+      </w:r>
+      <w:r>
+        <w:rPr>
+          <w:rFonts w:ascii="Arial" w:hAnsi="Arial" w:cs="Arial"/>
+          <w:sz w:val="20"/>
+          <w:szCs w:val="20"/>
+        </w:rPr>
+        <w:t>ensuring a plurality of ethnicities are duly and adequate engaged within that very same recruitment process?</w:t>
+      </w:r>
+    </w:p>
+    <w:p>
+      <w:pPr>
+        <w:jc w:val="both"/>
+        <w:rPr>
+          <w:rFonts w:ascii="Arial" w:hAnsi="Arial" w:cs="Arial"/>
+          <w:sz w:val="20"/>
+          <w:szCs w:val="20"/>
+        </w:rPr>
+      </w:pPr>
       <w:r>
         <w:rPr>
           <w:rFonts w:ascii="Arial" w:hAnsi="Arial" w:cs="Arial"/>
@@ -3449,7 +3180,7 @@
           <w:sz w:val="20"/>
           <w:szCs w:val="20"/>
         </w:rPr>
-        <w:t>q</w:t>
+        <w:t>3</w:t>
       </w:r>
       <w:r>
         <w:rPr>
@@ -3459,15 +3190,95 @@
           <w:sz w:val="20"/>
           <w:szCs w:val="20"/>
         </w:rPr>
-        <w:t>uestion:</w:t>
-      </w:r>
-      <w:r>
-        <w:rPr>
-          <w:rFonts w:ascii="Arial" w:hAnsi="Arial" w:cs="Arial"/>
-          <w:sz w:val="20"/>
-          <w:szCs w:val="20"/>
-        </w:rPr>
-        <w:t xml:space="preserve"> What kind of signalling is adequate for HRM to communicate during a corporate hiring process for a high-growth firm? How do signalling approaches benefit Black neurodivergent candidates?</w:t>
+        <w:t>:</w:t>
+      </w:r>
+      <w:r>
+        <w:rPr>
+          <w:rFonts w:ascii="Arial" w:hAnsi="Arial" w:cs="Arial"/>
+          <w:sz w:val="20"/>
+          <w:szCs w:val="20"/>
+        </w:rPr>
+        <w:t xml:space="preserve"> In a separating equilibrium, that is, in a sub-game perfect</w:t>
+      </w:r>
+      <w:r>
+        <w:rPr>
+          <w:rFonts w:ascii="Arial" w:hAnsi="Arial" w:cs="Arial"/>
+          <w:sz w:val="20"/>
+          <w:szCs w:val="20"/>
+        </w:rPr>
+        <w:t xml:space="preserve">, </w:t>
+      </w:r>
+      <w:r>
+        <w:rPr>
+          <w:rFonts w:ascii="Arial" w:hAnsi="Arial" w:cs="Arial"/>
+          <w:sz w:val="20"/>
+          <w:szCs w:val="20"/>
+        </w:rPr>
+        <w:t xml:space="preserve">repeated game with known payoffs, and standard assumptions (complete information and perfect monitoring), how do employers </w:t>
+      </w:r>
+      <w:r>
+        <w:rPr>
+          <w:rFonts w:ascii="Arial" w:hAnsi="Arial" w:cs="Arial"/>
+          <w:sz w:val="20"/>
+          <w:szCs w:val="20"/>
+        </w:rPr>
+        <w:t xml:space="preserve">successfully </w:t>
+      </w:r>
+      <w:r>
+        <w:rPr>
+          <w:rFonts w:ascii="Arial" w:hAnsi="Arial" w:cs="Arial"/>
+          <w:sz w:val="20"/>
+          <w:szCs w:val="20"/>
+        </w:rPr>
+        <w:t xml:space="preserve">navigate a many-to-one “lottery” scenario, using the offered wage as </w:t>
+      </w:r>
+      <w:r>
+        <w:rPr>
+          <w:rFonts w:ascii="Arial" w:hAnsi="Arial" w:cs="Arial"/>
+          <w:sz w:val="20"/>
+          <w:szCs w:val="20"/>
+        </w:rPr>
+        <w:t xml:space="preserve">an optimal </w:t>
+      </w:r>
+      <w:r>
+        <w:rPr>
+          <w:rFonts w:ascii="Arial" w:hAnsi="Arial" w:cs="Arial"/>
+          <w:sz w:val="20"/>
+          <w:szCs w:val="20"/>
+        </w:rPr>
+        <w:t xml:space="preserve">signal </w:t>
+      </w:r>
+      <w:r>
+        <w:rPr>
+          <w:rFonts w:ascii="Arial" w:hAnsi="Arial" w:cs="Arial"/>
+          <w:sz w:val="20"/>
+          <w:szCs w:val="20"/>
+        </w:rPr>
+        <w:t xml:space="preserve">or </w:t>
+      </w:r>
+      <w:r>
+        <w:rPr>
+          <w:rFonts w:ascii="Arial" w:hAnsi="Arial" w:cs="Arial"/>
+          <w:sz w:val="20"/>
+          <w:szCs w:val="20"/>
+        </w:rPr>
+        <w:t xml:space="preserve">as </w:t>
+      </w:r>
+      <w:r>
+        <w:rPr>
+          <w:rFonts w:ascii="Arial" w:hAnsi="Arial" w:cs="Arial"/>
+          <w:sz w:val="20"/>
+          <w:szCs w:val="20"/>
+        </w:rPr>
+        <w:t xml:space="preserve">a </w:t>
+      </w:r>
+      <w:r>
+        <w:rPr>
+          <w:rFonts w:ascii="Arial" w:hAnsi="Arial" w:cs="Arial"/>
+          <w:sz w:val="20"/>
+          <w:szCs w:val="20"/>
+        </w:rPr>
+        <w:t>navigating mechanism?</w:t>
       </w:r>
     </w:p>
     <w:p>
@@ -3487,26 +3298,8 @@
           <w:sz w:val="20"/>
           <w:szCs w:val="20"/>
         </w:rPr>
-        <w:t>Key question:</w:t>
-      </w:r>
-      <w:r>
-        <w:rPr>
-          <w:rFonts w:ascii="Arial" w:hAnsi="Arial" w:cs="Arial"/>
-          <w:sz w:val="20"/>
-          <w:szCs w:val="20"/>
-        </w:rPr>
-        <w:t xml:space="preserve"> What is the sub-game optimal (in a game of separating or pooling equilibrium) signal an employer should send to all applicants in order to be neuroinclusive? Also, at what level of signal does an employer who signals acceptance of a neurodiverse condition, become accepted by a neurodiverse applicant?</w:t>
-      </w:r>
-    </w:p>
-    <w:p>
-      <w:pPr>
-        <w:jc w:val="both"/>
-        <w:rPr>
-          <w:rFonts w:ascii="Arial" w:hAnsi="Arial" w:cs="Arial"/>
-          <w:sz w:val="20"/>
-          <w:szCs w:val="20"/>
-        </w:rPr>
-      </w:pPr>
+        <w:t>4</w:t>
+      </w:r>
       <w:r>
         <w:rPr>
           <w:rFonts w:ascii="Arial" w:hAnsi="Arial" w:cs="Arial"/>
@@ -3515,79 +3308,47 @@
           <w:sz w:val="20"/>
           <w:szCs w:val="20"/>
         </w:rPr>
-        <w:t xml:space="preserve">Key question: </w:t>
-      </w:r>
-      <w:r>
-        <w:rPr>
-          <w:rFonts w:ascii="Arial" w:hAnsi="Arial" w:cs="Arial"/>
-          <w:sz w:val="20"/>
-          <w:szCs w:val="20"/>
-        </w:rPr>
-        <w:t xml:space="preserve">What proportion of effort should be given to ensure reasonable adjustments are afforded to all neurodiverse applicants who are successful during the interview process and what proportion of effort should be afforded to </w:t>
-      </w:r>
-      <w:r>
-        <w:rPr>
-          <w:rFonts w:ascii="Arial" w:hAnsi="Arial" w:cs="Arial"/>
-          <w:sz w:val="20"/>
-          <w:szCs w:val="20"/>
-        </w:rPr>
-        <w:t>ensuring a plurality of ethnicities are duly and adequate engaged within that very same recruitment process?</w:t>
-      </w:r>
-    </w:p>
-    <w:p>
-      <w:pPr>
-        <w:jc w:val="both"/>
-        <w:rPr>
-          <w:rFonts w:ascii="Arial" w:hAnsi="Arial" w:cs="Arial"/>
-          <w:sz w:val="20"/>
-          <w:szCs w:val="20"/>
-        </w:rPr>
-      </w:pPr>
-      <w:r>
-        <w:rPr>
-          <w:rFonts w:ascii="Arial" w:hAnsi="Arial" w:cs="Arial"/>
-          <w:b/>
-          <w:bCs/>
-          <w:sz w:val="20"/>
-          <w:szCs w:val="20"/>
-        </w:rPr>
-        <w:t>Key question:</w:t>
-      </w:r>
-      <w:r>
-        <w:rPr>
-          <w:rFonts w:ascii="Arial" w:hAnsi="Arial" w:cs="Arial"/>
-          <w:sz w:val="20"/>
-          <w:szCs w:val="20"/>
-        </w:rPr>
-        <w:t xml:space="preserve"> In a separating equilibrium, that is, in a sub-game perfect Bayesian repeated game with known payoffs, and standard assumptions (complete information and perfect monitoring), how do employers navigate a many-to-one “lottery” scenario, using the offered wage as signals as navigating mechanisms?</w:t>
-      </w:r>
-    </w:p>
-    <w:p>
-      <w:pPr>
-        <w:jc w:val="both"/>
-        <w:rPr>
-          <w:rFonts w:ascii="Arial" w:hAnsi="Arial" w:cs="Arial"/>
-          <w:sz w:val="20"/>
-          <w:szCs w:val="20"/>
-        </w:rPr>
-      </w:pPr>
-      <w:r>
-        <w:rPr>
-          <w:rFonts w:ascii="Arial" w:hAnsi="Arial" w:cs="Arial"/>
-          <w:b/>
-          <w:bCs/>
-          <w:sz w:val="20"/>
-          <w:szCs w:val="20"/>
-        </w:rPr>
-        <w:t xml:space="preserve">Key question: </w:t>
-      </w:r>
-      <w:r>
-        <w:rPr>
-          <w:rFonts w:ascii="Arial" w:hAnsi="Arial" w:cs="Arial"/>
-          <w:sz w:val="20"/>
-          <w:szCs w:val="20"/>
-        </w:rPr>
-        <w:t>How can the use of artificial intelligence inspire a Nash outcome to occur that is Pareto-optimal in a repeated sub-game with known payoffs such as set wage parameters and a signal for a neuroinclusive working environment revealed by the employer and as accepted by the applicant.</w:t>
+        <w:t xml:space="preserve">: </w:t>
+      </w:r>
+      <w:r>
+        <w:rPr>
+          <w:rFonts w:ascii="Arial" w:hAnsi="Arial" w:cs="Arial"/>
+          <w:sz w:val="20"/>
+          <w:szCs w:val="20"/>
+        </w:rPr>
+        <w:t>How can the use of artificial intelligence inspire a Nash outcome to occur that is Pareto-optimal</w:t>
+      </w:r>
+      <w:r>
+        <w:rPr>
+          <w:rFonts w:ascii="Arial" w:hAnsi="Arial" w:cs="Arial"/>
+          <w:sz w:val="20"/>
+          <w:szCs w:val="20"/>
+        </w:rPr>
+        <w:t xml:space="preserve">, where the </w:t>
+      </w:r>
+      <w:r>
+        <w:rPr>
+          <w:rFonts w:ascii="Arial" w:hAnsi="Arial" w:cs="Arial"/>
+          <w:sz w:val="20"/>
+          <w:szCs w:val="20"/>
+        </w:rPr>
+        <w:t xml:space="preserve">set wage and a signal for a neuroinclusive working environment </w:t>
+      </w:r>
+      <w:r>
+        <w:rPr>
+          <w:rFonts w:ascii="Arial" w:hAnsi="Arial" w:cs="Arial"/>
+          <w:sz w:val="20"/>
+          <w:szCs w:val="20"/>
+        </w:rPr>
+        <w:t xml:space="preserve">are both </w:t>
+      </w:r>
+      <w:r>
+        <w:rPr>
+          <w:rFonts w:ascii="Arial" w:hAnsi="Arial" w:cs="Arial"/>
+          <w:sz w:val="20"/>
+          <w:szCs w:val="20"/>
+        </w:rPr>
+        <w:t>revealed by the employer and accepted by the applicant.</w:t>
       </w:r>
     </w:p>
     <w:p>
@@ -4311,16 +4072,7 @@
           <w:sz w:val="20"/>
           <w:szCs w:val="20"/>
         </w:rPr>
-        <w:t xml:space="preserve"> hypotheses are subject to supervisory changes and will be honed and amended </w:t>
-      </w:r>
-      <w:r>
-        <w:rPr>
-          <w:rFonts w:ascii="Arial" w:hAnsi="Arial" w:cs="Arial"/>
-          <w:sz w:val="20"/>
-          <w:szCs w:val="20"/>
-        </w:rPr>
-        <w:lastRenderedPageBreak/>
-        <w:t>as and when new information in the literature is discovered, reviewed and internalised. In order, these initial hypotheses read as follows:</w:t>
+        <w:t xml:space="preserve"> hypotheses are subject to supervisory changes and will be honed and amended as and when new information in the literature is discovered, reviewed and internalised. In order, these initial hypotheses read as follows:</w:t>
       </w:r>
     </w:p>
     <w:p>
@@ -4644,7 +4396,16 @@
           <w:sz w:val="20"/>
           <w:szCs w:val="20"/>
         </w:rPr>
-        <w:t xml:space="preserve"> of neurodiverse candidates (Celani and Singh, 2011). </w:t>
+        <w:t xml:space="preserve"> of neurodiverse </w:t>
+      </w:r>
+      <w:r>
+        <w:rPr>
+          <w:rFonts w:ascii="Arial" w:hAnsi="Arial" w:cs="Arial"/>
+          <w:sz w:val="20"/>
+          <w:szCs w:val="20"/>
+        </w:rPr>
+        <w:lastRenderedPageBreak/>
+        <w:t xml:space="preserve">candidates (Celani and Singh, 2011). </w:t>
       </w:r>
       <w:r>
         <w:rPr>
@@ -4794,8 +4555,8 @@
           <w:color w:val="auto"/>
         </w:rPr>
       </w:pPr>
-      <w:bookmarkStart w:id="12" w:name="_Toc215736436"/>
-      <w:bookmarkStart w:id="13" w:name="_Toc221638265"/>
+      <w:bookmarkStart w:id="12" w:name="_Toc221638265"/>
+      <w:bookmarkStart w:id="13" w:name="_Toc215736436"/>
       <w:r>
         <w:rPr>
           <w:rStyle w:val="Strong"/>
@@ -4804,7 +4565,7 @@
           <w:bCs w:val="0"/>
           <w:color w:val="auto"/>
         </w:rPr>
-        <w:t>1.13</w:t>
+        <w:t>1.13.1</w:t>
       </w:r>
       <w:r>
         <w:rPr>
@@ -4814,7 +4575,7 @@
           <w:bCs w:val="0"/>
           <w:color w:val="auto"/>
         </w:rPr>
-        <w:t>.1</w:t>
+        <w:t xml:space="preserve"> </w:t>
       </w:r>
       <w:r>
         <w:rPr>
@@ -4824,19 +4585,9 @@
           <w:bCs w:val="0"/>
           <w:color w:val="auto"/>
         </w:rPr>
-        <w:t xml:space="preserve"> </w:t>
-      </w:r>
-      <w:r>
-        <w:rPr>
-          <w:rStyle w:val="Strong"/>
-          <w:rFonts w:ascii="Arial" w:hAnsi="Arial" w:cs="Arial"/>
-          <w:b w:val="0"/>
-          <w:bCs w:val="0"/>
-          <w:color w:val="auto"/>
-        </w:rPr>
         <w:t>Data Sources</w:t>
       </w:r>
-      <w:bookmarkEnd w:id="13"/>
+      <w:bookmarkEnd w:id="12"/>
     </w:p>
     <w:p>
       <w:pPr>
@@ -5616,7 +5367,7 @@
         </w:rPr>
         <w:t xml:space="preserve"> </w:t>
       </w:r>
-      <w:bookmarkEnd w:id="12"/>
+      <w:bookmarkEnd w:id="13"/>
       <w:r>
         <w:rPr>
           <w:rStyle w:val="Strong"/>
@@ -5768,7 +5519,6 @@
           <w:sz w:val="20"/>
           <w:szCs w:val="20"/>
         </w:rPr>
-        <w:lastRenderedPageBreak/>
         <w:t>The firm may initiate a signal to the receiver via this website about its high-commitment HRM strategy</w:t>
       </w:r>
     </w:p>
@@ -6571,8 +6321,8 @@
         </w:rPr>
       </w:pPr>
       <w:bookmarkStart w:id="23" w:name="_Toc216632807"/>
-      <w:bookmarkStart w:id="24" w:name="_Toc215736438"/>
-      <w:bookmarkStart w:id="25" w:name="_Toc221638268"/>
+      <w:bookmarkStart w:id="24" w:name="_Toc221638268"/>
+      <w:bookmarkStart w:id="25" w:name="_Toc215736438"/>
       <w:r>
         <w:rPr>
           <w:rStyle w:val="Strong"/>
@@ -6624,7 +6374,7 @@
         </w:rPr>
         <w:t xml:space="preserve"> – Literature Review</w:t>
       </w:r>
-      <w:bookmarkEnd w:id="25"/>
+      <w:bookmarkEnd w:id="24"/>
     </w:p>
     <w:p>
       <w:pPr>
@@ -6688,7 +6438,6 @@
           <w:bCs w:val="0"/>
           <w:color w:val="000000" w:themeColor="text1"/>
         </w:rPr>
-        <w:lastRenderedPageBreak/>
         <w:t>1.</w:t>
       </w:r>
       <w:r>
@@ -6981,6 +6730,7 @@
           <w:bCs w:val="0"/>
           <w:color w:val="000000" w:themeColor="text1"/>
         </w:rPr>
+        <w:lastRenderedPageBreak/>
         <w:t xml:space="preserve">1.18 </w:t>
       </w:r>
       <w:r>
@@ -8254,7 +8004,6 @@
           <w:bCs w:val="0"/>
           <w:color w:val="000000" w:themeColor="text1"/>
         </w:rPr>
-        <w:lastRenderedPageBreak/>
         <w:t>1.20</w:t>
       </w:r>
       <w:r>
@@ -8626,6 +8375,7 @@
           <w:color w:val="000000" w:themeColor="text1"/>
           <w:u w:val="single"/>
         </w:rPr>
+        <w:lastRenderedPageBreak/>
         <w:t>Applicant Attraction</w:t>
       </w:r>
     </w:p>
@@ -10530,7 +10280,6 @@
           <w:sz w:val="20"/>
           <w:szCs w:val="20"/>
         </w:rPr>
-        <w:lastRenderedPageBreak/>
         <w:t>Spence (1973): Theoretical Article</w:t>
       </w:r>
       <w:r>
@@ -11172,6 +10921,7 @@
           <w:sz w:val="20"/>
           <w:szCs w:val="20"/>
         </w:rPr>
+        <w:lastRenderedPageBreak/>
         <w:t xml:space="preserve">references alterable attributes </w:t>
       </w:r>
       <w:r>
@@ -11944,17 +11694,7 @@
           <w:sz w:val="20"/>
           <w:szCs w:val="20"/>
         </w:rPr>
-        <w:t xml:space="preserve">. By multi-level, one might interpret the meaning also as multi-hierarchical (affecting </w:t>
-      </w:r>
-      <w:r>
-        <w:rPr>
-          <w:rFonts w:ascii="Arial" w:hAnsi="Arial" w:cs="Arial"/>
-          <w:color w:val="000000" w:themeColor="text1"/>
-          <w:sz w:val="20"/>
-          <w:szCs w:val="20"/>
-        </w:rPr>
-        <w:lastRenderedPageBreak/>
-        <w:t>various modes of the organisation</w:t>
+        <w:t>. By multi-level, one might interpret the meaning also as multi-hierarchical (affecting various modes of the organisation</w:t>
       </w:r>
       <w:r>
         <w:rPr>
@@ -12495,6 +12235,7 @@
           <w:sz w:val="20"/>
           <w:szCs w:val="20"/>
         </w:rPr>
+        <w:lastRenderedPageBreak/>
         <w:t>Here, t</w:t>
       </w:r>
       <w:r>
@@ -13585,7 +13326,6 @@
                 <w:sz w:val="20"/>
                 <w:szCs w:val="20"/>
               </w:rPr>
-              <w:lastRenderedPageBreak/>
               <w:t>J24</w:t>
             </w:r>
           </w:p>
@@ -14334,7 +14074,7 @@
           <w:bCs w:val="0"/>
           <w:color w:val="000000" w:themeColor="text1"/>
         </w:rPr>
-        <w:t>1.2</w:t>
+        <w:t>1.24</w:t>
       </w:r>
       <w:r>
         <w:rPr>
@@ -14344,7 +14084,7 @@
           <w:bCs w:val="0"/>
           <w:color w:val="000000" w:themeColor="text1"/>
         </w:rPr>
-        <w:t>4</w:t>
+        <w:t xml:space="preserve"> </w:t>
       </w:r>
       <w:r>
         <w:rPr>
@@ -14354,19 +14094,155 @@
           <w:bCs w:val="0"/>
           <w:color w:val="000000" w:themeColor="text1"/>
         </w:rPr>
+        <w:t>Discussion</w:t>
+      </w:r>
+      <w:bookmarkEnd w:id="36"/>
+    </w:p>
+    <w:p>
+      <w:pPr>
+        <w:jc w:val="both"/>
+        <w:rPr>
+          <w:rFonts w:ascii="Arial" w:hAnsi="Arial" w:cs="Arial"/>
+          <w:sz w:val="20"/>
+          <w:szCs w:val="20"/>
+        </w:rPr>
+      </w:pPr>
+      <w:r>
+        <w:rPr>
+          <w:rFonts w:ascii="Arial" w:hAnsi="Arial" w:cs="Arial"/>
+          <w:sz w:val="20"/>
+          <w:szCs w:val="20"/>
+        </w:rPr>
+        <w:t>A great example of how a high-growth firm’s ne</w:t>
+      </w:r>
+      <w:r>
+        <w:rPr>
+          <w:rFonts w:ascii="Arial" w:hAnsi="Arial" w:cs="Arial"/>
+          <w:sz w:val="20"/>
+          <w:szCs w:val="20"/>
+        </w:rPr>
+        <w:t xml:space="preserve">urodiversity </w:t>
+      </w:r>
+      <w:r>
+        <w:rPr>
+          <w:rFonts w:ascii="Arial" w:hAnsi="Arial" w:cs="Arial"/>
+          <w:sz w:val="20"/>
+          <w:szCs w:val="20"/>
+        </w:rPr>
+        <w:t>h</w:t>
+      </w:r>
+      <w:r>
+        <w:rPr>
+          <w:rFonts w:ascii="Arial" w:hAnsi="Arial" w:cs="Arial"/>
+          <w:sz w:val="20"/>
+          <w:szCs w:val="20"/>
+        </w:rPr>
+        <w:t xml:space="preserve">iring approach </w:t>
+      </w:r>
+      <w:r>
+        <w:rPr>
+          <w:rFonts w:ascii="Arial" w:hAnsi="Arial" w:cs="Arial"/>
+          <w:sz w:val="20"/>
+          <w:szCs w:val="20"/>
+        </w:rPr>
+        <w:t xml:space="preserve">can </w:t>
+      </w:r>
+      <w:r>
+        <w:rPr>
+          <w:rFonts w:ascii="Arial" w:hAnsi="Arial" w:cs="Arial"/>
+          <w:sz w:val="20"/>
+          <w:szCs w:val="20"/>
+        </w:rPr>
+        <w:t>eliminate</w:t>
+      </w:r>
+      <w:r>
+        <w:rPr>
+          <w:rFonts w:ascii="Arial" w:hAnsi="Arial" w:cs="Arial"/>
+          <w:sz w:val="20"/>
+          <w:szCs w:val="20"/>
+        </w:rPr>
+        <w:t xml:space="preserve"> the bias of the interviewer, recruiter or hiring manager</w:t>
+      </w:r>
+      <w:r>
+        <w:rPr>
+          <w:rFonts w:ascii="Arial" w:hAnsi="Arial" w:cs="Arial"/>
+          <w:sz w:val="20"/>
+          <w:szCs w:val="20"/>
+        </w:rPr>
         <w:t xml:space="preserve"> </w:t>
       </w:r>
       <w:r>
         <w:rPr>
-          <w:rStyle w:val="Strong"/>
-          <w:rFonts w:ascii="Arial" w:hAnsi="Arial" w:cs="Arial"/>
-          <w:b w:val="0"/>
-          <w:bCs w:val="0"/>
-          <w:color w:val="000000" w:themeColor="text1"/>
-        </w:rPr>
-        <w:t>Discussion</w:t>
-      </w:r>
-      <w:bookmarkEnd w:id="36"/>
+          <w:rFonts w:ascii="Arial" w:hAnsi="Arial" w:cs="Arial"/>
+          <w:sz w:val="20"/>
+          <w:szCs w:val="20"/>
+        </w:rPr>
+        <w:t>comes in the form of Microsoft recruitment and workplace accom</w:t>
+      </w:r>
+      <w:r>
+        <w:rPr>
+          <w:rFonts w:ascii="Arial" w:hAnsi="Arial" w:cs="Arial"/>
+          <w:sz w:val="20"/>
+          <w:szCs w:val="20"/>
+        </w:rPr>
+        <w:t>m</w:t>
+      </w:r>
+      <w:r>
+        <w:rPr>
+          <w:rFonts w:ascii="Arial" w:hAnsi="Arial" w:cs="Arial"/>
+          <w:sz w:val="20"/>
+          <w:szCs w:val="20"/>
+        </w:rPr>
+        <w:t>odations (</w:t>
+      </w:r>
+      <w:r>
+        <w:rPr>
+          <w:rFonts w:ascii="Arial" w:hAnsi="Arial" w:cs="Arial"/>
+          <w:sz w:val="20"/>
+          <w:szCs w:val="20"/>
+        </w:rPr>
+        <w:t xml:space="preserve">Microsoft, </w:t>
+      </w:r>
+      <w:r>
+        <w:rPr>
+          <w:rFonts w:ascii="Arial" w:hAnsi="Arial" w:cs="Arial"/>
+          <w:sz w:val="20"/>
+          <w:szCs w:val="20"/>
+        </w:rPr>
+        <w:t>202</w:t>
+      </w:r>
+      <w:r>
+        <w:rPr>
+          <w:rFonts w:ascii="Arial" w:hAnsi="Arial" w:cs="Arial"/>
+          <w:sz w:val="20"/>
+          <w:szCs w:val="20"/>
+        </w:rPr>
+        <w:t>6</w:t>
+      </w:r>
+      <w:r>
+        <w:rPr>
+          <w:rFonts w:ascii="Arial" w:hAnsi="Arial" w:cs="Arial"/>
+          <w:sz w:val="20"/>
+          <w:szCs w:val="20"/>
+        </w:rPr>
+        <w:t>)</w:t>
+      </w:r>
+      <w:r>
+        <w:rPr>
+          <w:rFonts w:ascii="Arial" w:hAnsi="Arial" w:cs="Arial"/>
+          <w:sz w:val="20"/>
+          <w:szCs w:val="20"/>
+        </w:rPr>
+        <w:t>.</w:t>
+      </w:r>
+      <w:r>
+        <w:rPr>
+          <w:rFonts w:ascii="Arial" w:hAnsi="Arial" w:cs="Arial"/>
+          <w:sz w:val="20"/>
+          <w:szCs w:val="20"/>
+        </w:rPr>
+        <w:t xml:space="preserve"> </w:t>
+      </w:r>
     </w:p>
     <w:p>
       <w:pPr>
@@ -14383,152 +14259,7 @@
           <w:sz w:val="20"/>
           <w:szCs w:val="20"/>
         </w:rPr>
-        <w:t>A great example of how a high-growth firm’s ne</w:t>
-      </w:r>
-      <w:r>
-        <w:rPr>
-          <w:rFonts w:ascii="Arial" w:hAnsi="Arial" w:cs="Arial"/>
-          <w:sz w:val="20"/>
-          <w:szCs w:val="20"/>
-        </w:rPr>
-        <w:t xml:space="preserve">urodiversity </w:t>
-      </w:r>
-      <w:r>
-        <w:rPr>
-          <w:rFonts w:ascii="Arial" w:hAnsi="Arial" w:cs="Arial"/>
-          <w:sz w:val="20"/>
-          <w:szCs w:val="20"/>
-        </w:rPr>
-        <w:t>h</w:t>
-      </w:r>
-      <w:r>
-        <w:rPr>
-          <w:rFonts w:ascii="Arial" w:hAnsi="Arial" w:cs="Arial"/>
-          <w:sz w:val="20"/>
-          <w:szCs w:val="20"/>
-        </w:rPr>
-        <w:t xml:space="preserve">iring approach </w:t>
-      </w:r>
-      <w:r>
-        <w:rPr>
-          <w:rFonts w:ascii="Arial" w:hAnsi="Arial" w:cs="Arial"/>
-          <w:sz w:val="20"/>
-          <w:szCs w:val="20"/>
-        </w:rPr>
-        <w:t xml:space="preserve">can </w:t>
-      </w:r>
-      <w:r>
-        <w:rPr>
-          <w:rFonts w:ascii="Arial" w:hAnsi="Arial" w:cs="Arial"/>
-          <w:sz w:val="20"/>
-          <w:szCs w:val="20"/>
-        </w:rPr>
-        <w:t>eliminate</w:t>
-      </w:r>
-      <w:r>
-        <w:rPr>
-          <w:rFonts w:ascii="Arial" w:hAnsi="Arial" w:cs="Arial"/>
-          <w:sz w:val="20"/>
-          <w:szCs w:val="20"/>
-        </w:rPr>
-        <w:t xml:space="preserve"> the bias of the interviewer, recruiter or hiring manager</w:t>
-      </w:r>
-      <w:r>
-        <w:rPr>
-          <w:rFonts w:ascii="Arial" w:hAnsi="Arial" w:cs="Arial"/>
-          <w:sz w:val="20"/>
-          <w:szCs w:val="20"/>
-        </w:rPr>
-        <w:t xml:space="preserve"> </w:t>
-      </w:r>
-      <w:r>
-        <w:rPr>
-          <w:rFonts w:ascii="Arial" w:hAnsi="Arial" w:cs="Arial"/>
-          <w:sz w:val="20"/>
-          <w:szCs w:val="20"/>
-        </w:rPr>
-        <w:t>comes in the form of Microsoft recruitment and workplace accom</w:t>
-      </w:r>
-      <w:r>
-        <w:rPr>
-          <w:rFonts w:ascii="Arial" w:hAnsi="Arial" w:cs="Arial"/>
-          <w:sz w:val="20"/>
-          <w:szCs w:val="20"/>
-        </w:rPr>
-        <w:t>m</w:t>
-      </w:r>
-      <w:r>
-        <w:rPr>
-          <w:rFonts w:ascii="Arial" w:hAnsi="Arial" w:cs="Arial"/>
-          <w:sz w:val="20"/>
-          <w:szCs w:val="20"/>
-        </w:rPr>
-        <w:t>odations (</w:t>
-      </w:r>
-      <w:r>
-        <w:rPr>
-          <w:rFonts w:ascii="Arial" w:hAnsi="Arial" w:cs="Arial"/>
-          <w:sz w:val="20"/>
-          <w:szCs w:val="20"/>
-        </w:rPr>
-        <w:t xml:space="preserve">Microsoft, </w:t>
-      </w:r>
-      <w:r>
-        <w:rPr>
-          <w:rFonts w:ascii="Arial" w:hAnsi="Arial" w:cs="Arial"/>
-          <w:sz w:val="20"/>
-          <w:szCs w:val="20"/>
-        </w:rPr>
-        <w:t>202</w:t>
-      </w:r>
-      <w:r>
-        <w:rPr>
-          <w:rFonts w:ascii="Arial" w:hAnsi="Arial" w:cs="Arial"/>
-          <w:sz w:val="20"/>
-          <w:szCs w:val="20"/>
-        </w:rPr>
-        <w:t>6</w:t>
-      </w:r>
-      <w:r>
-        <w:rPr>
-          <w:rFonts w:ascii="Arial" w:hAnsi="Arial" w:cs="Arial"/>
-          <w:sz w:val="20"/>
-          <w:szCs w:val="20"/>
-        </w:rPr>
-        <w:t>)</w:t>
-      </w:r>
-      <w:r>
-        <w:rPr>
-          <w:rFonts w:ascii="Arial" w:hAnsi="Arial" w:cs="Arial"/>
-          <w:sz w:val="20"/>
-          <w:szCs w:val="20"/>
-        </w:rPr>
-        <w:t>.</w:t>
-      </w:r>
-      <w:r>
-        <w:rPr>
-          <w:rFonts w:ascii="Arial" w:hAnsi="Arial" w:cs="Arial"/>
-          <w:sz w:val="20"/>
-          <w:szCs w:val="20"/>
-        </w:rPr>
-        <w:t xml:space="preserve"> </w:t>
-      </w:r>
-    </w:p>
-    <w:p>
-      <w:pPr>
-        <w:jc w:val="both"/>
-        <w:rPr>
-          <w:rFonts w:ascii="Arial" w:hAnsi="Arial" w:cs="Arial"/>
-          <w:sz w:val="20"/>
-          <w:szCs w:val="20"/>
-        </w:rPr>
-      </w:pPr>
-      <w:r>
-        <w:rPr>
-          <w:rFonts w:ascii="Arial" w:hAnsi="Arial" w:cs="Arial"/>
-          <w:sz w:val="20"/>
-          <w:szCs w:val="20"/>
-        </w:rPr>
+        <w:lastRenderedPageBreak/>
         <w:t xml:space="preserve">Axiology which </w:t>
       </w:r>
       <w:r>
@@ -14577,55 +14308,7 @@
           <w:sz w:val="20"/>
           <w:szCs w:val="20"/>
         </w:rPr>
-        <w:t xml:space="preserve"> is an important aspect to consider when developing a </w:t>
-      </w:r>
-      <w:r>
-        <w:rPr>
-          <w:rFonts w:ascii="Arial" w:hAnsi="Arial" w:cs="Arial"/>
-          <w:sz w:val="20"/>
-          <w:szCs w:val="20"/>
-        </w:rPr>
-        <w:t>theoretical understanding of recruitment.</w:t>
-      </w:r>
-      <w:r>
-        <w:rPr>
-          <w:rFonts w:ascii="Arial" w:hAnsi="Arial" w:cs="Arial"/>
-          <w:sz w:val="20"/>
-          <w:szCs w:val="20"/>
-        </w:rPr>
-        <w:t xml:space="preserve"> Contextualising and internalising the scientific value of the process requires an understanding of the employer’s brand value, and its positioning relative </w:t>
-      </w:r>
-      <w:r>
-        <w:rPr>
-          <w:rFonts w:ascii="Arial" w:hAnsi="Arial" w:cs="Arial"/>
-          <w:sz w:val="20"/>
-          <w:szCs w:val="20"/>
-        </w:rPr>
-        <w:t xml:space="preserve">proximity </w:t>
-      </w:r>
-      <w:r>
-        <w:rPr>
-          <w:rFonts w:ascii="Arial" w:hAnsi="Arial" w:cs="Arial"/>
-          <w:sz w:val="20"/>
-          <w:szCs w:val="20"/>
-        </w:rPr>
-        <w:t xml:space="preserve">to </w:t>
-      </w:r>
-      <w:r>
-        <w:rPr>
-          <w:rFonts w:ascii="Arial" w:hAnsi="Arial" w:cs="Arial"/>
-          <w:sz w:val="20"/>
-          <w:szCs w:val="20"/>
-        </w:rPr>
-        <w:t xml:space="preserve">the preferences of ideal applicants and </w:t>
-      </w:r>
-      <w:r>
-        <w:rPr>
-          <w:rFonts w:ascii="Arial" w:hAnsi="Arial" w:cs="Arial"/>
-          <w:sz w:val="20"/>
-          <w:szCs w:val="20"/>
-        </w:rPr>
-        <w:t>other organizations</w:t>
+        <w:t xml:space="preserve"> is an important aspect to consider when developing a theoretical understanding of recruitment. Contextualising and internalising the scientific value of the process requires an understanding of the employer’s brand value, and its positioning relative proximity to the preferences of ideal applicants and other organizations</w:t>
       </w:r>
       <w:r>
         <w:rPr>
@@ -14650,7 +14333,7 @@
         </w:rPr>
       </w:pPr>
       <w:bookmarkStart w:id="37" w:name="_Toc221638277"/>
-      <w:bookmarkEnd w:id="24"/>
+      <w:bookmarkEnd w:id="25"/>
       <w:r>
         <w:rPr>
           <w:rStyle w:val="Strong"/>
@@ -15118,7 +14801,6 @@
           <w:sz w:val="20"/>
           <w:szCs w:val="20"/>
         </w:rPr>
-        <w:lastRenderedPageBreak/>
         <w:t xml:space="preserve">Doyle (2025) ‘To Get Britain Working? Invest In People: Mayfield’s Report’, Available at: </w:t>
       </w:r>
       <w:hyperlink r:id="rId16" w:history="1">
@@ -15393,6 +15075,7 @@
           <w:sz w:val="20"/>
           <w:szCs w:val="20"/>
         </w:rPr>
+        <w:lastRenderedPageBreak/>
         <w:t>Jones, D.A., Willness, C.R. and Madey, S. (2014) ‘Why Are Job Seekers Attracted by Corporate Social Performance? Experimental and Field Tests of Three Signal-Based Mechanisms’, </w:t>
       </w:r>
       <w:r>
@@ -15969,7 +15652,6 @@
           <w:sz w:val="20"/>
           <w:szCs w:val="20"/>
         </w:rPr>
-        <w:lastRenderedPageBreak/>
         <w:t>Rynes, S. L. and Barber, A. E. (1990). Applicant attraction strategies: An organizational perspective. </w:t>
       </w:r>
       <w:r>
@@ -16218,6 +15900,7 @@
           <w:sz w:val="20"/>
           <w:szCs w:val="20"/>
         </w:rPr>
+        <w:lastRenderedPageBreak/>
         <w:t xml:space="preserve">University of Hull Library (2025) ‘Literature Review: Reviewing for Research’, University of Hull Skills Team, Available at: </w:t>
       </w:r>
       <w:hyperlink r:id="rId27" w:history="1">
@@ -19295,15 +18978,6 @@
   </w:num>
   <w:num w:numId="21" w16cid:durableId="813789302">
     <w:abstractNumId w:val="7"/>
-    <w:lvlOverride w:ilvl="0"/>
-    <w:lvlOverride w:ilvl="1"/>
-    <w:lvlOverride w:ilvl="2"/>
-    <w:lvlOverride w:ilvl="3"/>
-    <w:lvlOverride w:ilvl="4"/>
-    <w:lvlOverride w:ilvl="5"/>
-    <w:lvlOverride w:ilvl="6"/>
-    <w:lvlOverride w:ilvl="7"/>
-    <w:lvlOverride w:ilvl="8"/>
   </w:num>
 </w:numbering>
 </file>
@@ -19922,6 +19596,7 @@
   <w:style w:type="character" w:default="1" w:styleId="DefaultParagraphFont">
     <w:name w:val="Default Paragraph Font"/>
     <w:uiPriority w:val="1"/>
+    <w:semiHidden/>
     <w:unhideWhenUsed/>
   </w:style>
   <w:style w:type="table" w:default="1" w:styleId="TableNormal">

</xml_diff>